<commit_message>
feat(Szakdolgozat): Architektúra - Adatbázis felépítés - entitások - relációk
</commit_message>
<xml_diff>
--- a/Szakdolgozat.docx
+++ b/Szakdolgozat.docx
@@ -525,7 +525,7 @@
       <w:pPr>
         <w:pStyle w:val="szmozatlanSzakdolgozath1"/>
       </w:pPr>
-      <w:bookmarkStart w:id="0" w:name="_Toc225185483"/>
+      <w:bookmarkStart w:id="0" w:name="_Toc225492651"/>
       <w:r>
         <w:lastRenderedPageBreak/>
         <w:t>Feladatkiírás</w:t>
@@ -625,50 +625,51 @@
           <w:sz w:val="24"/>
           <w:szCs w:val="24"/>
         </w:rPr>
-        <w:t xml:space="preserve">Az alkalmazás nem csupán maga a játék, hanem egy teljes webes rendszerként működik. Lehetőséget biztosít felhasználói fiókok kezelésére, ahol a felhasználók saját pályákat generálhatnak. A pályagenerálás </w:t>
-      </w:r>
-      <w:proofErr w:type="spellStart"/>
-      <w:r>
+        <w:t>Az alkalmazás nem csupán maga a játék, hanem egy teljes webes rendszerként működik. Lehetőséget biztosít felhasználói fiókok kezelésére, ahol a felhasználók saját pályákat generálhatnak. A pályagenerálás token alapú rendszerhez kötött, ahol a felhasználók tokeneket vásárolhatnak, és ezek felhasználásával indíthatják el az új pályák létrehozását.</w:t>
+      </w:r>
+    </w:p>
+    <w:p>
+      <w:pPr>
+        <w:spacing w:line="360" w:lineRule="auto"/>
+        <w:ind w:firstLine="720"/>
+        <w:jc w:val="both"/>
         <w:rPr>
           <w:rFonts w:ascii="Times New Roman" w:hAnsi="Times New Roman" w:cs="Times New Roman"/>
           <w:sz w:val="24"/>
           <w:szCs w:val="24"/>
         </w:rPr>
-        <w:t>token</w:t>
-      </w:r>
-      <w:proofErr w:type="spellEnd"/>
+      </w:pPr>
       <w:r>
         <w:rPr>
           <w:rFonts w:ascii="Times New Roman" w:hAnsi="Times New Roman" w:cs="Times New Roman"/>
           <w:sz w:val="24"/>
           <w:szCs w:val="24"/>
         </w:rPr>
-        <w:t xml:space="preserve"> alapú rendszerhez kötött, ahol a felhasználók </w:t>
-      </w:r>
-      <w:proofErr w:type="spellStart"/>
-      <w:r>
+        <w:t>A rendszer támogatja a generált pályák közötti böngészést és keresést, így a felhasználók mások által létrehozott tartalmakat is kipróbálhatnak. Emellett lehetőség van a pályák értékelésére és kedvencekhez adására, amely közösségi funkciókkal egészíti ki az alkalmazást.</w:t>
+      </w:r>
+    </w:p>
+    <w:p>
+      <w:pPr>
+        <w:spacing w:line="360" w:lineRule="auto"/>
+        <w:ind w:firstLine="720"/>
+        <w:jc w:val="both"/>
         <w:rPr>
           <w:rFonts w:ascii="Times New Roman" w:hAnsi="Times New Roman" w:cs="Times New Roman"/>
           <w:sz w:val="24"/>
           <w:szCs w:val="24"/>
         </w:rPr>
-        <w:t>tokeneket</w:t>
-      </w:r>
-      <w:proofErr w:type="spellEnd"/>
+      </w:pPr>
       <w:r>
         <w:rPr>
           <w:rFonts w:ascii="Times New Roman" w:hAnsi="Times New Roman" w:cs="Times New Roman"/>
           <w:sz w:val="24"/>
           <w:szCs w:val="24"/>
         </w:rPr>
-        <w:t xml:space="preserve"> vásárolhatnak, és ezek felhasználásával indíthatják el az új pályák létrehozását.</w:t>
-      </w:r>
-    </w:p>
-    <w:p>
-      <w:pPr>
-        <w:spacing w:line="360" w:lineRule="auto"/>
-        <w:ind w:firstLine="720"/>
-        <w:jc w:val="both"/>
+        <w:t>A pályagenerálási folyamatokhoz részletes statisztikai adatgyűjtés is kapcsolódik. A rendszer rögzíti többek között a generáláshoz, validáláshoz és esetleges javításokhoz felhasznált tokenek mennyiségét, valamint az egyes folyamatok időigényét. Ezek az adatok lehetőséget biztosítanak a rendszer működésének elemzésére és optimalizálására.</w:t>
+      </w:r>
+    </w:p>
+    <w:p>
+      <w:pPr>
         <w:rPr>
           <w:rFonts w:ascii="Times New Roman" w:hAnsi="Times New Roman" w:cs="Times New Roman"/>
           <w:sz w:val="24"/>
@@ -681,79 +682,6 @@
           <w:sz w:val="24"/>
           <w:szCs w:val="24"/>
         </w:rPr>
-        <w:t>A rendszer támogatja a generált pályák közötti böngészést és keresést, így a felhasználók mások által létrehozott tartalmakat is kipróbálhatnak. Emellett lehetőség van a pályák értékelésére és kedvencekhez adására, amely közösségi funkciókkal egészíti ki az alkalmazást.</w:t>
-      </w:r>
-    </w:p>
-    <w:p>
-      <w:pPr>
-        <w:spacing w:line="360" w:lineRule="auto"/>
-        <w:ind w:firstLine="720"/>
-        <w:jc w:val="both"/>
-        <w:rPr>
-          <w:rFonts w:ascii="Times New Roman" w:hAnsi="Times New Roman" w:cs="Times New Roman"/>
-          <w:sz w:val="24"/>
-          <w:szCs w:val="24"/>
-        </w:rPr>
-      </w:pPr>
-      <w:r>
-        <w:rPr>
-          <w:rFonts w:ascii="Times New Roman" w:hAnsi="Times New Roman" w:cs="Times New Roman"/>
-          <w:sz w:val="24"/>
-          <w:szCs w:val="24"/>
-        </w:rPr>
-        <w:t xml:space="preserve">A pályagenerálási folyamatokhoz részletes statisztikai adatgyűjtés is kapcsolódik. A rendszer rögzíti többek között a generáláshoz, </w:t>
-      </w:r>
-      <w:proofErr w:type="spellStart"/>
-      <w:r>
-        <w:rPr>
-          <w:rFonts w:ascii="Times New Roman" w:hAnsi="Times New Roman" w:cs="Times New Roman"/>
-          <w:sz w:val="24"/>
-          <w:szCs w:val="24"/>
-        </w:rPr>
-        <w:t>validáláshoz</w:t>
-      </w:r>
-      <w:proofErr w:type="spellEnd"/>
-      <w:r>
-        <w:rPr>
-          <w:rFonts w:ascii="Times New Roman" w:hAnsi="Times New Roman" w:cs="Times New Roman"/>
-          <w:sz w:val="24"/>
-          <w:szCs w:val="24"/>
-        </w:rPr>
-        <w:t xml:space="preserve"> és esetleges javításokhoz felhasznált </w:t>
-      </w:r>
-      <w:proofErr w:type="spellStart"/>
-      <w:r>
-        <w:rPr>
-          <w:rFonts w:ascii="Times New Roman" w:hAnsi="Times New Roman" w:cs="Times New Roman"/>
-          <w:sz w:val="24"/>
-          <w:szCs w:val="24"/>
-        </w:rPr>
-        <w:t>tokenek</w:t>
-      </w:r>
-      <w:proofErr w:type="spellEnd"/>
-      <w:r>
-        <w:rPr>
-          <w:rFonts w:ascii="Times New Roman" w:hAnsi="Times New Roman" w:cs="Times New Roman"/>
-          <w:sz w:val="24"/>
-          <w:szCs w:val="24"/>
-        </w:rPr>
-        <w:t xml:space="preserve"> mennyiségét, valamint az egyes folyamatok időigényét. Ezek az adatok lehetőséget biztosítanak a rendszer működésének elemzésére és optimalizálására.</w:t>
-      </w:r>
-    </w:p>
-    <w:p>
-      <w:pPr>
-        <w:rPr>
-          <w:rFonts w:ascii="Times New Roman" w:hAnsi="Times New Roman" w:cs="Times New Roman"/>
-          <w:sz w:val="24"/>
-          <w:szCs w:val="24"/>
-        </w:rPr>
-      </w:pPr>
-      <w:r>
-        <w:rPr>
-          <w:rFonts w:ascii="Times New Roman" w:hAnsi="Times New Roman" w:cs="Times New Roman"/>
-          <w:sz w:val="24"/>
-          <w:szCs w:val="24"/>
-        </w:rPr>
         <w:br w:type="page"/>
       </w:r>
     </w:p>
@@ -761,7 +689,7 @@
       <w:pPr>
         <w:pStyle w:val="szmozatlanSzakdolgozath1"/>
       </w:pPr>
-      <w:bookmarkStart w:id="1" w:name="_Toc225185484"/>
+      <w:bookmarkStart w:id="1" w:name="_Toc225492652"/>
       <w:r>
         <w:lastRenderedPageBreak/>
         <w:t>Tartalomjegyzék</w:t>
@@ -824,7 +752,7 @@
           <w:r>
             <w:fldChar w:fldCharType="separate"/>
           </w:r>
-          <w:hyperlink w:anchor="_Toc225185483" w:history="1">
+          <w:hyperlink w:anchor="_Toc225492651" w:history="1">
             <w:r>
               <w:rPr>
                 <w:rStyle w:val="Hyperlink"/>
@@ -851,7 +779,7 @@
                 <w:noProof/>
                 <w:webHidden/>
               </w:rPr>
-              <w:instrText xml:space="preserve"> PAGEREF _Toc225185483 \h </w:instrText>
+              <w:instrText xml:space="preserve"> PAGEREF _Toc225492651 \h </w:instrText>
             </w:r>
             <w:r>
               <w:rPr>
@@ -896,7 +824,7 @@
               <w:lang w:val="en-US"/>
             </w:rPr>
           </w:pPr>
-          <w:hyperlink w:anchor="_Toc225185484" w:history="1">
+          <w:hyperlink w:anchor="_Toc225492652" w:history="1">
             <w:r>
               <w:rPr>
                 <w:rStyle w:val="Hyperlink"/>
@@ -923,7 +851,7 @@
                 <w:noProof/>
                 <w:webHidden/>
               </w:rPr>
-              <w:instrText xml:space="preserve"> PAGEREF _Toc225185484 \h </w:instrText>
+              <w:instrText xml:space="preserve"> PAGEREF _Toc225492652 \h </w:instrText>
             </w:r>
             <w:r>
               <w:rPr>
@@ -969,7 +897,7 @@
               <w:lang w:val="en-US"/>
             </w:rPr>
           </w:pPr>
-          <w:hyperlink w:anchor="_Toc225185485" w:history="1">
+          <w:hyperlink w:anchor="_Toc225492653" w:history="1">
             <w:r>
               <w:rPr>
                 <w:rStyle w:val="Hyperlink"/>
@@ -1014,7 +942,7 @@
                 <w:noProof/>
                 <w:webHidden/>
               </w:rPr>
-              <w:instrText xml:space="preserve"> PAGEREF _Toc225185485 \h </w:instrText>
+              <w:instrText xml:space="preserve"> PAGEREF _Toc225492653 \h </w:instrText>
             </w:r>
             <w:r>
               <w:rPr>
@@ -1060,7 +988,7 @@
               <w:lang w:val="en-US"/>
             </w:rPr>
           </w:pPr>
-          <w:hyperlink w:anchor="_Toc225185486" w:history="1">
+          <w:hyperlink w:anchor="_Toc225492654" w:history="1">
             <w:r>
               <w:rPr>
                 <w:rStyle w:val="Hyperlink"/>
@@ -1104,7 +1032,7 @@
                 <w:noProof/>
                 <w:webHidden/>
               </w:rPr>
-              <w:instrText xml:space="preserve"> PAGEREF _Toc225185486 \h </w:instrText>
+              <w:instrText xml:space="preserve"> PAGEREF _Toc225492654 \h </w:instrText>
             </w:r>
             <w:r>
               <w:rPr>
@@ -1150,7 +1078,7 @@
               <w:lang w:val="en-US"/>
             </w:rPr>
           </w:pPr>
-          <w:hyperlink w:anchor="_Toc225185487" w:history="1">
+          <w:hyperlink w:anchor="_Toc225492655" w:history="1">
             <w:r>
               <w:rPr>
                 <w:rStyle w:val="Hyperlink"/>
@@ -1194,7 +1122,7 @@
                 <w:noProof/>
                 <w:webHidden/>
               </w:rPr>
-              <w:instrText xml:space="preserve"> PAGEREF _Toc225185487 \h </w:instrText>
+              <w:instrText xml:space="preserve"> PAGEREF _Toc225492655 \h </w:instrText>
             </w:r>
             <w:r>
               <w:rPr>
@@ -1240,7 +1168,7 @@
               <w:lang w:val="en-US"/>
             </w:rPr>
           </w:pPr>
-          <w:hyperlink w:anchor="_Toc225185488" w:history="1">
+          <w:hyperlink w:anchor="_Toc225492656" w:history="1">
             <w:r>
               <w:rPr>
                 <w:rStyle w:val="Hyperlink"/>
@@ -1284,7 +1212,7 @@
                 <w:noProof/>
                 <w:webHidden/>
               </w:rPr>
-              <w:instrText xml:space="preserve"> PAGEREF _Toc225185488 \h </w:instrText>
+              <w:instrText xml:space="preserve"> PAGEREF _Toc225492656 \h </w:instrText>
             </w:r>
             <w:r>
               <w:rPr>
@@ -1330,7 +1258,7 @@
               <w:lang w:val="en-US"/>
             </w:rPr>
           </w:pPr>
-          <w:hyperlink w:anchor="_Toc225185489" w:history="1">
+          <w:hyperlink w:anchor="_Toc225492657" w:history="1">
             <w:r>
               <w:rPr>
                 <w:rStyle w:val="Hyperlink"/>
@@ -1374,7 +1302,7 @@
                 <w:noProof/>
                 <w:webHidden/>
               </w:rPr>
-              <w:instrText xml:space="preserve"> PAGEREF _Toc225185489 \h </w:instrText>
+              <w:instrText xml:space="preserve"> PAGEREF _Toc225492657 \h </w:instrText>
             </w:r>
             <w:r>
               <w:rPr>
@@ -1420,7 +1348,7 @@
               <w:lang w:val="en-US"/>
             </w:rPr>
           </w:pPr>
-          <w:hyperlink w:anchor="_Toc225185490" w:history="1">
+          <w:hyperlink w:anchor="_Toc225492658" w:history="1">
             <w:r>
               <w:rPr>
                 <w:rStyle w:val="Hyperlink"/>
@@ -1464,7 +1392,7 @@
                 <w:noProof/>
                 <w:webHidden/>
               </w:rPr>
-              <w:instrText xml:space="preserve"> PAGEREF _Toc225185490 \h </w:instrText>
+              <w:instrText xml:space="preserve"> PAGEREF _Toc225492658 \h </w:instrText>
             </w:r>
             <w:r>
               <w:rPr>
@@ -1510,7 +1438,7 @@
               <w:lang w:val="en-US"/>
             </w:rPr>
           </w:pPr>
-          <w:hyperlink w:anchor="_Toc225185491" w:history="1">
+          <w:hyperlink w:anchor="_Toc225492659" w:history="1">
             <w:r>
               <w:rPr>
                 <w:rStyle w:val="Hyperlink"/>
@@ -1554,7 +1482,457 @@
                 <w:noProof/>
                 <w:webHidden/>
               </w:rPr>
-              <w:instrText xml:space="preserve"> PAGEREF _Toc225185491 \h </w:instrText>
+              <w:instrText xml:space="preserve"> PAGEREF _Toc225492659 \h </w:instrText>
+            </w:r>
+            <w:r>
+              <w:rPr>
+                <w:noProof/>
+                <w:webHidden/>
+              </w:rPr>
+            </w:r>
+            <w:r>
+              <w:rPr>
+                <w:noProof/>
+                <w:webHidden/>
+              </w:rPr>
+              <w:fldChar w:fldCharType="separate"/>
+            </w:r>
+            <w:r>
+              <w:rPr>
+                <w:noProof/>
+                <w:webHidden/>
+              </w:rPr>
+              <w:t>8</w:t>
+            </w:r>
+            <w:r>
+              <w:rPr>
+                <w:noProof/>
+                <w:webHidden/>
+              </w:rPr>
+              <w:fldChar w:fldCharType="end"/>
+            </w:r>
+          </w:hyperlink>
+        </w:p>
+        <w:p>
+          <w:pPr>
+            <w:pStyle w:val="TOC1"/>
+            <w:tabs>
+              <w:tab w:val="left" w:pos="440"/>
+              <w:tab w:val="right" w:leader="dot" w:pos="8827"/>
+            </w:tabs>
+            <w:rPr>
+              <w:rFonts w:eastAsiaTheme="minorEastAsia"/>
+              <w:noProof/>
+              <w:sz w:val="24"/>
+              <w:szCs w:val="24"/>
+              <w:lang w:val="en-US"/>
+            </w:rPr>
+          </w:pPr>
+          <w:hyperlink w:anchor="_Toc225492660" w:history="1">
+            <w:r>
+              <w:rPr>
+                <w:rStyle w:val="Hyperlink"/>
+                <w:noProof/>
+              </w:rPr>
+              <w:t>2.</w:t>
+            </w:r>
+            <w:r>
+              <w:rPr>
+                <w:rFonts w:eastAsiaTheme="minorEastAsia"/>
+                <w:noProof/>
+                <w:sz w:val="24"/>
+                <w:szCs w:val="24"/>
+                <w:lang w:val="en-US"/>
+              </w:rPr>
+              <w:tab/>
+            </w:r>
+            <w:r>
+              <w:rPr>
+                <w:rStyle w:val="Hyperlink"/>
+                <w:noProof/>
+              </w:rPr>
+              <w:t>Architektúra</w:t>
+            </w:r>
+            <w:r>
+              <w:rPr>
+                <w:noProof/>
+                <w:webHidden/>
+              </w:rPr>
+              <w:tab/>
+            </w:r>
+            <w:r>
+              <w:rPr>
+                <w:noProof/>
+                <w:webHidden/>
+              </w:rPr>
+              <w:fldChar w:fldCharType="begin"/>
+            </w:r>
+            <w:r>
+              <w:rPr>
+                <w:noProof/>
+                <w:webHidden/>
+              </w:rPr>
+              <w:instrText xml:space="preserve"> PAGEREF _Toc225492660 \h </w:instrText>
+            </w:r>
+            <w:r>
+              <w:rPr>
+                <w:noProof/>
+                <w:webHidden/>
+              </w:rPr>
+            </w:r>
+            <w:r>
+              <w:rPr>
+                <w:noProof/>
+                <w:webHidden/>
+              </w:rPr>
+              <w:fldChar w:fldCharType="separate"/>
+            </w:r>
+            <w:r>
+              <w:rPr>
+                <w:noProof/>
+                <w:webHidden/>
+              </w:rPr>
+              <w:t>9</w:t>
+            </w:r>
+            <w:r>
+              <w:rPr>
+                <w:noProof/>
+                <w:webHidden/>
+              </w:rPr>
+              <w:fldChar w:fldCharType="end"/>
+            </w:r>
+          </w:hyperlink>
+        </w:p>
+        <w:p>
+          <w:pPr>
+            <w:pStyle w:val="TOC2"/>
+            <w:tabs>
+              <w:tab w:val="left" w:pos="960"/>
+              <w:tab w:val="right" w:leader="dot" w:pos="8827"/>
+            </w:tabs>
+            <w:rPr>
+              <w:rFonts w:eastAsiaTheme="minorEastAsia"/>
+              <w:noProof/>
+              <w:sz w:val="24"/>
+              <w:szCs w:val="24"/>
+              <w:lang w:val="en-US"/>
+            </w:rPr>
+          </w:pPr>
+          <w:hyperlink w:anchor="_Toc225492661" w:history="1">
+            <w:r>
+              <w:rPr>
+                <w:rStyle w:val="Hyperlink"/>
+                <w:noProof/>
+              </w:rPr>
+              <w:t>2.1.</w:t>
+            </w:r>
+            <w:r>
+              <w:rPr>
+                <w:rFonts w:eastAsiaTheme="minorEastAsia"/>
+                <w:noProof/>
+                <w:sz w:val="24"/>
+                <w:szCs w:val="24"/>
+                <w:lang w:val="en-US"/>
+              </w:rPr>
+              <w:tab/>
+            </w:r>
+            <w:r>
+              <w:rPr>
+                <w:rStyle w:val="Hyperlink"/>
+                <w:noProof/>
+              </w:rPr>
+              <w:t>Adatbázis felépítés – relációk – entitások</w:t>
+            </w:r>
+            <w:r>
+              <w:rPr>
+                <w:noProof/>
+                <w:webHidden/>
+              </w:rPr>
+              <w:tab/>
+            </w:r>
+            <w:r>
+              <w:rPr>
+                <w:noProof/>
+                <w:webHidden/>
+              </w:rPr>
+              <w:fldChar w:fldCharType="begin"/>
+            </w:r>
+            <w:r>
+              <w:rPr>
+                <w:noProof/>
+                <w:webHidden/>
+              </w:rPr>
+              <w:instrText xml:space="preserve"> PAGEREF _Toc225492661 \h </w:instrText>
+            </w:r>
+            <w:r>
+              <w:rPr>
+                <w:noProof/>
+                <w:webHidden/>
+              </w:rPr>
+            </w:r>
+            <w:r>
+              <w:rPr>
+                <w:noProof/>
+                <w:webHidden/>
+              </w:rPr>
+              <w:fldChar w:fldCharType="separate"/>
+            </w:r>
+            <w:r>
+              <w:rPr>
+                <w:noProof/>
+                <w:webHidden/>
+              </w:rPr>
+              <w:t>9</w:t>
+            </w:r>
+            <w:r>
+              <w:rPr>
+                <w:noProof/>
+                <w:webHidden/>
+              </w:rPr>
+              <w:fldChar w:fldCharType="end"/>
+            </w:r>
+          </w:hyperlink>
+        </w:p>
+        <w:p>
+          <w:pPr>
+            <w:pStyle w:val="TOC2"/>
+            <w:tabs>
+              <w:tab w:val="left" w:pos="960"/>
+              <w:tab w:val="right" w:leader="dot" w:pos="8827"/>
+            </w:tabs>
+            <w:rPr>
+              <w:rFonts w:eastAsiaTheme="minorEastAsia"/>
+              <w:noProof/>
+              <w:sz w:val="24"/>
+              <w:szCs w:val="24"/>
+              <w:lang w:val="en-US"/>
+            </w:rPr>
+          </w:pPr>
+          <w:hyperlink w:anchor="_Toc225492662" w:history="1">
+            <w:r>
+              <w:rPr>
+                <w:rStyle w:val="Hyperlink"/>
+                <w:noProof/>
+              </w:rPr>
+              <w:t>2.2.</w:t>
+            </w:r>
+            <w:r>
+              <w:rPr>
+                <w:rFonts w:eastAsiaTheme="minorEastAsia"/>
+                <w:noProof/>
+                <w:sz w:val="24"/>
+                <w:szCs w:val="24"/>
+                <w:lang w:val="en-US"/>
+              </w:rPr>
+              <w:tab/>
+            </w:r>
+            <w:r>
+              <w:rPr>
+                <w:rStyle w:val="Hyperlink"/>
+                <w:noProof/>
+              </w:rPr>
+              <w:t>Kommunikáció, API és a websocket</w:t>
+            </w:r>
+            <w:r>
+              <w:rPr>
+                <w:noProof/>
+                <w:webHidden/>
+              </w:rPr>
+              <w:tab/>
+            </w:r>
+            <w:r>
+              <w:rPr>
+                <w:noProof/>
+                <w:webHidden/>
+              </w:rPr>
+              <w:fldChar w:fldCharType="begin"/>
+            </w:r>
+            <w:r>
+              <w:rPr>
+                <w:noProof/>
+                <w:webHidden/>
+              </w:rPr>
+              <w:instrText xml:space="preserve"> PAGEREF _Toc225492662 \h </w:instrText>
+            </w:r>
+            <w:r>
+              <w:rPr>
+                <w:noProof/>
+                <w:webHidden/>
+              </w:rPr>
+            </w:r>
+            <w:r>
+              <w:rPr>
+                <w:noProof/>
+                <w:webHidden/>
+              </w:rPr>
+              <w:fldChar w:fldCharType="separate"/>
+            </w:r>
+            <w:r>
+              <w:rPr>
+                <w:noProof/>
+                <w:webHidden/>
+              </w:rPr>
+              <w:t>9</w:t>
+            </w:r>
+            <w:r>
+              <w:rPr>
+                <w:noProof/>
+                <w:webHidden/>
+              </w:rPr>
+              <w:fldChar w:fldCharType="end"/>
+            </w:r>
+          </w:hyperlink>
+        </w:p>
+        <w:p>
+          <w:pPr>
+            <w:pStyle w:val="TOC2"/>
+            <w:tabs>
+              <w:tab w:val="left" w:pos="960"/>
+              <w:tab w:val="right" w:leader="dot" w:pos="8827"/>
+            </w:tabs>
+            <w:rPr>
+              <w:rFonts w:eastAsiaTheme="minorEastAsia"/>
+              <w:noProof/>
+              <w:sz w:val="24"/>
+              <w:szCs w:val="24"/>
+              <w:lang w:val="en-US"/>
+            </w:rPr>
+          </w:pPr>
+          <w:hyperlink w:anchor="_Toc225492663" w:history="1">
+            <w:r>
+              <w:rPr>
+                <w:rStyle w:val="Hyperlink"/>
+                <w:noProof/>
+              </w:rPr>
+              <w:t>2.3.</w:t>
+            </w:r>
+            <w:r>
+              <w:rPr>
+                <w:rFonts w:eastAsiaTheme="minorEastAsia"/>
+                <w:noProof/>
+                <w:sz w:val="24"/>
+                <w:szCs w:val="24"/>
+                <w:lang w:val="en-US"/>
+              </w:rPr>
+              <w:tab/>
+            </w:r>
+            <w:r>
+              <w:rPr>
+                <w:rStyle w:val="Hyperlink"/>
+                <w:noProof/>
+              </w:rPr>
+              <w:t>File tárolás - Blob storage</w:t>
+            </w:r>
+            <w:r>
+              <w:rPr>
+                <w:noProof/>
+                <w:webHidden/>
+              </w:rPr>
+              <w:tab/>
+            </w:r>
+            <w:r>
+              <w:rPr>
+                <w:noProof/>
+                <w:webHidden/>
+              </w:rPr>
+              <w:fldChar w:fldCharType="begin"/>
+            </w:r>
+            <w:r>
+              <w:rPr>
+                <w:noProof/>
+                <w:webHidden/>
+              </w:rPr>
+              <w:instrText xml:space="preserve"> PAGEREF _Toc225492663 \h </w:instrText>
+            </w:r>
+            <w:r>
+              <w:rPr>
+                <w:noProof/>
+                <w:webHidden/>
+              </w:rPr>
+            </w:r>
+            <w:r>
+              <w:rPr>
+                <w:noProof/>
+                <w:webHidden/>
+              </w:rPr>
+              <w:fldChar w:fldCharType="separate"/>
+            </w:r>
+            <w:r>
+              <w:rPr>
+                <w:noProof/>
+                <w:webHidden/>
+              </w:rPr>
+              <w:t>9</w:t>
+            </w:r>
+            <w:r>
+              <w:rPr>
+                <w:noProof/>
+                <w:webHidden/>
+              </w:rPr>
+              <w:fldChar w:fldCharType="end"/>
+            </w:r>
+          </w:hyperlink>
+        </w:p>
+        <w:p>
+          <w:pPr>
+            <w:pStyle w:val="TOC2"/>
+            <w:tabs>
+              <w:tab w:val="left" w:pos="960"/>
+              <w:tab w:val="right" w:leader="dot" w:pos="8827"/>
+            </w:tabs>
+            <w:rPr>
+              <w:rFonts w:eastAsiaTheme="minorEastAsia"/>
+              <w:noProof/>
+              <w:sz w:val="24"/>
+              <w:szCs w:val="24"/>
+              <w:lang w:val="en-US"/>
+            </w:rPr>
+          </w:pPr>
+          <w:hyperlink w:anchor="_Toc225492664" w:history="1">
+            <w:r>
+              <w:rPr>
+                <w:rStyle w:val="Hyperlink"/>
+                <w:noProof/>
+              </w:rPr>
+              <w:t>2.4.</w:t>
+            </w:r>
+            <w:r>
+              <w:rPr>
+                <w:rFonts w:eastAsiaTheme="minorEastAsia"/>
+                <w:noProof/>
+                <w:sz w:val="24"/>
+                <w:szCs w:val="24"/>
+                <w:lang w:val="en-US"/>
+              </w:rPr>
+              <w:tab/>
+            </w:r>
+            <w:r>
+              <w:rPr>
+                <w:rStyle w:val="Hyperlink"/>
+                <w:noProof/>
+              </w:rPr>
+              <w:t>Biztonság, JWT token authentikáció</w:t>
+            </w:r>
+            <w:r>
+              <w:rPr>
+                <w:noProof/>
+                <w:webHidden/>
+              </w:rPr>
+              <w:tab/>
+            </w:r>
+            <w:r>
+              <w:rPr>
+                <w:noProof/>
+                <w:webHidden/>
+              </w:rPr>
+              <w:fldChar w:fldCharType="begin"/>
+            </w:r>
+            <w:r>
+              <w:rPr>
+                <w:noProof/>
+                <w:webHidden/>
+              </w:rPr>
+              <w:instrText xml:space="preserve"> PAGEREF _Toc225492664 \h </w:instrText>
             </w:r>
             <w:r>
               <w:rPr>
@@ -1599,7 +1977,7 @@
               <w:lang w:val="en-US"/>
             </w:rPr>
           </w:pPr>
-          <w:hyperlink w:anchor="_Toc225185492" w:history="1">
+          <w:hyperlink w:anchor="_Toc225492665" w:history="1">
             <w:r>
               <w:rPr>
                 <w:rStyle w:val="Hyperlink"/>
@@ -1626,7 +2004,7 @@
                 <w:noProof/>
                 <w:webHidden/>
               </w:rPr>
-              <w:instrText xml:space="preserve"> PAGEREF _Toc225185492 \h </w:instrText>
+              <w:instrText xml:space="preserve"> PAGEREF _Toc225492665 \h </w:instrText>
             </w:r>
             <w:r>
               <w:rPr>
@@ -1647,6 +2025,240 @@
                 <w:webHidden/>
               </w:rPr>
               <w:t>10</w:t>
+            </w:r>
+            <w:r>
+              <w:rPr>
+                <w:noProof/>
+                <w:webHidden/>
+              </w:rPr>
+              <w:fldChar w:fldCharType="end"/>
+            </w:r>
+          </w:hyperlink>
+        </w:p>
+        <w:p>
+          <w:pPr>
+            <w:pStyle w:val="TOC1"/>
+            <w:tabs>
+              <w:tab w:val="right" w:leader="dot" w:pos="8827"/>
+            </w:tabs>
+            <w:rPr>
+              <w:rFonts w:eastAsiaTheme="minorEastAsia"/>
+              <w:noProof/>
+              <w:sz w:val="24"/>
+              <w:szCs w:val="24"/>
+              <w:lang w:val="en-US"/>
+            </w:rPr>
+          </w:pPr>
+          <w:hyperlink w:anchor="_Toc225492666" w:history="1">
+            <w:r>
+              <w:rPr>
+                <w:rStyle w:val="Hyperlink"/>
+                <w:noProof/>
+              </w:rPr>
+              <w:t>Nyilatkozat</w:t>
+            </w:r>
+            <w:r>
+              <w:rPr>
+                <w:noProof/>
+                <w:webHidden/>
+              </w:rPr>
+              <w:tab/>
+            </w:r>
+            <w:r>
+              <w:rPr>
+                <w:noProof/>
+                <w:webHidden/>
+              </w:rPr>
+              <w:fldChar w:fldCharType="begin"/>
+            </w:r>
+            <w:r>
+              <w:rPr>
+                <w:noProof/>
+                <w:webHidden/>
+              </w:rPr>
+              <w:instrText xml:space="preserve"> PAGEREF _Toc225492666 \h </w:instrText>
+            </w:r>
+            <w:r>
+              <w:rPr>
+                <w:noProof/>
+                <w:webHidden/>
+              </w:rPr>
+            </w:r>
+            <w:r>
+              <w:rPr>
+                <w:noProof/>
+                <w:webHidden/>
+              </w:rPr>
+              <w:fldChar w:fldCharType="separate"/>
+            </w:r>
+            <w:r>
+              <w:rPr>
+                <w:noProof/>
+                <w:webHidden/>
+              </w:rPr>
+              <w:t>11</w:t>
+            </w:r>
+            <w:r>
+              <w:rPr>
+                <w:noProof/>
+                <w:webHidden/>
+              </w:rPr>
+              <w:fldChar w:fldCharType="end"/>
+            </w:r>
+          </w:hyperlink>
+        </w:p>
+        <w:p>
+          <w:pPr>
+            <w:pStyle w:val="TOC1"/>
+            <w:tabs>
+              <w:tab w:val="right" w:leader="dot" w:pos="8827"/>
+            </w:tabs>
+            <w:rPr>
+              <w:rFonts w:eastAsiaTheme="minorEastAsia"/>
+              <w:noProof/>
+              <w:sz w:val="24"/>
+              <w:szCs w:val="24"/>
+              <w:lang w:val="en-US"/>
+            </w:rPr>
+          </w:pPr>
+          <w:hyperlink w:anchor="_Toc225492667" w:history="1">
+            <w:r>
+              <w:rPr>
+                <w:rStyle w:val="Hyperlink"/>
+                <w:noProof/>
+              </w:rPr>
+              <w:t>Mellékletek</w:t>
+            </w:r>
+            <w:r>
+              <w:rPr>
+                <w:noProof/>
+                <w:webHidden/>
+              </w:rPr>
+              <w:tab/>
+            </w:r>
+            <w:r>
+              <w:rPr>
+                <w:noProof/>
+                <w:webHidden/>
+              </w:rPr>
+              <w:fldChar w:fldCharType="begin"/>
+            </w:r>
+            <w:r>
+              <w:rPr>
+                <w:noProof/>
+                <w:webHidden/>
+              </w:rPr>
+              <w:instrText xml:space="preserve"> PAGEREF _Toc225492667 \h </w:instrText>
+            </w:r>
+            <w:r>
+              <w:rPr>
+                <w:noProof/>
+                <w:webHidden/>
+              </w:rPr>
+            </w:r>
+            <w:r>
+              <w:rPr>
+                <w:noProof/>
+                <w:webHidden/>
+              </w:rPr>
+              <w:fldChar w:fldCharType="separate"/>
+            </w:r>
+            <w:r>
+              <w:rPr>
+                <w:noProof/>
+                <w:webHidden/>
+              </w:rPr>
+              <w:t>12</w:t>
+            </w:r>
+            <w:r>
+              <w:rPr>
+                <w:noProof/>
+                <w:webHidden/>
+              </w:rPr>
+              <w:fldChar w:fldCharType="end"/>
+            </w:r>
+          </w:hyperlink>
+        </w:p>
+        <w:p>
+          <w:pPr>
+            <w:pStyle w:val="TOC2"/>
+            <w:tabs>
+              <w:tab w:val="left" w:pos="960"/>
+              <w:tab w:val="right" w:leader="dot" w:pos="8827"/>
+            </w:tabs>
+            <w:rPr>
+              <w:rFonts w:eastAsiaTheme="minorEastAsia"/>
+              <w:noProof/>
+              <w:sz w:val="24"/>
+              <w:szCs w:val="24"/>
+              <w:lang w:val="en-US"/>
+            </w:rPr>
+          </w:pPr>
+          <w:hyperlink w:anchor="_Toc225492668" w:history="1">
+            <w:r>
+              <w:rPr>
+                <w:rStyle w:val="Hyperlink"/>
+                <w:noProof/>
+              </w:rPr>
+              <w:t>2.5.</w:t>
+            </w:r>
+            <w:r>
+              <w:rPr>
+                <w:rFonts w:eastAsiaTheme="minorEastAsia"/>
+                <w:noProof/>
+                <w:sz w:val="24"/>
+                <w:szCs w:val="24"/>
+                <w:lang w:val="en-US"/>
+              </w:rPr>
+              <w:tab/>
+            </w:r>
+            <w:r>
+              <w:rPr>
+                <w:rStyle w:val="Hyperlink"/>
+                <w:noProof/>
+              </w:rPr>
+              <w:t>Adatbázis relációk</w:t>
+            </w:r>
+            <w:r>
+              <w:rPr>
+                <w:noProof/>
+                <w:webHidden/>
+              </w:rPr>
+              <w:tab/>
+            </w:r>
+            <w:r>
+              <w:rPr>
+                <w:noProof/>
+                <w:webHidden/>
+              </w:rPr>
+              <w:fldChar w:fldCharType="begin"/>
+            </w:r>
+            <w:r>
+              <w:rPr>
+                <w:noProof/>
+                <w:webHidden/>
+              </w:rPr>
+              <w:instrText xml:space="preserve"> PAGEREF _Toc225492668 \h </w:instrText>
+            </w:r>
+            <w:r>
+              <w:rPr>
+                <w:noProof/>
+                <w:webHidden/>
+              </w:rPr>
+            </w:r>
+            <w:r>
+              <w:rPr>
+                <w:noProof/>
+                <w:webHidden/>
+              </w:rPr>
+              <w:fldChar w:fldCharType="separate"/>
+            </w:r>
+            <w:r>
+              <w:rPr>
+                <w:noProof/>
+                <w:webHidden/>
+              </w:rPr>
+              <w:t>12</w:t>
             </w:r>
             <w:r>
               <w:rPr>
@@ -1686,43 +2298,42 @@
         <w:jc w:val="both"/>
         <w:rPr>
           <w:rFonts w:ascii="Times New Roman" w:hAnsi="Times New Roman" w:cs="Times New Roman"/>
+          <w:color w:val="EE0000"/>
           <w:sz w:val="24"/>
           <w:szCs w:val="24"/>
         </w:rPr>
       </w:pPr>
-    </w:p>
-    <w:p>
-      <w:pPr>
-        <w:spacing w:line="360" w:lineRule="auto"/>
-        <w:jc w:val="both"/>
+      <w:r>
         <w:rPr>
           <w:rFonts w:ascii="Times New Roman" w:hAnsi="Times New Roman" w:cs="Times New Roman"/>
           <w:color w:val="EE0000"/>
           <w:sz w:val="24"/>
           <w:szCs w:val="24"/>
         </w:rPr>
-      </w:pPr>
-      <w:r>
+        <w:t>Pálya generálása</w:t>
+      </w:r>
+    </w:p>
+    <w:p>
+      <w:pPr>
+        <w:spacing w:line="360" w:lineRule="auto"/>
+        <w:ind w:firstLine="720"/>
+        <w:jc w:val="both"/>
         <w:rPr>
           <w:rFonts w:ascii="Times New Roman" w:hAnsi="Times New Roman" w:cs="Times New Roman"/>
           <w:color w:val="EE0000"/>
           <w:sz w:val="24"/>
           <w:szCs w:val="24"/>
         </w:rPr>
-        <w:t>Architektúra</w:t>
-      </w:r>
-    </w:p>
-    <w:p>
-      <w:pPr>
-        <w:spacing w:line="360" w:lineRule="auto"/>
-        <w:jc w:val="both"/>
+      </w:pPr>
+      <w:r>
         <w:rPr>
           <w:rFonts w:ascii="Times New Roman" w:hAnsi="Times New Roman" w:cs="Times New Roman"/>
           <w:color w:val="EE0000"/>
           <w:sz w:val="24"/>
           <w:szCs w:val="24"/>
         </w:rPr>
-      </w:pPr>
+        <w:t xml:space="preserve">Generikus </w:t>
+      </w:r>
       <w:r>
         <w:rPr>
           <w:rFonts w:ascii="Times New Roman" w:hAnsi="Times New Roman" w:cs="Times New Roman"/>
@@ -1730,41 +2341,43 @@
           <w:sz w:val="24"/>
           <w:szCs w:val="24"/>
         </w:rPr>
-        <w:tab/>
-        <w:t>Adatbázis felépítés – relációk</w:t>
-      </w:r>
-      <w:r>
+        <w:t>játék modellek</w:t>
+      </w:r>
+    </w:p>
+    <w:p>
+      <w:pPr>
+        <w:spacing w:line="360" w:lineRule="auto"/>
+        <w:ind w:firstLine="720"/>
+        <w:jc w:val="both"/>
         <w:rPr>
           <w:rFonts w:ascii="Times New Roman" w:hAnsi="Times New Roman" w:cs="Times New Roman"/>
           <w:color w:val="EE0000"/>
           <w:sz w:val="24"/>
           <w:szCs w:val="24"/>
         </w:rPr>
-        <w:t xml:space="preserve"> – entitások</w:t>
-      </w:r>
-    </w:p>
-    <w:p>
-      <w:pPr>
-        <w:spacing w:line="360" w:lineRule="auto"/>
-        <w:jc w:val="both"/>
+      </w:pPr>
+      <w:r>
         <w:rPr>
           <w:rFonts w:ascii="Times New Roman" w:hAnsi="Times New Roman" w:cs="Times New Roman"/>
           <w:color w:val="EE0000"/>
           <w:sz w:val="24"/>
           <w:szCs w:val="24"/>
         </w:rPr>
-      </w:pPr>
-      <w:r>
+        <w:t>Gráf alapú struktúra deffiniálása</w:t>
+      </w:r>
+    </w:p>
+    <w:p>
+      <w:pPr>
+        <w:spacing w:line="360" w:lineRule="auto"/>
+        <w:ind w:firstLine="720"/>
+        <w:jc w:val="both"/>
         <w:rPr>
           <w:rFonts w:ascii="Times New Roman" w:hAnsi="Times New Roman" w:cs="Times New Roman"/>
           <w:color w:val="EE0000"/>
           <w:sz w:val="24"/>
           <w:szCs w:val="24"/>
         </w:rPr>
-        <w:tab/>
-        <w:t xml:space="preserve">Kommunikáció, API és a </w:t>
-      </w:r>
-      <w:proofErr w:type="spellStart"/>
+      </w:pPr>
       <w:r>
         <w:rPr>
           <w:rFonts w:ascii="Times New Roman" w:hAnsi="Times New Roman" w:cs="Times New Roman"/>
@@ -1772,32 +2385,29 @@
           <w:sz w:val="24"/>
           <w:szCs w:val="24"/>
         </w:rPr>
-        <w:t>websocket</w:t>
-      </w:r>
-      <w:proofErr w:type="spellEnd"/>
-    </w:p>
-    <w:p>
-      <w:pPr>
-        <w:spacing w:line="360" w:lineRule="auto"/>
-        <w:jc w:val="both"/>
+        <w:t>Promtolás, kipróbált és használt modellek</w:t>
+      </w:r>
+      <w:r>
         <w:rPr>
           <w:rFonts w:ascii="Times New Roman" w:hAnsi="Times New Roman" w:cs="Times New Roman"/>
           <w:color w:val="EE0000"/>
           <w:sz w:val="24"/>
           <w:szCs w:val="24"/>
         </w:rPr>
-      </w:pPr>
-      <w:r>
+        <w:t>, Prompt mint fekete mágia</w:t>
+      </w:r>
+    </w:p>
+    <w:p>
+      <w:pPr>
+        <w:spacing w:line="360" w:lineRule="auto"/>
+        <w:jc w:val="both"/>
         <w:rPr>
           <w:rFonts w:ascii="Times New Roman" w:hAnsi="Times New Roman" w:cs="Times New Roman"/>
           <w:color w:val="EE0000"/>
           <w:sz w:val="24"/>
           <w:szCs w:val="24"/>
         </w:rPr>
-        <w:tab/>
-        <w:t xml:space="preserve">Biztonság, JWT </w:t>
-      </w:r>
-      <w:proofErr w:type="spellStart"/>
+      </w:pPr>
       <w:r>
         <w:rPr>
           <w:rFonts w:ascii="Times New Roman" w:hAnsi="Times New Roman" w:cs="Times New Roman"/>
@@ -1805,19 +2415,21 @@
           <w:sz w:val="24"/>
           <w:szCs w:val="24"/>
         </w:rPr>
-        <w:t>token</w:t>
-      </w:r>
-      <w:proofErr w:type="spellEnd"/>
-      <w:r>
+        <w:tab/>
+        <w:t>Milyen folyamatok és miért csatolódtak rá a pálya generálásra, hint rendszer</w:t>
+      </w:r>
+    </w:p>
+    <w:p>
+      <w:pPr>
+        <w:spacing w:line="360" w:lineRule="auto"/>
+        <w:jc w:val="both"/>
         <w:rPr>
           <w:rFonts w:ascii="Times New Roman" w:hAnsi="Times New Roman" w:cs="Times New Roman"/>
           <w:color w:val="EE0000"/>
           <w:sz w:val="24"/>
           <w:szCs w:val="24"/>
         </w:rPr>
-        <w:t xml:space="preserve"> </w:t>
-      </w:r>
-      <w:proofErr w:type="spellStart"/>
+      </w:pPr>
       <w:r>
         <w:rPr>
           <w:rFonts w:ascii="Times New Roman" w:hAnsi="Times New Roman" w:cs="Times New Roman"/>
@@ -1825,61 +2437,64 @@
           <w:sz w:val="24"/>
           <w:szCs w:val="24"/>
         </w:rPr>
-        <w:t>authentikáció</w:t>
-      </w:r>
-      <w:proofErr w:type="spellEnd"/>
-      <w:r>
+        <w:tab/>
+        <w:t>Milyen modelleket használtam végül</w:t>
+      </w:r>
+    </w:p>
+    <w:p>
+      <w:pPr>
+        <w:spacing w:line="360" w:lineRule="auto"/>
+        <w:jc w:val="both"/>
         <w:rPr>
           <w:rFonts w:ascii="Times New Roman" w:hAnsi="Times New Roman" w:cs="Times New Roman"/>
           <w:color w:val="EE0000"/>
           <w:sz w:val="24"/>
           <w:szCs w:val="24"/>
         </w:rPr>
-        <w:t xml:space="preserve"> </w:t>
-      </w:r>
-    </w:p>
-    <w:p>
-      <w:pPr>
-        <w:spacing w:line="360" w:lineRule="auto"/>
-        <w:jc w:val="both"/>
+      </w:pPr>
+      <w:r>
         <w:rPr>
           <w:rFonts w:ascii="Times New Roman" w:hAnsi="Times New Roman" w:cs="Times New Roman"/>
           <w:color w:val="EE0000"/>
           <w:sz w:val="24"/>
           <w:szCs w:val="24"/>
         </w:rPr>
-      </w:pPr>
-      <w:r>
+        <w:tab/>
+        <w:t>Sprite png generálása amit végül a modell megoldott</w:t>
+      </w:r>
+    </w:p>
+    <w:p>
+      <w:pPr>
+        <w:spacing w:line="360" w:lineRule="auto"/>
+        <w:jc w:val="both"/>
         <w:rPr>
           <w:rFonts w:ascii="Times New Roman" w:hAnsi="Times New Roman" w:cs="Times New Roman"/>
           <w:color w:val="EE0000"/>
           <w:sz w:val="24"/>
           <w:szCs w:val="24"/>
         </w:rPr>
-        <w:t>Pálya generálása</w:t>
-      </w:r>
-    </w:p>
-    <w:p>
-      <w:pPr>
-        <w:spacing w:line="360" w:lineRule="auto"/>
-        <w:ind w:firstLine="720"/>
-        <w:jc w:val="both"/>
+      </w:pPr>
+      <w:r>
         <w:rPr>
           <w:rFonts w:ascii="Times New Roman" w:hAnsi="Times New Roman" w:cs="Times New Roman"/>
           <w:color w:val="EE0000"/>
           <w:sz w:val="24"/>
           <w:szCs w:val="24"/>
         </w:rPr>
-      </w:pPr>
-      <w:r>
+        <w:t>Költség elemzés</w:t>
+      </w:r>
+    </w:p>
+    <w:p>
+      <w:pPr>
+        <w:spacing w:line="360" w:lineRule="auto"/>
+        <w:jc w:val="both"/>
         <w:rPr>
           <w:rFonts w:ascii="Times New Roman" w:hAnsi="Times New Roman" w:cs="Times New Roman"/>
           <w:color w:val="EE0000"/>
           <w:sz w:val="24"/>
           <w:szCs w:val="24"/>
         </w:rPr>
-        <w:t xml:space="preserve">Generikus </w:t>
-      </w:r>
+      </w:pPr>
       <w:r>
         <w:rPr>
           <w:rFonts w:ascii="Times New Roman" w:hAnsi="Times New Roman" w:cs="Times New Roman"/>
@@ -1887,13 +2502,13 @@
           <w:sz w:val="24"/>
           <w:szCs w:val="24"/>
         </w:rPr>
-        <w:t>játék modellek</w:t>
+        <w:tab/>
+        <w:t>Mérési eredmények - statisztikák</w:t>
       </w:r>
     </w:p>
     <w:p>
       <w:pPr>
         <w:spacing w:line="360" w:lineRule="auto"/>
-        <w:ind w:firstLine="720"/>
         <w:jc w:val="both"/>
         <w:rPr>
           <w:rFonts w:ascii="Times New Roman" w:hAnsi="Times New Roman" w:cs="Times New Roman"/>
@@ -1909,43 +2524,43 @@
           <w:sz w:val="24"/>
           <w:szCs w:val="24"/>
         </w:rPr>
-        <w:t xml:space="preserve">Gráf alapú struktúra </w:t>
-      </w:r>
-      <w:proofErr w:type="spellStart"/>
-      <w:r>
+        <w:tab/>
+        <w:t>Milyen költsége van egy pálya generálásának</w:t>
+      </w:r>
+    </w:p>
+    <w:p>
+      <w:pPr>
+        <w:spacing w:line="360" w:lineRule="auto"/>
+        <w:jc w:val="both"/>
         <w:rPr>
           <w:rFonts w:ascii="Times New Roman" w:hAnsi="Times New Roman" w:cs="Times New Roman"/>
           <w:color w:val="EE0000"/>
           <w:sz w:val="24"/>
           <w:szCs w:val="24"/>
         </w:rPr>
-        <w:t>deffiniálása</w:t>
-      </w:r>
-      <w:proofErr w:type="spellEnd"/>
-    </w:p>
-    <w:p>
-      <w:pPr>
-        <w:spacing w:line="360" w:lineRule="auto"/>
-        <w:ind w:firstLine="720"/>
-        <w:jc w:val="both"/>
+      </w:pPr>
+      <w:r>
         <w:rPr>
           <w:rFonts w:ascii="Times New Roman" w:hAnsi="Times New Roman" w:cs="Times New Roman"/>
           <w:color w:val="EE0000"/>
           <w:sz w:val="24"/>
           <w:szCs w:val="24"/>
         </w:rPr>
-      </w:pPr>
-      <w:proofErr w:type="spellStart"/>
-      <w:r>
+        <w:tab/>
+        <w:t>Modell alternatívák, saját hardware-en való futtatás</w:t>
+      </w:r>
+    </w:p>
+    <w:p>
+      <w:pPr>
+        <w:spacing w:line="360" w:lineRule="auto"/>
+        <w:jc w:val="both"/>
         <w:rPr>
           <w:rFonts w:ascii="Times New Roman" w:hAnsi="Times New Roman" w:cs="Times New Roman"/>
           <w:color w:val="EE0000"/>
           <w:sz w:val="24"/>
           <w:szCs w:val="24"/>
         </w:rPr>
-        <w:t>Promtolás</w:t>
-      </w:r>
-      <w:proofErr w:type="spellEnd"/>
+      </w:pPr>
       <w:r>
         <w:rPr>
           <w:rFonts w:ascii="Times New Roman" w:hAnsi="Times New Roman" w:cs="Times New Roman"/>
@@ -1953,40 +2568,43 @@
           <w:sz w:val="24"/>
           <w:szCs w:val="24"/>
         </w:rPr>
-        <w:t>, kipróbált és használt modellek</w:t>
-      </w:r>
-      <w:r>
+        <w:lastRenderedPageBreak/>
+        <w:t>Frontend és felhasználói felületek</w:t>
+      </w:r>
+    </w:p>
+    <w:p>
+      <w:pPr>
+        <w:spacing w:line="360" w:lineRule="auto"/>
+        <w:ind w:firstLine="720"/>
+        <w:jc w:val="both"/>
         <w:rPr>
           <w:rFonts w:ascii="Times New Roman" w:hAnsi="Times New Roman" w:cs="Times New Roman"/>
           <w:color w:val="EE0000"/>
           <w:sz w:val="24"/>
           <w:szCs w:val="24"/>
         </w:rPr>
-        <w:t>, Prompt mint fekete mágia</w:t>
-      </w:r>
-    </w:p>
-    <w:p>
-      <w:pPr>
-        <w:spacing w:line="360" w:lineRule="auto"/>
-        <w:jc w:val="both"/>
+      </w:pPr>
+      <w:r>
         <w:rPr>
           <w:rFonts w:ascii="Times New Roman" w:hAnsi="Times New Roman" w:cs="Times New Roman"/>
           <w:color w:val="EE0000"/>
           <w:sz w:val="24"/>
           <w:szCs w:val="24"/>
         </w:rPr>
-      </w:pPr>
-      <w:r>
+        <w:t>Bejelentkezés/Regisztráció</w:t>
+      </w:r>
+    </w:p>
+    <w:p>
+      <w:pPr>
+        <w:spacing w:line="360" w:lineRule="auto"/>
+        <w:jc w:val="both"/>
         <w:rPr>
           <w:rFonts w:ascii="Times New Roman" w:hAnsi="Times New Roman" w:cs="Times New Roman"/>
           <w:color w:val="EE0000"/>
           <w:sz w:val="24"/>
           <w:szCs w:val="24"/>
         </w:rPr>
-        <w:tab/>
-        <w:t xml:space="preserve">Milyen folyamatok és miért </w:t>
-      </w:r>
-      <w:proofErr w:type="spellStart"/>
+      </w:pPr>
       <w:r>
         <w:rPr>
           <w:rFonts w:ascii="Times New Roman" w:hAnsi="Times New Roman" w:cs="Times New Roman"/>
@@ -1994,62 +2612,65 @@
           <w:sz w:val="24"/>
           <w:szCs w:val="24"/>
         </w:rPr>
-        <w:t>csatolódtak</w:t>
-      </w:r>
-      <w:proofErr w:type="spellEnd"/>
-      <w:r>
+        <w:tab/>
+        <w:t>Pálya generálás – Token rendszer</w:t>
+      </w:r>
+    </w:p>
+    <w:p>
+      <w:pPr>
+        <w:spacing w:line="360" w:lineRule="auto"/>
+        <w:jc w:val="both"/>
         <w:rPr>
           <w:rFonts w:ascii="Times New Roman" w:hAnsi="Times New Roman" w:cs="Times New Roman"/>
           <w:color w:val="EE0000"/>
           <w:sz w:val="24"/>
           <w:szCs w:val="24"/>
         </w:rPr>
-        <w:t xml:space="preserve"> rá a pálya generálásra, hint rendszer</w:t>
-      </w:r>
-    </w:p>
-    <w:p>
-      <w:pPr>
-        <w:spacing w:line="360" w:lineRule="auto"/>
-        <w:jc w:val="both"/>
+      </w:pPr>
+      <w:r>
         <w:rPr>
           <w:rFonts w:ascii="Times New Roman" w:hAnsi="Times New Roman" w:cs="Times New Roman"/>
           <w:color w:val="EE0000"/>
           <w:sz w:val="24"/>
           <w:szCs w:val="24"/>
         </w:rPr>
-      </w:pPr>
-      <w:r>
+        <w:tab/>
+        <w:t>Pályák böngészése</w:t>
+      </w:r>
+    </w:p>
+    <w:p>
+      <w:pPr>
+        <w:spacing w:line="360" w:lineRule="auto"/>
+        <w:jc w:val="both"/>
         <w:rPr>
           <w:rFonts w:ascii="Times New Roman" w:hAnsi="Times New Roman" w:cs="Times New Roman"/>
           <w:color w:val="EE0000"/>
           <w:sz w:val="24"/>
           <w:szCs w:val="24"/>
         </w:rPr>
-        <w:tab/>
-        <w:t>Milyen modelleket használtam végül</w:t>
-      </w:r>
-    </w:p>
-    <w:p>
-      <w:pPr>
-        <w:spacing w:line="360" w:lineRule="auto"/>
-        <w:jc w:val="both"/>
+      </w:pPr>
+      <w:r>
         <w:rPr>
           <w:rFonts w:ascii="Times New Roman" w:hAnsi="Times New Roman" w:cs="Times New Roman"/>
           <w:color w:val="EE0000"/>
           <w:sz w:val="24"/>
           <w:szCs w:val="24"/>
         </w:rPr>
-      </w:pPr>
-      <w:r>
+        <w:tab/>
+        <w:t>Game UI bemutatása</w:t>
+      </w:r>
+    </w:p>
+    <w:p>
+      <w:pPr>
+        <w:spacing w:line="360" w:lineRule="auto"/>
+        <w:jc w:val="both"/>
         <w:rPr>
           <w:rFonts w:ascii="Times New Roman" w:hAnsi="Times New Roman" w:cs="Times New Roman"/>
           <w:color w:val="EE0000"/>
           <w:sz w:val="24"/>
           <w:szCs w:val="24"/>
         </w:rPr>
-        <w:tab/>
-      </w:r>
-      <w:proofErr w:type="spellStart"/>
+      </w:pPr>
       <w:r>
         <w:rPr>
           <w:rFonts w:ascii="Times New Roman" w:hAnsi="Times New Roman" w:cs="Times New Roman"/>
@@ -2057,19 +2678,20 @@
           <w:sz w:val="24"/>
           <w:szCs w:val="24"/>
         </w:rPr>
-        <w:t>Sprite</w:t>
-      </w:r>
-      <w:proofErr w:type="spellEnd"/>
-      <w:r>
+        <w:t>Tovább fejlesztési lehetőségek</w:t>
+      </w:r>
+    </w:p>
+    <w:p>
+      <w:pPr>
+        <w:spacing w:line="360" w:lineRule="auto"/>
+        <w:jc w:val="both"/>
         <w:rPr>
           <w:rFonts w:ascii="Times New Roman" w:hAnsi="Times New Roman" w:cs="Times New Roman"/>
           <w:color w:val="EE0000"/>
           <w:sz w:val="24"/>
           <w:szCs w:val="24"/>
         </w:rPr>
-        <w:t xml:space="preserve"> </w:t>
-      </w:r>
-      <w:proofErr w:type="spellStart"/>
+      </w:pPr>
       <w:r>
         <w:rPr>
           <w:rFonts w:ascii="Times New Roman" w:hAnsi="Times New Roman" w:cs="Times New Roman"/>
@@ -2077,139 +2699,139 @@
           <w:sz w:val="24"/>
           <w:szCs w:val="24"/>
         </w:rPr>
-        <w:t>png</w:t>
-      </w:r>
-      <w:proofErr w:type="spellEnd"/>
-      <w:r>
+        <w:tab/>
+        <w:t>Több szoba, több logikai feladat, ezeknek jelenlegi AI json generálás korlátjai</w:t>
+      </w:r>
+    </w:p>
+    <w:p>
+      <w:pPr>
+        <w:spacing w:line="360" w:lineRule="auto"/>
+        <w:jc w:val="both"/>
         <w:rPr>
           <w:rFonts w:ascii="Times New Roman" w:hAnsi="Times New Roman" w:cs="Times New Roman"/>
           <w:color w:val="EE0000"/>
           <w:sz w:val="24"/>
           <w:szCs w:val="24"/>
         </w:rPr>
-        <w:t xml:space="preserve"> generálása amit végül a modell megoldott</w:t>
-      </w:r>
-    </w:p>
-    <w:p>
-      <w:pPr>
-        <w:spacing w:line="360" w:lineRule="auto"/>
-        <w:jc w:val="both"/>
+      </w:pPr>
+      <w:r>
         <w:rPr>
           <w:rFonts w:ascii="Times New Roman" w:hAnsi="Times New Roman" w:cs="Times New Roman"/>
           <w:color w:val="EE0000"/>
           <w:sz w:val="24"/>
           <w:szCs w:val="24"/>
         </w:rPr>
-      </w:pPr>
-      <w:r>
+        <w:tab/>
+        <w:t>Célzott feltanítás szabaduló szobákba</w:t>
+      </w:r>
+    </w:p>
+    <w:p>
+      <w:pPr>
+        <w:spacing w:line="360" w:lineRule="auto"/>
+        <w:jc w:val="both"/>
         <w:rPr>
           <w:rFonts w:ascii="Times New Roman" w:hAnsi="Times New Roman" w:cs="Times New Roman"/>
           <w:color w:val="EE0000"/>
           <w:sz w:val="24"/>
           <w:szCs w:val="24"/>
         </w:rPr>
-        <w:t>Költség elemzés</w:t>
-      </w:r>
-    </w:p>
-    <w:p>
-      <w:pPr>
-        <w:spacing w:line="360" w:lineRule="auto"/>
-        <w:jc w:val="both"/>
+      </w:pPr>
+      <w:r>
         <w:rPr>
           <w:rFonts w:ascii="Times New Roman" w:hAnsi="Times New Roman" w:cs="Times New Roman"/>
           <w:color w:val="EE0000"/>
           <w:sz w:val="24"/>
           <w:szCs w:val="24"/>
         </w:rPr>
-      </w:pPr>
-      <w:r>
+        <w:tab/>
+        <w:t>Dinamikus js generálás</w:t>
+      </w:r>
+    </w:p>
+    <w:p>
+      <w:pPr>
+        <w:spacing w:line="360" w:lineRule="auto"/>
+        <w:jc w:val="both"/>
         <w:rPr>
           <w:rFonts w:ascii="Times New Roman" w:hAnsi="Times New Roman" w:cs="Times New Roman"/>
           <w:color w:val="EE0000"/>
           <w:sz w:val="24"/>
           <w:szCs w:val="24"/>
         </w:rPr>
-        <w:tab/>
-        <w:t>Mérési eredmények - statisztikák</w:t>
-      </w:r>
-    </w:p>
-    <w:p>
-      <w:pPr>
-        <w:spacing w:line="360" w:lineRule="auto"/>
-        <w:jc w:val="both"/>
+      </w:pPr>
+      <w:r>
         <w:rPr>
           <w:rFonts w:ascii="Times New Roman" w:hAnsi="Times New Roman" w:cs="Times New Roman"/>
           <w:color w:val="EE0000"/>
           <w:sz w:val="24"/>
           <w:szCs w:val="24"/>
         </w:rPr>
-      </w:pPr>
-      <w:r>
+        <w:t>AI felhasználása</w:t>
+      </w:r>
+    </w:p>
+    <w:p>
+      <w:pPr>
+        <w:spacing w:line="360" w:lineRule="auto"/>
+        <w:jc w:val="both"/>
         <w:rPr>
           <w:rFonts w:ascii="Times New Roman" w:hAnsi="Times New Roman" w:cs="Times New Roman"/>
           <w:color w:val="EE0000"/>
           <w:sz w:val="24"/>
           <w:szCs w:val="24"/>
         </w:rPr>
-        <w:tab/>
-        <w:t>Milyen költsége van egy pálya generálásának</w:t>
-      </w:r>
-    </w:p>
-    <w:p>
-      <w:pPr>
-        <w:spacing w:line="360" w:lineRule="auto"/>
-        <w:jc w:val="both"/>
+      </w:pPr>
+      <w:r>
         <w:rPr>
           <w:rFonts w:ascii="Times New Roman" w:hAnsi="Times New Roman" w:cs="Times New Roman"/>
           <w:color w:val="EE0000"/>
           <w:sz w:val="24"/>
           <w:szCs w:val="24"/>
         </w:rPr>
-      </w:pPr>
-      <w:r>
+        <w:tab/>
+        <w:t>Copilot</w:t>
+      </w:r>
+    </w:p>
+    <w:p>
+      <w:pPr>
+        <w:spacing w:line="360" w:lineRule="auto"/>
+        <w:jc w:val="both"/>
         <w:rPr>
           <w:rFonts w:ascii="Times New Roman" w:hAnsi="Times New Roman" w:cs="Times New Roman"/>
           <w:color w:val="EE0000"/>
           <w:sz w:val="24"/>
           <w:szCs w:val="24"/>
         </w:rPr>
-        <w:tab/>
-        <w:t>Modell alternatívák, saját hardware-en való futtatás</w:t>
-      </w:r>
-    </w:p>
-    <w:p>
-      <w:pPr>
-        <w:spacing w:line="360" w:lineRule="auto"/>
-        <w:jc w:val="both"/>
+      </w:pPr>
+      <w:r>
         <w:rPr>
           <w:rFonts w:ascii="Times New Roman" w:hAnsi="Times New Roman" w:cs="Times New Roman"/>
           <w:color w:val="EE0000"/>
           <w:sz w:val="24"/>
           <w:szCs w:val="24"/>
         </w:rPr>
-      </w:pPr>
-      <w:r>
+        <w:tab/>
+        <w:t>ChatGpt/Claude</w:t>
+      </w:r>
+    </w:p>
+    <w:p>
+      <w:pPr>
+        <w:spacing w:line="360" w:lineRule="auto"/>
+        <w:jc w:val="both"/>
         <w:rPr>
           <w:rFonts w:ascii="Times New Roman" w:hAnsi="Times New Roman" w:cs="Times New Roman"/>
           <w:color w:val="EE0000"/>
           <w:sz w:val="24"/>
           <w:szCs w:val="24"/>
         </w:rPr>
-        <w:t>Frontend és felhasználói felületek</w:t>
-      </w:r>
-    </w:p>
-    <w:p>
-      <w:pPr>
-        <w:spacing w:line="360" w:lineRule="auto"/>
-        <w:ind w:firstLine="720"/>
-        <w:jc w:val="both"/>
+      </w:pPr>
+      <w:r>
         <w:rPr>
           <w:rFonts w:ascii="Times New Roman" w:hAnsi="Times New Roman" w:cs="Times New Roman"/>
           <w:color w:val="EE0000"/>
           <w:sz w:val="24"/>
           <w:szCs w:val="24"/>
         </w:rPr>
-      </w:pPr>
+        <w:tab/>
+      </w:r>
       <w:r>
         <w:rPr>
           <w:rFonts w:ascii="Times New Roman" w:hAnsi="Times New Roman" w:cs="Times New Roman"/>
@@ -2217,357 +2839,8 @@
           <w:sz w:val="24"/>
           <w:szCs w:val="24"/>
         </w:rPr>
-        <w:t>Bejelentkezés/Regisztráció</w:t>
-      </w:r>
-    </w:p>
-    <w:p>
-      <w:pPr>
-        <w:spacing w:line="360" w:lineRule="auto"/>
-        <w:jc w:val="both"/>
-        <w:rPr>
-          <w:rFonts w:ascii="Times New Roman" w:hAnsi="Times New Roman" w:cs="Times New Roman"/>
-          <w:color w:val="EE0000"/>
-          <w:sz w:val="24"/>
-          <w:szCs w:val="24"/>
-        </w:rPr>
-      </w:pPr>
-      <w:r>
-        <w:rPr>
-          <w:rFonts w:ascii="Times New Roman" w:hAnsi="Times New Roman" w:cs="Times New Roman"/>
-          <w:color w:val="EE0000"/>
-          <w:sz w:val="24"/>
-          <w:szCs w:val="24"/>
-        </w:rPr>
-        <w:lastRenderedPageBreak/>
-        <w:tab/>
-        <w:t xml:space="preserve">Pálya generálás – </w:t>
-      </w:r>
-      <w:proofErr w:type="spellStart"/>
-      <w:r>
-        <w:rPr>
-          <w:rFonts w:ascii="Times New Roman" w:hAnsi="Times New Roman" w:cs="Times New Roman"/>
-          <w:color w:val="EE0000"/>
-          <w:sz w:val="24"/>
-          <w:szCs w:val="24"/>
-        </w:rPr>
-        <w:t>Token</w:t>
-      </w:r>
-      <w:proofErr w:type="spellEnd"/>
-      <w:r>
-        <w:rPr>
-          <w:rFonts w:ascii="Times New Roman" w:hAnsi="Times New Roman" w:cs="Times New Roman"/>
-          <w:color w:val="EE0000"/>
-          <w:sz w:val="24"/>
-          <w:szCs w:val="24"/>
-        </w:rPr>
-        <w:t xml:space="preserve"> rendszer</w:t>
-      </w:r>
-    </w:p>
-    <w:p>
-      <w:pPr>
-        <w:spacing w:line="360" w:lineRule="auto"/>
-        <w:jc w:val="both"/>
-        <w:rPr>
-          <w:rFonts w:ascii="Times New Roman" w:hAnsi="Times New Roman" w:cs="Times New Roman"/>
-          <w:color w:val="EE0000"/>
-          <w:sz w:val="24"/>
-          <w:szCs w:val="24"/>
-        </w:rPr>
-      </w:pPr>
-      <w:r>
-        <w:rPr>
-          <w:rFonts w:ascii="Times New Roman" w:hAnsi="Times New Roman" w:cs="Times New Roman"/>
-          <w:color w:val="EE0000"/>
-          <w:sz w:val="24"/>
-          <w:szCs w:val="24"/>
-        </w:rPr>
-        <w:tab/>
-        <w:t>Pályák böngészése</w:t>
-      </w:r>
-    </w:p>
-    <w:p>
-      <w:pPr>
-        <w:spacing w:line="360" w:lineRule="auto"/>
-        <w:jc w:val="both"/>
-        <w:rPr>
-          <w:rFonts w:ascii="Times New Roman" w:hAnsi="Times New Roman" w:cs="Times New Roman"/>
-          <w:color w:val="EE0000"/>
-          <w:sz w:val="24"/>
-          <w:szCs w:val="24"/>
-        </w:rPr>
-      </w:pPr>
-      <w:r>
-        <w:rPr>
-          <w:rFonts w:ascii="Times New Roman" w:hAnsi="Times New Roman" w:cs="Times New Roman"/>
-          <w:color w:val="EE0000"/>
-          <w:sz w:val="24"/>
-          <w:szCs w:val="24"/>
-        </w:rPr>
-        <w:tab/>
-        <w:t>Game UI bemutatása</w:t>
-      </w:r>
-    </w:p>
-    <w:p>
-      <w:pPr>
-        <w:spacing w:line="360" w:lineRule="auto"/>
-        <w:jc w:val="both"/>
-        <w:rPr>
-          <w:rFonts w:ascii="Times New Roman" w:hAnsi="Times New Roman" w:cs="Times New Roman"/>
-          <w:color w:val="EE0000"/>
-          <w:sz w:val="24"/>
-          <w:szCs w:val="24"/>
-        </w:rPr>
-      </w:pPr>
-      <w:r>
-        <w:rPr>
-          <w:rFonts w:ascii="Times New Roman" w:hAnsi="Times New Roman" w:cs="Times New Roman"/>
-          <w:color w:val="EE0000"/>
-          <w:sz w:val="24"/>
-          <w:szCs w:val="24"/>
-        </w:rPr>
-        <w:t>Tovább fejlesztési lehetőségek</w:t>
-      </w:r>
-    </w:p>
-    <w:p>
-      <w:pPr>
-        <w:spacing w:line="360" w:lineRule="auto"/>
-        <w:jc w:val="both"/>
-        <w:rPr>
-          <w:rFonts w:ascii="Times New Roman" w:hAnsi="Times New Roman" w:cs="Times New Roman"/>
-          <w:color w:val="EE0000"/>
-          <w:sz w:val="24"/>
-          <w:szCs w:val="24"/>
-        </w:rPr>
-      </w:pPr>
-      <w:r>
-        <w:rPr>
-          <w:rFonts w:ascii="Times New Roman" w:hAnsi="Times New Roman" w:cs="Times New Roman"/>
-          <w:color w:val="EE0000"/>
-          <w:sz w:val="24"/>
-          <w:szCs w:val="24"/>
-        </w:rPr>
-        <w:tab/>
-        <w:t xml:space="preserve">Több szoba, több logikai feladat, ezeknek jelenlegi AI </w:t>
-      </w:r>
-      <w:proofErr w:type="spellStart"/>
-      <w:r>
-        <w:rPr>
-          <w:rFonts w:ascii="Times New Roman" w:hAnsi="Times New Roman" w:cs="Times New Roman"/>
-          <w:color w:val="EE0000"/>
-          <w:sz w:val="24"/>
-          <w:szCs w:val="24"/>
-        </w:rPr>
-        <w:t>json</w:t>
-      </w:r>
-      <w:proofErr w:type="spellEnd"/>
-      <w:r>
-        <w:rPr>
-          <w:rFonts w:ascii="Times New Roman" w:hAnsi="Times New Roman" w:cs="Times New Roman"/>
-          <w:color w:val="EE0000"/>
-          <w:sz w:val="24"/>
-          <w:szCs w:val="24"/>
-        </w:rPr>
-        <w:t xml:space="preserve"> generálás korlátjai</w:t>
-      </w:r>
-    </w:p>
-    <w:p>
-      <w:pPr>
-        <w:spacing w:line="360" w:lineRule="auto"/>
-        <w:jc w:val="both"/>
-        <w:rPr>
-          <w:rFonts w:ascii="Times New Roman" w:hAnsi="Times New Roman" w:cs="Times New Roman"/>
-          <w:color w:val="EE0000"/>
-          <w:sz w:val="24"/>
-          <w:szCs w:val="24"/>
-        </w:rPr>
-      </w:pPr>
-      <w:r>
-        <w:rPr>
-          <w:rFonts w:ascii="Times New Roman" w:hAnsi="Times New Roman" w:cs="Times New Roman"/>
-          <w:color w:val="EE0000"/>
-          <w:sz w:val="24"/>
-          <w:szCs w:val="24"/>
-        </w:rPr>
-        <w:tab/>
-        <w:t>Célzott feltanítás szabaduló szobákba</w:t>
-      </w:r>
-    </w:p>
-    <w:p>
-      <w:pPr>
-        <w:spacing w:line="360" w:lineRule="auto"/>
-        <w:jc w:val="both"/>
-        <w:rPr>
-          <w:rFonts w:ascii="Times New Roman" w:hAnsi="Times New Roman" w:cs="Times New Roman"/>
-          <w:color w:val="EE0000"/>
-          <w:sz w:val="24"/>
-          <w:szCs w:val="24"/>
-        </w:rPr>
-      </w:pPr>
-      <w:r>
-        <w:rPr>
-          <w:rFonts w:ascii="Times New Roman" w:hAnsi="Times New Roman" w:cs="Times New Roman"/>
-          <w:color w:val="EE0000"/>
-          <w:sz w:val="24"/>
-          <w:szCs w:val="24"/>
-        </w:rPr>
-        <w:tab/>
-        <w:t xml:space="preserve">Dinamikus </w:t>
-      </w:r>
-      <w:proofErr w:type="spellStart"/>
-      <w:r>
-        <w:rPr>
-          <w:rFonts w:ascii="Times New Roman" w:hAnsi="Times New Roman" w:cs="Times New Roman"/>
-          <w:color w:val="EE0000"/>
-          <w:sz w:val="24"/>
-          <w:szCs w:val="24"/>
-        </w:rPr>
-        <w:t>js</w:t>
-      </w:r>
-      <w:proofErr w:type="spellEnd"/>
-      <w:r>
-        <w:rPr>
-          <w:rFonts w:ascii="Times New Roman" w:hAnsi="Times New Roman" w:cs="Times New Roman"/>
-          <w:color w:val="EE0000"/>
-          <w:sz w:val="24"/>
-          <w:szCs w:val="24"/>
-        </w:rPr>
-        <w:t xml:space="preserve"> generálás</w:t>
-      </w:r>
-    </w:p>
-    <w:p>
-      <w:pPr>
-        <w:spacing w:line="360" w:lineRule="auto"/>
-        <w:jc w:val="both"/>
-        <w:rPr>
-          <w:rFonts w:ascii="Times New Roman" w:hAnsi="Times New Roman" w:cs="Times New Roman"/>
-          <w:color w:val="EE0000"/>
-          <w:sz w:val="24"/>
-          <w:szCs w:val="24"/>
-        </w:rPr>
-      </w:pPr>
-      <w:r>
-        <w:rPr>
-          <w:rFonts w:ascii="Times New Roman" w:hAnsi="Times New Roman" w:cs="Times New Roman"/>
-          <w:color w:val="EE0000"/>
-          <w:sz w:val="24"/>
-          <w:szCs w:val="24"/>
-        </w:rPr>
-        <w:t>AI felhasználása</w:t>
-      </w:r>
-    </w:p>
-    <w:p>
-      <w:pPr>
-        <w:spacing w:line="360" w:lineRule="auto"/>
-        <w:jc w:val="both"/>
-        <w:rPr>
-          <w:rFonts w:ascii="Times New Roman" w:hAnsi="Times New Roman" w:cs="Times New Roman"/>
-          <w:color w:val="EE0000"/>
-          <w:sz w:val="24"/>
-          <w:szCs w:val="24"/>
-        </w:rPr>
-      </w:pPr>
-      <w:r>
-        <w:rPr>
-          <w:rFonts w:ascii="Times New Roman" w:hAnsi="Times New Roman" w:cs="Times New Roman"/>
-          <w:color w:val="EE0000"/>
-          <w:sz w:val="24"/>
-          <w:szCs w:val="24"/>
-        </w:rPr>
-        <w:tab/>
-      </w:r>
-      <w:proofErr w:type="spellStart"/>
-      <w:r>
-        <w:rPr>
-          <w:rFonts w:ascii="Times New Roman" w:hAnsi="Times New Roman" w:cs="Times New Roman"/>
-          <w:color w:val="EE0000"/>
-          <w:sz w:val="24"/>
-          <w:szCs w:val="24"/>
-        </w:rPr>
-        <w:t>Copilot</w:t>
-      </w:r>
-      <w:proofErr w:type="spellEnd"/>
-    </w:p>
-    <w:p>
-      <w:pPr>
-        <w:spacing w:line="360" w:lineRule="auto"/>
-        <w:jc w:val="both"/>
-        <w:rPr>
-          <w:rFonts w:ascii="Times New Roman" w:hAnsi="Times New Roman" w:cs="Times New Roman"/>
-          <w:color w:val="EE0000"/>
-          <w:sz w:val="24"/>
-          <w:szCs w:val="24"/>
-        </w:rPr>
-      </w:pPr>
-      <w:r>
-        <w:rPr>
-          <w:rFonts w:ascii="Times New Roman" w:hAnsi="Times New Roman" w:cs="Times New Roman"/>
-          <w:color w:val="EE0000"/>
-          <w:sz w:val="24"/>
-          <w:szCs w:val="24"/>
-        </w:rPr>
-        <w:tab/>
-      </w:r>
-      <w:proofErr w:type="spellStart"/>
-      <w:r>
-        <w:rPr>
-          <w:rFonts w:ascii="Times New Roman" w:hAnsi="Times New Roman" w:cs="Times New Roman"/>
-          <w:color w:val="EE0000"/>
-          <w:sz w:val="24"/>
-          <w:szCs w:val="24"/>
-        </w:rPr>
-        <w:t>ChatGpt</w:t>
-      </w:r>
-      <w:proofErr w:type="spellEnd"/>
-      <w:r>
-        <w:rPr>
-          <w:rFonts w:ascii="Times New Roman" w:hAnsi="Times New Roman" w:cs="Times New Roman"/>
-          <w:color w:val="EE0000"/>
-          <w:sz w:val="24"/>
-          <w:szCs w:val="24"/>
-        </w:rPr>
-        <w:t>/Claude</w:t>
-      </w:r>
-    </w:p>
-    <w:p>
-      <w:pPr>
-        <w:spacing w:line="360" w:lineRule="auto"/>
-        <w:jc w:val="both"/>
-        <w:rPr>
-          <w:rFonts w:ascii="Times New Roman" w:hAnsi="Times New Roman" w:cs="Times New Roman"/>
-          <w:color w:val="EE0000"/>
-          <w:sz w:val="24"/>
-          <w:szCs w:val="24"/>
-        </w:rPr>
-      </w:pPr>
-      <w:r>
-        <w:rPr>
-          <w:rFonts w:ascii="Times New Roman" w:hAnsi="Times New Roman" w:cs="Times New Roman"/>
-          <w:color w:val="EE0000"/>
-          <w:sz w:val="24"/>
-          <w:szCs w:val="24"/>
-        </w:rPr>
-        <w:tab/>
-      </w:r>
-      <w:r>
-        <w:rPr>
-          <w:rFonts w:ascii="Times New Roman" w:hAnsi="Times New Roman" w:cs="Times New Roman"/>
-          <w:color w:val="EE0000"/>
-          <w:sz w:val="24"/>
-          <w:szCs w:val="24"/>
-        </w:rPr>
-        <w:t xml:space="preserve">AI szerepe a fejlesztési folyamatban és annak </w:t>
-      </w:r>
-      <w:proofErr w:type="spellStart"/>
-      <w:r>
-        <w:rPr>
-          <w:rFonts w:ascii="Times New Roman" w:hAnsi="Times New Roman" w:cs="Times New Roman"/>
-          <w:color w:val="EE0000"/>
-          <w:sz w:val="24"/>
-          <w:szCs w:val="24"/>
-        </w:rPr>
-        <w:t>korlátai</w:t>
-      </w:r>
-      <w:proofErr w:type="spellEnd"/>
+        <w:t>AI szerepe a fejlesztési folyamatban és annak korlátai</w:t>
+      </w:r>
     </w:p>
     <w:p>
       <w:pPr>
@@ -2660,7 +2933,7 @@
           <w:i/>
         </w:rPr>
       </w:pPr>
-      <w:bookmarkStart w:id="2" w:name="_Toc225185485"/>
+      <w:bookmarkStart w:id="2" w:name="_Toc225492653"/>
       <w:r>
         <w:lastRenderedPageBreak/>
         <w:t>Technológiák</w:t>
@@ -2679,16 +2952,11 @@
       <w:pPr>
         <w:pStyle w:val="Szakdolgozath2"/>
       </w:pPr>
-      <w:bookmarkStart w:id="3" w:name="_Toc225185486"/>
-      <w:r>
-        <w:t xml:space="preserve">Docker és </w:t>
-      </w:r>
-      <w:proofErr w:type="spellStart"/>
-      <w:r>
-        <w:t>konténerizáció</w:t>
+      <w:bookmarkStart w:id="3" w:name="_Toc225492654"/>
+      <w:r>
+        <w:t>Docker és konténerizáció</w:t>
       </w:r>
       <w:bookmarkEnd w:id="3"/>
-      <w:proofErr w:type="spellEnd"/>
     </w:p>
     <w:p>
       <w:pPr>
@@ -2698,23 +2966,10 @@
         <w:t>A</w:t>
       </w:r>
       <w:r>
-        <w:t xml:space="preserve">z </w:t>
-      </w:r>
-      <w:proofErr w:type="spellStart"/>
-      <w:r>
-        <w:t>alkalmazés</w:t>
-      </w:r>
-      <w:proofErr w:type="spellEnd"/>
-      <w:r>
-        <w:t xml:space="preserve"> fejlesztése </w:t>
-      </w:r>
-      <w:proofErr w:type="spellStart"/>
-      <w:r>
-        <w:t>konténerizált</w:t>
-      </w:r>
-      <w:proofErr w:type="spellEnd"/>
-      <w:r>
-        <w:t xml:space="preserve"> környezetben történik Docker</w:t>
+        <w:t xml:space="preserve">z alkalmazés fejlesztése </w:t>
+      </w:r>
+      <w:r>
+        <w:t>konténerizált környezetben történik Docker</w:t>
       </w:r>
       <w:sdt>
         <w:sdtPr>
@@ -2761,13 +3016,8 @@
         <w:t xml:space="preserve"> de együttesen is elindíthatóak</w:t>
       </w:r>
       <w:r>
-        <w:t xml:space="preserve">. A Docker </w:t>
-      </w:r>
-      <w:proofErr w:type="spellStart"/>
-      <w:r>
-        <w:t>Compose</w:t>
-      </w:r>
-      <w:proofErr w:type="spellEnd"/>
+        <w:t>. A Docker Compose</w:t>
+      </w:r>
       <w:sdt>
         <w:sdtPr>
           <w:id w:val="1576857532"/>
@@ -2804,15 +3054,7 @@
         <w:t xml:space="preserve"> használata lehetővé teszi, hogy a teljes fejlesztői környezet egységesen és reprodukálható módon legyen felépíthető</w:t>
       </w:r>
       <w:r>
-        <w:t xml:space="preserve">, így szimulálva </w:t>
-      </w:r>
-      <w:proofErr w:type="spellStart"/>
-      <w:r>
-        <w:t>production</w:t>
-      </w:r>
-      <w:proofErr w:type="spellEnd"/>
-      <w:r>
-        <w:t xml:space="preserve"> szerver környezetet</w:t>
+        <w:t>, így szimulálva production szerver környezetet</w:t>
       </w:r>
       <w:r>
         <w:t>.</w:t>
@@ -2822,7 +3064,7 @@
       <w:pPr>
         <w:pStyle w:val="Szakdolgozath2"/>
       </w:pPr>
-      <w:bookmarkStart w:id="4" w:name="_Toc225185487"/>
+      <w:bookmarkStart w:id="4" w:name="_Toc225492655"/>
       <w:r>
         <w:t>Frontend technológiák</w:t>
       </w:r>
@@ -2840,24 +3082,17 @@
       <w:pPr>
         <w:pStyle w:val="Szakdolgozath3"/>
       </w:pPr>
-      <w:proofErr w:type="spellStart"/>
       <w:r>
         <w:t>TypeScript</w:t>
       </w:r>
-      <w:proofErr w:type="spellEnd"/>
     </w:p>
     <w:p>
       <w:pPr>
         <w:pStyle w:val="Szakdolgozatbekezds"/>
       </w:pPr>
       <w:r>
-        <w:t xml:space="preserve">A frontend fejlesztése </w:t>
-      </w:r>
-      <w:proofErr w:type="spellStart"/>
-      <w:r>
-        <w:t>TypeScript</w:t>
-      </w:r>
-      <w:proofErr w:type="spellEnd"/>
+        <w:t>A frontend fejlesztése TypeScript</w:t>
+      </w:r>
       <w:sdt>
         <w:sdtPr>
           <w:id w:val="-892112070"/>
@@ -2891,15 +3126,7 @@
         </w:sdtContent>
       </w:sdt>
       <w:r>
-        <w:t xml:space="preserve"> nyelven történt. A </w:t>
-      </w:r>
-      <w:proofErr w:type="spellStart"/>
-      <w:r>
-        <w:t>TypeScript</w:t>
-      </w:r>
-      <w:proofErr w:type="spellEnd"/>
-      <w:r>
-        <w:t xml:space="preserve"> használata lehetővé teszi a statikus típusellenőrzést, amely csökkenti a fejlesztés során előforduló hibák számát, </w:t>
+        <w:t xml:space="preserve"> nyelven történt. A TypeScript használata lehetővé teszi a statikus típusellenőrzést, amely csökkenti a fejlesztés során előforduló hibák számát, </w:t>
       </w:r>
       <w:r>
         <w:t xml:space="preserve">emellett </w:t>
@@ -2908,29 +3135,13 @@
         <w:t xml:space="preserve"> javítja a kód karbantarthatóságát és átláthatóságát</w:t>
       </w:r>
       <w:r>
-        <w:t xml:space="preserve"> a </w:t>
-      </w:r>
-      <w:proofErr w:type="spellStart"/>
-      <w:r>
-        <w:t>vanilla</w:t>
-      </w:r>
-      <w:proofErr w:type="spellEnd"/>
-      <w:r>
-        <w:t xml:space="preserve"> </w:t>
-      </w:r>
-      <w:proofErr w:type="spellStart"/>
-      <w:r>
-        <w:t>j</w:t>
+        <w:t xml:space="preserve"> a vanilla j</w:t>
       </w:r>
       <w:r>
         <w:t>a</w:t>
       </w:r>
       <w:r>
-        <w:t>vascripttel</w:t>
-      </w:r>
-      <w:proofErr w:type="spellEnd"/>
-      <w:r>
-        <w:t xml:space="preserve"> szemben</w:t>
+        <w:t>vascripttel szemben</w:t>
       </w:r>
       <w:r>
         <w:t>.</w:t>
@@ -2940,11 +3151,9 @@
       <w:pPr>
         <w:pStyle w:val="Szakdolgozath3"/>
       </w:pPr>
-      <w:proofErr w:type="spellStart"/>
       <w:r>
         <w:t>React</w:t>
       </w:r>
-      <w:proofErr w:type="spellEnd"/>
     </w:p>
     <w:p>
       <w:pPr>
@@ -2957,13 +3166,8 @@
         <w:t xml:space="preserve"> webes kliens oldal</w:t>
       </w:r>
       <w:r>
-        <w:t xml:space="preserve"> kialakítása </w:t>
-      </w:r>
-      <w:proofErr w:type="spellStart"/>
-      <w:r>
-        <w:t>React</w:t>
-      </w:r>
-      <w:proofErr w:type="spellEnd"/>
+        <w:t xml:space="preserve"> kialakítása React</w:t>
+      </w:r>
       <w:sdt>
         <w:sdtPr>
           <w:id w:val="1000310456"/>
@@ -3003,15 +3207,7 @@
         <w:t>, amelyet eredetileg a Facebook, ma</w:t>
       </w:r>
       <w:r>
-        <w:t xml:space="preserve">i nevén </w:t>
-      </w:r>
-      <w:proofErr w:type="spellStart"/>
-      <w:r>
-        <w:t>Meta</w:t>
-      </w:r>
-      <w:proofErr w:type="spellEnd"/>
-      <w:r>
-        <w:t xml:space="preserve"> fejlesztett</w:t>
+        <w:t>i nevén Meta fejlesztett</w:t>
       </w:r>
       <w:r>
         <w:t xml:space="preserve">. </w:t>
@@ -3039,13 +3235,8 @@
         <w:t xml:space="preserve">. </w:t>
       </w:r>
       <w:r>
-        <w:t xml:space="preserve">Alternatív megoldásként szóba jöhetett volna például az </w:t>
-      </w:r>
-      <w:proofErr w:type="spellStart"/>
-      <w:r>
-        <w:t>Angular</w:t>
-      </w:r>
-      <w:proofErr w:type="spellEnd"/>
+        <w:t>Alternatív megoldásként szóba jöhetett volna például az Angular</w:t>
+      </w:r>
       <w:sdt>
         <w:sdtPr>
           <w:id w:val="558358392"/>
@@ -3124,11 +3315,9 @@
       <w:pPr>
         <w:pStyle w:val="Szakdolgozath3"/>
       </w:pPr>
-      <w:proofErr w:type="spellStart"/>
       <w:r>
         <w:t>PixiJS</w:t>
       </w:r>
-      <w:proofErr w:type="spellEnd"/>
     </w:p>
     <w:p>
       <w:pPr>
@@ -3138,13 +3327,8 @@
         </w:rPr>
       </w:pPr>
       <w:r>
-        <w:t xml:space="preserve">A játéktér megjelenítéséhez a </w:t>
-      </w:r>
-      <w:proofErr w:type="spellStart"/>
-      <w:r>
-        <w:t>PixiJS</w:t>
-      </w:r>
-      <w:proofErr w:type="spellEnd"/>
+        <w:t>A játéktér megjelenítéséhez a PixiJS</w:t>
+      </w:r>
       <w:sdt>
         <w:sdtPr>
           <w:id w:val="223420300"/>
@@ -3178,39 +3362,7 @@
         </w:sdtContent>
       </w:sdt>
       <w:r>
-        <w:t xml:space="preserve"> grafikai könyvtár került felhasználásra. A </w:t>
-      </w:r>
-      <w:proofErr w:type="spellStart"/>
-      <w:r>
-        <w:t>PixiJS</w:t>
-      </w:r>
-      <w:proofErr w:type="spellEnd"/>
-      <w:r>
-        <w:t xml:space="preserve"> böngészőben futó, elsősorban HTML5 </w:t>
-      </w:r>
-      <w:proofErr w:type="spellStart"/>
-      <w:r>
-        <w:t>Canvas</w:t>
-      </w:r>
-      <w:proofErr w:type="spellEnd"/>
-      <w:r>
-        <w:t xml:space="preserve"> és </w:t>
-      </w:r>
-      <w:proofErr w:type="spellStart"/>
-      <w:r>
-        <w:t>WebGL</w:t>
-      </w:r>
-      <w:proofErr w:type="spellEnd"/>
-      <w:r>
-        <w:t xml:space="preserve"> alapú 2D </w:t>
-      </w:r>
-      <w:proofErr w:type="spellStart"/>
-      <w:r>
-        <w:t>renderelést</w:t>
-      </w:r>
-      <w:proofErr w:type="spellEnd"/>
-      <w:r>
-        <w:t xml:space="preserve"> biztosító technológia, amely alkalmas játékobjektumok, helyszínek és interaktív elemek dinamikus megjelenítésére és kezelésére.</w:t>
+        <w:t xml:space="preserve"> grafikai könyvtár került felhasználásra. A PixiJS böngészőben futó, elsősorban HTML5 Canvas és WebGL alapú 2D renderelést biztosító technológia, amely alkalmas játékobjektumok, helyszínek és interaktív elemek dinamikus megjelenítésére és kezelésére.</w:t>
       </w:r>
     </w:p>
     <w:p>
@@ -3277,7 +3429,7 @@
       <w:pPr>
         <w:pStyle w:val="Szakdolgozath2"/>
       </w:pPr>
-      <w:bookmarkStart w:id="5" w:name="_Toc225185488"/>
+      <w:bookmarkStart w:id="5" w:name="_Toc225492656"/>
       <w:r>
         <w:t>Backend technológiák</w:t>
       </w:r>
@@ -3288,15 +3440,7 @@
         <w:pStyle w:val="Szakdolgozatbekezds"/>
       </w:pPr>
       <w:r>
-        <w:t xml:space="preserve">A szerveroldali logika, az üzleti folyamatok kezelése, az AI integráció, valamint az adatbázis-műveletek a backend rétegben valósulnak meg. A backend fejlesztése során a gyors fejlesztést, a jó </w:t>
-      </w:r>
-      <w:proofErr w:type="spellStart"/>
-      <w:r>
-        <w:t>strukturálhatóságot</w:t>
-      </w:r>
-      <w:proofErr w:type="spellEnd"/>
-      <w:r>
-        <w:t xml:space="preserve"> és az API-központú működést támogató technológiák kerültek kiválasztásra.</w:t>
+        <w:t>A szerveroldali logika, az üzleti folyamatok kezelése, az AI integráció, valamint az adatbázis-műveletek a backend rétegben valósulnak meg. A backend fejlesztése során a gyors fejlesztést, a jó strukturálhatóságot és az API-központú működést támogató technológiák kerültek kiválasztásra.</w:t>
       </w:r>
     </w:p>
     <w:p>
@@ -3350,13 +3494,8 @@
         <w:t xml:space="preserve"> nyelven készült. A Python előnye, hogy jól használható webes szolgáltatások, adatkezelési logikák és mesterséges intelligenciához kapcsolódó integrációk megvalósítására.</w:t>
       </w:r>
       <w:r>
-        <w:t xml:space="preserve"> Projekt elején tervben voltak kép transzformációs feladatok is, ezek valósultak volna meg az </w:t>
-      </w:r>
-      <w:proofErr w:type="spellStart"/>
-      <w:r>
-        <w:t>OpenCV</w:t>
-      </w:r>
-      <w:proofErr w:type="spellEnd"/>
+        <w:t xml:space="preserve"> Projekt elején tervben voltak kép transzformációs feladatok is, ezek valósultak volna meg az OpenCV</w:t>
+      </w:r>
       <w:sdt>
         <w:sdtPr>
           <w:id w:val="-1397195207"/>
@@ -3397,40 +3536,17 @@
       <w:pPr>
         <w:pStyle w:val="Szakdolgozath3"/>
       </w:pPr>
-      <w:proofErr w:type="spellStart"/>
-      <w:r>
-        <w:t>FastAPI</w:t>
-      </w:r>
-      <w:proofErr w:type="spellEnd"/>
-      <w:r>
-        <w:t xml:space="preserve"> és </w:t>
-      </w:r>
-      <w:proofErr w:type="spellStart"/>
-      <w:r>
-        <w:t>OpenAPI</w:t>
-      </w:r>
-      <w:proofErr w:type="spellEnd"/>
+      <w:r>
+        <w:t>FastAPI és OpenAPI</w:t>
+      </w:r>
     </w:p>
     <w:p>
       <w:pPr>
         <w:pStyle w:val="Szakdolgozatbekezds"/>
       </w:pPr>
       <w:r>
-        <w:t xml:space="preserve">A backend A </w:t>
-      </w:r>
-      <w:proofErr w:type="spellStart"/>
-      <w:r>
-        <w:t>a</w:t>
-      </w:r>
-      <w:proofErr w:type="spellEnd"/>
-      <w:r>
-        <w:t xml:space="preserve"> </w:t>
-      </w:r>
-      <w:proofErr w:type="spellStart"/>
-      <w:r>
-        <w:t>FastAPI</w:t>
-      </w:r>
-      <w:proofErr w:type="spellEnd"/>
+        <w:t>A backend A a FastAPI</w:t>
+      </w:r>
       <w:sdt>
         <w:sdtPr>
           <w:id w:val="-1088236458"/>
@@ -3464,23 +3580,7 @@
         </w:sdtContent>
       </w:sdt>
       <w:r>
-        <w:t xml:space="preserve"> keretrendszerre épül. A </w:t>
-      </w:r>
-      <w:proofErr w:type="spellStart"/>
-      <w:r>
-        <w:t>FastAPI</w:t>
-      </w:r>
-      <w:proofErr w:type="spellEnd"/>
-      <w:r>
-        <w:t xml:space="preserve"> modern, nagy teljesítményű megoldást nyújt REST alapú szolgáltatások fejlesztésére, és automatikusan képes </w:t>
-      </w:r>
-      <w:proofErr w:type="spellStart"/>
-      <w:r>
-        <w:t>OpenAPI</w:t>
-      </w:r>
-      <w:proofErr w:type="spellEnd"/>
-      <w:r>
-        <w:t xml:space="preserve"> </w:t>
+        <w:t xml:space="preserve"> keretrendszerre épül. A FastAPI modern, nagy teljesítményű megoldást nyújt REST alapú szolgáltatások fejlesztésére, és automatikusan képes OpenAPI </w:t>
       </w:r>
       <w:sdt>
         <w:sdtPr>
@@ -3513,47 +3613,24 @@
       </w:r>
       <w:r>
         <w:lastRenderedPageBreak/>
-        <w:t xml:space="preserve">megkönnyíti az API dokumentálását és az interfészek áttekinthetőségét. A választás azért esett erre a keretrendszerre, mert a </w:t>
-      </w:r>
-      <w:proofErr w:type="spellStart"/>
-      <w:r>
-        <w:t>Flaskkal</w:t>
-      </w:r>
-      <w:proofErr w:type="spellEnd"/>
-      <w:r>
-        <w:t xml:space="preserve"> szemben erősebben épít a típusosságra, ami biztonságosabb és átláthatóbb API-fejlesztést tesz lehetővé.</w:t>
+        <w:t>megkönnyíti az API dokumentálását és az interfészek áttekinthetőségét. A választás azért esett erre a keretrendszerre, mert a Flaskkal szemben erősebben épít a típusosságra, ami biztonságosabb és átláthatóbb API-fejlesztést tesz lehetővé.</w:t>
       </w:r>
     </w:p>
     <w:p>
       <w:pPr>
         <w:pStyle w:val="Szakdolgozath3"/>
       </w:pPr>
-      <w:proofErr w:type="spellStart"/>
-      <w:r>
-        <w:t>SQLAlchemy</w:t>
-      </w:r>
-      <w:proofErr w:type="spellEnd"/>
-      <w:r>
-        <w:t xml:space="preserve"> és </w:t>
-      </w:r>
-      <w:proofErr w:type="spellStart"/>
-      <w:r>
-        <w:t>Alembic</w:t>
-      </w:r>
-      <w:proofErr w:type="spellEnd"/>
+      <w:r>
+        <w:t>SQLAlchemy és Alembic</w:t>
+      </w:r>
     </w:p>
     <w:p>
       <w:pPr>
         <w:pStyle w:val="Szakdolgozatbekezds"/>
       </w:pPr>
       <w:r>
-        <w:t xml:space="preserve">Az adatbázisréteg kezelésére a </w:t>
-      </w:r>
-      <w:proofErr w:type="spellStart"/>
-      <w:r>
-        <w:t>SQLAlchemy</w:t>
-      </w:r>
-      <w:proofErr w:type="spellEnd"/>
+        <w:t>Az adatbázisréteg kezelésére a SQLAlchemy</w:t>
+      </w:r>
       <w:sdt>
         <w:sdtPr>
           <w:id w:val="367569242"/>
@@ -3587,23 +3664,7 @@
         </w:sdtContent>
       </w:sdt>
       <w:r>
-        <w:t xml:space="preserve"> ORM (</w:t>
-      </w:r>
-      <w:proofErr w:type="spellStart"/>
-      <w:r>
-        <w:t>Object-Relational</w:t>
-      </w:r>
-      <w:proofErr w:type="spellEnd"/>
-      <w:r>
-        <w:t xml:space="preserve"> </w:t>
-      </w:r>
-      <w:proofErr w:type="spellStart"/>
-      <w:r>
-        <w:t>Mapping</w:t>
-      </w:r>
-      <w:proofErr w:type="spellEnd"/>
-      <w:r>
-        <w:t>) került alkalmazásra, amely lehetővé teszi a relációs adatmodell objektumorientált kezelését. Ennek köszönhetően az adatbázissal való kommunikáció során nem minden esetben szükséges alacsony szintű SQL utasítások közvetlen írása, mivel az adatszerkezetek Python objektumokon keresztül is kezelhetők. Ez átláthatóbbá és karbantarthatóbbá teszi a backend oldali adatkezelési logikát.</w:t>
+        <w:t xml:space="preserve"> ORM (Object-Relational Mapping) került alkalmazásra, amely lehetővé teszi a relációs adatmodell objektumorientált kezelését. Ennek köszönhetően az adatbázissal való kommunikáció során nem minden esetben szükséges alacsony szintű SQL utasítások közvetlen írása, mivel az adatszerkezetek Python objektumokon keresztül is kezelhetők. Ez átláthatóbbá és karbantarthatóbbá teszi a backend oldali adatkezelési logikát.</w:t>
       </w:r>
     </w:p>
     <w:p>
@@ -3611,21 +3672,8 @@
         <w:pStyle w:val="Szakdolgozatbekezds"/>
       </w:pPr>
       <w:r>
-        <w:t xml:space="preserve">Az adatbázisséma változásainak nyomon követésére és a migrációk kezelésére az </w:t>
-      </w:r>
-      <w:proofErr w:type="spellStart"/>
-      <w:r>
-        <w:t>Alembic</w:t>
-      </w:r>
-      <w:proofErr w:type="spellEnd"/>
-      <w:r>
-        <w:t xml:space="preserve"> került felhasználásra. Az </w:t>
-      </w:r>
-      <w:proofErr w:type="spellStart"/>
-      <w:r>
-        <w:t>Alembic</w:t>
-      </w:r>
-      <w:proofErr w:type="spellEnd"/>
+        <w:t>Az adatbázisséma változásainak nyomon követésére és a migrációk kezelésére az Alembic került felhasználásra. Az Alembic</w:t>
+      </w:r>
       <w:sdt>
         <w:sdtPr>
           <w:id w:val="1603687888"/>
@@ -3664,57 +3712,9 @@
     </w:p>
     <w:p>
       <w:pPr>
-        <w:pStyle w:val="Szakdolgozath3"/>
-      </w:pPr>
-      <w:r>
-        <w:t xml:space="preserve">JWT alapú </w:t>
-      </w:r>
-      <w:proofErr w:type="spellStart"/>
-      <w:r>
-        <w:t>autentikáció</w:t>
-      </w:r>
-      <w:proofErr w:type="spellEnd"/>
-      <w:r>
-        <w:t xml:space="preserve"> TODO Ez ne itt legyen hanem a </w:t>
-      </w:r>
-      <w:proofErr w:type="spellStart"/>
-      <w:r>
-        <w:t>jwt</w:t>
-      </w:r>
-      <w:proofErr w:type="spellEnd"/>
-      <w:r>
-        <w:t xml:space="preserve"> releváns résznél</w:t>
-      </w:r>
-    </w:p>
-    <w:p>
-      <w:pPr>
-        <w:pStyle w:val="Szakdolgozatbekezds"/>
-      </w:pPr>
-      <w:r>
-        <w:t xml:space="preserve">A felhasználók hitelesítése JSON Web </w:t>
-      </w:r>
-      <w:proofErr w:type="spellStart"/>
-      <w:r>
-        <w:t>Token</w:t>
-      </w:r>
-      <w:proofErr w:type="spellEnd"/>
-      <w:r>
-        <w:t xml:space="preserve"> (JWT) alapú megoldással történik, amely RS256 algoritmust alkalmazó, nyilvános és privát kulcspáron alapuló aláírással került megvalósításra. Ez biztosítja, hogy a kliensoldali alkalmazás a bejelentkezést követően biztonságos módon férjen hozzá a védett erőforrásokhoz, miközben a szerver ellenőrizni tudja a </w:t>
-      </w:r>
-      <w:proofErr w:type="spellStart"/>
-      <w:r>
-        <w:t>tokenek</w:t>
-      </w:r>
-      <w:proofErr w:type="spellEnd"/>
-      <w:r>
-        <w:t xml:space="preserve"> hitelességét és érvényességét.</w:t>
-      </w:r>
-    </w:p>
-    <w:p>
-      <w:pPr>
         <w:pStyle w:val="Szakdolgozath2"/>
       </w:pPr>
-      <w:bookmarkStart w:id="6" w:name="_Toc225185489"/>
+      <w:bookmarkStart w:id="6" w:name="_Toc225492657"/>
       <w:r>
         <w:t>Valós idejű kommunikáció</w:t>
       </w:r>
@@ -3776,63 +3776,37 @@
         </w:sdtContent>
       </w:sdt>
       <w:r>
-        <w:t xml:space="preserve"> környezetben fut. A Node.js egy JavaScript futtatókörnyezet, amelyet a Chrome V8 motorjára építettek, és amely különösen jól </w:t>
-      </w:r>
+        <w:t xml:space="preserve"> környezetben fut. A Node.js egy JavaScript futtatókörnyezet, amelyet a Chrome V8 motorjára építettek, és amely különösen jól használható hálózati</w:t>
+      </w:r>
+      <w:r>
+        <w:t xml:space="preserve"> és</w:t>
+      </w:r>
+      <w:r>
+        <w:t xml:space="preserve"> eseményvezérelt alkalmazások fejlesztésére. Működésének egyik legfontosabb jellemzője a nem blokkoló I/O-kezelés, amely lehetővé teszi, hogy a szerver egyszerre több klienskapcsolatot is hatékonyan kezeljen anélkül, hogy minden kérés külön végrehajtási szálat igényelne.</w:t>
+      </w:r>
+    </w:p>
+    <w:p>
+      <w:pPr>
+        <w:pStyle w:val="Szakdolgozath3"/>
+      </w:pPr>
+      <w:r>
+        <w:t>Express</w:t>
+      </w:r>
+      <w:r>
+        <w:t>Js</w:t>
+      </w:r>
+    </w:p>
+    <w:p>
+      <w:pPr>
+        <w:pStyle w:val="Szakdolgozatbekezds"/>
+      </w:pPr>
       <w:r>
         <w:lastRenderedPageBreak/>
-        <w:t>használható hálózati</w:t>
-      </w:r>
-      <w:r>
-        <w:t xml:space="preserve"> és</w:t>
-      </w:r>
-      <w:r>
-        <w:t xml:space="preserve"> </w:t>
-      </w:r>
-      <w:proofErr w:type="spellStart"/>
-      <w:r>
-        <w:t>eseményvezérelt</w:t>
-      </w:r>
-      <w:proofErr w:type="spellEnd"/>
-      <w:r>
-        <w:t xml:space="preserve"> alkalmazások fejlesztésére. Működésének egyik legfontosabb jellemzője a nem blokkoló I/O-kezelés, amely lehetővé teszi, hogy a szerver egyszerre több klienskapcsolatot is hatékonyan kezeljen anélkül, hogy minden kérés külön végrehajtási szálat igényelne.</w:t>
-      </w:r>
-    </w:p>
-    <w:p>
-      <w:pPr>
-        <w:pStyle w:val="Szakdolgozath3"/>
-      </w:pPr>
-      <w:proofErr w:type="spellStart"/>
-      <w:r>
-        <w:t>Express</w:t>
+        <w:t>A websocket szerver HTTP végpontjainak és alapvető kiszolgálási logikájának megvalósítására az Express keretrendszer került felhasználásra. Az Express</w:t>
       </w:r>
       <w:r>
         <w:t>Js</w:t>
       </w:r>
-      <w:proofErr w:type="spellEnd"/>
-    </w:p>
-    <w:p>
-      <w:pPr>
-        <w:pStyle w:val="Szakdolgozatbekezds"/>
-      </w:pPr>
-      <w:r>
-        <w:t xml:space="preserve">A </w:t>
-      </w:r>
-      <w:proofErr w:type="spellStart"/>
-      <w:r>
-        <w:t>websocket</w:t>
-      </w:r>
-      <w:proofErr w:type="spellEnd"/>
-      <w:r>
-        <w:t xml:space="preserve"> szerver HTTP végpontjainak és alapvető kiszolgálási logikájának megvalósítására az Express keretrendszer került felhasználásra. Az </w:t>
-      </w:r>
-      <w:proofErr w:type="spellStart"/>
-      <w:r>
-        <w:t>Express</w:t>
-      </w:r>
-      <w:r>
-        <w:t>Js</w:t>
-      </w:r>
-      <w:proofErr w:type="spellEnd"/>
       <w:sdt>
         <w:sdtPr>
           <w:id w:val="725874965"/>
@@ -3924,7 +3898,7 @@
       <w:pPr>
         <w:pStyle w:val="Szakdolgozath2"/>
       </w:pPr>
-      <w:bookmarkStart w:id="7" w:name="_Toc225185490"/>
+      <w:bookmarkStart w:id="7" w:name="_Toc225492658"/>
       <w:r>
         <w:t>Adatkezelés és tárolás</w:t>
       </w:r>
@@ -3942,24 +3916,17 @@
       <w:pPr>
         <w:pStyle w:val="Szakdolgozath3"/>
       </w:pPr>
-      <w:proofErr w:type="spellStart"/>
       <w:r>
         <w:t>PostgreSQL</w:t>
       </w:r>
-      <w:proofErr w:type="spellEnd"/>
     </w:p>
     <w:p>
       <w:pPr>
         <w:pStyle w:val="Szakdolgozatbekezds"/>
       </w:pPr>
       <w:r>
-        <w:t xml:space="preserve">A strukturált adatok tárolására </w:t>
-      </w:r>
-      <w:proofErr w:type="spellStart"/>
-      <w:r>
-        <w:t>PostgreSQL</w:t>
-      </w:r>
-      <w:proofErr w:type="spellEnd"/>
+        <w:t>A strukturált adatok tárolására PostgreSQL</w:t>
+      </w:r>
       <w:sdt>
         <w:sdtPr>
           <w:id w:val="1681394402"/>
@@ -3993,39 +3960,24 @@
         </w:sdtContent>
       </w:sdt>
       <w:r>
-        <w:t xml:space="preserve"> adatbázis-kezelő rendszer szolgál. Ebben kerülnek eltárolásra például a felhasználói adatok, a </w:t>
-      </w:r>
-      <w:proofErr w:type="spellStart"/>
-      <w:r>
-        <w:t>tokenekhez</w:t>
-      </w:r>
-      <w:proofErr w:type="spellEnd"/>
-      <w:r>
-        <w:t xml:space="preserve"> kapcsolódó információk, valamint a pályákhoz tartozó metaadatok és statisztikák.</w:t>
+        <w:t xml:space="preserve"> adatbázis-kezelő rendszer szolgál. Ebben kerülnek eltárolásra például a felhasználói adatok, a tokenekhez kapcsolódó információk, valamint a pályákhoz tartozó metaadatok és statisztikák.</w:t>
       </w:r>
     </w:p>
     <w:p>
       <w:pPr>
         <w:pStyle w:val="Szakdolgozath3"/>
       </w:pPr>
-      <w:proofErr w:type="spellStart"/>
       <w:r>
         <w:t>MinIO</w:t>
       </w:r>
-      <w:proofErr w:type="spellEnd"/>
     </w:p>
     <w:p>
       <w:pPr>
         <w:pStyle w:val="Szakdolgozatbekezds"/>
       </w:pPr>
       <w:r>
-        <w:t xml:space="preserve">A generált fájlok, például a pályákhoz tartozó JSON állományok és képi erőforrások tárolására </w:t>
-      </w:r>
-      <w:proofErr w:type="spellStart"/>
-      <w:r>
-        <w:t>MinIO</w:t>
-      </w:r>
-      <w:proofErr w:type="spellEnd"/>
+        <w:t>A generált fájlok, például a pályákhoz tartozó JSON állományok és képi erőforrások tárolására MinIO</w:t>
+      </w:r>
       <w:sdt>
         <w:sdtPr>
           <w:id w:val="-1181898533"/>
@@ -4059,71 +4011,42 @@
         </w:sdtContent>
       </w:sdt>
       <w:r>
-        <w:t xml:space="preserve"> objektumtároló került alkalmazásra. A </w:t>
-      </w:r>
-      <w:proofErr w:type="spellStart"/>
-      <w:r>
-        <w:t>MinIO</w:t>
-      </w:r>
-      <w:proofErr w:type="spellEnd"/>
-      <w:r>
-        <w:t xml:space="preserve"> egy S3-kompatibilis objektumtárolási megoldás, amely működésében az Amazon Web </w:t>
-      </w:r>
-      <w:proofErr w:type="spellStart"/>
-      <w:r>
-        <w:t>Services</w:t>
-      </w:r>
-      <w:proofErr w:type="spellEnd"/>
-      <w:r>
-        <w:t xml:space="preserve"> társzolgáltatásaihoz hasonló módon használható. Ez lehetővé teszi, hogy a fájlok kezelése elkülönüljön a relációs adatbázistól, így a strukturált adatok és a bináris állományok tárolása külön rétegben valósulhat meg.</w:t>
+        <w:t xml:space="preserve"> objektumtároló került alkalmazásra. A MinIO egy S3-kompatibilis objektumtárolási megoldás, amely működésében az Amazon Web Services társzolgáltatásaihoz hasonló módon használható. Ez lehetővé teszi, hogy a fájlok kezelése elkülönüljön a relációs adatbázistól, így a strukturált adatok és a bináris állományok tárolása külön rétegben valósulhat meg.</w:t>
       </w:r>
     </w:p>
     <w:p>
       <w:pPr>
         <w:pStyle w:val="Szakdolgozath2"/>
       </w:pPr>
-      <w:bookmarkStart w:id="8" w:name="_Toc225185491"/>
+      <w:bookmarkStart w:id="8" w:name="_Toc225492659"/>
+      <w:r>
+        <w:t>MI integráció</w:t>
+      </w:r>
+      <w:bookmarkEnd w:id="8"/>
+    </w:p>
+    <w:p>
+      <w:pPr>
+        <w:pStyle w:val="Szakdolgozatbekezds"/>
+      </w:pPr>
+      <w:r>
+        <w:t>A rendszer egyik legfontosabb sajátossága, hogy a pályagenerálás és bizonyos erőforrások előállítása mesterséges intelligencia segítségével történik. Ez a projekt központi innovatív eleme, ezért külön technológiai kategóriaként is indokolt kezelni.</w:t>
+      </w:r>
+    </w:p>
+    <w:p>
+      <w:pPr>
+        <w:pStyle w:val="Szakdolgozath3"/>
+      </w:pPr>
       <w:r>
         <w:lastRenderedPageBreak/>
-        <w:t>MI integráció</w:t>
-      </w:r>
-      <w:bookmarkEnd w:id="8"/>
+        <w:t>OpenAI API</w:t>
+      </w:r>
     </w:p>
     <w:p>
       <w:pPr>
         <w:pStyle w:val="Szakdolgozatbekezds"/>
       </w:pPr>
       <w:r>
-        <w:t>A rendszer egyik legfontosabb sajátossága, hogy a pályagenerálás és bizonyos erőforrások előállítása mesterséges intelligencia segítségével történik. Ez a projekt központi innovatív eleme, ezért külön technológiai kategóriaként is indokolt kezelni.</w:t>
-      </w:r>
-    </w:p>
-    <w:p>
-      <w:pPr>
-        <w:pStyle w:val="Szakdolgozath3"/>
-      </w:pPr>
-      <w:proofErr w:type="spellStart"/>
-      <w:r>
-        <w:t>OpenAI</w:t>
-      </w:r>
-      <w:proofErr w:type="spellEnd"/>
-      <w:r>
-        <w:t xml:space="preserve"> API</w:t>
-      </w:r>
-    </w:p>
-    <w:p>
-      <w:pPr>
-        <w:pStyle w:val="Szakdolgozatbekezds"/>
-      </w:pPr>
-      <w:r>
-        <w:t xml:space="preserve">A mesterséges intelligencia alapú funkciók megvalósítása az </w:t>
-      </w:r>
-      <w:proofErr w:type="spellStart"/>
-      <w:r>
-        <w:t>OpenAI</w:t>
-      </w:r>
-      <w:proofErr w:type="spellEnd"/>
-      <w:r>
-        <w:t xml:space="preserve"> API</w:t>
+        <w:t>A mesterséges intelligencia alapú funkciók megvalósítása az OpenAI API</w:t>
       </w:r>
       <w:sdt>
         <w:sdtPr>
@@ -4168,6 +4091,667 @@
     </w:p>
     <w:p>
       <w:pPr>
+        <w:pStyle w:val="SzekdolgozatH1"/>
+      </w:pPr>
+      <w:bookmarkStart w:id="9" w:name="_Toc225492660"/>
+      <w:r>
+        <w:t>Architektúra</w:t>
+      </w:r>
+      <w:bookmarkEnd w:id="9"/>
+    </w:p>
+    <w:p>
+      <w:pPr>
+        <w:pStyle w:val="Szakdolgozath2"/>
+      </w:pPr>
+      <w:bookmarkStart w:id="10" w:name="_Toc225492661"/>
+      <w:r>
+        <w:t>Adatbázis felépítés –</w:t>
+      </w:r>
+      <w:r>
+        <w:t xml:space="preserve"> </w:t>
+      </w:r>
+      <w:r>
+        <w:t>entitások</w:t>
+      </w:r>
+      <w:bookmarkEnd w:id="10"/>
+      <w:r>
+        <w:t xml:space="preserve"> és relációk</w:t>
+      </w:r>
+    </w:p>
+    <w:p>
+      <w:pPr>
+        <w:pStyle w:val="Szakdolgozath3"/>
+      </w:pPr>
+      <w:bookmarkStart w:id="11" w:name="Db_User"/>
+      <w:r>
+        <w:t>User</w:t>
+      </w:r>
+    </w:p>
+    <w:bookmarkEnd w:id="11"/>
+    <w:p>
+      <w:pPr>
+        <w:pStyle w:val="Szakdolgozatbekezds"/>
+      </w:pPr>
+      <w:r>
+        <w:t>A rendszer felhasználóit reprezentáló alapentitás. Az autentikációhoz szükséges azonosító adatokat tárolja, vagyis az e-mail címet, a felhasználónevet és a jelszó hash-ét.</w:t>
+      </w:r>
+    </w:p>
+    <w:p>
+      <w:pPr>
+        <w:pStyle w:val="Szakdolgozatbekezds"/>
+      </w:pPr>
+      <w:r>
+        <w:t>Egy-a</w:t>
+      </w:r>
+      <w:r>
+        <w:t>z</w:t>
+      </w:r>
+      <w:r>
+        <w:t xml:space="preserve">-egyhez kapcsolatban áll a </w:t>
+      </w:r>
+      <w:hyperlink w:anchor="Db_UserToken" w:history="1">
+        <w:r>
+          <w:rPr>
+            <w:rStyle w:val="Hyperlink"/>
+            <w:b/>
+            <w:bCs/>
+            <w:color w:val="auto"/>
+            <w:u w:val="none"/>
+          </w:rPr>
+          <w:t>UserToken</w:t>
+        </w:r>
+      </w:hyperlink>
+      <w:r>
+        <w:t xml:space="preserve"> modellel. Egy-a-többhöz kapcsolatban áll a </w:t>
+      </w:r>
+      <w:hyperlink w:anchor="Db_RefreshToken" w:history="1">
+        <w:r>
+          <w:rPr>
+            <w:rStyle w:val="Hyperlink"/>
+            <w:b/>
+            <w:bCs/>
+            <w:color w:val="auto"/>
+            <w:u w:val="none"/>
+          </w:rPr>
+          <w:t>RefreshToken</w:t>
+        </w:r>
+      </w:hyperlink>
+      <w:r>
+        <w:t xml:space="preserve">, </w:t>
+      </w:r>
+      <w:hyperlink w:anchor="Db_LevelRating" w:history="1">
+        <w:r>
+          <w:rPr>
+            <w:rStyle w:val="Hyperlink"/>
+            <w:b/>
+            <w:bCs/>
+            <w:color w:val="auto"/>
+            <w:u w:val="none"/>
+          </w:rPr>
+          <w:t>LevelRating</w:t>
+        </w:r>
+      </w:hyperlink>
+      <w:r>
+        <w:t xml:space="preserve">, </w:t>
+      </w:r>
+      <w:hyperlink w:anchor="Db_FavoriteLevel" w:history="1">
+        <w:r>
+          <w:rPr>
+            <w:rStyle w:val="Hyperlink"/>
+            <w:b/>
+            <w:bCs/>
+            <w:color w:val="auto"/>
+            <w:u w:val="none"/>
+          </w:rPr>
+          <w:t>FavoriteLevel</w:t>
+        </w:r>
+      </w:hyperlink>
+      <w:r>
+        <w:t xml:space="preserve"> és </w:t>
+      </w:r>
+      <w:hyperlink w:anchor="Db_LevelCompletion" w:history="1">
+        <w:r>
+          <w:rPr>
+            <w:rStyle w:val="Hyperlink"/>
+            <w:b/>
+            <w:bCs/>
+            <w:color w:val="auto"/>
+            <w:u w:val="none"/>
+          </w:rPr>
+          <w:t>LevelCompletion</w:t>
+        </w:r>
+      </w:hyperlink>
+      <w:r>
+        <w:t xml:space="preserve"> modellekkel.</w:t>
+      </w:r>
+    </w:p>
+    <w:p>
+      <w:pPr>
+        <w:pStyle w:val="Szakdolgozath3"/>
+      </w:pPr>
+      <w:bookmarkStart w:id="12" w:name="Db_UserToken"/>
+      <w:r>
+        <w:t>UserToken</w:t>
+      </w:r>
+    </w:p>
+    <w:bookmarkEnd w:id="12"/>
+    <w:p>
+      <w:pPr>
+        <w:pStyle w:val="Szakdolgozatbekezds"/>
+      </w:pPr>
+      <w:r>
+        <w:t>A felhasználó aktuális token</w:t>
+      </w:r>
+      <w:r>
+        <w:t xml:space="preserve"> </w:t>
+      </w:r>
+      <w:r>
+        <w:t>egyenlegét tároló modell. A rendszer ezt használja annak ellenőrzésére, hogy a felhasználó rendelkezik-e elegendő tokennel új pálya generálásához.</w:t>
+      </w:r>
+    </w:p>
+    <w:p>
+      <w:pPr>
+        <w:pStyle w:val="Szakdolgozatbekezds"/>
+      </w:pPr>
+      <w:r>
+        <w:t>Egy-a</w:t>
+      </w:r>
+      <w:r>
+        <w:t>z</w:t>
+      </w:r>
+      <w:r>
+        <w:t xml:space="preserve">-egyhez kapcsolatban áll a </w:t>
+      </w:r>
+      <w:hyperlink w:anchor="Db_User" w:history="1">
+        <w:r>
+          <w:rPr>
+            <w:rStyle w:val="Hyperlink"/>
+            <w:b/>
+            <w:bCs/>
+            <w:color w:val="auto"/>
+            <w:u w:val="none"/>
+          </w:rPr>
+          <w:t>User</w:t>
+        </w:r>
+      </w:hyperlink>
+      <w:r>
+        <w:t xml:space="preserve"> modellel.</w:t>
+      </w:r>
+    </w:p>
+    <w:p>
+      <w:pPr>
+        <w:pStyle w:val="Szakdolgozath3"/>
+      </w:pPr>
+      <w:bookmarkStart w:id="13" w:name="Db_RefreshToken"/>
+      <w:r>
+        <w:t>RefreshToken</w:t>
+      </w:r>
+    </w:p>
+    <w:bookmarkEnd w:id="13"/>
+    <w:p>
+      <w:pPr>
+        <w:pStyle w:val="Szakdolgozatbekezds"/>
+      </w:pPr>
+      <w:r>
+        <w:t>A JWT-alapú hitelesítéshez tartozó frissítő tokeneket tárolja. Nyilvántartja magát a token stringet, a lejárati időt, valamint azt is, hogy a token visszavonásra került-e.</w:t>
+      </w:r>
+    </w:p>
+    <w:p>
+      <w:pPr>
+        <w:pStyle w:val="Szakdolgozatbekezds"/>
+      </w:pPr>
+      <w:r>
+        <w:t xml:space="preserve">Egy-a-többhöz kapcsolatban kapcsolódik a </w:t>
+      </w:r>
+      <w:hyperlink w:anchor="Db_User" w:history="1">
+        <w:r>
+          <w:rPr>
+            <w:rStyle w:val="Hyperlink"/>
+            <w:b/>
+            <w:bCs/>
+            <w:color w:val="auto"/>
+            <w:u w:val="none"/>
+          </w:rPr>
+          <w:t>User</w:t>
+        </w:r>
+      </w:hyperlink>
+      <w:r>
+        <w:t xml:space="preserve"> modellhez, mivel egy felhasználóhoz több </w:t>
+      </w:r>
+      <w:r>
+        <w:t xml:space="preserve">kliens refresh </w:t>
+      </w:r>
+      <w:r>
+        <w:t>token is tartozhat</w:t>
+      </w:r>
+      <w:r>
+        <w:t>, például web alkalmazás és vagy mobil alkalmazás</w:t>
+      </w:r>
+      <w:r>
+        <w:t>.</w:t>
+      </w:r>
+    </w:p>
+    <w:p>
+      <w:pPr>
+        <w:pStyle w:val="Szakdolgozath3"/>
+      </w:pPr>
+      <w:bookmarkStart w:id="14" w:name="Db_Level"/>
+      <w:r>
+        <w:t>Level</w:t>
+      </w:r>
+    </w:p>
+    <w:bookmarkEnd w:id="14"/>
+    <w:p>
+      <w:pPr>
+        <w:pStyle w:val="Szakdolgozatbekezds"/>
+      </w:pPr>
+      <w:r>
+        <w:t>A generált</w:t>
+      </w:r>
+      <w:r>
+        <w:t xml:space="preserve"> </w:t>
+      </w:r>
+      <w:r>
+        <w:t>pályák fő entitása. Tárolja a pálya címét, történetét, a generálás sikerességét, a sprite-generálás</w:t>
+      </w:r>
+      <w:r>
+        <w:t xml:space="preserve"> sikerességét</w:t>
+      </w:r>
+      <w:r>
+        <w:t>, a nehézségi szintet</w:t>
+      </w:r>
+      <w:r>
+        <w:t xml:space="preserve"> vagyis a kijárati feladaton kívül hány db feladat van a pályán</w:t>
+      </w:r>
+      <w:r>
+        <w:t xml:space="preserve"> és a választott képi stílust</w:t>
+      </w:r>
+      <w:r>
+        <w:t xml:space="preserve"> amivel a pályához a sprite-ok generálva lettek</w:t>
+      </w:r>
+      <w:r>
+        <w:t>.</w:t>
+      </w:r>
+    </w:p>
+    <w:p>
+      <w:pPr>
+        <w:pStyle w:val="Szakdolgozatbekezds"/>
+      </w:pPr>
+      <w:r>
+        <w:lastRenderedPageBreak/>
+        <w:t xml:space="preserve">Egy-a-többhöz kapcsolatban áll a </w:t>
+      </w:r>
+      <w:hyperlink w:anchor="Db_LevelRating" w:history="1">
+        <w:r>
+          <w:rPr>
+            <w:rStyle w:val="Hyperlink"/>
+            <w:b/>
+            <w:bCs/>
+            <w:color w:val="auto"/>
+            <w:u w:val="none"/>
+          </w:rPr>
+          <w:t>LevelRating</w:t>
+        </w:r>
+      </w:hyperlink>
+      <w:r>
+        <w:t xml:space="preserve">, </w:t>
+      </w:r>
+      <w:hyperlink w:anchor="Db_FavoriteLevel" w:history="1">
+        <w:r>
+          <w:rPr>
+            <w:rStyle w:val="Hyperlink"/>
+            <w:b/>
+            <w:bCs/>
+            <w:color w:val="auto"/>
+            <w:u w:val="none"/>
+          </w:rPr>
+          <w:t>FavoriteLevel</w:t>
+        </w:r>
+      </w:hyperlink>
+      <w:r>
+        <w:t xml:space="preserve">, </w:t>
+      </w:r>
+      <w:hyperlink w:anchor="Db_LevelCompletion" w:history="1">
+        <w:r>
+          <w:rPr>
+            <w:rStyle w:val="Hyperlink"/>
+            <w:b/>
+            <w:bCs/>
+            <w:color w:val="auto"/>
+            <w:u w:val="none"/>
+          </w:rPr>
+          <w:t>LevelCompletion</w:t>
+        </w:r>
+      </w:hyperlink>
+      <w:r>
+        <w:t xml:space="preserve"> és </w:t>
+      </w:r>
+      <w:hyperlink w:anchor="Db_LevelTokenUsage" w:history="1">
+        <w:r>
+          <w:rPr>
+            <w:rStyle w:val="Hyperlink"/>
+            <w:b/>
+            <w:bCs/>
+            <w:color w:val="auto"/>
+            <w:u w:val="none"/>
+          </w:rPr>
+          <w:t>LevelTokenUsage</w:t>
+        </w:r>
+      </w:hyperlink>
+      <w:r>
+        <w:t xml:space="preserve"> modellekkel.</w:t>
+      </w:r>
+    </w:p>
+    <w:p>
+      <w:pPr>
+        <w:pStyle w:val="Szakdolgozath3"/>
+      </w:pPr>
+      <w:r>
+        <w:t>LevelRating</w:t>
+      </w:r>
+    </w:p>
+    <w:p>
+      <w:pPr>
+        <w:pStyle w:val="Szakdolgozatbekezds"/>
+      </w:pPr>
+      <w:r>
+        <w:t>A felhasználók pályaértékeléseit tároló kapcsoló</w:t>
+      </w:r>
+      <w:r>
+        <w:t xml:space="preserve"> </w:t>
+      </w:r>
+      <w:r>
+        <w:t>modell. Egy rekord egy adott felhasználó egy adott pályára adott 1 és 5 közötti értékelését reprezentálja.</w:t>
+      </w:r>
+    </w:p>
+    <w:p>
+      <w:pPr>
+        <w:pStyle w:val="Szakdolgozatbekezds"/>
+      </w:pPr>
+      <w:r>
+        <w:t>Több-a</w:t>
+      </w:r>
+      <w:r>
+        <w:t>z</w:t>
+      </w:r>
+      <w:r>
+        <w:t xml:space="preserve">-egyhez kapcsolatban kapcsolódik a </w:t>
+      </w:r>
+      <w:hyperlink w:anchor="Db_User" w:history="1">
+        <w:r>
+          <w:rPr>
+            <w:rStyle w:val="Hyperlink"/>
+            <w:b/>
+            <w:bCs/>
+            <w:color w:val="auto"/>
+            <w:u w:val="none"/>
+          </w:rPr>
+          <w:t>User</w:t>
+        </w:r>
+      </w:hyperlink>
+      <w:r>
+        <w:t xml:space="preserve"> és a </w:t>
+      </w:r>
+      <w:hyperlink w:anchor="Db_Level" w:history="1">
+        <w:r>
+          <w:rPr>
+            <w:rStyle w:val="Hyperlink"/>
+            <w:b/>
+            <w:bCs/>
+            <w:color w:val="auto"/>
+            <w:u w:val="none"/>
+          </w:rPr>
+          <w:t>Level</w:t>
+        </w:r>
+      </w:hyperlink>
+      <w:r>
+        <w:t xml:space="preserve"> modellekhez. Logikailag sok-sok kapcsolatot valósít meg a felhasználók és pályák között</w:t>
+      </w:r>
+      <w:r>
+        <w:t>.</w:t>
+      </w:r>
+    </w:p>
+    <w:p>
+      <w:pPr>
+        <w:pStyle w:val="Szakdolgozath3"/>
+      </w:pPr>
+      <w:bookmarkStart w:id="15" w:name="Db_LevelRating"/>
+      <w:bookmarkStart w:id="16" w:name="Db_FavoriteLevel"/>
+      <w:r>
+        <w:t>FavoriteLevel</w:t>
+      </w:r>
+    </w:p>
+    <w:bookmarkEnd w:id="15"/>
+    <w:bookmarkEnd w:id="16"/>
+    <w:p>
+      <w:pPr>
+        <w:pStyle w:val="Szakdolgozatbekezds"/>
+      </w:pPr>
+      <w:r>
+        <w:t>A kedvencnek jelölt pályákat tároló kapcsolómodell. Arra szolgál, hogy egy felhasználó elmenthesse a számára érdekes pályákat.</w:t>
+      </w:r>
+    </w:p>
+    <w:p>
+      <w:pPr>
+        <w:pStyle w:val="Szakdolgozatbekezds"/>
+      </w:pPr>
+      <w:r>
+        <w:t>Több-a</w:t>
+      </w:r>
+      <w:r>
+        <w:t>z</w:t>
+      </w:r>
+      <w:r>
+        <w:t xml:space="preserve">-egyhez kapcsolatban kapcsolódik a </w:t>
+      </w:r>
+      <w:hyperlink w:anchor="Db_User" w:history="1">
+        <w:r>
+          <w:rPr>
+            <w:rStyle w:val="Hyperlink"/>
+            <w:b/>
+            <w:bCs/>
+            <w:color w:val="auto"/>
+            <w:u w:val="none"/>
+          </w:rPr>
+          <w:t>User</w:t>
+        </w:r>
+      </w:hyperlink>
+      <w:r>
+        <w:t xml:space="preserve"> és a </w:t>
+      </w:r>
+      <w:hyperlink w:anchor="Db_Level" w:history="1">
+        <w:r>
+          <w:rPr>
+            <w:rStyle w:val="Hyperlink"/>
+            <w:b/>
+            <w:bCs/>
+            <w:color w:val="auto"/>
+            <w:u w:val="none"/>
+          </w:rPr>
+          <w:t>Level</w:t>
+        </w:r>
+      </w:hyperlink>
+      <w:r>
+        <w:t xml:space="preserve"> modellekhez. Logikailag sok-sok kapcsolatot valósít meg a felhasználók és pályák között.</w:t>
+      </w:r>
+    </w:p>
+    <w:p>
+      <w:pPr>
+        <w:pStyle w:val="Szakdolgozath3"/>
+      </w:pPr>
+      <w:bookmarkStart w:id="17" w:name="Db_LevelCompletion"/>
+      <w:r>
+        <w:t>LevelCompletion</w:t>
+      </w:r>
+    </w:p>
+    <w:bookmarkEnd w:id="17"/>
+    <w:p>
+      <w:pPr>
+        <w:pStyle w:val="Szakdolgozatbekezds"/>
+      </w:pPr>
+      <w:r>
+        <w:t xml:space="preserve">A pályák </w:t>
+      </w:r>
+      <w:r>
+        <w:t>adott felhasználó első végigjátszásának</w:t>
+      </w:r>
+      <w:r>
+        <w:t xml:space="preserve"> nyilvántartására szolgáló modell. A teljesítés tényén kívül eltárolja a teljesítéshez szükséges időt percben.</w:t>
+      </w:r>
+    </w:p>
+    <w:p>
+      <w:pPr>
+        <w:pStyle w:val="Szakdolgozatbekezds"/>
+      </w:pPr>
+      <w:r>
+        <w:t>Több-a</w:t>
+      </w:r>
+      <w:r>
+        <w:t>z</w:t>
+      </w:r>
+      <w:r>
+        <w:t xml:space="preserve">-egyhez kapcsolatban kapcsolódik a </w:t>
+      </w:r>
+      <w:hyperlink w:anchor="Db_User" w:history="1">
+        <w:r>
+          <w:rPr>
+            <w:rStyle w:val="Hyperlink"/>
+            <w:b/>
+            <w:bCs/>
+            <w:color w:val="auto"/>
+            <w:u w:val="none"/>
+          </w:rPr>
+          <w:t>User</w:t>
+        </w:r>
+      </w:hyperlink>
+      <w:r>
+        <w:t xml:space="preserve"> és a </w:t>
+      </w:r>
+      <w:hyperlink w:anchor="Db_Level" w:history="1">
+        <w:r>
+          <w:rPr>
+            <w:rStyle w:val="Hyperlink"/>
+            <w:b/>
+            <w:bCs/>
+            <w:color w:val="auto"/>
+            <w:u w:val="none"/>
+          </w:rPr>
+          <w:t>Level</w:t>
+        </w:r>
+      </w:hyperlink>
+      <w:r>
+        <w:t xml:space="preserve"> modellekhez. Logikailag sok-sok kapcsolatot valósít meg a felhasználók és pályák között.</w:t>
+      </w:r>
+    </w:p>
+    <w:p>
+      <w:pPr>
+        <w:pStyle w:val="Szakdolgozath3"/>
+      </w:pPr>
+      <w:bookmarkStart w:id="18" w:name="Db_LevelTokenUsage"/>
+      <w:r>
+        <w:t>LevelTokenUsage</w:t>
+      </w:r>
+    </w:p>
+    <w:bookmarkEnd w:id="18"/>
+    <w:p>
+      <w:pPr>
+        <w:pStyle w:val="Szakdolgozatbekezds"/>
+      </w:pPr>
+      <w:r>
+        <w:t>A pályagenerálás és a kapcsolódó AI-műveletek erőforrás-felhasználását naplózó modell. Eseményszinten rögzíti a token- és időfelhasználást a generation, validation, repair és sprite</w:t>
+      </w:r>
+      <w:r>
+        <w:t xml:space="preserve">-generation </w:t>
+      </w:r>
+      <w:r>
+        <w:t>művelettípusok szerint.</w:t>
+      </w:r>
+    </w:p>
+    <w:p>
+      <w:pPr>
+        <w:pStyle w:val="Szakdolgozatbekezds"/>
+      </w:pPr>
+      <w:r>
+        <w:t>Több-a</w:t>
+      </w:r>
+      <w:r>
+        <w:t>z</w:t>
+      </w:r>
+      <w:r>
+        <w:t xml:space="preserve">-egyhez kapcsolatban kapcsolódik a </w:t>
+      </w:r>
+      <w:hyperlink w:anchor="Db_Level" w:history="1">
+        <w:r>
+          <w:rPr>
+            <w:rStyle w:val="Hyperlink"/>
+            <w:b/>
+            <w:bCs/>
+            <w:color w:val="auto"/>
+            <w:u w:val="none"/>
+          </w:rPr>
+          <w:t>Level</w:t>
+        </w:r>
+      </w:hyperlink>
+      <w:r>
+        <w:t xml:space="preserve"> modellhez</w:t>
+      </w:r>
+      <w:r>
+        <w:t>, vagyis egy pályához több rekord tartozik.</w:t>
+      </w:r>
+    </w:p>
+    <w:p>
+      <w:pPr>
+        <w:pStyle w:val="Szakdolgozath2"/>
+      </w:pPr>
+      <w:r>
+        <w:tab/>
+      </w:r>
+      <w:bookmarkStart w:id="19" w:name="_Toc225492662"/>
+      <w:r>
+        <w:t>Kommunikáció, API és a websocket</w:t>
+      </w:r>
+      <w:bookmarkEnd w:id="19"/>
+    </w:p>
+    <w:p>
+      <w:pPr>
+        <w:pStyle w:val="Szakdolgozatbekezds"/>
+      </w:pPr>
+      <w:r>
+        <w:t xml:space="preserve">A felhasználók hitelesítése JSON Web Token (JWT) alapú megoldással történik, amely RS256 algoritmust alkalmazó, nyilvános és privát kulcspáron alapuló aláírással került megvalósításra. Ez biztosítja, hogy a kliensoldali alkalmazás a bejelentkezést követően </w:t>
+      </w:r>
+      <w:r>
+        <w:lastRenderedPageBreak/>
+        <w:t>biztonságos módon férjen hozzá a védett erőforrásokhoz, miközben a szerver ellenőrizni tudja a tokenek hitelességét és érvényességét.</w:t>
+      </w:r>
+    </w:p>
+    <w:p>
+      <w:pPr>
+        <w:pStyle w:val="Szakdolgozath2"/>
+      </w:pPr>
+      <w:bookmarkStart w:id="20" w:name="_Toc225492663"/>
+      <w:r>
+        <w:t>File tárolás - Blob storage</w:t>
+      </w:r>
+      <w:bookmarkEnd w:id="20"/>
+    </w:p>
+    <w:p>
+      <w:pPr>
+        <w:pStyle w:val="Szakdolgozath2"/>
+      </w:pPr>
+      <w:r>
+        <w:tab/>
+      </w:r>
+      <w:bookmarkStart w:id="21" w:name="_Toc225492664"/>
+      <w:r>
+        <w:t>Biztonság, JWT token authentikáció</w:t>
+      </w:r>
+      <w:bookmarkEnd w:id="21"/>
+      <w:r>
+        <w:t xml:space="preserve"> </w:t>
+      </w:r>
+    </w:p>
+    <w:p>
+      <w:pPr>
         <w:spacing w:line="360" w:lineRule="auto"/>
         <w:jc w:val="both"/>
         <w:rPr>
@@ -4194,7 +4778,16 @@
         <w:br w:type="page"/>
       </w:r>
     </w:p>
-    <w:bookmarkStart w:id="9" w:name="_Toc225185492" w:displacedByCustomXml="next"/>
+    <w:p>
+      <w:pPr>
+        <w:rPr>
+          <w:rFonts w:ascii="Times New Roman" w:hAnsi="Times New Roman" w:cs="Times New Roman"/>
+          <w:sz w:val="24"/>
+          <w:szCs w:val="24"/>
+        </w:rPr>
+      </w:pPr>
+    </w:p>
+    <w:bookmarkStart w:id="22" w:name="_Toc225492665" w:displacedByCustomXml="next"/>
     <w:sdt>
       <w:sdtPr>
         <w:rPr>
@@ -4220,7 +4813,7 @@
           <w:r>
             <w:t>Irodalomjegyzék</w:t>
           </w:r>
-          <w:bookmarkEnd w:id="9"/>
+          <w:bookmarkEnd w:id="22"/>
         </w:p>
         <w:sdt>
           <w:sdtPr>
@@ -5172,10 +5765,12 @@
       <w:pPr>
         <w:pStyle w:val="szmozatlanSzakdolgozath1"/>
       </w:pPr>
+      <w:bookmarkStart w:id="23" w:name="_Toc225492666"/>
       <w:r>
         <w:lastRenderedPageBreak/>
         <w:t>Nyilatkozat</w:t>
       </w:r>
+      <w:bookmarkEnd w:id="23"/>
     </w:p>
     <w:p>
       <w:pPr>
@@ -5183,32 +5778,7 @@
         <w:ind w:firstLine="720"/>
       </w:pPr>
       <w:r>
-        <w:t xml:space="preserve">Alulírott </w:t>
-      </w:r>
-      <w:r>
-        <w:t xml:space="preserve">Bacsur Martin </w:t>
-      </w:r>
-      <w:r>
-        <w:t xml:space="preserve">programtervező informatikus </w:t>
-      </w:r>
-      <w:proofErr w:type="spellStart"/>
-      <w:r>
-        <w:t>BSc</w:t>
-      </w:r>
-      <w:proofErr w:type="spellEnd"/>
-      <w:r>
-        <w:t xml:space="preserve"> </w:t>
-      </w:r>
-      <w:r>
-        <w:t xml:space="preserve">szakos hallgató, kijelentem, hogy a dolgozatomat a Szegedi Tudományegyetem, Informatikai Intézet Szoftverfejlesztés Tanszékén készítettem, programtervező informatikus </w:t>
-      </w:r>
-      <w:proofErr w:type="spellStart"/>
-      <w:r>
-        <w:t>BSc</w:t>
-      </w:r>
-      <w:proofErr w:type="spellEnd"/>
-      <w:r>
-        <w:t xml:space="preserve"> diploma megszerzése érdekében. </w:t>
+        <w:t>Alulírott Bacsur Martin programtervező informatikus BSc szakos hallgató, kijelentem, hogy a dolgozatomat a Szegedi Tudományegyetem, Informatikai Intézet Szoftverfejlesztés Tanszékén készítettem, programtervező informatikus BSc diploma megszerzése érdekében. </w:t>
       </w:r>
     </w:p>
     <w:p>
@@ -5226,15 +5796,7 @@
         <w:ind w:firstLine="720"/>
       </w:pPr>
       <w:r>
-        <w:t xml:space="preserve">Tudomásul veszem, hogy szakdolgozatomat a Szegedi Tudományegyetem Diplomamunka </w:t>
-      </w:r>
-      <w:proofErr w:type="spellStart"/>
-      <w:r>
-        <w:t>Repozitóriumában</w:t>
-      </w:r>
-      <w:proofErr w:type="spellEnd"/>
-      <w:r>
-        <w:t xml:space="preserve"> tárolja.</w:t>
+        <w:t>Tudomásul veszem, hogy szakdolgozatomat a Szegedi Tudományegyetem Diplomamunka Repozitóriumában tárolja.</w:t>
       </w:r>
     </w:p>
     <w:p/>
@@ -5274,8 +5836,118 @@
         <w:t>Bacsur Martin</w:t>
       </w:r>
     </w:p>
+    <w:p/>
+    <w:p>
+      <w:r>
+        <w:br w:type="page"/>
+      </w:r>
+    </w:p>
+    <w:p>
+      <w:pPr>
+        <w:pStyle w:val="szmozatlanSzakdolgozath1"/>
+      </w:pPr>
+      <w:bookmarkStart w:id="24" w:name="_Toc225492667"/>
+      <w:r>
+        <w:lastRenderedPageBreak/>
+        <w:t>Mellékletek</w:t>
+      </w:r>
+      <w:bookmarkEnd w:id="24"/>
+    </w:p>
+    <w:p>
+      <w:pPr>
+        <w:pStyle w:val="Szakdolgozath2"/>
+      </w:pPr>
+      <w:bookmarkStart w:id="25" w:name="_Toc225492668"/>
+      <w:r>
+        <w:t>Adatbázis</w:t>
+      </w:r>
+      <w:r>
+        <w:t xml:space="preserve"> relációk</w:t>
+      </w:r>
+      <w:bookmarkEnd w:id="25"/>
+    </w:p>
+    <w:p>
+      <w:pPr>
+        <w:pStyle w:val="Szakdolgozatbekezds"/>
+        <w:ind w:left="720"/>
+      </w:pPr>
+      <w:r>
+        <w:t>A diagram elkészítéséhez a Graphviz Online</w:t>
+      </w:r>
+      <w:r>
+        <w:t xml:space="preserve">-t </w:t>
+      </w:r>
+      <w:r>
+        <w:t>használtam.</w:t>
+      </w:r>
+      <w:r>
+        <w:t xml:space="preserve"> </w:t>
+      </w:r>
+      <w:r>
+        <w:t>https://dreampuf.github.io/GraphvizOnline/?engine=dot#digraph%20G%7B%7D</w:t>
+      </w:r>
+    </w:p>
+    <w:p>
+      <w:pPr>
+        <w:pStyle w:val="Szakdolgozatbekezds"/>
+        <w:jc w:val="center"/>
+      </w:pPr>
+      <w:r>
+        <w:rPr>
+          <w:noProof/>
+        </w:rPr>
+        <w:drawing>
+          <wp:inline distT="0" distB="0" distL="0" distR="0" wp14:anchorId="50B267F7" wp14:editId="508E6D91">
+            <wp:extent cx="5606415" cy="7010400"/>
+            <wp:effectExtent l="0" t="0" r="0" b="0"/>
+            <wp:docPr id="1744326226" name="Picture 1"/>
+            <wp:cNvGraphicFramePr>
+              <a:graphicFrameLocks xmlns:a="http://schemas.openxmlformats.org/drawingml/2006/main" noChangeAspect="1"/>
+            </wp:cNvGraphicFramePr>
+            <a:graphic xmlns:a="http://schemas.openxmlformats.org/drawingml/2006/main">
+              <a:graphicData uri="http://schemas.openxmlformats.org/drawingml/2006/picture">
+                <pic:pic xmlns:pic="http://schemas.openxmlformats.org/drawingml/2006/picture">
+                  <pic:nvPicPr>
+                    <pic:cNvPr id="0" name="Picture 1"/>
+                    <pic:cNvPicPr>
+                      <a:picLocks noChangeAspect="1" noChangeArrowheads="1"/>
+                    </pic:cNvPicPr>
+                  </pic:nvPicPr>
+                  <pic:blipFill>
+                    <a:blip r:embed="rId8">
+                      <a:extLst>
+                        <a:ext uri="{28A0092B-C50C-407E-A947-70E740481C1C}">
+                          <a14:useLocalDpi xmlns:a14="http://schemas.microsoft.com/office/drawing/2010/main" val="0"/>
+                        </a:ext>
+                      </a:extLst>
+                    </a:blip>
+                    <a:srcRect/>
+                    <a:stretch>
+                      <a:fillRect/>
+                    </a:stretch>
+                  </pic:blipFill>
+                  <pic:spPr bwMode="auto">
+                    <a:xfrm>
+                      <a:off x="0" y="0"/>
+                      <a:ext cx="5606415" cy="7010400"/>
+                    </a:xfrm>
+                    <a:prstGeom prst="rect">
+                      <a:avLst/>
+                    </a:prstGeom>
+                    <a:noFill/>
+                    <a:ln>
+                      <a:noFill/>
+                    </a:ln>
+                  </pic:spPr>
+                </pic:pic>
+              </a:graphicData>
+            </a:graphic>
+          </wp:inline>
+        </w:drawing>
+      </w:r>
+    </w:p>
     <w:sectPr>
-      <w:footerReference w:type="default" r:id="rId8"/>
+      <w:footerReference w:type="default" r:id="rId9"/>
       <w:pgSz w:w="12240" w:h="15840" w:code="1"/>
       <w:pgMar w:top="1418" w:right="1418" w:bottom="1418" w:left="1418" w:header="720" w:footer="720" w:gutter="567"/>
       <w:pgNumType w:start="2"/>
@@ -5597,6 +6269,95 @@
       </w:rPr>
     </w:lvl>
   </w:abstractNum>
+  <w:abstractNum w:abstractNumId="2" w15:restartNumberingAfterBreak="0">
+    <w:nsid w:val="7DD472F8"/>
+    <w:multiLevelType w:val="hybridMultilevel"/>
+    <w:tmpl w:val="80140464"/>
+    <w:lvl w:ilvl="0" w:tplc="04090015">
+      <w:start w:val="1"/>
+      <w:numFmt w:val="upperLetter"/>
+      <w:lvlText w:val="%1."/>
+      <w:lvlJc w:val="left"/>
+      <w:pPr>
+        <w:ind w:left="720" w:hanging="360"/>
+      </w:pPr>
+      <w:rPr>
+        <w:rFonts w:hint="default"/>
+      </w:rPr>
+    </w:lvl>
+    <w:lvl w:ilvl="1" w:tplc="04090019" w:tentative="1">
+      <w:start w:val="1"/>
+      <w:numFmt w:val="lowerLetter"/>
+      <w:lvlText w:val="%2."/>
+      <w:lvlJc w:val="left"/>
+      <w:pPr>
+        <w:ind w:left="1440" w:hanging="360"/>
+      </w:pPr>
+    </w:lvl>
+    <w:lvl w:ilvl="2" w:tplc="0409001B" w:tentative="1">
+      <w:start w:val="1"/>
+      <w:numFmt w:val="lowerRoman"/>
+      <w:lvlText w:val="%3."/>
+      <w:lvlJc w:val="right"/>
+      <w:pPr>
+        <w:ind w:left="2160" w:hanging="180"/>
+      </w:pPr>
+    </w:lvl>
+    <w:lvl w:ilvl="3" w:tplc="0409000F" w:tentative="1">
+      <w:start w:val="1"/>
+      <w:numFmt w:val="decimal"/>
+      <w:lvlText w:val="%4."/>
+      <w:lvlJc w:val="left"/>
+      <w:pPr>
+        <w:ind w:left="2880" w:hanging="360"/>
+      </w:pPr>
+    </w:lvl>
+    <w:lvl w:ilvl="4" w:tplc="04090019" w:tentative="1">
+      <w:start w:val="1"/>
+      <w:numFmt w:val="lowerLetter"/>
+      <w:lvlText w:val="%5."/>
+      <w:lvlJc w:val="left"/>
+      <w:pPr>
+        <w:ind w:left="3600" w:hanging="360"/>
+      </w:pPr>
+    </w:lvl>
+    <w:lvl w:ilvl="5" w:tplc="0409001B" w:tentative="1">
+      <w:start w:val="1"/>
+      <w:numFmt w:val="lowerRoman"/>
+      <w:lvlText w:val="%6."/>
+      <w:lvlJc w:val="right"/>
+      <w:pPr>
+        <w:ind w:left="4320" w:hanging="180"/>
+      </w:pPr>
+    </w:lvl>
+    <w:lvl w:ilvl="6" w:tplc="0409000F" w:tentative="1">
+      <w:start w:val="1"/>
+      <w:numFmt w:val="decimal"/>
+      <w:lvlText w:val="%7."/>
+      <w:lvlJc w:val="left"/>
+      <w:pPr>
+        <w:ind w:left="5040" w:hanging="360"/>
+      </w:pPr>
+    </w:lvl>
+    <w:lvl w:ilvl="7" w:tplc="04090019" w:tentative="1">
+      <w:start w:val="1"/>
+      <w:numFmt w:val="lowerLetter"/>
+      <w:lvlText w:val="%8."/>
+      <w:lvlJc w:val="left"/>
+      <w:pPr>
+        <w:ind w:left="5760" w:hanging="360"/>
+      </w:pPr>
+    </w:lvl>
+    <w:lvl w:ilvl="8" w:tplc="0409001B" w:tentative="1">
+      <w:start w:val="1"/>
+      <w:numFmt w:val="lowerRoman"/>
+      <w:lvlText w:val="%9."/>
+      <w:lvlJc w:val="right"/>
+      <w:pPr>
+        <w:ind w:left="6480" w:hanging="180"/>
+      </w:pPr>
+    </w:lvl>
+  </w:abstractNum>
   <w:num w:numId="1" w16cid:durableId="1477646002">
     <w:abstractNumId w:val="0"/>
   </w:num>
@@ -5605,6 +6366,9 @@
   </w:num>
   <w:num w:numId="3" w16cid:durableId="625625629">
     <w:abstractNumId w:val="1"/>
+  </w:num>
+  <w:num w:numId="4" w16cid:durableId="1709179735">
+    <w:abstractNumId w:val="2"/>
   </w:num>
 </w:numbering>
 </file>
@@ -6060,7 +6824,6 @@
     <w:next w:val="Normal"/>
     <w:link w:val="Heading3Char"/>
     <w:uiPriority w:val="9"/>
-    <w:semiHidden/>
     <w:unhideWhenUsed/>
     <w:qFormat/>
     <w:rsid w:val="007018B4"/>
@@ -6267,7 +7030,6 @@
     <w:basedOn w:val="DefaultParagraphFont"/>
     <w:link w:val="Heading3"/>
     <w:uiPriority w:val="9"/>
-    <w:semiHidden/>
     <w:rsid w:val="007018B4"/>
     <w:rPr>
       <w:rFonts w:eastAsiaTheme="majorEastAsia" w:cstheme="majorBidi"/>
@@ -6974,6 +7736,30 @@
       <w:vertAlign w:val="superscript"/>
     </w:rPr>
   </w:style>
+  <w:style w:type="character" w:styleId="UnresolvedMention">
+    <w:name w:val="Unresolved Mention"/>
+    <w:basedOn w:val="DefaultParagraphFont"/>
+    <w:uiPriority w:val="99"/>
+    <w:semiHidden/>
+    <w:unhideWhenUsed/>
+    <w:rsid w:val="009A41E3"/>
+    <w:rPr>
+      <w:color w:val="605E5C"/>
+      <w:shd w:val="clear" w:color="auto" w:fill="E1DFDD"/>
+    </w:rPr>
+  </w:style>
+  <w:style w:type="character" w:styleId="FollowedHyperlink">
+    <w:name w:val="FollowedHyperlink"/>
+    <w:basedOn w:val="DefaultParagraphFont"/>
+    <w:uiPriority w:val="99"/>
+    <w:semiHidden/>
+    <w:unhideWhenUsed/>
+    <w:rsid w:val="005F599D"/>
+    <w:rPr>
+      <w:color w:val="954F72" w:themeColor="followedHyperlink"/>
+      <w:u w:val="single"/>
+    </w:rPr>
+  </w:style>
 </w:styles>
 </file>
 

</xml_diff>

<commit_message>
feat(Szakdolgozat): Architectúra -a Alkalmazások
</commit_message>
<xml_diff>
--- a/Szakdolgozat.docx
+++ b/Szakdolgozat.docx
@@ -525,7 +525,7 @@
       <w:pPr>
         <w:pStyle w:val="szmozatlanSzakdolgozath1"/>
       </w:pPr>
-      <w:bookmarkStart w:id="0" w:name="_Toc225492651"/>
+      <w:bookmarkStart w:id="0" w:name="_Toc225505728"/>
       <w:r>
         <w:lastRenderedPageBreak/>
         <w:t>Feladatkiírás</w:t>
@@ -625,7 +625,43 @@
           <w:sz w:val="24"/>
           <w:szCs w:val="24"/>
         </w:rPr>
-        <w:t>Az alkalmazás nem csupán maga a játék, hanem egy teljes webes rendszerként működik. Lehetőséget biztosít felhasználói fiókok kezelésére, ahol a felhasználók saját pályákat generálhatnak. A pályagenerálás token alapú rendszerhez kötött, ahol a felhasználók tokeneket vásárolhatnak, és ezek felhasználásával indíthatják el az új pályák létrehozását.</w:t>
+        <w:t xml:space="preserve">Az alkalmazás nem csupán maga a játék, hanem egy teljes webes rendszerként működik. Lehetőséget biztosít felhasználói fiókok kezelésére, ahol a felhasználók saját pályákat generálhatnak. A pályagenerálás </w:t>
+      </w:r>
+      <w:proofErr w:type="spellStart"/>
+      <w:r>
+        <w:rPr>
+          <w:rFonts w:ascii="Times New Roman" w:hAnsi="Times New Roman" w:cs="Times New Roman"/>
+          <w:sz w:val="24"/>
+          <w:szCs w:val="24"/>
+        </w:rPr>
+        <w:t>token</w:t>
+      </w:r>
+      <w:proofErr w:type="spellEnd"/>
+      <w:r>
+        <w:rPr>
+          <w:rFonts w:ascii="Times New Roman" w:hAnsi="Times New Roman" w:cs="Times New Roman"/>
+          <w:sz w:val="24"/>
+          <w:szCs w:val="24"/>
+        </w:rPr>
+        <w:t xml:space="preserve"> alapú rendszerhez kötött, ahol a felhasználók </w:t>
+      </w:r>
+      <w:proofErr w:type="spellStart"/>
+      <w:r>
+        <w:rPr>
+          <w:rFonts w:ascii="Times New Roman" w:hAnsi="Times New Roman" w:cs="Times New Roman"/>
+          <w:sz w:val="24"/>
+          <w:szCs w:val="24"/>
+        </w:rPr>
+        <w:t>tokeneket</w:t>
+      </w:r>
+      <w:proofErr w:type="spellEnd"/>
+      <w:r>
+        <w:rPr>
+          <w:rFonts w:ascii="Times New Roman" w:hAnsi="Times New Roman" w:cs="Times New Roman"/>
+          <w:sz w:val="24"/>
+          <w:szCs w:val="24"/>
+        </w:rPr>
+        <w:t xml:space="preserve"> vásárolhatnak, és ezek felhasználásával indíthatják el az új pályák létrehozását.</w:t>
       </w:r>
     </w:p>
     <w:p>
@@ -665,7 +701,43 @@
           <w:sz w:val="24"/>
           <w:szCs w:val="24"/>
         </w:rPr>
-        <w:t>A pályagenerálási folyamatokhoz részletes statisztikai adatgyűjtés is kapcsolódik. A rendszer rögzíti többek között a generáláshoz, validáláshoz és esetleges javításokhoz felhasznált tokenek mennyiségét, valamint az egyes folyamatok időigényét. Ezek az adatok lehetőséget biztosítanak a rendszer működésének elemzésére és optimalizálására.</w:t>
+        <w:t xml:space="preserve">A pályagenerálási folyamatokhoz részletes statisztikai adatgyűjtés is kapcsolódik. A rendszer rögzíti többek között a generáláshoz, </w:t>
+      </w:r>
+      <w:proofErr w:type="spellStart"/>
+      <w:r>
+        <w:rPr>
+          <w:rFonts w:ascii="Times New Roman" w:hAnsi="Times New Roman" w:cs="Times New Roman"/>
+          <w:sz w:val="24"/>
+          <w:szCs w:val="24"/>
+        </w:rPr>
+        <w:t>validáláshoz</w:t>
+      </w:r>
+      <w:proofErr w:type="spellEnd"/>
+      <w:r>
+        <w:rPr>
+          <w:rFonts w:ascii="Times New Roman" w:hAnsi="Times New Roman" w:cs="Times New Roman"/>
+          <w:sz w:val="24"/>
+          <w:szCs w:val="24"/>
+        </w:rPr>
+        <w:t xml:space="preserve"> és esetleges javításokhoz felhasznált </w:t>
+      </w:r>
+      <w:proofErr w:type="spellStart"/>
+      <w:r>
+        <w:rPr>
+          <w:rFonts w:ascii="Times New Roman" w:hAnsi="Times New Roman" w:cs="Times New Roman"/>
+          <w:sz w:val="24"/>
+          <w:szCs w:val="24"/>
+        </w:rPr>
+        <w:t>tokenek</w:t>
+      </w:r>
+      <w:proofErr w:type="spellEnd"/>
+      <w:r>
+        <w:rPr>
+          <w:rFonts w:ascii="Times New Roman" w:hAnsi="Times New Roman" w:cs="Times New Roman"/>
+          <w:sz w:val="24"/>
+          <w:szCs w:val="24"/>
+        </w:rPr>
+        <w:t xml:space="preserve"> mennyiségét, valamint az egyes folyamatok időigényét. Ezek az adatok lehetőséget biztosítanak a rendszer működésének elemzésére és optimalizálására.</w:t>
       </w:r>
     </w:p>
     <w:p>
@@ -689,7 +761,7 @@
       <w:pPr>
         <w:pStyle w:val="szmozatlanSzakdolgozath1"/>
       </w:pPr>
-      <w:bookmarkStart w:id="1" w:name="_Toc225492652"/>
+      <w:bookmarkStart w:id="1" w:name="_Toc225505729"/>
       <w:r>
         <w:lastRenderedPageBreak/>
         <w:t>Tartalomjegyzék</w:t>
@@ -752,7 +824,7 @@
           <w:r>
             <w:fldChar w:fldCharType="separate"/>
           </w:r>
-          <w:hyperlink w:anchor="_Toc225492651" w:history="1">
+          <w:hyperlink w:anchor="_Toc225505728" w:history="1">
             <w:r>
               <w:rPr>
                 <w:rStyle w:val="Hyperlink"/>
@@ -779,7 +851,7 @@
                 <w:noProof/>
                 <w:webHidden/>
               </w:rPr>
-              <w:instrText xml:space="preserve"> PAGEREF _Toc225492651 \h </w:instrText>
+              <w:instrText xml:space="preserve"> PAGEREF _Toc225505728 \h </w:instrText>
             </w:r>
             <w:r>
               <w:rPr>
@@ -824,7 +896,7 @@
               <w:lang w:val="en-US"/>
             </w:rPr>
           </w:pPr>
-          <w:hyperlink w:anchor="_Toc225492652" w:history="1">
+          <w:hyperlink w:anchor="_Toc225505729" w:history="1">
             <w:r>
               <w:rPr>
                 <w:rStyle w:val="Hyperlink"/>
@@ -851,7 +923,7 @@
                 <w:noProof/>
                 <w:webHidden/>
               </w:rPr>
-              <w:instrText xml:space="preserve"> PAGEREF _Toc225492652 \h </w:instrText>
+              <w:instrText xml:space="preserve"> PAGEREF _Toc225505729 \h </w:instrText>
             </w:r>
             <w:r>
               <w:rPr>
@@ -897,7 +969,7 @@
               <w:lang w:val="en-US"/>
             </w:rPr>
           </w:pPr>
-          <w:hyperlink w:anchor="_Toc225492653" w:history="1">
+          <w:hyperlink w:anchor="_Toc225505730" w:history="1">
             <w:r>
               <w:rPr>
                 <w:rStyle w:val="Hyperlink"/>
@@ -942,7 +1014,7 @@
                 <w:noProof/>
                 <w:webHidden/>
               </w:rPr>
-              <w:instrText xml:space="preserve"> PAGEREF _Toc225492653 \h </w:instrText>
+              <w:instrText xml:space="preserve"> PAGEREF _Toc225505730 \h </w:instrText>
             </w:r>
             <w:r>
               <w:rPr>
@@ -988,7 +1060,7 @@
               <w:lang w:val="en-US"/>
             </w:rPr>
           </w:pPr>
-          <w:hyperlink w:anchor="_Toc225492654" w:history="1">
+          <w:hyperlink w:anchor="_Toc225505731" w:history="1">
             <w:r>
               <w:rPr>
                 <w:rStyle w:val="Hyperlink"/>
@@ -1032,7 +1104,7 @@
                 <w:noProof/>
                 <w:webHidden/>
               </w:rPr>
-              <w:instrText xml:space="preserve"> PAGEREF _Toc225492654 \h </w:instrText>
+              <w:instrText xml:space="preserve"> PAGEREF _Toc225505731 \h </w:instrText>
             </w:r>
             <w:r>
               <w:rPr>
@@ -1078,7 +1150,7 @@
               <w:lang w:val="en-US"/>
             </w:rPr>
           </w:pPr>
-          <w:hyperlink w:anchor="_Toc225492655" w:history="1">
+          <w:hyperlink w:anchor="_Toc225505732" w:history="1">
             <w:r>
               <w:rPr>
                 <w:rStyle w:val="Hyperlink"/>
@@ -1122,7 +1194,7 @@
                 <w:noProof/>
                 <w:webHidden/>
               </w:rPr>
-              <w:instrText xml:space="preserve"> PAGEREF _Toc225492655 \h </w:instrText>
+              <w:instrText xml:space="preserve"> PAGEREF _Toc225505732 \h </w:instrText>
             </w:r>
             <w:r>
               <w:rPr>
@@ -1168,7 +1240,7 @@
               <w:lang w:val="en-US"/>
             </w:rPr>
           </w:pPr>
-          <w:hyperlink w:anchor="_Toc225492656" w:history="1">
+          <w:hyperlink w:anchor="_Toc225505733" w:history="1">
             <w:r>
               <w:rPr>
                 <w:rStyle w:val="Hyperlink"/>
@@ -1212,7 +1284,7 @@
                 <w:noProof/>
                 <w:webHidden/>
               </w:rPr>
-              <w:instrText xml:space="preserve"> PAGEREF _Toc225492656 \h </w:instrText>
+              <w:instrText xml:space="preserve"> PAGEREF _Toc225505733 \h </w:instrText>
             </w:r>
             <w:r>
               <w:rPr>
@@ -1258,7 +1330,7 @@
               <w:lang w:val="en-US"/>
             </w:rPr>
           </w:pPr>
-          <w:hyperlink w:anchor="_Toc225492657" w:history="1">
+          <w:hyperlink w:anchor="_Toc225505734" w:history="1">
             <w:r>
               <w:rPr>
                 <w:rStyle w:val="Hyperlink"/>
@@ -1302,7 +1374,7 @@
                 <w:noProof/>
                 <w:webHidden/>
               </w:rPr>
-              <w:instrText xml:space="preserve"> PAGEREF _Toc225492657 \h </w:instrText>
+              <w:instrText xml:space="preserve"> PAGEREF _Toc225505734 \h </w:instrText>
             </w:r>
             <w:r>
               <w:rPr>
@@ -1348,7 +1420,7 @@
               <w:lang w:val="en-US"/>
             </w:rPr>
           </w:pPr>
-          <w:hyperlink w:anchor="_Toc225492658" w:history="1">
+          <w:hyperlink w:anchor="_Toc225505735" w:history="1">
             <w:r>
               <w:rPr>
                 <w:rStyle w:val="Hyperlink"/>
@@ -1392,7 +1464,7 @@
                 <w:noProof/>
                 <w:webHidden/>
               </w:rPr>
-              <w:instrText xml:space="preserve"> PAGEREF _Toc225492658 \h </w:instrText>
+              <w:instrText xml:space="preserve"> PAGEREF _Toc225505735 \h </w:instrText>
             </w:r>
             <w:r>
               <w:rPr>
@@ -1438,7 +1510,7 @@
               <w:lang w:val="en-US"/>
             </w:rPr>
           </w:pPr>
-          <w:hyperlink w:anchor="_Toc225492659" w:history="1">
+          <w:hyperlink w:anchor="_Toc225505736" w:history="1">
             <w:r>
               <w:rPr>
                 <w:rStyle w:val="Hyperlink"/>
@@ -1482,7 +1554,7 @@
                 <w:noProof/>
                 <w:webHidden/>
               </w:rPr>
-              <w:instrText xml:space="preserve"> PAGEREF _Toc225492659 \h </w:instrText>
+              <w:instrText xml:space="preserve"> PAGEREF _Toc225505736 \h </w:instrText>
             </w:r>
             <w:r>
               <w:rPr>
@@ -1528,7 +1600,7 @@
               <w:lang w:val="en-US"/>
             </w:rPr>
           </w:pPr>
-          <w:hyperlink w:anchor="_Toc225492660" w:history="1">
+          <w:hyperlink w:anchor="_Toc225505737" w:history="1">
             <w:r>
               <w:rPr>
                 <w:rStyle w:val="Hyperlink"/>
@@ -1572,7 +1644,7 @@
                 <w:noProof/>
                 <w:webHidden/>
               </w:rPr>
-              <w:instrText xml:space="preserve"> PAGEREF _Toc225492660 \h </w:instrText>
+              <w:instrText xml:space="preserve"> PAGEREF _Toc225505737 \h </w:instrText>
             </w:r>
             <w:r>
               <w:rPr>
@@ -1618,7 +1690,7 @@
               <w:lang w:val="en-US"/>
             </w:rPr>
           </w:pPr>
-          <w:hyperlink w:anchor="_Toc225492661" w:history="1">
+          <w:hyperlink w:anchor="_Toc225505738" w:history="1">
             <w:r>
               <w:rPr>
                 <w:rStyle w:val="Hyperlink"/>
@@ -1641,7 +1713,7 @@
                 <w:rStyle w:val="Hyperlink"/>
                 <w:noProof/>
               </w:rPr>
-              <w:t>Adatbázis felépítés – relációk – entitások</w:t>
+              <w:t>Adatbázis felépítés – entitások és relációk</w:t>
             </w:r>
             <w:r>
               <w:rPr>
@@ -1662,7 +1734,7 @@
                 <w:noProof/>
                 <w:webHidden/>
               </w:rPr>
-              <w:instrText xml:space="preserve"> PAGEREF _Toc225492661 \h </w:instrText>
+              <w:instrText xml:space="preserve"> PAGEREF _Toc225505738 \h </w:instrText>
             </w:r>
             <w:r>
               <w:rPr>
@@ -1708,7 +1780,7 @@
               <w:lang w:val="en-US"/>
             </w:rPr>
           </w:pPr>
-          <w:hyperlink w:anchor="_Toc225492662" w:history="1">
+          <w:hyperlink w:anchor="_Toc225505739" w:history="1">
             <w:r>
               <w:rPr>
                 <w:rStyle w:val="Hyperlink"/>
@@ -1731,7 +1803,7 @@
                 <w:rStyle w:val="Hyperlink"/>
                 <w:noProof/>
               </w:rPr>
-              <w:t>Kommunikáció, API és a websocket</w:t>
+              <w:t>Frontend</w:t>
             </w:r>
             <w:r>
               <w:rPr>
@@ -1752,7 +1824,7 @@
                 <w:noProof/>
                 <w:webHidden/>
               </w:rPr>
-              <w:instrText xml:space="preserve"> PAGEREF _Toc225492662 \h </w:instrText>
+              <w:instrText xml:space="preserve"> PAGEREF _Toc225505739 \h </w:instrText>
             </w:r>
             <w:r>
               <w:rPr>
@@ -1772,7 +1844,7 @@
                 <w:noProof/>
                 <w:webHidden/>
               </w:rPr>
-              <w:t>9</w:t>
+              <w:t>10</w:t>
             </w:r>
             <w:r>
               <w:rPr>
@@ -1798,7 +1870,7 @@
               <w:lang w:val="en-US"/>
             </w:rPr>
           </w:pPr>
-          <w:hyperlink w:anchor="_Toc225492663" w:history="1">
+          <w:hyperlink w:anchor="_Toc225505740" w:history="1">
             <w:r>
               <w:rPr>
                 <w:rStyle w:val="Hyperlink"/>
@@ -1821,7 +1893,7 @@
                 <w:rStyle w:val="Hyperlink"/>
                 <w:noProof/>
               </w:rPr>
-              <w:t>File tárolás - Blob storage</w:t>
+              <w:t>Backend API</w:t>
             </w:r>
             <w:r>
               <w:rPr>
@@ -1842,7 +1914,7 @@
                 <w:noProof/>
                 <w:webHidden/>
               </w:rPr>
-              <w:instrText xml:space="preserve"> PAGEREF _Toc225492663 \h </w:instrText>
+              <w:instrText xml:space="preserve"> PAGEREF _Toc225505740 \h </w:instrText>
             </w:r>
             <w:r>
               <w:rPr>
@@ -1862,7 +1934,7 @@
                 <w:noProof/>
                 <w:webHidden/>
               </w:rPr>
-              <w:t>9</w:t>
+              <w:t>11</w:t>
             </w:r>
             <w:r>
               <w:rPr>
@@ -1888,7 +1960,7 @@
               <w:lang w:val="en-US"/>
             </w:rPr>
           </w:pPr>
-          <w:hyperlink w:anchor="_Toc225492664" w:history="1">
+          <w:hyperlink w:anchor="_Toc225505741" w:history="1">
             <w:r>
               <w:rPr>
                 <w:rStyle w:val="Hyperlink"/>
@@ -1911,7 +1983,7 @@
                 <w:rStyle w:val="Hyperlink"/>
                 <w:noProof/>
               </w:rPr>
-              <w:t>Biztonság, JWT token authentikáció</w:t>
+              <w:t>WebSocket server</w:t>
             </w:r>
             <w:r>
               <w:rPr>
@@ -1932,223 +2004,7 @@
                 <w:noProof/>
                 <w:webHidden/>
               </w:rPr>
-              <w:instrText xml:space="preserve"> PAGEREF _Toc225492664 \h </w:instrText>
-            </w:r>
-            <w:r>
-              <w:rPr>
-                <w:noProof/>
-                <w:webHidden/>
-              </w:rPr>
-            </w:r>
-            <w:r>
-              <w:rPr>
-                <w:noProof/>
-                <w:webHidden/>
-              </w:rPr>
-              <w:fldChar w:fldCharType="separate"/>
-            </w:r>
-            <w:r>
-              <w:rPr>
-                <w:noProof/>
-                <w:webHidden/>
-              </w:rPr>
-              <w:t>9</w:t>
-            </w:r>
-            <w:r>
-              <w:rPr>
-                <w:noProof/>
-                <w:webHidden/>
-              </w:rPr>
-              <w:fldChar w:fldCharType="end"/>
-            </w:r>
-          </w:hyperlink>
-        </w:p>
-        <w:p>
-          <w:pPr>
-            <w:pStyle w:val="TOC1"/>
-            <w:tabs>
-              <w:tab w:val="right" w:leader="dot" w:pos="8827"/>
-            </w:tabs>
-            <w:rPr>
-              <w:rFonts w:eastAsiaTheme="minorEastAsia"/>
-              <w:noProof/>
-              <w:sz w:val="24"/>
-              <w:szCs w:val="24"/>
-              <w:lang w:val="en-US"/>
-            </w:rPr>
-          </w:pPr>
-          <w:hyperlink w:anchor="_Toc225492665" w:history="1">
-            <w:r>
-              <w:rPr>
-                <w:rStyle w:val="Hyperlink"/>
-                <w:noProof/>
-              </w:rPr>
-              <w:t>Irodalomjegyzék</w:t>
-            </w:r>
-            <w:r>
-              <w:rPr>
-                <w:noProof/>
-                <w:webHidden/>
-              </w:rPr>
-              <w:tab/>
-            </w:r>
-            <w:r>
-              <w:rPr>
-                <w:noProof/>
-                <w:webHidden/>
-              </w:rPr>
-              <w:fldChar w:fldCharType="begin"/>
-            </w:r>
-            <w:r>
-              <w:rPr>
-                <w:noProof/>
-                <w:webHidden/>
-              </w:rPr>
-              <w:instrText xml:space="preserve"> PAGEREF _Toc225492665 \h </w:instrText>
-            </w:r>
-            <w:r>
-              <w:rPr>
-                <w:noProof/>
-                <w:webHidden/>
-              </w:rPr>
-            </w:r>
-            <w:r>
-              <w:rPr>
-                <w:noProof/>
-                <w:webHidden/>
-              </w:rPr>
-              <w:fldChar w:fldCharType="separate"/>
-            </w:r>
-            <w:r>
-              <w:rPr>
-                <w:noProof/>
-                <w:webHidden/>
-              </w:rPr>
-              <w:t>10</w:t>
-            </w:r>
-            <w:r>
-              <w:rPr>
-                <w:noProof/>
-                <w:webHidden/>
-              </w:rPr>
-              <w:fldChar w:fldCharType="end"/>
-            </w:r>
-          </w:hyperlink>
-        </w:p>
-        <w:p>
-          <w:pPr>
-            <w:pStyle w:val="TOC1"/>
-            <w:tabs>
-              <w:tab w:val="right" w:leader="dot" w:pos="8827"/>
-            </w:tabs>
-            <w:rPr>
-              <w:rFonts w:eastAsiaTheme="minorEastAsia"/>
-              <w:noProof/>
-              <w:sz w:val="24"/>
-              <w:szCs w:val="24"/>
-              <w:lang w:val="en-US"/>
-            </w:rPr>
-          </w:pPr>
-          <w:hyperlink w:anchor="_Toc225492666" w:history="1">
-            <w:r>
-              <w:rPr>
-                <w:rStyle w:val="Hyperlink"/>
-                <w:noProof/>
-              </w:rPr>
-              <w:t>Nyilatkozat</w:t>
-            </w:r>
-            <w:r>
-              <w:rPr>
-                <w:noProof/>
-                <w:webHidden/>
-              </w:rPr>
-              <w:tab/>
-            </w:r>
-            <w:r>
-              <w:rPr>
-                <w:noProof/>
-                <w:webHidden/>
-              </w:rPr>
-              <w:fldChar w:fldCharType="begin"/>
-            </w:r>
-            <w:r>
-              <w:rPr>
-                <w:noProof/>
-                <w:webHidden/>
-              </w:rPr>
-              <w:instrText xml:space="preserve"> PAGEREF _Toc225492666 \h </w:instrText>
-            </w:r>
-            <w:r>
-              <w:rPr>
-                <w:noProof/>
-                <w:webHidden/>
-              </w:rPr>
-            </w:r>
-            <w:r>
-              <w:rPr>
-                <w:noProof/>
-                <w:webHidden/>
-              </w:rPr>
-              <w:fldChar w:fldCharType="separate"/>
-            </w:r>
-            <w:r>
-              <w:rPr>
-                <w:noProof/>
-                <w:webHidden/>
-              </w:rPr>
-              <w:t>11</w:t>
-            </w:r>
-            <w:r>
-              <w:rPr>
-                <w:noProof/>
-                <w:webHidden/>
-              </w:rPr>
-              <w:fldChar w:fldCharType="end"/>
-            </w:r>
-          </w:hyperlink>
-        </w:p>
-        <w:p>
-          <w:pPr>
-            <w:pStyle w:val="TOC1"/>
-            <w:tabs>
-              <w:tab w:val="right" w:leader="dot" w:pos="8827"/>
-            </w:tabs>
-            <w:rPr>
-              <w:rFonts w:eastAsiaTheme="minorEastAsia"/>
-              <w:noProof/>
-              <w:sz w:val="24"/>
-              <w:szCs w:val="24"/>
-              <w:lang w:val="en-US"/>
-            </w:rPr>
-          </w:pPr>
-          <w:hyperlink w:anchor="_Toc225492667" w:history="1">
-            <w:r>
-              <w:rPr>
-                <w:rStyle w:val="Hyperlink"/>
-                <w:noProof/>
-              </w:rPr>
-              <w:t>Mellékletek</w:t>
-            </w:r>
-            <w:r>
-              <w:rPr>
-                <w:noProof/>
-                <w:webHidden/>
-              </w:rPr>
-              <w:tab/>
-            </w:r>
-            <w:r>
-              <w:rPr>
-                <w:noProof/>
-                <w:webHidden/>
-              </w:rPr>
-              <w:fldChar w:fldCharType="begin"/>
-            </w:r>
-            <w:r>
-              <w:rPr>
-                <w:noProof/>
-                <w:webHidden/>
-              </w:rPr>
-              <w:instrText xml:space="preserve"> PAGEREF _Toc225492667 \h </w:instrText>
+              <w:instrText xml:space="preserve"> PAGEREF _Toc225505741 \h </w:instrText>
             </w:r>
             <w:r>
               <w:rPr>
@@ -2194,7 +2050,7 @@
               <w:lang w:val="en-US"/>
             </w:rPr>
           </w:pPr>
-          <w:hyperlink w:anchor="_Toc225492668" w:history="1">
+          <w:hyperlink w:anchor="_Toc225505742" w:history="1">
             <w:r>
               <w:rPr>
                 <w:rStyle w:val="Hyperlink"/>
@@ -2217,6 +2073,402 @@
                 <w:rStyle w:val="Hyperlink"/>
                 <w:noProof/>
               </w:rPr>
+              <w:t>File Blob storage</w:t>
+            </w:r>
+            <w:r>
+              <w:rPr>
+                <w:noProof/>
+                <w:webHidden/>
+              </w:rPr>
+              <w:tab/>
+            </w:r>
+            <w:r>
+              <w:rPr>
+                <w:noProof/>
+                <w:webHidden/>
+              </w:rPr>
+              <w:fldChar w:fldCharType="begin"/>
+            </w:r>
+            <w:r>
+              <w:rPr>
+                <w:noProof/>
+                <w:webHidden/>
+              </w:rPr>
+              <w:instrText xml:space="preserve"> PAGEREF _Toc225505742 \h </w:instrText>
+            </w:r>
+            <w:r>
+              <w:rPr>
+                <w:noProof/>
+                <w:webHidden/>
+              </w:rPr>
+            </w:r>
+            <w:r>
+              <w:rPr>
+                <w:noProof/>
+                <w:webHidden/>
+              </w:rPr>
+              <w:fldChar w:fldCharType="separate"/>
+            </w:r>
+            <w:r>
+              <w:rPr>
+                <w:noProof/>
+                <w:webHidden/>
+              </w:rPr>
+              <w:t>12</w:t>
+            </w:r>
+            <w:r>
+              <w:rPr>
+                <w:noProof/>
+                <w:webHidden/>
+              </w:rPr>
+              <w:fldChar w:fldCharType="end"/>
+            </w:r>
+          </w:hyperlink>
+        </w:p>
+        <w:p>
+          <w:pPr>
+            <w:pStyle w:val="TOC2"/>
+            <w:tabs>
+              <w:tab w:val="left" w:pos="960"/>
+              <w:tab w:val="right" w:leader="dot" w:pos="8827"/>
+            </w:tabs>
+            <w:rPr>
+              <w:rFonts w:eastAsiaTheme="minorEastAsia"/>
+              <w:noProof/>
+              <w:sz w:val="24"/>
+              <w:szCs w:val="24"/>
+              <w:lang w:val="en-US"/>
+            </w:rPr>
+          </w:pPr>
+          <w:hyperlink w:anchor="_Toc225505743" w:history="1">
+            <w:r>
+              <w:rPr>
+                <w:rStyle w:val="Hyperlink"/>
+                <w:noProof/>
+              </w:rPr>
+              <w:t>2.6.</w:t>
+            </w:r>
+            <w:r>
+              <w:rPr>
+                <w:rFonts w:eastAsiaTheme="minorEastAsia"/>
+                <w:noProof/>
+                <w:sz w:val="24"/>
+                <w:szCs w:val="24"/>
+                <w:lang w:val="en-US"/>
+              </w:rPr>
+              <w:tab/>
+            </w:r>
+            <w:r>
+              <w:rPr>
+                <w:rStyle w:val="Hyperlink"/>
+                <w:noProof/>
+              </w:rPr>
+              <w:t>Biztonság, JWT token authentikáció</w:t>
+            </w:r>
+            <w:r>
+              <w:rPr>
+                <w:noProof/>
+                <w:webHidden/>
+              </w:rPr>
+              <w:tab/>
+            </w:r>
+            <w:r>
+              <w:rPr>
+                <w:noProof/>
+                <w:webHidden/>
+              </w:rPr>
+              <w:fldChar w:fldCharType="begin"/>
+            </w:r>
+            <w:r>
+              <w:rPr>
+                <w:noProof/>
+                <w:webHidden/>
+              </w:rPr>
+              <w:instrText xml:space="preserve"> PAGEREF _Toc225505743 \h </w:instrText>
+            </w:r>
+            <w:r>
+              <w:rPr>
+                <w:noProof/>
+                <w:webHidden/>
+              </w:rPr>
+            </w:r>
+            <w:r>
+              <w:rPr>
+                <w:noProof/>
+                <w:webHidden/>
+              </w:rPr>
+              <w:fldChar w:fldCharType="separate"/>
+            </w:r>
+            <w:r>
+              <w:rPr>
+                <w:noProof/>
+                <w:webHidden/>
+              </w:rPr>
+              <w:t>13</w:t>
+            </w:r>
+            <w:r>
+              <w:rPr>
+                <w:noProof/>
+                <w:webHidden/>
+              </w:rPr>
+              <w:fldChar w:fldCharType="end"/>
+            </w:r>
+          </w:hyperlink>
+        </w:p>
+        <w:p>
+          <w:pPr>
+            <w:pStyle w:val="TOC1"/>
+            <w:tabs>
+              <w:tab w:val="right" w:leader="dot" w:pos="8827"/>
+            </w:tabs>
+            <w:rPr>
+              <w:rFonts w:eastAsiaTheme="minorEastAsia"/>
+              <w:noProof/>
+              <w:sz w:val="24"/>
+              <w:szCs w:val="24"/>
+              <w:lang w:val="en-US"/>
+            </w:rPr>
+          </w:pPr>
+          <w:hyperlink w:anchor="_Toc225505744" w:history="1">
+            <w:r>
+              <w:rPr>
+                <w:rStyle w:val="Hyperlink"/>
+                <w:noProof/>
+              </w:rPr>
+              <w:t>Irodalomjegyzék</w:t>
+            </w:r>
+            <w:r>
+              <w:rPr>
+                <w:noProof/>
+                <w:webHidden/>
+              </w:rPr>
+              <w:tab/>
+            </w:r>
+            <w:r>
+              <w:rPr>
+                <w:noProof/>
+                <w:webHidden/>
+              </w:rPr>
+              <w:fldChar w:fldCharType="begin"/>
+            </w:r>
+            <w:r>
+              <w:rPr>
+                <w:noProof/>
+                <w:webHidden/>
+              </w:rPr>
+              <w:instrText xml:space="preserve"> PAGEREF _Toc225505744 \h </w:instrText>
+            </w:r>
+            <w:r>
+              <w:rPr>
+                <w:noProof/>
+                <w:webHidden/>
+              </w:rPr>
+            </w:r>
+            <w:r>
+              <w:rPr>
+                <w:noProof/>
+                <w:webHidden/>
+              </w:rPr>
+              <w:fldChar w:fldCharType="separate"/>
+            </w:r>
+            <w:r>
+              <w:rPr>
+                <w:noProof/>
+                <w:webHidden/>
+              </w:rPr>
+              <w:t>14</w:t>
+            </w:r>
+            <w:r>
+              <w:rPr>
+                <w:noProof/>
+                <w:webHidden/>
+              </w:rPr>
+              <w:fldChar w:fldCharType="end"/>
+            </w:r>
+          </w:hyperlink>
+        </w:p>
+        <w:p>
+          <w:pPr>
+            <w:pStyle w:val="TOC1"/>
+            <w:tabs>
+              <w:tab w:val="right" w:leader="dot" w:pos="8827"/>
+            </w:tabs>
+            <w:rPr>
+              <w:rFonts w:eastAsiaTheme="minorEastAsia"/>
+              <w:noProof/>
+              <w:sz w:val="24"/>
+              <w:szCs w:val="24"/>
+              <w:lang w:val="en-US"/>
+            </w:rPr>
+          </w:pPr>
+          <w:hyperlink w:anchor="_Toc225505745" w:history="1">
+            <w:r>
+              <w:rPr>
+                <w:rStyle w:val="Hyperlink"/>
+                <w:noProof/>
+              </w:rPr>
+              <w:t>Nyilatkozat</w:t>
+            </w:r>
+            <w:r>
+              <w:rPr>
+                <w:noProof/>
+                <w:webHidden/>
+              </w:rPr>
+              <w:tab/>
+            </w:r>
+            <w:r>
+              <w:rPr>
+                <w:noProof/>
+                <w:webHidden/>
+              </w:rPr>
+              <w:fldChar w:fldCharType="begin"/>
+            </w:r>
+            <w:r>
+              <w:rPr>
+                <w:noProof/>
+                <w:webHidden/>
+              </w:rPr>
+              <w:instrText xml:space="preserve"> PAGEREF _Toc225505745 \h </w:instrText>
+            </w:r>
+            <w:r>
+              <w:rPr>
+                <w:noProof/>
+                <w:webHidden/>
+              </w:rPr>
+            </w:r>
+            <w:r>
+              <w:rPr>
+                <w:noProof/>
+                <w:webHidden/>
+              </w:rPr>
+              <w:fldChar w:fldCharType="separate"/>
+            </w:r>
+            <w:r>
+              <w:rPr>
+                <w:noProof/>
+                <w:webHidden/>
+              </w:rPr>
+              <w:t>15</w:t>
+            </w:r>
+            <w:r>
+              <w:rPr>
+                <w:noProof/>
+                <w:webHidden/>
+              </w:rPr>
+              <w:fldChar w:fldCharType="end"/>
+            </w:r>
+          </w:hyperlink>
+        </w:p>
+        <w:p>
+          <w:pPr>
+            <w:pStyle w:val="TOC1"/>
+            <w:tabs>
+              <w:tab w:val="right" w:leader="dot" w:pos="8827"/>
+            </w:tabs>
+            <w:rPr>
+              <w:rFonts w:eastAsiaTheme="minorEastAsia"/>
+              <w:noProof/>
+              <w:sz w:val="24"/>
+              <w:szCs w:val="24"/>
+              <w:lang w:val="en-US"/>
+            </w:rPr>
+          </w:pPr>
+          <w:hyperlink w:anchor="_Toc225505746" w:history="1">
+            <w:r>
+              <w:rPr>
+                <w:rStyle w:val="Hyperlink"/>
+                <w:noProof/>
+              </w:rPr>
+              <w:t>Mellékletek</w:t>
+            </w:r>
+            <w:r>
+              <w:rPr>
+                <w:noProof/>
+                <w:webHidden/>
+              </w:rPr>
+              <w:tab/>
+            </w:r>
+            <w:r>
+              <w:rPr>
+                <w:noProof/>
+                <w:webHidden/>
+              </w:rPr>
+              <w:fldChar w:fldCharType="begin"/>
+            </w:r>
+            <w:r>
+              <w:rPr>
+                <w:noProof/>
+                <w:webHidden/>
+              </w:rPr>
+              <w:instrText xml:space="preserve"> PAGEREF _Toc225505746 \h </w:instrText>
+            </w:r>
+            <w:r>
+              <w:rPr>
+                <w:noProof/>
+                <w:webHidden/>
+              </w:rPr>
+            </w:r>
+            <w:r>
+              <w:rPr>
+                <w:noProof/>
+                <w:webHidden/>
+              </w:rPr>
+              <w:fldChar w:fldCharType="separate"/>
+            </w:r>
+            <w:r>
+              <w:rPr>
+                <w:noProof/>
+                <w:webHidden/>
+              </w:rPr>
+              <w:t>16</w:t>
+            </w:r>
+            <w:r>
+              <w:rPr>
+                <w:noProof/>
+                <w:webHidden/>
+              </w:rPr>
+              <w:fldChar w:fldCharType="end"/>
+            </w:r>
+          </w:hyperlink>
+        </w:p>
+        <w:p>
+          <w:pPr>
+            <w:pStyle w:val="TOC2"/>
+            <w:tabs>
+              <w:tab w:val="left" w:pos="960"/>
+              <w:tab w:val="right" w:leader="dot" w:pos="8827"/>
+            </w:tabs>
+            <w:rPr>
+              <w:rFonts w:eastAsiaTheme="minorEastAsia"/>
+              <w:noProof/>
+              <w:sz w:val="24"/>
+              <w:szCs w:val="24"/>
+              <w:lang w:val="en-US"/>
+            </w:rPr>
+          </w:pPr>
+          <w:hyperlink w:anchor="_Toc225505747" w:history="1">
+            <w:r>
+              <w:rPr>
+                <w:rStyle w:val="Hyperlink"/>
+                <w:noProof/>
+              </w:rPr>
+              <w:t>2.7.</w:t>
+            </w:r>
+            <w:r>
+              <w:rPr>
+                <w:rFonts w:eastAsiaTheme="minorEastAsia"/>
+                <w:noProof/>
+                <w:sz w:val="24"/>
+                <w:szCs w:val="24"/>
+                <w:lang w:val="en-US"/>
+              </w:rPr>
+              <w:tab/>
+            </w:r>
+            <w:r>
+              <w:rPr>
+                <w:rStyle w:val="Hyperlink"/>
+                <w:noProof/>
+              </w:rPr>
               <w:t>Adatbázis relációk</w:t>
             </w:r>
             <w:r>
@@ -2238,7 +2490,7 @@
                 <w:noProof/>
                 <w:webHidden/>
               </w:rPr>
-              <w:instrText xml:space="preserve"> PAGEREF _Toc225492668 \h </w:instrText>
+              <w:instrText xml:space="preserve"> PAGEREF _Toc225505747 \h </w:instrText>
             </w:r>
             <w:r>
               <w:rPr>
@@ -2258,7 +2510,7 @@
                 <w:noProof/>
                 <w:webHidden/>
               </w:rPr>
-              <w:t>12</w:t>
+              <w:t>16</w:t>
             </w:r>
             <w:r>
               <w:rPr>
@@ -2363,8 +2615,19 @@
           <w:sz w:val="24"/>
           <w:szCs w:val="24"/>
         </w:rPr>
-        <w:t>Gráf alapú struktúra deffiniálása</w:t>
-      </w:r>
+        <w:t xml:space="preserve">Gráf alapú struktúra </w:t>
+      </w:r>
+      <w:proofErr w:type="spellStart"/>
+      <w:r>
+        <w:rPr>
+          <w:rFonts w:ascii="Times New Roman" w:hAnsi="Times New Roman" w:cs="Times New Roman"/>
+          <w:color w:val="EE0000"/>
+          <w:sz w:val="24"/>
+          <w:szCs w:val="24"/>
+        </w:rPr>
+        <w:t>deffiniálása</w:t>
+      </w:r>
+      <w:proofErr w:type="spellEnd"/>
     </w:p>
     <w:p>
       <w:pPr>
@@ -2378,6 +2641,7 @@
           <w:szCs w:val="24"/>
         </w:rPr>
       </w:pPr>
+      <w:proofErr w:type="spellStart"/>
       <w:r>
         <w:rPr>
           <w:rFonts w:ascii="Times New Roman" w:hAnsi="Times New Roman" w:cs="Times New Roman"/>
@@ -2385,7 +2649,17 @@
           <w:sz w:val="24"/>
           <w:szCs w:val="24"/>
         </w:rPr>
-        <w:t>Promtolás, kipróbált és használt modellek</w:t>
+        <w:t>Promtolás</w:t>
+      </w:r>
+      <w:proofErr w:type="spellEnd"/>
+      <w:r>
+        <w:rPr>
+          <w:rFonts w:ascii="Times New Roman" w:hAnsi="Times New Roman" w:cs="Times New Roman"/>
+          <w:color w:val="EE0000"/>
+          <w:sz w:val="24"/>
+          <w:szCs w:val="24"/>
+        </w:rPr>
+        <w:t>, kipróbált és használt modellek</w:t>
       </w:r>
       <w:r>
         <w:rPr>
@@ -2416,7 +2690,27 @@
           <w:szCs w:val="24"/>
         </w:rPr>
         <w:tab/>
-        <w:t>Milyen folyamatok és miért csatolódtak rá a pálya generálásra, hint rendszer</w:t>
+        <w:t xml:space="preserve">Milyen folyamatok és miért </w:t>
+      </w:r>
+      <w:proofErr w:type="spellStart"/>
+      <w:r>
+        <w:rPr>
+          <w:rFonts w:ascii="Times New Roman" w:hAnsi="Times New Roman" w:cs="Times New Roman"/>
+          <w:color w:val="EE0000"/>
+          <w:sz w:val="24"/>
+          <w:szCs w:val="24"/>
+        </w:rPr>
+        <w:t>csatolódtak</w:t>
+      </w:r>
+      <w:proofErr w:type="spellEnd"/>
+      <w:r>
+        <w:rPr>
+          <w:rFonts w:ascii="Times New Roman" w:hAnsi="Times New Roman" w:cs="Times New Roman"/>
+          <w:color w:val="EE0000"/>
+          <w:sz w:val="24"/>
+          <w:szCs w:val="24"/>
+        </w:rPr>
+        <w:t xml:space="preserve"> rá a pálya generálásra, hint rendszer</w:t>
       </w:r>
     </w:p>
     <w:p>
@@ -2460,7 +2754,66 @@
           <w:szCs w:val="24"/>
         </w:rPr>
         <w:tab/>
-        <w:t>Sprite png generálása amit végül a modell megoldott</w:t>
+      </w:r>
+      <w:proofErr w:type="spellStart"/>
+      <w:r>
+        <w:rPr>
+          <w:rFonts w:ascii="Times New Roman" w:hAnsi="Times New Roman" w:cs="Times New Roman"/>
+          <w:color w:val="EE0000"/>
+          <w:sz w:val="24"/>
+          <w:szCs w:val="24"/>
+        </w:rPr>
+        <w:t>Sprite</w:t>
+      </w:r>
+      <w:proofErr w:type="spellEnd"/>
+      <w:r>
+        <w:rPr>
+          <w:rFonts w:ascii="Times New Roman" w:hAnsi="Times New Roman" w:cs="Times New Roman"/>
+          <w:color w:val="EE0000"/>
+          <w:sz w:val="24"/>
+          <w:szCs w:val="24"/>
+        </w:rPr>
+        <w:t xml:space="preserve"> </w:t>
+      </w:r>
+      <w:proofErr w:type="spellStart"/>
+      <w:r>
+        <w:rPr>
+          <w:rFonts w:ascii="Times New Roman" w:hAnsi="Times New Roman" w:cs="Times New Roman"/>
+          <w:color w:val="EE0000"/>
+          <w:sz w:val="24"/>
+          <w:szCs w:val="24"/>
+        </w:rPr>
+        <w:t>png</w:t>
+      </w:r>
+      <w:proofErr w:type="spellEnd"/>
+      <w:r>
+        <w:rPr>
+          <w:rFonts w:ascii="Times New Roman" w:hAnsi="Times New Roman" w:cs="Times New Roman"/>
+          <w:color w:val="EE0000"/>
+          <w:sz w:val="24"/>
+          <w:szCs w:val="24"/>
+        </w:rPr>
+        <w:t xml:space="preserve"> </w:t>
+      </w:r>
+      <w:proofErr w:type="gramStart"/>
+      <w:r>
+        <w:rPr>
+          <w:rFonts w:ascii="Times New Roman" w:hAnsi="Times New Roman" w:cs="Times New Roman"/>
+          <w:color w:val="EE0000"/>
+          <w:sz w:val="24"/>
+          <w:szCs w:val="24"/>
+        </w:rPr>
+        <w:t>generálása</w:t>
+      </w:r>
+      <w:proofErr w:type="gramEnd"/>
+      <w:r>
+        <w:rPr>
+          <w:rFonts w:ascii="Times New Roman" w:hAnsi="Times New Roman" w:cs="Times New Roman"/>
+          <w:color w:val="EE0000"/>
+          <w:sz w:val="24"/>
+          <w:szCs w:val="24"/>
+        </w:rPr>
+        <w:t xml:space="preserve"> amit végül a modell megoldott</w:t>
       </w:r>
     </w:p>
     <w:p>
@@ -2524,6 +2877,7 @@
           <w:sz w:val="24"/>
           <w:szCs w:val="24"/>
         </w:rPr>
+        <w:lastRenderedPageBreak/>
         <w:tab/>
         <w:t>Milyen költsége van egy pálya generálásának</w:t>
       </w:r>
@@ -2568,7 +2922,6 @@
           <w:sz w:val="24"/>
           <w:szCs w:val="24"/>
         </w:rPr>
-        <w:lastRenderedPageBreak/>
         <w:t>Frontend és felhasználói felületek</w:t>
       </w:r>
     </w:p>
@@ -2613,7 +2966,27 @@
           <w:szCs w:val="24"/>
         </w:rPr>
         <w:tab/>
-        <w:t>Pálya generálás – Token rendszer</w:t>
+        <w:t xml:space="preserve">Pálya generálás – </w:t>
+      </w:r>
+      <w:proofErr w:type="spellStart"/>
+      <w:r>
+        <w:rPr>
+          <w:rFonts w:ascii="Times New Roman" w:hAnsi="Times New Roman" w:cs="Times New Roman"/>
+          <w:color w:val="EE0000"/>
+          <w:sz w:val="24"/>
+          <w:szCs w:val="24"/>
+        </w:rPr>
+        <w:t>Token</w:t>
+      </w:r>
+      <w:proofErr w:type="spellEnd"/>
+      <w:r>
+        <w:rPr>
+          <w:rFonts w:ascii="Times New Roman" w:hAnsi="Times New Roman" w:cs="Times New Roman"/>
+          <w:color w:val="EE0000"/>
+          <w:sz w:val="24"/>
+          <w:szCs w:val="24"/>
+        </w:rPr>
+        <w:t xml:space="preserve"> rendszer</w:t>
       </w:r>
     </w:p>
     <w:p>
@@ -2700,7 +3073,27 @@
           <w:szCs w:val="24"/>
         </w:rPr>
         <w:tab/>
-        <w:t>Több szoba, több logikai feladat, ezeknek jelenlegi AI json generálás korlátjai</w:t>
+        <w:t xml:space="preserve">Több szoba, több logikai feladat, ezeknek jelenlegi AI </w:t>
+      </w:r>
+      <w:proofErr w:type="spellStart"/>
+      <w:r>
+        <w:rPr>
+          <w:rFonts w:ascii="Times New Roman" w:hAnsi="Times New Roman" w:cs="Times New Roman"/>
+          <w:color w:val="EE0000"/>
+          <w:sz w:val="24"/>
+          <w:szCs w:val="24"/>
+        </w:rPr>
+        <w:t>json</w:t>
+      </w:r>
+      <w:proofErr w:type="spellEnd"/>
+      <w:r>
+        <w:rPr>
+          <w:rFonts w:ascii="Times New Roman" w:hAnsi="Times New Roman" w:cs="Times New Roman"/>
+          <w:color w:val="EE0000"/>
+          <w:sz w:val="24"/>
+          <w:szCs w:val="24"/>
+        </w:rPr>
+        <w:t xml:space="preserve"> generálás korlátjai</w:t>
       </w:r>
     </w:p>
     <w:p>
@@ -2744,7 +3137,27 @@
           <w:szCs w:val="24"/>
         </w:rPr>
         <w:tab/>
-        <w:t>Dinamikus js generálás</w:t>
+        <w:t xml:space="preserve">Dinamikus </w:t>
+      </w:r>
+      <w:proofErr w:type="spellStart"/>
+      <w:r>
+        <w:rPr>
+          <w:rFonts w:ascii="Times New Roman" w:hAnsi="Times New Roman" w:cs="Times New Roman"/>
+          <w:color w:val="EE0000"/>
+          <w:sz w:val="24"/>
+          <w:szCs w:val="24"/>
+        </w:rPr>
+        <w:t>js</w:t>
+      </w:r>
+      <w:proofErr w:type="spellEnd"/>
+      <w:r>
+        <w:rPr>
+          <w:rFonts w:ascii="Times New Roman" w:hAnsi="Times New Roman" w:cs="Times New Roman"/>
+          <w:color w:val="EE0000"/>
+          <w:sz w:val="24"/>
+          <w:szCs w:val="24"/>
+        </w:rPr>
+        <w:t xml:space="preserve"> generálás</w:t>
       </w:r>
     </w:p>
     <w:p>
@@ -2787,8 +3200,18 @@
           <w:szCs w:val="24"/>
         </w:rPr>
         <w:tab/>
+      </w:r>
+      <w:proofErr w:type="spellStart"/>
+      <w:r>
+        <w:rPr>
+          <w:rFonts w:ascii="Times New Roman" w:hAnsi="Times New Roman" w:cs="Times New Roman"/>
+          <w:color w:val="EE0000"/>
+          <w:sz w:val="24"/>
+          <w:szCs w:val="24"/>
+        </w:rPr>
         <w:t>Copilot</w:t>
       </w:r>
+      <w:proofErr w:type="spellEnd"/>
     </w:p>
     <w:p>
       <w:pPr>
@@ -2809,7 +3232,26 @@
           <w:szCs w:val="24"/>
         </w:rPr>
         <w:tab/>
-        <w:t>ChatGpt/Claude</w:t>
+      </w:r>
+      <w:proofErr w:type="spellStart"/>
+      <w:r>
+        <w:rPr>
+          <w:rFonts w:ascii="Times New Roman" w:hAnsi="Times New Roman" w:cs="Times New Roman"/>
+          <w:color w:val="EE0000"/>
+          <w:sz w:val="24"/>
+          <w:szCs w:val="24"/>
+        </w:rPr>
+        <w:t>ChatGpt</w:t>
+      </w:r>
+      <w:proofErr w:type="spellEnd"/>
+      <w:r>
+        <w:rPr>
+          <w:rFonts w:ascii="Times New Roman" w:hAnsi="Times New Roman" w:cs="Times New Roman"/>
+          <w:color w:val="EE0000"/>
+          <w:sz w:val="24"/>
+          <w:szCs w:val="24"/>
+        </w:rPr>
+        <w:t>/Claude</w:t>
       </w:r>
     </w:p>
     <w:p>
@@ -2839,8 +3281,19 @@
           <w:sz w:val="24"/>
           <w:szCs w:val="24"/>
         </w:rPr>
-        <w:t>AI szerepe a fejlesztési folyamatban és annak korlátai</w:t>
-      </w:r>
+        <w:t xml:space="preserve">AI szerepe a fejlesztési folyamatban és annak </w:t>
+      </w:r>
+      <w:proofErr w:type="spellStart"/>
+      <w:r>
+        <w:rPr>
+          <w:rFonts w:ascii="Times New Roman" w:hAnsi="Times New Roman" w:cs="Times New Roman"/>
+          <w:color w:val="EE0000"/>
+          <w:sz w:val="24"/>
+          <w:szCs w:val="24"/>
+        </w:rPr>
+        <w:t>korlátai</w:t>
+      </w:r>
+      <w:proofErr w:type="spellEnd"/>
     </w:p>
     <w:p>
       <w:pPr>
@@ -2933,7 +3386,7 @@
           <w:i/>
         </w:rPr>
       </w:pPr>
-      <w:bookmarkStart w:id="2" w:name="_Toc225492653"/>
+      <w:bookmarkStart w:id="2" w:name="_Toc225505730"/>
       <w:r>
         <w:lastRenderedPageBreak/>
         <w:t>Technológiák</w:t>
@@ -2952,11 +3405,16 @@
       <w:pPr>
         <w:pStyle w:val="Szakdolgozath2"/>
       </w:pPr>
-      <w:bookmarkStart w:id="3" w:name="_Toc225492654"/>
-      <w:r>
-        <w:t>Docker és konténerizáció</w:t>
+      <w:bookmarkStart w:id="3" w:name="_Toc225505731"/>
+      <w:r>
+        <w:t xml:space="preserve">Docker és </w:t>
+      </w:r>
+      <w:proofErr w:type="spellStart"/>
+      <w:r>
+        <w:t>konténerizáció</w:t>
       </w:r>
       <w:bookmarkEnd w:id="3"/>
+      <w:proofErr w:type="spellEnd"/>
     </w:p>
     <w:p>
       <w:pPr>
@@ -2966,10 +3424,23 @@
         <w:t>A</w:t>
       </w:r>
       <w:r>
-        <w:t xml:space="preserve">z alkalmazés fejlesztése </w:t>
-      </w:r>
-      <w:r>
-        <w:t>konténerizált környezetben történik Docker</w:t>
+        <w:t xml:space="preserve">z </w:t>
+      </w:r>
+      <w:proofErr w:type="spellStart"/>
+      <w:r>
+        <w:t>alkalmazés</w:t>
+      </w:r>
+      <w:proofErr w:type="spellEnd"/>
+      <w:r>
+        <w:t xml:space="preserve"> fejlesztése </w:t>
+      </w:r>
+      <w:proofErr w:type="spellStart"/>
+      <w:r>
+        <w:t>konténerizált</w:t>
+      </w:r>
+      <w:proofErr w:type="spellEnd"/>
+      <w:r>
+        <w:t xml:space="preserve"> környezetben történik Docker</w:t>
       </w:r>
       <w:sdt>
         <w:sdtPr>
@@ -2981,7 +3452,7 @@
             <w:fldChar w:fldCharType="begin"/>
           </w:r>
           <w:r>
-            <w:instrText xml:space="preserve">CITATION Doc \l 1038 </w:instrText>
+            <w:instrText xml:space="preserve">CITATION Docker \l 1038 </w:instrText>
           </w:r>
           <w:r>
             <w:fldChar w:fldCharType="separate"/>
@@ -3016,8 +3487,13 @@
         <w:t xml:space="preserve"> de együttesen is elindíthatóak</w:t>
       </w:r>
       <w:r>
-        <w:t>. A Docker Compose</w:t>
-      </w:r>
+        <w:t xml:space="preserve">. A Docker </w:t>
+      </w:r>
+      <w:proofErr w:type="spellStart"/>
+      <w:r>
+        <w:t>Compose</w:t>
+      </w:r>
+      <w:proofErr w:type="spellEnd"/>
       <w:sdt>
         <w:sdtPr>
           <w:id w:val="1576857532"/>
@@ -3028,7 +3504,7 @@
             <w:fldChar w:fldCharType="begin"/>
           </w:r>
           <w:r>
-            <w:instrText xml:space="preserve"> CITATION Doc1 \l 1038 </w:instrText>
+            <w:instrText xml:space="preserve">CITATION DockerCompose \l 1038 </w:instrText>
           </w:r>
           <w:r>
             <w:fldChar w:fldCharType="separate"/>
@@ -3054,7 +3530,15 @@
         <w:t xml:space="preserve"> használata lehetővé teszi, hogy a teljes fejlesztői környezet egységesen és reprodukálható módon legyen felépíthető</w:t>
       </w:r>
       <w:r>
-        <w:t>, így szimulálva production szerver környezetet</w:t>
+        <w:t xml:space="preserve">, így szimulálva </w:t>
+      </w:r>
+      <w:proofErr w:type="spellStart"/>
+      <w:r>
+        <w:t>production</w:t>
+      </w:r>
+      <w:proofErr w:type="spellEnd"/>
+      <w:r>
+        <w:t xml:space="preserve"> szerver környezetet</w:t>
       </w:r>
       <w:r>
         <w:t>.</w:t>
@@ -3064,7 +3548,7 @@
       <w:pPr>
         <w:pStyle w:val="Szakdolgozath2"/>
       </w:pPr>
-      <w:bookmarkStart w:id="4" w:name="_Toc225492655"/>
+      <w:bookmarkStart w:id="4" w:name="_Toc225505732"/>
       <w:r>
         <w:t>Frontend technológiák</w:t>
       </w:r>
@@ -3082,17 +3566,24 @@
       <w:pPr>
         <w:pStyle w:val="Szakdolgozath3"/>
       </w:pPr>
+      <w:proofErr w:type="spellStart"/>
       <w:r>
         <w:t>TypeScript</w:t>
       </w:r>
+      <w:proofErr w:type="spellEnd"/>
     </w:p>
     <w:p>
       <w:pPr>
         <w:pStyle w:val="Szakdolgozatbekezds"/>
       </w:pPr>
       <w:r>
-        <w:t>A frontend fejlesztése TypeScript</w:t>
-      </w:r>
+        <w:t xml:space="preserve">A frontend fejlesztése </w:t>
+      </w:r>
+      <w:proofErr w:type="spellStart"/>
+      <w:r>
+        <w:t>TypeScript</w:t>
+      </w:r>
+      <w:proofErr w:type="spellEnd"/>
       <w:sdt>
         <w:sdtPr>
           <w:id w:val="-892112070"/>
@@ -3103,7 +3594,7 @@
             <w:fldChar w:fldCharType="begin"/>
           </w:r>
           <w:r>
-            <w:instrText xml:space="preserve">CITATION Typ \l 1038 </w:instrText>
+            <w:instrText xml:space="preserve">CITATION TypeScript \l 1038 </w:instrText>
           </w:r>
           <w:r>
             <w:fldChar w:fldCharType="separate"/>
@@ -3126,22 +3617,51 @@
         </w:sdtContent>
       </w:sdt>
       <w:r>
-        <w:t xml:space="preserve"> nyelven történt. A TypeScript használata lehetővé teszi a statikus típusellenőrzést, amely csökkenti a fejlesztés során előforduló hibák számát, </w:t>
-      </w:r>
+        <w:t xml:space="preserve"> nyelven történt. A </w:t>
+      </w:r>
+      <w:proofErr w:type="spellStart"/>
+      <w:r>
+        <w:t>TypeScript</w:t>
+      </w:r>
+      <w:proofErr w:type="spellEnd"/>
+      <w:r>
+        <w:t xml:space="preserve"> használata lehetővé teszi a statikus típusellenőrzést, amely csökkenti a fejlesztés során előforduló hibák számát, </w:t>
+      </w:r>
+      <w:proofErr w:type="gramStart"/>
       <w:r>
         <w:t xml:space="preserve">emellett </w:t>
       </w:r>
       <w:r>
-        <w:t xml:space="preserve"> javítja a kód karbantarthatóságát és átláthatóságát</w:t>
-      </w:r>
-      <w:r>
-        <w:t xml:space="preserve"> a vanilla j</w:t>
+        <w:t xml:space="preserve"> javítja</w:t>
+      </w:r>
+      <w:proofErr w:type="gramEnd"/>
+      <w:r>
+        <w:t xml:space="preserve"> a kód karbantarthatóságát és átláthatóságát</w:t>
+      </w:r>
+      <w:r>
+        <w:t xml:space="preserve"> a </w:t>
+      </w:r>
+      <w:proofErr w:type="spellStart"/>
+      <w:r>
+        <w:t>vanilla</w:t>
+      </w:r>
+      <w:proofErr w:type="spellEnd"/>
+      <w:r>
+        <w:t xml:space="preserve"> </w:t>
+      </w:r>
+      <w:proofErr w:type="spellStart"/>
+      <w:r>
+        <w:t>j</w:t>
       </w:r>
       <w:r>
         <w:t>a</w:t>
       </w:r>
       <w:r>
-        <w:t>vascripttel szemben</w:t>
+        <w:t>vascripttel</w:t>
+      </w:r>
+      <w:proofErr w:type="spellEnd"/>
+      <w:r>
+        <w:t xml:space="preserve"> szemben</w:t>
       </w:r>
       <w:r>
         <w:t>.</w:t>
@@ -3151,9 +3671,11 @@
       <w:pPr>
         <w:pStyle w:val="Szakdolgozath3"/>
       </w:pPr>
+      <w:proofErr w:type="spellStart"/>
       <w:r>
         <w:t>React</w:t>
       </w:r>
+      <w:proofErr w:type="spellEnd"/>
     </w:p>
     <w:p>
       <w:pPr>
@@ -3166,8 +3688,13 @@
         <w:t xml:space="preserve"> webes kliens oldal</w:t>
       </w:r>
       <w:r>
-        <w:t xml:space="preserve"> kialakítása React</w:t>
-      </w:r>
+        <w:t xml:space="preserve"> kialakítása </w:t>
+      </w:r>
+      <w:proofErr w:type="spellStart"/>
+      <w:r>
+        <w:t>React</w:t>
+      </w:r>
+      <w:proofErr w:type="spellEnd"/>
       <w:sdt>
         <w:sdtPr>
           <w:id w:val="1000310456"/>
@@ -3178,7 +3705,7 @@
             <w:fldChar w:fldCharType="begin"/>
           </w:r>
           <w:r>
-            <w:instrText xml:space="preserve"> CITATION Rea \l 1038 </w:instrText>
+            <w:instrText xml:space="preserve">CITATION React \l 1038 </w:instrText>
           </w:r>
           <w:r>
             <w:fldChar w:fldCharType="separate"/>
@@ -3207,7 +3734,15 @@
         <w:t>, amelyet eredetileg a Facebook, ma</w:t>
       </w:r>
       <w:r>
-        <w:t>i nevén Meta fejlesztett</w:t>
+        <w:t xml:space="preserve">i nevén </w:t>
+      </w:r>
+      <w:proofErr w:type="spellStart"/>
+      <w:r>
+        <w:t>Meta</w:t>
+      </w:r>
+      <w:proofErr w:type="spellEnd"/>
+      <w:r>
+        <w:t xml:space="preserve"> fejlesztett</w:t>
       </w:r>
       <w:r>
         <w:t xml:space="preserve">. </w:t>
@@ -3235,8 +3770,13 @@
         <w:t xml:space="preserve">. </w:t>
       </w:r>
       <w:r>
-        <w:t>Alternatív megoldásként szóba jöhetett volna például az Angular</w:t>
-      </w:r>
+        <w:t xml:space="preserve">Alternatív megoldásként szóba jöhetett volna például az </w:t>
+      </w:r>
+      <w:proofErr w:type="spellStart"/>
+      <w:r>
+        <w:t>Angular</w:t>
+      </w:r>
+      <w:proofErr w:type="spellEnd"/>
       <w:sdt>
         <w:sdtPr>
           <w:id w:val="558358392"/>
@@ -3247,7 +3787,7 @@
             <w:fldChar w:fldCharType="begin"/>
           </w:r>
           <w:r>
-            <w:instrText xml:space="preserve"> CITATION Ang \l 1038 </w:instrText>
+            <w:instrText xml:space="preserve">CITATION Angular \l 1038 </w:instrText>
           </w:r>
           <w:r>
             <w:fldChar w:fldCharType="separate"/>
@@ -3315,9 +3855,11 @@
       <w:pPr>
         <w:pStyle w:val="Szakdolgozath3"/>
       </w:pPr>
+      <w:proofErr w:type="spellStart"/>
       <w:r>
         <w:t>PixiJS</w:t>
       </w:r>
+      <w:proofErr w:type="spellEnd"/>
     </w:p>
     <w:p>
       <w:pPr>
@@ -3327,8 +3869,13 @@
         </w:rPr>
       </w:pPr>
       <w:r>
-        <w:t>A játéktér megjelenítéséhez a PixiJS</w:t>
-      </w:r>
+        <w:t xml:space="preserve">A játéktér megjelenítéséhez a </w:t>
+      </w:r>
+      <w:proofErr w:type="spellStart"/>
+      <w:r>
+        <w:t>PixiJS</w:t>
+      </w:r>
+      <w:proofErr w:type="spellEnd"/>
       <w:sdt>
         <w:sdtPr>
           <w:id w:val="223420300"/>
@@ -3339,7 +3886,7 @@
             <w:fldChar w:fldCharType="begin"/>
           </w:r>
           <w:r>
-            <w:instrText xml:space="preserve"> CITATION Pix \l 1038 </w:instrText>
+            <w:instrText xml:space="preserve">CITATION PixiJs \l 1038 </w:instrText>
           </w:r>
           <w:r>
             <w:fldChar w:fldCharType="separate"/>
@@ -3362,7 +3909,39 @@
         </w:sdtContent>
       </w:sdt>
       <w:r>
-        <w:t xml:space="preserve"> grafikai könyvtár került felhasználásra. A PixiJS böngészőben futó, elsősorban HTML5 Canvas és WebGL alapú 2D renderelést biztosító technológia, amely alkalmas játékobjektumok, helyszínek és interaktív elemek dinamikus megjelenítésére és kezelésére.</w:t>
+        <w:t xml:space="preserve"> grafikai könyvtár került felhasználásra. A </w:t>
+      </w:r>
+      <w:proofErr w:type="spellStart"/>
+      <w:r>
+        <w:t>PixiJS</w:t>
+      </w:r>
+      <w:proofErr w:type="spellEnd"/>
+      <w:r>
+        <w:t xml:space="preserve"> böngészőben futó, elsősorban HTML5 </w:t>
+      </w:r>
+      <w:proofErr w:type="spellStart"/>
+      <w:r>
+        <w:t>Canvas</w:t>
+      </w:r>
+      <w:proofErr w:type="spellEnd"/>
+      <w:r>
+        <w:t xml:space="preserve"> és </w:t>
+      </w:r>
+      <w:proofErr w:type="spellStart"/>
+      <w:r>
+        <w:t>WebGL</w:t>
+      </w:r>
+      <w:proofErr w:type="spellEnd"/>
+      <w:r>
+        <w:t xml:space="preserve"> alapú 2D </w:t>
+      </w:r>
+      <w:proofErr w:type="spellStart"/>
+      <w:r>
+        <w:t>renderelést</w:t>
+      </w:r>
+      <w:proofErr w:type="spellEnd"/>
+      <w:r>
+        <w:t xml:space="preserve"> biztosító technológia, amely alkalmas játékobjektumok, helyszínek és interaktív elemek dinamikus megjelenítésére és kezelésére.</w:t>
       </w:r>
     </w:p>
     <w:p>
@@ -3390,7 +3969,7 @@
             <w:fldChar w:fldCharType="begin"/>
           </w:r>
           <w:r>
-            <w:instrText xml:space="preserve"> CITATION Soc \l 1038 </w:instrText>
+            <w:instrText xml:space="preserve">CITATION SocketIO \l 1038 </w:instrText>
           </w:r>
           <w:r>
             <w:fldChar w:fldCharType="separate"/>
@@ -3429,7 +4008,7 @@
       <w:pPr>
         <w:pStyle w:val="Szakdolgozath2"/>
       </w:pPr>
-      <w:bookmarkStart w:id="5" w:name="_Toc225492656"/>
+      <w:bookmarkStart w:id="5" w:name="_Toc225505733"/>
       <w:r>
         <w:t>Backend technológiák</w:t>
       </w:r>
@@ -3440,7 +4019,15 @@
         <w:pStyle w:val="Szakdolgozatbekezds"/>
       </w:pPr>
       <w:r>
-        <w:t>A szerveroldali logika, az üzleti folyamatok kezelése, az AI integráció, valamint az adatbázis-műveletek a backend rétegben valósulnak meg. A backend fejlesztése során a gyors fejlesztést, a jó strukturálhatóságot és az API-központú működést támogató technológiák kerültek kiválasztásra.</w:t>
+        <w:t xml:space="preserve">A szerveroldali logika, az üzleti folyamatok kezelése, az AI integráció, valamint az adatbázis-műveletek a backend rétegben valósulnak meg. A backend fejlesztése során a gyors fejlesztést, a jó </w:t>
+      </w:r>
+      <w:proofErr w:type="spellStart"/>
+      <w:r>
+        <w:t>strukturálhatóságot</w:t>
+      </w:r>
+      <w:proofErr w:type="spellEnd"/>
+      <w:r>
+        <w:t xml:space="preserve"> és az API-központú működést támogató technológiák kerültek kiválasztásra.</w:t>
       </w:r>
     </w:p>
     <w:p>
@@ -3468,7 +4055,7 @@
             <w:fldChar w:fldCharType="begin"/>
           </w:r>
           <w:r>
-            <w:instrText xml:space="preserve"> CITATION Pyt \l 1038 </w:instrText>
+            <w:instrText xml:space="preserve">CITATION Python \l 1038 </w:instrText>
           </w:r>
           <w:r>
             <w:fldChar w:fldCharType="separate"/>
@@ -3494,8 +4081,13 @@
         <w:t xml:space="preserve"> nyelven készült. A Python előnye, hogy jól használható webes szolgáltatások, adatkezelési logikák és mesterséges intelligenciához kapcsolódó integrációk megvalósítására.</w:t>
       </w:r>
       <w:r>
-        <w:t xml:space="preserve"> Projekt elején tervben voltak kép transzformációs feladatok is, ezek valósultak volna meg az OpenCV</w:t>
-      </w:r>
+        <w:t xml:space="preserve"> Projekt elején tervben voltak kép transzformációs feladatok is, ezek valósultak volna meg az </w:t>
+      </w:r>
+      <w:proofErr w:type="spellStart"/>
+      <w:r>
+        <w:t>OpenCV</w:t>
+      </w:r>
+      <w:proofErr w:type="spellEnd"/>
       <w:sdt>
         <w:sdtPr>
           <w:id w:val="-1397195207"/>
@@ -3536,17 +4128,40 @@
       <w:pPr>
         <w:pStyle w:val="Szakdolgozath3"/>
       </w:pPr>
-      <w:r>
-        <w:t>FastAPI és OpenAPI</w:t>
-      </w:r>
+      <w:proofErr w:type="spellStart"/>
+      <w:r>
+        <w:t>FastAPI</w:t>
+      </w:r>
+      <w:proofErr w:type="spellEnd"/>
+      <w:r>
+        <w:t xml:space="preserve"> és </w:t>
+      </w:r>
+      <w:proofErr w:type="spellStart"/>
+      <w:r>
+        <w:t>OpenAPI</w:t>
+      </w:r>
+      <w:proofErr w:type="spellEnd"/>
     </w:p>
     <w:p>
       <w:pPr>
         <w:pStyle w:val="Szakdolgozatbekezds"/>
       </w:pPr>
       <w:r>
-        <w:t>A backend A a FastAPI</w:t>
-      </w:r>
+        <w:t xml:space="preserve">A backend A </w:t>
+      </w:r>
+      <w:proofErr w:type="spellStart"/>
+      <w:r>
+        <w:t>a</w:t>
+      </w:r>
+      <w:proofErr w:type="spellEnd"/>
+      <w:r>
+        <w:t xml:space="preserve"> </w:t>
+      </w:r>
+      <w:proofErr w:type="spellStart"/>
+      <w:r>
+        <w:t>FastAPI</w:t>
+      </w:r>
+      <w:proofErr w:type="spellEnd"/>
       <w:sdt>
         <w:sdtPr>
           <w:id w:val="-1088236458"/>
@@ -3557,7 +4172,7 @@
             <w:fldChar w:fldCharType="begin"/>
           </w:r>
           <w:r>
-            <w:instrText xml:space="preserve"> CITATION Fas \l 1038 </w:instrText>
+            <w:instrText xml:space="preserve">CITATION FastApi \l 1038 </w:instrText>
           </w:r>
           <w:r>
             <w:fldChar w:fldCharType="separate"/>
@@ -3580,7 +4195,23 @@
         </w:sdtContent>
       </w:sdt>
       <w:r>
-        <w:t xml:space="preserve"> keretrendszerre épül. A FastAPI modern, nagy teljesítményű megoldást nyújt REST alapú szolgáltatások fejlesztésére, és automatikusan képes OpenAPI </w:t>
+        <w:t xml:space="preserve"> keretrendszerre épül. A </w:t>
+      </w:r>
+      <w:proofErr w:type="spellStart"/>
+      <w:r>
+        <w:t>FastAPI</w:t>
+      </w:r>
+      <w:proofErr w:type="spellEnd"/>
+      <w:r>
+        <w:t xml:space="preserve"> modern, nagy teljesítményű megoldást nyújt REST alapú szolgáltatások fejlesztésére, és automatikusan képes </w:t>
+      </w:r>
+      <w:proofErr w:type="spellStart"/>
+      <w:r>
+        <w:t>OpenAPI</w:t>
+      </w:r>
+      <w:proofErr w:type="spellEnd"/>
+      <w:r>
+        <w:t xml:space="preserve"> </w:t>
       </w:r>
       <w:sdt>
         <w:sdtPr>
@@ -3592,7 +4223,7 @@
             <w:fldChar w:fldCharType="begin"/>
           </w:r>
           <w:r>
-            <w:instrText xml:space="preserve"> CITATION Ope \l 1038 </w:instrText>
+            <w:instrText xml:space="preserve">CITATION OpenAPI \l 1038 </w:instrText>
           </w:r>
           <w:r>
             <w:fldChar w:fldCharType="separate"/>
@@ -3613,24 +4244,47 @@
       </w:r>
       <w:r>
         <w:lastRenderedPageBreak/>
-        <w:t>megkönnyíti az API dokumentálását és az interfészek áttekinthetőségét. A választás azért esett erre a keretrendszerre, mert a Flaskkal szemben erősebben épít a típusosságra, ami biztonságosabb és átláthatóbb API-fejlesztést tesz lehetővé.</w:t>
+        <w:t xml:space="preserve">megkönnyíti az API dokumentálását és az interfészek áttekinthetőségét. A választás azért esett erre a keretrendszerre, mert a </w:t>
+      </w:r>
+      <w:proofErr w:type="spellStart"/>
+      <w:r>
+        <w:t>Flaskkal</w:t>
+      </w:r>
+      <w:proofErr w:type="spellEnd"/>
+      <w:r>
+        <w:t xml:space="preserve"> szemben erősebben épít a típusosságra, ami biztonságosabb és átláthatóbb API-fejlesztést tesz lehetővé.</w:t>
       </w:r>
     </w:p>
     <w:p>
       <w:pPr>
         <w:pStyle w:val="Szakdolgozath3"/>
       </w:pPr>
-      <w:r>
-        <w:t>SQLAlchemy és Alembic</w:t>
-      </w:r>
+      <w:proofErr w:type="spellStart"/>
+      <w:r>
+        <w:t>SQLAlchemy</w:t>
+      </w:r>
+      <w:proofErr w:type="spellEnd"/>
+      <w:r>
+        <w:t xml:space="preserve"> és </w:t>
+      </w:r>
+      <w:proofErr w:type="spellStart"/>
+      <w:r>
+        <w:t>Alembic</w:t>
+      </w:r>
+      <w:proofErr w:type="spellEnd"/>
     </w:p>
     <w:p>
       <w:pPr>
         <w:pStyle w:val="Szakdolgozatbekezds"/>
       </w:pPr>
       <w:r>
-        <w:t>Az adatbázisréteg kezelésére a SQLAlchemy</w:t>
-      </w:r>
+        <w:t xml:space="preserve">Az adatbázisréteg kezelésére a </w:t>
+      </w:r>
+      <w:proofErr w:type="spellStart"/>
+      <w:r>
+        <w:t>SQLAlchemy</w:t>
+      </w:r>
+      <w:proofErr w:type="spellEnd"/>
       <w:sdt>
         <w:sdtPr>
           <w:id w:val="367569242"/>
@@ -3641,7 +4295,7 @@
             <w:fldChar w:fldCharType="begin"/>
           </w:r>
           <w:r>
-            <w:instrText xml:space="preserve"> CITATION SQL \l 1038 </w:instrText>
+            <w:instrText xml:space="preserve">CITATION SQLAclhemy \l 1038 </w:instrText>
           </w:r>
           <w:r>
             <w:fldChar w:fldCharType="separate"/>
@@ -3664,7 +4318,23 @@
         </w:sdtContent>
       </w:sdt>
       <w:r>
-        <w:t xml:space="preserve"> ORM (Object-Relational Mapping) került alkalmazásra, amely lehetővé teszi a relációs adatmodell objektumorientált kezelését. Ennek köszönhetően az adatbázissal való kommunikáció során nem minden esetben szükséges alacsony szintű SQL utasítások közvetlen írása, mivel az adatszerkezetek Python objektumokon keresztül is kezelhetők. Ez átláthatóbbá és karbantarthatóbbá teszi a backend oldali adatkezelési logikát.</w:t>
+        <w:t xml:space="preserve"> ORM (</w:t>
+      </w:r>
+      <w:proofErr w:type="spellStart"/>
+      <w:r>
+        <w:t>Object-Relational</w:t>
+      </w:r>
+      <w:proofErr w:type="spellEnd"/>
+      <w:r>
+        <w:t xml:space="preserve"> </w:t>
+      </w:r>
+      <w:proofErr w:type="spellStart"/>
+      <w:r>
+        <w:t>Mapping</w:t>
+      </w:r>
+      <w:proofErr w:type="spellEnd"/>
+      <w:r>
+        <w:t>) került alkalmazásra, amely lehetővé teszi a relációs adatmodell objektumorientált kezelését. Ennek köszönhetően az adatbázissal való kommunikáció során nem minden esetben szükséges alacsony szintű SQL utasítások közvetlen írása, mivel az adatszerkezetek Python objektumokon keresztül is kezelhetők. Ez átláthatóbbá és karbantarthatóbbá teszi a backend oldali adatkezelési logikát.</w:t>
       </w:r>
     </w:p>
     <w:p>
@@ -3672,8 +4342,21 @@
         <w:pStyle w:val="Szakdolgozatbekezds"/>
       </w:pPr>
       <w:r>
-        <w:t>Az adatbázisséma változásainak nyomon követésére és a migrációk kezelésére az Alembic került felhasználásra. Az Alembic</w:t>
-      </w:r>
+        <w:t xml:space="preserve">Az adatbázisséma változásainak nyomon követésére és a migrációk kezelésére az </w:t>
+      </w:r>
+      <w:proofErr w:type="spellStart"/>
+      <w:r>
+        <w:t>Alembic</w:t>
+      </w:r>
+      <w:proofErr w:type="spellEnd"/>
+      <w:r>
+        <w:t xml:space="preserve"> került felhasználásra. Az </w:t>
+      </w:r>
+      <w:proofErr w:type="spellStart"/>
+      <w:r>
+        <w:t>Alembic</w:t>
+      </w:r>
+      <w:proofErr w:type="spellEnd"/>
       <w:sdt>
         <w:sdtPr>
           <w:id w:val="1603687888"/>
@@ -3684,7 +4367,7 @@
             <w:fldChar w:fldCharType="begin"/>
           </w:r>
           <w:r>
-            <w:instrText xml:space="preserve"> CITATION Ale \l 1038 </w:instrText>
+            <w:instrText xml:space="preserve">CITATION Alembic \l 1038 </w:instrText>
           </w:r>
           <w:r>
             <w:fldChar w:fldCharType="separate"/>
@@ -3714,7 +4397,7 @@
       <w:pPr>
         <w:pStyle w:val="Szakdolgozath2"/>
       </w:pPr>
-      <w:bookmarkStart w:id="6" w:name="_Toc225492657"/>
+      <w:bookmarkStart w:id="6" w:name="_Toc225505734"/>
       <w:r>
         <w:t>Valós idejű kommunikáció</w:t>
       </w:r>
@@ -3753,7 +4436,7 @@
             <w:fldChar w:fldCharType="begin"/>
           </w:r>
           <w:r>
-            <w:instrText xml:space="preserve"> CITATION Nod \l 1038 </w:instrText>
+            <w:instrText xml:space="preserve">CITATION NodeJs \l 1038 </w:instrText>
           </w:r>
           <w:r>
             <w:fldChar w:fldCharType="separate"/>
@@ -3782,19 +4465,29 @@
         <w:t xml:space="preserve"> és</w:t>
       </w:r>
       <w:r>
-        <w:t xml:space="preserve"> eseményvezérelt alkalmazások fejlesztésére. Működésének egyik legfontosabb jellemzője a nem blokkoló I/O-kezelés, amely lehetővé teszi, hogy a szerver egyszerre több klienskapcsolatot is hatékonyan kezeljen anélkül, hogy minden kérés külön végrehajtási szálat igényelne.</w:t>
+        <w:t xml:space="preserve"> </w:t>
+      </w:r>
+      <w:proofErr w:type="spellStart"/>
+      <w:r>
+        <w:t>eseményvezérelt</w:t>
+      </w:r>
+      <w:proofErr w:type="spellEnd"/>
+      <w:r>
+        <w:t xml:space="preserve"> alkalmazások fejlesztésére. Működésének egyik legfontosabb jellemzője a nem blokkoló I/O-kezelés, amely lehetővé teszi, hogy a szerver egyszerre több klienskapcsolatot is hatékonyan kezeljen anélkül, hogy minden kérés külön végrehajtási szálat igényelne.</w:t>
       </w:r>
     </w:p>
     <w:p>
       <w:pPr>
         <w:pStyle w:val="Szakdolgozath3"/>
       </w:pPr>
+      <w:proofErr w:type="spellStart"/>
       <w:r>
         <w:t>Express</w:t>
       </w:r>
       <w:r>
         <w:t>Js</w:t>
       </w:r>
+      <w:proofErr w:type="spellEnd"/>
     </w:p>
     <w:p>
       <w:pPr>
@@ -3802,11 +4495,24 @@
       </w:pPr>
       <w:r>
         <w:lastRenderedPageBreak/>
-        <w:t>A websocket szerver HTTP végpontjainak és alapvető kiszolgálási logikájának megvalósítására az Express keretrendszer került felhasználásra. Az Express</w:t>
+        <w:t xml:space="preserve">A </w:t>
+      </w:r>
+      <w:proofErr w:type="spellStart"/>
+      <w:r>
+        <w:t>websocket</w:t>
+      </w:r>
+      <w:proofErr w:type="spellEnd"/>
+      <w:r>
+        <w:t xml:space="preserve"> szerver HTTP végpontjainak és alapvető kiszolgálási logikájának megvalósítására az Express keretrendszer került felhasználásra. Az </w:t>
+      </w:r>
+      <w:proofErr w:type="spellStart"/>
+      <w:r>
+        <w:t>Express</w:t>
       </w:r>
       <w:r>
         <w:t>Js</w:t>
       </w:r>
+      <w:proofErr w:type="spellEnd"/>
       <w:sdt>
         <w:sdtPr>
           <w:id w:val="725874965"/>
@@ -3817,7 +4523,7 @@
             <w:fldChar w:fldCharType="begin"/>
           </w:r>
           <w:r>
-            <w:instrText xml:space="preserve"> CITATION Exp \l 1038 </w:instrText>
+            <w:instrText xml:space="preserve">CITATION ExppressJs \l 1038 </w:instrText>
           </w:r>
           <w:r>
             <w:fldChar w:fldCharType="separate"/>
@@ -3868,7 +4574,7 @@
             <w:fldChar w:fldCharType="begin"/>
           </w:r>
           <w:r>
-            <w:instrText xml:space="preserve"> CITATION Soc \l 1038 </w:instrText>
+            <w:instrText xml:space="preserve">CITATION SocketIO \l 1038 </w:instrText>
           </w:r>
           <w:r>
             <w:fldChar w:fldCharType="separate"/>
@@ -3898,7 +4604,7 @@
       <w:pPr>
         <w:pStyle w:val="Szakdolgozath2"/>
       </w:pPr>
-      <w:bookmarkStart w:id="7" w:name="_Toc225492658"/>
+      <w:bookmarkStart w:id="7" w:name="_Toc225505735"/>
       <w:r>
         <w:t>Adatkezelés és tárolás</w:t>
       </w:r>
@@ -3916,17 +4622,24 @@
       <w:pPr>
         <w:pStyle w:val="Szakdolgozath3"/>
       </w:pPr>
+      <w:proofErr w:type="spellStart"/>
       <w:r>
         <w:t>PostgreSQL</w:t>
       </w:r>
+      <w:proofErr w:type="spellEnd"/>
     </w:p>
     <w:p>
       <w:pPr>
         <w:pStyle w:val="Szakdolgozatbekezds"/>
       </w:pPr>
       <w:r>
-        <w:t>A strukturált adatok tárolására PostgreSQL</w:t>
-      </w:r>
+        <w:t xml:space="preserve">A strukturált adatok tárolására </w:t>
+      </w:r>
+      <w:proofErr w:type="spellStart"/>
+      <w:r>
+        <w:t>PostgreSQL</w:t>
+      </w:r>
+      <w:proofErr w:type="spellEnd"/>
       <w:sdt>
         <w:sdtPr>
           <w:id w:val="1681394402"/>
@@ -3937,7 +4650,7 @@
             <w:fldChar w:fldCharType="begin"/>
           </w:r>
           <w:r>
-            <w:instrText xml:space="preserve"> CITATION Pos \l 1038 </w:instrText>
+            <w:instrText xml:space="preserve">CITATION PostgreSQL \l 1038 </w:instrText>
           </w:r>
           <w:r>
             <w:fldChar w:fldCharType="separate"/>
@@ -3960,24 +4673,39 @@
         </w:sdtContent>
       </w:sdt>
       <w:r>
-        <w:t xml:space="preserve"> adatbázis-kezelő rendszer szolgál. Ebben kerülnek eltárolásra például a felhasználói adatok, a tokenekhez kapcsolódó információk, valamint a pályákhoz tartozó metaadatok és statisztikák.</w:t>
+        <w:t xml:space="preserve"> adatbázis-kezelő rendszer szolgál. Ebben kerülnek eltárolásra például a felhasználói adatok, a </w:t>
+      </w:r>
+      <w:proofErr w:type="spellStart"/>
+      <w:r>
+        <w:t>tokenekhez</w:t>
+      </w:r>
+      <w:proofErr w:type="spellEnd"/>
+      <w:r>
+        <w:t xml:space="preserve"> kapcsolódó információk, valamint a pályákhoz tartozó metaadatok és statisztikák.</w:t>
       </w:r>
     </w:p>
     <w:p>
       <w:pPr>
         <w:pStyle w:val="Szakdolgozath3"/>
       </w:pPr>
+      <w:proofErr w:type="spellStart"/>
       <w:r>
         <w:t>MinIO</w:t>
       </w:r>
+      <w:proofErr w:type="spellEnd"/>
     </w:p>
     <w:p>
       <w:pPr>
         <w:pStyle w:val="Szakdolgozatbekezds"/>
       </w:pPr>
       <w:r>
-        <w:t>A generált fájlok, például a pályákhoz tartozó JSON állományok és képi erőforrások tárolására MinIO</w:t>
-      </w:r>
+        <w:t xml:space="preserve">A generált fájlok, például a pályákhoz tartozó JSON állományok és képi erőforrások tárolására </w:t>
+      </w:r>
+      <w:proofErr w:type="spellStart"/>
+      <w:r>
+        <w:t>MinIO</w:t>
+      </w:r>
+      <w:proofErr w:type="spellEnd"/>
       <w:sdt>
         <w:sdtPr>
           <w:id w:val="-1181898533"/>
@@ -3988,7 +4716,7 @@
             <w:fldChar w:fldCharType="begin"/>
           </w:r>
           <w:r>
-            <w:instrText xml:space="preserve"> CITATION Min \l 1038 </w:instrText>
+            <w:instrText xml:space="preserve">CITATION MinIO \l 1038 </w:instrText>
           </w:r>
           <w:r>
             <w:fldChar w:fldCharType="separate"/>
@@ -4011,14 +4739,30 @@
         </w:sdtContent>
       </w:sdt>
       <w:r>
-        <w:t xml:space="preserve"> objektumtároló került alkalmazásra. A MinIO egy S3-kompatibilis objektumtárolási megoldás, amely működésében az Amazon Web Services társzolgáltatásaihoz hasonló módon használható. Ez lehetővé teszi, hogy a fájlok kezelése elkülönüljön a relációs adatbázistól, így a strukturált adatok és a bináris állományok tárolása külön rétegben valósulhat meg.</w:t>
+        <w:t xml:space="preserve"> objektumtároló került alkalmazásra. A </w:t>
+      </w:r>
+      <w:proofErr w:type="spellStart"/>
+      <w:r>
+        <w:t>MinIO</w:t>
+      </w:r>
+      <w:proofErr w:type="spellEnd"/>
+      <w:r>
+        <w:t xml:space="preserve"> egy S3-kompatibilis objektumtárolási megoldás, amely működésében az Amazon Web </w:t>
+      </w:r>
+      <w:proofErr w:type="spellStart"/>
+      <w:r>
+        <w:t>Services</w:t>
+      </w:r>
+      <w:proofErr w:type="spellEnd"/>
+      <w:r>
+        <w:t xml:space="preserve"> társzolgáltatásaihoz hasonló módon használható. Ez lehetővé teszi, hogy a fájlok kezelése elkülönüljön a relációs adatbázistól, így a strukturált adatok és a bináris állományok tárolása külön rétegben valósulhat meg.</w:t>
       </w:r>
     </w:p>
     <w:p>
       <w:pPr>
         <w:pStyle w:val="Szakdolgozath2"/>
       </w:pPr>
-      <w:bookmarkStart w:id="8" w:name="_Toc225492659"/>
+      <w:bookmarkStart w:id="8" w:name="_Toc225505736"/>
       <w:r>
         <w:t>MI integráció</w:t>
       </w:r>
@@ -4036,9 +4780,14 @@
       <w:pPr>
         <w:pStyle w:val="Szakdolgozath3"/>
       </w:pPr>
+      <w:proofErr w:type="spellStart"/>
       <w:r>
         <w:lastRenderedPageBreak/>
-        <w:t>OpenAI API</w:t>
+        <w:t>OpenAI</w:t>
+      </w:r>
+      <w:proofErr w:type="spellEnd"/>
+      <w:r>
+        <w:t xml:space="preserve"> API</w:t>
       </w:r>
     </w:p>
     <w:p>
@@ -4046,7 +4795,15 @@
         <w:pStyle w:val="Szakdolgozatbekezds"/>
       </w:pPr>
       <w:r>
-        <w:t>A mesterséges intelligencia alapú funkciók megvalósítása az OpenAI API</w:t>
+        <w:t xml:space="preserve">A mesterséges intelligencia alapú funkciók megvalósítása az </w:t>
+      </w:r>
+      <w:proofErr w:type="spellStart"/>
+      <w:r>
+        <w:t>OpenAI</w:t>
+      </w:r>
+      <w:proofErr w:type="spellEnd"/>
+      <w:r>
+        <w:t xml:space="preserve"> API</w:t>
       </w:r>
       <w:sdt>
         <w:sdtPr>
@@ -4058,7 +4815,7 @@
             <w:fldChar w:fldCharType="begin"/>
           </w:r>
           <w:r>
-            <w:instrText xml:space="preserve"> CITATION Ope1 \l 1038 </w:instrText>
+            <w:instrText xml:space="preserve">CITATION OpenAI \l 1038 </w:instrText>
           </w:r>
           <w:r>
             <w:fldChar w:fldCharType="separate"/>
@@ -4093,7 +4850,7 @@
       <w:pPr>
         <w:pStyle w:val="SzekdolgozatH1"/>
       </w:pPr>
-      <w:bookmarkStart w:id="9" w:name="_Toc225492660"/>
+      <w:bookmarkStart w:id="9" w:name="_Toc225505737"/>
       <w:r>
         <w:t>Architektúra</w:t>
       </w:r>
@@ -4103,7 +4860,7 @@
       <w:pPr>
         <w:pStyle w:val="Szakdolgozath2"/>
       </w:pPr>
-      <w:bookmarkStart w:id="10" w:name="_Toc225492661"/>
+      <w:bookmarkStart w:id="10" w:name="_Toc225505738"/>
       <w:r>
         <w:t>Adatbázis felépítés –</w:t>
       </w:r>
@@ -4113,19 +4870,21 @@
       <w:r>
         <w:t>entitások</w:t>
       </w:r>
+      <w:r>
+        <w:t xml:space="preserve"> és relációk</w:t>
+      </w:r>
       <w:bookmarkEnd w:id="10"/>
-      <w:r>
-        <w:t xml:space="preserve"> és relációk</w:t>
-      </w:r>
     </w:p>
     <w:p>
       <w:pPr>
         <w:pStyle w:val="Szakdolgozath3"/>
       </w:pPr>
       <w:bookmarkStart w:id="11" w:name="Db_User"/>
+      <w:proofErr w:type="spellStart"/>
       <w:r>
         <w:t>User</w:t>
       </w:r>
+      <w:proofErr w:type="spellEnd"/>
     </w:p>
     <w:bookmarkEnd w:id="11"/>
     <w:p>
@@ -4133,7 +4892,23 @@
         <w:pStyle w:val="Szakdolgozatbekezds"/>
       </w:pPr>
       <w:r>
-        <w:t>A rendszer felhasználóit reprezentáló alapentitás. Az autentikációhoz szükséges azonosító adatokat tárolja, vagyis az e-mail címet, a felhasználónevet és a jelszó hash-ét.</w:t>
+        <w:t xml:space="preserve">A rendszer felhasználóit reprezentáló alapentitás. Az </w:t>
+      </w:r>
+      <w:proofErr w:type="spellStart"/>
+      <w:r>
+        <w:t>autentikációhoz</w:t>
+      </w:r>
+      <w:proofErr w:type="spellEnd"/>
+      <w:r>
+        <w:t xml:space="preserve"> szükséges azonosító adatokat tárolja, vagyis az e-mail címet, a felhasználónevet és a jelszó </w:t>
+      </w:r>
+      <w:proofErr w:type="spellStart"/>
+      <w:r>
+        <w:t>hash</w:t>
+      </w:r>
+      <w:proofErr w:type="spellEnd"/>
+      <w:r>
+        <w:t>-ét.</w:t>
       </w:r>
     </w:p>
     <w:p>
@@ -4150,6 +4925,7 @@
         <w:t xml:space="preserve">-egyhez kapcsolatban áll a </w:t>
       </w:r>
       <w:hyperlink w:anchor="Db_UserToken" w:history="1">
+        <w:proofErr w:type="spellStart"/>
         <w:r>
           <w:rPr>
             <w:rStyle w:val="Hyperlink"/>
@@ -4160,11 +4936,13 @@
           </w:rPr>
           <w:t>UserToken</w:t>
         </w:r>
+        <w:proofErr w:type="spellEnd"/>
       </w:hyperlink>
       <w:r>
         <w:t xml:space="preserve"> modellel. Egy-a-többhöz kapcsolatban áll a </w:t>
       </w:r>
       <w:hyperlink w:anchor="Db_RefreshToken" w:history="1">
+        <w:proofErr w:type="spellStart"/>
         <w:r>
           <w:rPr>
             <w:rStyle w:val="Hyperlink"/>
@@ -4175,11 +4953,13 @@
           </w:rPr>
           <w:t>RefreshToken</w:t>
         </w:r>
+        <w:proofErr w:type="spellEnd"/>
       </w:hyperlink>
       <w:r>
         <w:t xml:space="preserve">, </w:t>
       </w:r>
       <w:hyperlink w:anchor="Db_LevelRating" w:history="1">
+        <w:proofErr w:type="spellStart"/>
         <w:r>
           <w:rPr>
             <w:rStyle w:val="Hyperlink"/>
@@ -4190,11 +4970,13 @@
           </w:rPr>
           <w:t>LevelRating</w:t>
         </w:r>
+        <w:proofErr w:type="spellEnd"/>
       </w:hyperlink>
       <w:r>
         <w:t xml:space="preserve">, </w:t>
       </w:r>
       <w:hyperlink w:anchor="Db_FavoriteLevel" w:history="1">
+        <w:proofErr w:type="spellStart"/>
         <w:r>
           <w:rPr>
             <w:rStyle w:val="Hyperlink"/>
@@ -4205,11 +4987,13 @@
           </w:rPr>
           <w:t>FavoriteLevel</w:t>
         </w:r>
+        <w:proofErr w:type="spellEnd"/>
       </w:hyperlink>
       <w:r>
         <w:t xml:space="preserve"> és </w:t>
       </w:r>
       <w:hyperlink w:anchor="Db_LevelCompletion" w:history="1">
+        <w:proofErr w:type="spellStart"/>
         <w:r>
           <w:rPr>
             <w:rStyle w:val="Hyperlink"/>
@@ -4220,6 +5004,7 @@
           </w:rPr>
           <w:t>LevelCompletion</w:t>
         </w:r>
+        <w:proofErr w:type="spellEnd"/>
       </w:hyperlink>
       <w:r>
         <w:t xml:space="preserve"> modellekkel.</w:t>
@@ -4230,9 +5015,11 @@
         <w:pStyle w:val="Szakdolgozath3"/>
       </w:pPr>
       <w:bookmarkStart w:id="12" w:name="Db_UserToken"/>
+      <w:proofErr w:type="spellStart"/>
       <w:r>
         <w:t>UserToken</w:t>
       </w:r>
+      <w:proofErr w:type="spellEnd"/>
     </w:p>
     <w:bookmarkEnd w:id="12"/>
     <w:p>
@@ -4240,13 +5027,26 @@
         <w:pStyle w:val="Szakdolgozatbekezds"/>
       </w:pPr>
       <w:r>
-        <w:t>A felhasználó aktuális token</w:t>
-      </w:r>
+        <w:t xml:space="preserve">A felhasználó aktuális </w:t>
+      </w:r>
+      <w:proofErr w:type="spellStart"/>
+      <w:r>
+        <w:t>token</w:t>
+      </w:r>
+      <w:proofErr w:type="spellEnd"/>
       <w:r>
         <w:t xml:space="preserve"> </w:t>
       </w:r>
       <w:r>
-        <w:t>egyenlegét tároló modell. A rendszer ezt használja annak ellenőrzésére, hogy a felhasználó rendelkezik-e elegendő tokennel új pálya generálásához.</w:t>
+        <w:t xml:space="preserve">egyenlegét tároló modell. A rendszer ezt használja annak ellenőrzésére, hogy a felhasználó rendelkezik-e elegendő </w:t>
+      </w:r>
+      <w:proofErr w:type="spellStart"/>
+      <w:r>
+        <w:t>tokennel</w:t>
+      </w:r>
+      <w:proofErr w:type="spellEnd"/>
+      <w:r>
+        <w:t xml:space="preserve"> új pálya generálásához.</w:t>
       </w:r>
     </w:p>
     <w:p>
@@ -4263,6 +5063,7 @@
         <w:t xml:space="preserve">-egyhez kapcsolatban áll a </w:t>
       </w:r>
       <w:hyperlink w:anchor="Db_User" w:history="1">
+        <w:proofErr w:type="spellStart"/>
         <w:r>
           <w:rPr>
             <w:rStyle w:val="Hyperlink"/>
@@ -4273,6 +5074,7 @@
           </w:rPr>
           <w:t>User</w:t>
         </w:r>
+        <w:proofErr w:type="spellEnd"/>
       </w:hyperlink>
       <w:r>
         <w:t xml:space="preserve"> modellel.</w:t>
@@ -4283,9 +5085,11 @@
         <w:pStyle w:val="Szakdolgozath3"/>
       </w:pPr>
       <w:bookmarkStart w:id="13" w:name="Db_RefreshToken"/>
+      <w:proofErr w:type="spellStart"/>
       <w:r>
         <w:t>RefreshToken</w:t>
       </w:r>
+      <w:proofErr w:type="spellEnd"/>
     </w:p>
     <w:bookmarkEnd w:id="13"/>
     <w:p>
@@ -4293,7 +5097,39 @@
         <w:pStyle w:val="Szakdolgozatbekezds"/>
       </w:pPr>
       <w:r>
-        <w:t>A JWT-alapú hitelesítéshez tartozó frissítő tokeneket tárolja. Nyilvántartja magát a token stringet, a lejárati időt, valamint azt is, hogy a token visszavonásra került-e.</w:t>
+        <w:t xml:space="preserve">A JWT-alapú hitelesítéshez tartozó frissítő </w:t>
+      </w:r>
+      <w:proofErr w:type="spellStart"/>
+      <w:r>
+        <w:t>tokeneket</w:t>
+      </w:r>
+      <w:proofErr w:type="spellEnd"/>
+      <w:r>
+        <w:t xml:space="preserve"> tárolja. Nyilvántartja magát a </w:t>
+      </w:r>
+      <w:proofErr w:type="spellStart"/>
+      <w:r>
+        <w:t>token</w:t>
+      </w:r>
+      <w:proofErr w:type="spellEnd"/>
+      <w:r>
+        <w:t xml:space="preserve"> </w:t>
+      </w:r>
+      <w:proofErr w:type="spellStart"/>
+      <w:r>
+        <w:t>stringet</w:t>
+      </w:r>
+      <w:proofErr w:type="spellEnd"/>
+      <w:r>
+        <w:t xml:space="preserve">, a lejárati időt, valamint azt is, hogy a </w:t>
+      </w:r>
+      <w:proofErr w:type="spellStart"/>
+      <w:r>
+        <w:t>token</w:t>
+      </w:r>
+      <w:proofErr w:type="spellEnd"/>
+      <w:r>
+        <w:t xml:space="preserve"> visszavonásra került-e.</w:t>
       </w:r>
     </w:p>
     <w:p>
@@ -4304,6 +5140,7 @@
         <w:t xml:space="preserve">Egy-a-többhöz kapcsolatban kapcsolódik a </w:t>
       </w:r>
       <w:hyperlink w:anchor="Db_User" w:history="1">
+        <w:proofErr w:type="spellStart"/>
         <w:r>
           <w:rPr>
             <w:rStyle w:val="Hyperlink"/>
@@ -4314,15 +5151,29 @@
           </w:rPr>
           <w:t>User</w:t>
         </w:r>
+        <w:proofErr w:type="spellEnd"/>
       </w:hyperlink>
       <w:r>
         <w:t xml:space="preserve"> modellhez, mivel egy felhasználóhoz több </w:t>
       </w:r>
       <w:r>
-        <w:t xml:space="preserve">kliens refresh </w:t>
-      </w:r>
-      <w:r>
-        <w:t>token is tartozhat</w:t>
+        <w:t xml:space="preserve">kliens </w:t>
+      </w:r>
+      <w:proofErr w:type="spellStart"/>
+      <w:r>
+        <w:t>refresh</w:t>
+      </w:r>
+      <w:proofErr w:type="spellEnd"/>
+      <w:r>
+        <w:t xml:space="preserve"> </w:t>
+      </w:r>
+      <w:proofErr w:type="spellStart"/>
+      <w:r>
+        <w:t>token</w:t>
+      </w:r>
+      <w:proofErr w:type="spellEnd"/>
+      <w:r>
+        <w:t xml:space="preserve"> is tartozhat</w:t>
       </w:r>
       <w:r>
         <w:t>, például web alkalmazás és vagy mobil alkalmazás</w:t>
@@ -4336,9 +5187,11 @@
         <w:pStyle w:val="Szakdolgozath3"/>
       </w:pPr>
       <w:bookmarkStart w:id="14" w:name="Db_Level"/>
+      <w:proofErr w:type="spellStart"/>
       <w:r>
         <w:t>Level</w:t>
       </w:r>
+      <w:proofErr w:type="spellEnd"/>
     </w:p>
     <w:bookmarkEnd w:id="14"/>
     <w:p>
@@ -4352,22 +5205,48 @@
         <w:t xml:space="preserve"> </w:t>
       </w:r>
       <w:r>
-        <w:t>pályák fő entitása. Tárolja a pálya címét, történetét, a generálás sikerességét, a sprite-generálás</w:t>
+        <w:t xml:space="preserve">pályák fő entitása. Tárolja a pálya címét, történetét, a generálás sikerességét, a </w:t>
+      </w:r>
+      <w:proofErr w:type="spellStart"/>
+      <w:r>
+        <w:t>sprite</w:t>
+      </w:r>
+      <w:proofErr w:type="spellEnd"/>
+      <w:r>
+        <w:t>-generálás</w:t>
       </w:r>
       <w:r>
         <w:t xml:space="preserve"> sikerességét</w:t>
       </w:r>
       <w:r>
-        <w:t>, a nehézségi szintet</w:t>
-      </w:r>
+        <w:t xml:space="preserve">, </w:t>
+      </w:r>
+      <w:proofErr w:type="gramStart"/>
+      <w:r>
+        <w:t>a nehézségi szintet</w:t>
+      </w:r>
+      <w:proofErr w:type="gramEnd"/>
       <w:r>
         <w:t xml:space="preserve"> vagyis a kijárati feladaton kívül hány db feladat van a pályán</w:t>
       </w:r>
       <w:r>
-        <w:t xml:space="preserve"> és a választott képi stílust</w:t>
-      </w:r>
-      <w:r>
-        <w:t xml:space="preserve"> amivel a pályához a sprite-ok generálva lettek</w:t>
+        <w:t xml:space="preserve"> és a választott képi </w:t>
+      </w:r>
+      <w:proofErr w:type="gramStart"/>
+      <w:r>
+        <w:t>stílust</w:t>
+      </w:r>
+      <w:proofErr w:type="gramEnd"/>
+      <w:r>
+        <w:t xml:space="preserve"> amivel a pályához a </w:t>
+      </w:r>
+      <w:proofErr w:type="spellStart"/>
+      <w:r>
+        <w:t>sprite</w:t>
+      </w:r>
+      <w:proofErr w:type="spellEnd"/>
+      <w:r>
+        <w:t>-ok generálva lettek</w:t>
       </w:r>
       <w:r>
         <w:t>.</w:t>
@@ -4382,6 +5261,7 @@
         <w:t xml:space="preserve">Egy-a-többhöz kapcsolatban áll a </w:t>
       </w:r>
       <w:hyperlink w:anchor="Db_LevelRating" w:history="1">
+        <w:proofErr w:type="spellStart"/>
         <w:r>
           <w:rPr>
             <w:rStyle w:val="Hyperlink"/>
@@ -4392,11 +5272,13 @@
           </w:rPr>
           <w:t>LevelRating</w:t>
         </w:r>
+        <w:proofErr w:type="spellEnd"/>
       </w:hyperlink>
       <w:r>
         <w:t xml:space="preserve">, </w:t>
       </w:r>
       <w:hyperlink w:anchor="Db_FavoriteLevel" w:history="1">
+        <w:proofErr w:type="spellStart"/>
         <w:r>
           <w:rPr>
             <w:rStyle w:val="Hyperlink"/>
@@ -4407,11 +5289,13 @@
           </w:rPr>
           <w:t>FavoriteLevel</w:t>
         </w:r>
+        <w:proofErr w:type="spellEnd"/>
       </w:hyperlink>
       <w:r>
         <w:t xml:space="preserve">, </w:t>
       </w:r>
       <w:hyperlink w:anchor="Db_LevelCompletion" w:history="1">
+        <w:proofErr w:type="spellStart"/>
         <w:r>
           <w:rPr>
             <w:rStyle w:val="Hyperlink"/>
@@ -4422,11 +5306,13 @@
           </w:rPr>
           <w:t>LevelCompletion</w:t>
         </w:r>
+        <w:proofErr w:type="spellEnd"/>
       </w:hyperlink>
       <w:r>
         <w:t xml:space="preserve"> és </w:t>
       </w:r>
       <w:hyperlink w:anchor="Db_LevelTokenUsage" w:history="1">
+        <w:proofErr w:type="spellStart"/>
         <w:r>
           <w:rPr>
             <w:rStyle w:val="Hyperlink"/>
@@ -4437,6 +5323,7 @@
           </w:rPr>
           <w:t>LevelTokenUsage</w:t>
         </w:r>
+        <w:proofErr w:type="spellEnd"/>
       </w:hyperlink>
       <w:r>
         <w:t xml:space="preserve"> modellekkel.</w:t>
@@ -4446,9 +5333,11 @@
       <w:pPr>
         <w:pStyle w:val="Szakdolgozath3"/>
       </w:pPr>
+      <w:proofErr w:type="spellStart"/>
       <w:r>
         <w:t>LevelRating</w:t>
       </w:r>
+      <w:proofErr w:type="spellEnd"/>
     </w:p>
     <w:p>
       <w:pPr>
@@ -4478,6 +5367,7 @@
         <w:t xml:space="preserve">-egyhez kapcsolatban kapcsolódik a </w:t>
       </w:r>
       <w:hyperlink w:anchor="Db_User" w:history="1">
+        <w:proofErr w:type="spellStart"/>
         <w:r>
           <w:rPr>
             <w:rStyle w:val="Hyperlink"/>
@@ -4488,11 +5378,13 @@
           </w:rPr>
           <w:t>User</w:t>
         </w:r>
+        <w:proofErr w:type="spellEnd"/>
       </w:hyperlink>
       <w:r>
         <w:t xml:space="preserve"> és a </w:t>
       </w:r>
       <w:hyperlink w:anchor="Db_Level" w:history="1">
+        <w:proofErr w:type="spellStart"/>
         <w:r>
           <w:rPr>
             <w:rStyle w:val="Hyperlink"/>
@@ -4503,6 +5395,7 @@
           </w:rPr>
           <w:t>Level</w:t>
         </w:r>
+        <w:proofErr w:type="spellEnd"/>
       </w:hyperlink>
       <w:r>
         <w:t xml:space="preserve"> modellekhez. Logikailag sok-sok kapcsolatot valósít meg a felhasználók és pályák között</w:t>
@@ -4517,9 +5410,11 @@
       </w:pPr>
       <w:bookmarkStart w:id="15" w:name="Db_LevelRating"/>
       <w:bookmarkStart w:id="16" w:name="Db_FavoriteLevel"/>
+      <w:proofErr w:type="spellStart"/>
       <w:r>
         <w:t>FavoriteLevel</w:t>
       </w:r>
+      <w:proofErr w:type="spellEnd"/>
     </w:p>
     <w:bookmarkEnd w:id="15"/>
     <w:bookmarkEnd w:id="16"/>
@@ -4545,6 +5440,7 @@
         <w:t xml:space="preserve">-egyhez kapcsolatban kapcsolódik a </w:t>
       </w:r>
       <w:hyperlink w:anchor="Db_User" w:history="1">
+        <w:proofErr w:type="spellStart"/>
         <w:r>
           <w:rPr>
             <w:rStyle w:val="Hyperlink"/>
@@ -4555,11 +5451,13 @@
           </w:rPr>
           <w:t>User</w:t>
         </w:r>
+        <w:proofErr w:type="spellEnd"/>
       </w:hyperlink>
       <w:r>
         <w:t xml:space="preserve"> és a </w:t>
       </w:r>
       <w:hyperlink w:anchor="Db_Level" w:history="1">
+        <w:proofErr w:type="spellStart"/>
         <w:r>
           <w:rPr>
             <w:rStyle w:val="Hyperlink"/>
@@ -4570,6 +5468,7 @@
           </w:rPr>
           <w:t>Level</w:t>
         </w:r>
+        <w:proofErr w:type="spellEnd"/>
       </w:hyperlink>
       <w:r>
         <w:t xml:space="preserve"> modellekhez. Logikailag sok-sok kapcsolatot valósít meg a felhasználók és pályák között.</w:t>
@@ -4580,9 +5479,11 @@
         <w:pStyle w:val="Szakdolgozath3"/>
       </w:pPr>
       <w:bookmarkStart w:id="17" w:name="Db_LevelCompletion"/>
+      <w:proofErr w:type="spellStart"/>
       <w:r>
         <w:t>LevelCompletion</w:t>
       </w:r>
+      <w:proofErr w:type="spellEnd"/>
     </w:p>
     <w:bookmarkEnd w:id="17"/>
     <w:p>
@@ -4593,8 +5494,13 @@
         <w:t xml:space="preserve">A pályák </w:t>
       </w:r>
       <w:r>
-        <w:t>adott felhasználó első végigjátszásának</w:t>
-      </w:r>
+        <w:t xml:space="preserve">adott felhasználó első </w:t>
+      </w:r>
+      <w:proofErr w:type="spellStart"/>
+      <w:r>
+        <w:t>végigjátszásának</w:t>
+      </w:r>
+      <w:proofErr w:type="spellEnd"/>
       <w:r>
         <w:t xml:space="preserve"> nyilvántartására szolgáló modell. A teljesítés tényén kívül eltárolja a teljesítéshez szükséges időt percben.</w:t>
       </w:r>
@@ -4613,6 +5519,7 @@
         <w:t xml:space="preserve">-egyhez kapcsolatban kapcsolódik a </w:t>
       </w:r>
       <w:hyperlink w:anchor="Db_User" w:history="1">
+        <w:proofErr w:type="spellStart"/>
         <w:r>
           <w:rPr>
             <w:rStyle w:val="Hyperlink"/>
@@ -4623,11 +5530,13 @@
           </w:rPr>
           <w:t>User</w:t>
         </w:r>
+        <w:proofErr w:type="spellEnd"/>
       </w:hyperlink>
       <w:r>
         <w:t xml:space="preserve"> és a </w:t>
       </w:r>
       <w:hyperlink w:anchor="Db_Level" w:history="1">
+        <w:proofErr w:type="spellStart"/>
         <w:r>
           <w:rPr>
             <w:rStyle w:val="Hyperlink"/>
@@ -4638,6 +5547,7 @@
           </w:rPr>
           <w:t>Level</w:t>
         </w:r>
+        <w:proofErr w:type="spellEnd"/>
       </w:hyperlink>
       <w:r>
         <w:t xml:space="preserve"> modellekhez. Logikailag sok-sok kapcsolatot valósít meg a felhasználók és pályák között.</w:t>
@@ -4648,9 +5558,11 @@
         <w:pStyle w:val="Szakdolgozath3"/>
       </w:pPr>
       <w:bookmarkStart w:id="18" w:name="Db_LevelTokenUsage"/>
+      <w:proofErr w:type="spellStart"/>
       <w:r>
         <w:t>LevelTokenUsage</w:t>
       </w:r>
+      <w:proofErr w:type="spellEnd"/>
     </w:p>
     <w:bookmarkEnd w:id="18"/>
     <w:p>
@@ -4658,10 +5570,50 @@
         <w:pStyle w:val="Szakdolgozatbekezds"/>
       </w:pPr>
       <w:r>
-        <w:t>A pályagenerálás és a kapcsolódó AI-műveletek erőforrás-felhasználását naplózó modell. Eseményszinten rögzíti a token- és időfelhasználást a generation, validation, repair és sprite</w:t>
-      </w:r>
-      <w:r>
-        <w:t xml:space="preserve">-generation </w:t>
+        <w:t xml:space="preserve">A pályagenerálás és a kapcsolódó AI-műveletek erőforrás-felhasználását naplózó modell. Eseményszinten rögzíti a </w:t>
+      </w:r>
+      <w:proofErr w:type="spellStart"/>
+      <w:r>
+        <w:t>token</w:t>
+      </w:r>
+      <w:proofErr w:type="spellEnd"/>
+      <w:r>
+        <w:t xml:space="preserve">- és időfelhasználást a </w:t>
+      </w:r>
+      <w:proofErr w:type="spellStart"/>
+      <w:r>
+        <w:t>generation</w:t>
+      </w:r>
+      <w:proofErr w:type="spellEnd"/>
+      <w:r>
+        <w:t xml:space="preserve">, </w:t>
+      </w:r>
+      <w:proofErr w:type="spellStart"/>
+      <w:r>
+        <w:t>validation</w:t>
+      </w:r>
+      <w:proofErr w:type="spellEnd"/>
+      <w:r>
+        <w:t xml:space="preserve">, </w:t>
+      </w:r>
+      <w:proofErr w:type="spellStart"/>
+      <w:r>
+        <w:t>repair</w:t>
+      </w:r>
+      <w:proofErr w:type="spellEnd"/>
+      <w:r>
+        <w:t xml:space="preserve"> és </w:t>
+      </w:r>
+      <w:proofErr w:type="spellStart"/>
+      <w:r>
+        <w:t>sprite</w:t>
+      </w:r>
+      <w:r>
+        <w:t>-generation</w:t>
+      </w:r>
+      <w:proofErr w:type="spellEnd"/>
+      <w:r>
+        <w:t xml:space="preserve"> </w:t>
       </w:r>
       <w:r>
         <w:t>művelettípusok szerint.</w:t>
@@ -4681,6 +5633,7 @@
         <w:t xml:space="preserve">-egyhez kapcsolatban kapcsolódik a </w:t>
       </w:r>
       <w:hyperlink w:anchor="Db_Level" w:history="1">
+        <w:proofErr w:type="spellStart"/>
         <w:r>
           <w:rPr>
             <w:rStyle w:val="Hyperlink"/>
@@ -4691,6 +5644,7 @@
           </w:rPr>
           <w:t>Level</w:t>
         </w:r>
+        <w:proofErr w:type="spellEnd"/>
       </w:hyperlink>
       <w:r>
         <w:t xml:space="preserve"> modellhez</w:t>
@@ -4703,12 +5657,9 @@
       <w:pPr>
         <w:pStyle w:val="Szakdolgozath2"/>
       </w:pPr>
-      <w:r>
-        <w:tab/>
-      </w:r>
-      <w:bookmarkStart w:id="19" w:name="_Toc225492662"/>
-      <w:r>
-        <w:t>Kommunikáció, API és a websocket</w:t>
+      <w:bookmarkStart w:id="19" w:name="_Toc225505739"/>
+      <w:r>
+        <w:t>Frontend</w:t>
       </w:r>
       <w:bookmarkEnd w:id="19"/>
     </w:p>
@@ -4717,37 +5668,1057 @@
         <w:pStyle w:val="Szakdolgozatbekezds"/>
       </w:pPr>
       <w:r>
-        <w:t xml:space="preserve">A felhasználók hitelesítése JSON Web Token (JWT) alapú megoldással történik, amely RS256 algoritmust alkalmazó, nyilvános és privát kulcspáron alapuló aláírással került megvalósításra. Ez biztosítja, hogy a kliensoldali alkalmazás a bejelentkezést követően </w:t>
-      </w:r>
+        <w:t xml:space="preserve">A rendszer felhasználói felülete egy </w:t>
+      </w:r>
+      <w:proofErr w:type="spellStart"/>
+      <w:r>
+        <w:t>React</w:t>
+      </w:r>
+      <w:proofErr w:type="spellEnd"/>
+      <w:sdt>
+        <w:sdtPr>
+          <w:id w:val="1484583592"/>
+          <w:citation/>
+        </w:sdtPr>
+        <w:sdtContent>
+          <w:r>
+            <w:fldChar w:fldCharType="begin"/>
+          </w:r>
+          <w:r>
+            <w:instrText xml:space="preserve">CITATION React \l 1038 </w:instrText>
+          </w:r>
+          <w:r>
+            <w:fldChar w:fldCharType="separate"/>
+          </w:r>
+          <w:r>
+            <w:rPr>
+              <w:noProof/>
+            </w:rPr>
+            <w:t xml:space="preserve"> </w:t>
+          </w:r>
+          <w:r>
+            <w:rPr>
+              <w:noProof/>
+            </w:rPr>
+            <w:t>[4]</w:t>
+          </w:r>
+          <w:r>
+            <w:fldChar w:fldCharType="end"/>
+          </w:r>
+        </w:sdtContent>
+      </w:sdt>
+      <w:r>
+        <w:t xml:space="preserve"> alapú webalkalmazásként valósul meg. </w:t>
+      </w:r>
+      <w:proofErr w:type="spellStart"/>
+      <w:r>
+        <w:t>Architekturális</w:t>
+      </w:r>
+      <w:proofErr w:type="spellEnd"/>
+      <w:r>
+        <w:t xml:space="preserve"> szempontból egyetlen kliensalkalmazásról van szó, amely útvonalkezelés segítségével több, egymástól jól elkülönített oldalra tagolódik.</w:t>
+      </w:r>
+    </w:p>
+    <w:p>
+      <w:pPr>
+        <w:pStyle w:val="Szakdolgozatbekezds"/>
+      </w:pPr>
       <w:r>
         <w:lastRenderedPageBreak/>
-        <w:t>biztonságos módon férjen hozzá a védett erőforrásokhoz, miközben a szerver ellenőrizni tudja a tokenek hitelességét és érvényességét.</w:t>
+        <w:t>Jelenlegi állapotában összesen 8 oldal-komponenst tartalmaz, amelyek lefedik a bejelentkezés, regisztráció, menükezelés, pályalistázás, új pálya létrehozása, profilkezelés, játékmenet és hibakezelés funkcionális területeit.</w:t>
+      </w:r>
+    </w:p>
+    <w:p>
+      <w:pPr>
+        <w:pStyle w:val="Szakdolgozatbekezds"/>
+      </w:pPr>
+      <w:r>
+        <w:t xml:space="preserve">A frontend felépítése komponensalapú, ami elősegíti az egyes felületi egységek </w:t>
+      </w:r>
+      <w:proofErr w:type="spellStart"/>
+      <w:r>
+        <w:t>újrafelhasználhatóságát</w:t>
+      </w:r>
+      <w:proofErr w:type="spellEnd"/>
+      <w:r>
+        <w:t xml:space="preserve"> és elkülönített kezelését. Üzleti logika szerint a kliensoldal két nagy részre bontható. Az egyik csoportba a hagyományos, teljes egészében HTML-alapú oldalak tartoznak, amelyek az alkalmazás klasszikus kezelőfelületi funkcióit biztosítják. A másik csoportot a játékoldal alkotja, amely a </w:t>
+      </w:r>
+      <w:proofErr w:type="spellStart"/>
+      <w:r>
+        <w:t>PixiJS</w:t>
+      </w:r>
+      <w:proofErr w:type="spellEnd"/>
+      <w:sdt>
+        <w:sdtPr>
+          <w:id w:val="-351725218"/>
+          <w:citation/>
+        </w:sdtPr>
+        <w:sdtContent>
+          <w:r>
+            <w:fldChar w:fldCharType="begin"/>
+          </w:r>
+          <w:r>
+            <w:instrText xml:space="preserve"> CITATION React \l 1038 </w:instrText>
+          </w:r>
+          <w:r>
+            <w:fldChar w:fldCharType="separate"/>
+          </w:r>
+          <w:r>
+            <w:rPr>
+              <w:noProof/>
+            </w:rPr>
+            <w:t xml:space="preserve"> </w:t>
+          </w:r>
+          <w:r>
+            <w:rPr>
+              <w:noProof/>
+            </w:rPr>
+            <w:t>[4]</w:t>
+          </w:r>
+          <w:r>
+            <w:fldChar w:fldCharType="end"/>
+          </w:r>
+        </w:sdtContent>
+      </w:sdt>
+      <w:r>
+        <w:t xml:space="preserve"> használata miatt alapvetően </w:t>
+      </w:r>
+      <w:proofErr w:type="spellStart"/>
+      <w:r>
+        <w:t>canvas</w:t>
+      </w:r>
+      <w:proofErr w:type="spellEnd"/>
+      <w:r>
+        <w:t xml:space="preserve">-alapú megjelenítésre épül, ugyanakkor ezt egy HTML </w:t>
+      </w:r>
+      <w:proofErr w:type="spellStart"/>
+      <w:r>
+        <w:t>overlay</w:t>
+      </w:r>
+      <w:proofErr w:type="spellEnd"/>
+      <w:r>
+        <w:t xml:space="preserve"> réteg egészíti ki. Ez az </w:t>
+      </w:r>
+      <w:proofErr w:type="spellStart"/>
+      <w:r>
+        <w:t>overlay</w:t>
+      </w:r>
+      <w:proofErr w:type="spellEnd"/>
+      <w:r>
+        <w:t xml:space="preserve"> felel többek között a modális ablakok, </w:t>
+      </w:r>
+      <w:r>
+        <w:t xml:space="preserve">és az </w:t>
+      </w:r>
+      <w:proofErr w:type="spellStart"/>
+      <w:r>
+        <w:t>inventory</w:t>
+      </w:r>
+      <w:proofErr w:type="spellEnd"/>
+      <w:r>
+        <w:t xml:space="preserve"> megjelenítéséért.</w:t>
+      </w:r>
+    </w:p>
+    <w:p>
+      <w:pPr>
+        <w:pStyle w:val="Szakdolgozatbekezds"/>
+      </w:pPr>
+      <w:r>
+        <w:t xml:space="preserve">Kódszinten a frontend struktúrája jól elkülöníti egymástól az oldalakat, a vizuális komponenseket és az állapotkezelési logikát. Az alkalmazás </w:t>
+      </w:r>
+      <w:proofErr w:type="spellStart"/>
+      <w:r>
+        <w:t>store</w:t>
+      </w:r>
+      <w:proofErr w:type="spellEnd"/>
+      <w:r>
+        <w:t>/</w:t>
+      </w:r>
+      <w:proofErr w:type="spellStart"/>
+      <w:r>
+        <w:t>reducer</w:t>
+      </w:r>
+      <w:proofErr w:type="spellEnd"/>
+      <w:sdt>
+        <w:sdtPr>
+          <w:id w:val="560218796"/>
+          <w:citation/>
+        </w:sdtPr>
+        <w:sdtContent>
+          <w:r>
+            <w:fldChar w:fldCharType="begin"/>
+          </w:r>
+          <w:r>
+            <w:instrText xml:space="preserve"> CITATION ReactStoreReducer \l 1038 </w:instrText>
+          </w:r>
+          <w:r>
+            <w:fldChar w:fldCharType="separate"/>
+          </w:r>
+          <w:r>
+            <w:rPr>
+              <w:noProof/>
+            </w:rPr>
+            <w:t xml:space="preserve"> </w:t>
+          </w:r>
+          <w:r>
+            <w:rPr>
+              <w:noProof/>
+            </w:rPr>
+            <w:t>[20]</w:t>
+          </w:r>
+          <w:r>
+            <w:fldChar w:fldCharType="end"/>
+          </w:r>
+        </w:sdtContent>
+      </w:sdt>
+      <w:r>
+        <w:t xml:space="preserve"> alapú állapotkezelést is használ, amely lehetővé teszi, hogy a business </w:t>
+      </w:r>
+      <w:proofErr w:type="spellStart"/>
+      <w:r>
+        <w:t>logic</w:t>
+      </w:r>
+      <w:proofErr w:type="spellEnd"/>
+      <w:r>
+        <w:t xml:space="preserve"> jelentős része ne közvetlenül a megjelenítési réteghez </w:t>
+      </w:r>
+      <w:proofErr w:type="spellStart"/>
+      <w:r>
+        <w:t>kötődjön</w:t>
+      </w:r>
+      <w:proofErr w:type="spellEnd"/>
+      <w:r>
+        <w:t xml:space="preserve">. Ez az </w:t>
+      </w:r>
+      <w:proofErr w:type="spellStart"/>
+      <w:r>
+        <w:t>architekturális</w:t>
+      </w:r>
+      <w:proofErr w:type="spellEnd"/>
+      <w:r>
+        <w:t xml:space="preserve"> megoldás hosszabb távon kedvező abból a szempontból is, hogy a klienslogika egy része könnyebben átültethető lenne egy másik felhasználói platformra, például egy </w:t>
+      </w:r>
+      <w:proofErr w:type="spellStart"/>
+      <w:r>
+        <w:t>React</w:t>
+      </w:r>
+      <w:proofErr w:type="spellEnd"/>
+      <w:r>
+        <w:t xml:space="preserve"> </w:t>
+      </w:r>
+      <w:proofErr w:type="spellStart"/>
+      <w:r>
+        <w:t>Native</w:t>
+      </w:r>
+      <w:proofErr w:type="spellEnd"/>
+      <w:r>
+        <w:t xml:space="preserve"> alapú mobilalkalmazásba.</w:t>
       </w:r>
     </w:p>
     <w:p>
       <w:pPr>
         <w:pStyle w:val="Szakdolgozath2"/>
       </w:pPr>
-      <w:bookmarkStart w:id="20" w:name="_Toc225492663"/>
-      <w:r>
-        <w:t>File tárolás - Blob storage</w:t>
+      <w:bookmarkStart w:id="20" w:name="_Toc225505740"/>
+      <w:r>
+        <w:t>Backend API</w:t>
       </w:r>
       <w:bookmarkEnd w:id="20"/>
     </w:p>
     <w:p>
       <w:pPr>
+        <w:pStyle w:val="Szakdolgozatbekezds"/>
+      </w:pPr>
+      <w:r>
+        <w:t xml:space="preserve">A háttérrendszer egy klasszikus, </w:t>
+      </w:r>
+      <w:proofErr w:type="spellStart"/>
+      <w:r>
+        <w:t>controller</w:t>
+      </w:r>
+      <w:proofErr w:type="spellEnd"/>
+      <w:r>
+        <w:t xml:space="preserve">-alapú API-architektúrát követ. A rendszer </w:t>
+      </w:r>
+      <w:proofErr w:type="spellStart"/>
+      <w:r>
+        <w:t>FastAPI</w:t>
+      </w:r>
+      <w:proofErr w:type="spellEnd"/>
+      <w:sdt>
+        <w:sdtPr>
+          <w:id w:val="-1616049989"/>
+          <w:citation/>
+        </w:sdtPr>
+        <w:sdtContent>
+          <w:r>
+            <w:fldChar w:fldCharType="begin"/>
+          </w:r>
+          <w:r>
+            <w:instrText xml:space="preserve"> CITATION FastApi \l 1038 </w:instrText>
+          </w:r>
+          <w:r>
+            <w:fldChar w:fldCharType="separate"/>
+          </w:r>
+          <w:r>
+            <w:rPr>
+              <w:noProof/>
+            </w:rPr>
+            <w:t xml:space="preserve"> </w:t>
+          </w:r>
+          <w:r>
+            <w:rPr>
+              <w:noProof/>
+            </w:rPr>
+            <w:t>[11]</w:t>
+          </w:r>
+          <w:r>
+            <w:fldChar w:fldCharType="end"/>
+          </w:r>
+        </w:sdtContent>
+      </w:sdt>
+      <w:r>
+        <w:t xml:space="preserve"> </w:t>
+      </w:r>
+      <w:r>
+        <w:t>alapokon épül fel, és több, funkció szerint szétválasztott routerre tagolódik. Az API elsődleges feladata az adatbázissal való kommunikáció, az üzleti szabályok érvényesítése, valamint a frontend számára szükséges szolgáltatások biztosítása.</w:t>
+      </w:r>
+    </w:p>
+    <w:p>
+      <w:pPr>
+        <w:pStyle w:val="Szakdolgozatbekezds"/>
+      </w:pPr>
+      <w:r>
+        <w:t xml:space="preserve">Jelenleg összesen 17 HTTP végponttal rendelkezik, amelyek a hitelesítéshez, felhasználói adatok kezeléséhez, </w:t>
+      </w:r>
+      <w:proofErr w:type="spellStart"/>
+      <w:r>
+        <w:t>token</w:t>
+      </w:r>
+      <w:proofErr w:type="spellEnd"/>
+      <w:r>
+        <w:t xml:space="preserve"> </w:t>
+      </w:r>
+      <w:r>
+        <w:t xml:space="preserve">műveletekhez, pályakezeléshez és </w:t>
+      </w:r>
+      <w:proofErr w:type="spellStart"/>
+      <w:r>
+        <w:t>sprite</w:t>
+      </w:r>
+      <w:proofErr w:type="spellEnd"/>
+      <w:r>
+        <w:t>-kiszolgáláshoz kapcsolódnak.</w:t>
+      </w:r>
+    </w:p>
+    <w:p>
+      <w:pPr>
+        <w:pStyle w:val="Szakdolgozatbekezds"/>
+      </w:pPr>
+      <w:r>
+        <w:t xml:space="preserve">Az adatkezelés modellalapú megközelítéssel történik. A rendszer </w:t>
+      </w:r>
+      <w:proofErr w:type="spellStart"/>
+      <w:r>
+        <w:t>SQLAlchemy</w:t>
+      </w:r>
+      <w:proofErr w:type="spellEnd"/>
+      <w:sdt>
+        <w:sdtPr>
+          <w:id w:val="-89865323"/>
+          <w:citation/>
+        </w:sdtPr>
+        <w:sdtContent>
+          <w:r>
+            <w:fldChar w:fldCharType="begin"/>
+          </w:r>
+          <w:r>
+            <w:instrText xml:space="preserve"> CITATION SQLAclhemy \l 1038 </w:instrText>
+          </w:r>
+          <w:r>
+            <w:fldChar w:fldCharType="separate"/>
+          </w:r>
+          <w:r>
+            <w:rPr>
+              <w:noProof/>
+            </w:rPr>
+            <w:t xml:space="preserve"> </w:t>
+          </w:r>
+          <w:r>
+            <w:rPr>
+              <w:noProof/>
+            </w:rPr>
+            <w:t>[13]</w:t>
+          </w:r>
+          <w:r>
+            <w:fldChar w:fldCharType="end"/>
+          </w:r>
+        </w:sdtContent>
+      </w:sdt>
+      <w:r>
+        <w:t xml:space="preserve"> ORM modelleket használ, amelyek az adatbázis struktúráját írják le. Az adatbázis-séma változásainak követésére és konzisztens kezelésére migrációs mechanizmus szolgál, amelyet </w:t>
+      </w:r>
+      <w:proofErr w:type="spellStart"/>
+      <w:r>
+        <w:t>Alembic</w:t>
+      </w:r>
+      <w:proofErr w:type="spellEnd"/>
+      <w:r>
+        <w:t xml:space="preserve"> alapokon valósít meg a projekt. Ez biztosítja, hogy a fejlesztési és futtatási környezetekben az adatbázis szerkezete egységesen kezelhető maradjon.</w:t>
+      </w:r>
+    </w:p>
+    <w:p>
+      <w:pPr>
+        <w:pStyle w:val="Szakdolgozatbekezds"/>
+      </w:pPr>
+    </w:p>
+    <w:p>
+      <w:pPr>
+        <w:pStyle w:val="Szakdolgozatbekezds"/>
+      </w:pPr>
+      <w:r>
+        <w:lastRenderedPageBreak/>
+        <w:t xml:space="preserve">Üzleti logika szerint a backend két jól elkülöníthető fő területre bontható. Az egyik a pályagenerálási folyamat, amely mesterséges intelligencia támogatásával történik, és az </w:t>
+      </w:r>
+      <w:proofErr w:type="spellStart"/>
+      <w:r>
+        <w:t>OpenAI</w:t>
+      </w:r>
+      <w:proofErr w:type="spellEnd"/>
+      <w:r>
+        <w:t xml:space="preserve"> szolgáltatásaira épül. Ez a rész kezeli a pályák előállítását, ellenőrzését, szükség szerinti javítását, valamint a kapcsolódó erőforrások létrehozását. A másik fő terület az egyéb, hagyományos CRUD-jellegű műveletek köre, mint például a felhasználókezelés, hitelesítés, értékelések, kedvencek, </w:t>
+      </w:r>
+      <w:proofErr w:type="spellStart"/>
+      <w:r>
+        <w:t>tokenegyenleg</w:t>
+      </w:r>
+      <w:proofErr w:type="spellEnd"/>
+      <w:r>
+        <w:t xml:space="preserve"> és pályaállapotok kezelése.</w:t>
+      </w:r>
+    </w:p>
+    <w:p>
+      <w:pPr>
         <w:pStyle w:val="Szakdolgozath2"/>
       </w:pPr>
-      <w:r>
-        <w:tab/>
-      </w:r>
-      <w:bookmarkStart w:id="21" w:name="_Toc225492664"/>
-      <w:r>
-        <w:t>Biztonság, JWT token authentikáció</w:t>
+      <w:bookmarkStart w:id="21" w:name="_Toc225505741"/>
+      <w:proofErr w:type="spellStart"/>
+      <w:r>
+        <w:t>WebSocket</w:t>
+      </w:r>
+      <w:proofErr w:type="spellEnd"/>
+      <w:r>
+        <w:t xml:space="preserve"> server</w:t>
       </w:r>
       <w:bookmarkEnd w:id="21"/>
+    </w:p>
+    <w:p>
+      <w:pPr>
+        <w:pStyle w:val="Szakdolgozatbekezds"/>
+      </w:pPr>
+      <w:r>
+        <w:t xml:space="preserve">A </w:t>
+      </w:r>
+      <w:proofErr w:type="spellStart"/>
+      <w:r>
+        <w:t>websocket</w:t>
+      </w:r>
+      <w:proofErr w:type="spellEnd"/>
       <w:r>
         <w:t xml:space="preserve"> </w:t>
+      </w:r>
+      <w:r>
+        <w:t>server</w:t>
+      </w:r>
+      <w:r>
+        <w:t xml:space="preserve"> egy egyszerű, könnyűsúlyú </w:t>
+      </w:r>
+      <w:proofErr w:type="spellStart"/>
+      <w:r>
+        <w:t>socket</w:t>
+      </w:r>
+      <w:proofErr w:type="spellEnd"/>
+      <w:r>
+        <w:t xml:space="preserve"> szerverként van jelen a rendszerben. Nem tartalmaz összetett üzleti logikát, elsődleges feladata az események közvetítése a háttérrendszer és a kliens között. A szerver Socket.IO alapú megoldást használ, amely szobákra épülő kommunikációt tesz lehetővé. Jelenlegi állapotában 2 HTTP végponttal rendelkezik, emellett </w:t>
+      </w:r>
+      <w:proofErr w:type="spellStart"/>
+      <w:r>
+        <w:t>websocket</w:t>
+      </w:r>
+      <w:proofErr w:type="spellEnd"/>
+      <w:r>
+        <w:t xml:space="preserve"> eseményeken keresztül biztosít </w:t>
+      </w:r>
+      <w:proofErr w:type="spellStart"/>
+      <w:r>
+        <w:t>kétirányú</w:t>
+      </w:r>
+      <w:proofErr w:type="spellEnd"/>
+      <w:r>
+        <w:t xml:space="preserve"> kommunikációt.</w:t>
+      </w:r>
+    </w:p>
+    <w:p>
+      <w:pPr>
+        <w:pStyle w:val="Szakdolgozatbekezds"/>
+      </w:pPr>
+      <w:proofErr w:type="spellStart"/>
+      <w:r>
+        <w:t>Architekturális</w:t>
+      </w:r>
+      <w:proofErr w:type="spellEnd"/>
+      <w:r>
+        <w:t xml:space="preserve"> szerepe elsősorban a pályagenerálási folyamat állapotkövetésében jelenik meg. A Backend API egy HTTP üzenetküldéssel értesíti a </w:t>
+      </w:r>
+      <w:proofErr w:type="spellStart"/>
+      <w:r>
+        <w:t>websocket</w:t>
+      </w:r>
+      <w:proofErr w:type="spellEnd"/>
+      <w:r>
+        <w:t xml:space="preserve"> szervert az aktuális generálási eseményekről, a frontend pedig </w:t>
+      </w:r>
+      <w:proofErr w:type="spellStart"/>
+      <w:r>
+        <w:t>websocket</w:t>
+      </w:r>
+      <w:proofErr w:type="spellEnd"/>
+      <w:r>
+        <w:t xml:space="preserve"> kapcsolaton keresztül csatlakozik az adott generálási folyamathoz tartozó szobához, és fogadja ezeket az állapotfrissítéseket. Ennek eredményeként a </w:t>
+      </w:r>
+      <w:proofErr w:type="spellStart"/>
+      <w:r>
+        <w:t>websocket</w:t>
+      </w:r>
+      <w:proofErr w:type="spellEnd"/>
+      <w:r>
+        <w:t xml:space="preserve"> réteg egy köztes kommunikációs csatornaként működik, amely valós idejű visszajelzést biztosít a felhasználó számára anélkül, hogy a backend és a frontend közvetlen, folyamatos </w:t>
+      </w:r>
+      <w:proofErr w:type="spellStart"/>
+      <w:r>
+        <w:t>polling</w:t>
+      </w:r>
+      <w:proofErr w:type="spellEnd"/>
+      <w:r>
+        <w:t xml:space="preserve"> alapú kapcsolatot igényelne.</w:t>
+      </w:r>
+    </w:p>
+    <w:p>
+      <w:pPr>
+        <w:pStyle w:val="Szakdolgozath2"/>
+      </w:pPr>
+      <w:bookmarkStart w:id="22" w:name="_Toc225505742"/>
+      <w:r>
+        <w:t xml:space="preserve">File </w:t>
+      </w:r>
+      <w:proofErr w:type="spellStart"/>
+      <w:r>
+        <w:t>Blob</w:t>
+      </w:r>
+      <w:proofErr w:type="spellEnd"/>
+      <w:r>
+        <w:t xml:space="preserve"> </w:t>
+      </w:r>
+      <w:proofErr w:type="spellStart"/>
+      <w:r>
+        <w:t>storage</w:t>
+      </w:r>
+      <w:bookmarkEnd w:id="22"/>
+      <w:proofErr w:type="spellEnd"/>
+    </w:p>
+    <w:p>
+      <w:pPr>
+        <w:pStyle w:val="Szakdolgozatbekezds"/>
+      </w:pPr>
+      <w:r>
+        <w:t>A fájltárolási réteg egy S3</w:t>
+      </w:r>
+      <w:sdt>
+        <w:sdtPr>
+          <w:id w:val="813140839"/>
+          <w:citation/>
+        </w:sdtPr>
+        <w:sdtContent>
+          <w:r>
+            <w:fldChar w:fldCharType="begin"/>
+          </w:r>
+          <w:r>
+            <w:instrText xml:space="preserve"> CITATION AWS_S3 \l 1038 </w:instrText>
+          </w:r>
+          <w:r>
+            <w:fldChar w:fldCharType="separate"/>
+          </w:r>
+          <w:r>
+            <w:rPr>
+              <w:noProof/>
+            </w:rPr>
+            <w:t xml:space="preserve"> </w:t>
+          </w:r>
+          <w:r>
+            <w:rPr>
+              <w:noProof/>
+            </w:rPr>
+            <w:t>[21]</w:t>
+          </w:r>
+          <w:r>
+            <w:fldChar w:fldCharType="end"/>
+          </w:r>
+        </w:sdtContent>
+      </w:sdt>
+      <w:r>
+        <w:t xml:space="preserve"> </w:t>
+      </w:r>
+      <w:r>
+        <w:t>kompatibilis objektumtárolási megközelítést alkalmaz. A projekt jelenlegi formájában egy AWS-</w:t>
+      </w:r>
+      <w:proofErr w:type="spellStart"/>
+      <w:r>
+        <w:t>ready</w:t>
+      </w:r>
+      <w:proofErr w:type="spellEnd"/>
+      <w:r>
+        <w:t xml:space="preserve"> szimulátoros környezetet használ, amely funkcionálisan az AWS S3 jellegű tárolási modellhez illeszkedik. A megoldás általános célú, vagyis </w:t>
+      </w:r>
+      <w:proofErr w:type="spellStart"/>
+      <w:r>
+        <w:t>architekturálisan</w:t>
+      </w:r>
+      <w:proofErr w:type="spellEnd"/>
+      <w:r>
+        <w:t xml:space="preserve"> bármilyen típusú fájl tárolására alkalmas, nem kizárólag egyetlen médiatípus kezelésére van optimalizálva.</w:t>
+      </w:r>
+      <w:r>
+        <w:t xml:space="preserve"> </w:t>
+      </w:r>
+      <w:r>
+        <w:t>A gyakorlatban a rendszer jelenleg főként .</w:t>
+      </w:r>
+      <w:proofErr w:type="spellStart"/>
+      <w:r>
+        <w:t>png</w:t>
+      </w:r>
+      <w:proofErr w:type="spellEnd"/>
+      <w:r>
+        <w:t xml:space="preserve"> képfájlokat </w:t>
+      </w:r>
+      <w:proofErr w:type="gramStart"/>
+      <w:r>
+        <w:t>és .</w:t>
+      </w:r>
+      <w:proofErr w:type="spellStart"/>
+      <w:r>
+        <w:t>json</w:t>
+      </w:r>
+      <w:proofErr w:type="spellEnd"/>
+      <w:proofErr w:type="gramEnd"/>
+      <w:r>
+        <w:t xml:space="preserve"> állományokat tárol. A tárolási struktúra</w:t>
+      </w:r>
+      <w:r>
+        <w:t xml:space="preserve"> </w:t>
+      </w:r>
+      <w:r>
+        <w:t>pályaazonosító alapú prefixek szerint szerveződik, vagyis minden generált pályához saját logikai mappa tartozik.</w:t>
+      </w:r>
+      <w:r>
+        <w:t xml:space="preserve"> </w:t>
+      </w:r>
+      <w:r>
+        <w:t xml:space="preserve">Ezen belül külön almappában helyezkednek el a </w:t>
+      </w:r>
+      <w:proofErr w:type="spellStart"/>
+      <w:r>
+        <w:t>sprite</w:t>
+      </w:r>
+      <w:proofErr w:type="spellEnd"/>
+      <w:r>
+        <w:t xml:space="preserve"> képek, míg a pályaállományok és a generálási folyamathoz kapcsolódó JSON fájlok a pályához tartozó gyökérszinten tárolódnak.</w:t>
+      </w:r>
+    </w:p>
+    <w:p>
+      <w:pPr>
+        <w:pStyle w:val="Szakdolgozatbekezds"/>
+      </w:pPr>
+    </w:p>
+    <w:p>
+      <w:pPr>
+        <w:pStyle w:val="Szakdolgozatbekezds"/>
+      </w:pPr>
+      <w:r>
+        <w:lastRenderedPageBreak/>
+        <w:t xml:space="preserve">A JSON állományok szerepkör szerint is elkülönülnek. Egy részük a generálási folyamat köztes eredményeit tartalmazza, például a kezdeti generált pályaváltozatot, a validációs kimeneteket vagy az egyes javítási körök eredményeit. Más részük a véglegesített pályaleírást reprezentálja, amelyet a frontend a játékmenet során betölt és feldolgoz. Emellett a rendszer diagnosztikai célból hibás generálási kimeneteket is képes külön fájlban eltárolni. Ez a struktúra </w:t>
+      </w:r>
+      <w:proofErr w:type="spellStart"/>
+      <w:r>
+        <w:t>architekturális</w:t>
+      </w:r>
+      <w:proofErr w:type="spellEnd"/>
+      <w:r>
+        <w:t xml:space="preserve"> szinten jól támogatja a generálási folyamat nyomon követhetőségét, a hibakezelést és a végleges pályaállapot tartós megőrzését.</w:t>
+      </w:r>
+    </w:p>
+    <w:p>
+      <w:pPr>
+        <w:pStyle w:val="Szakdolgozatbekezds"/>
+        <w:rPr>
+          <w:b/>
+          <w:bCs/>
+        </w:rPr>
+      </w:pPr>
+      <w:proofErr w:type="spellStart"/>
+      <w:r>
+        <w:rPr>
+          <w:b/>
+          <w:bCs/>
+        </w:rPr>
+        <w:t>Json</w:t>
+      </w:r>
+      <w:proofErr w:type="spellEnd"/>
+      <w:r>
+        <w:rPr>
+          <w:b/>
+          <w:bCs/>
+        </w:rPr>
+        <w:t xml:space="preserve"> file elérés:</w:t>
+      </w:r>
+    </w:p>
+    <w:p>
+      <w:pPr>
+        <w:pStyle w:val="Szakdolgozatbekezds"/>
+      </w:pPr>
+      <w:r>
+        <w:t>{STORAGE_PUBLIC_BASE_</w:t>
+      </w:r>
+      <w:proofErr w:type="gramStart"/>
+      <w:r>
+        <w:t>URL}/</w:t>
+      </w:r>
+      <w:proofErr w:type="gramEnd"/>
+      <w:r>
+        <w:t>{BUCKET_</w:t>
+      </w:r>
+      <w:proofErr w:type="gramStart"/>
+      <w:r>
+        <w:t>NAME}/</w:t>
+      </w:r>
+      <w:proofErr w:type="gramEnd"/>
+      <w:r>
+        <w:t>{</w:t>
+      </w:r>
+      <w:proofErr w:type="spellStart"/>
+      <w:r>
+        <w:t>level_</w:t>
+      </w:r>
+      <w:proofErr w:type="gramStart"/>
+      <w:r>
+        <w:t>id</w:t>
+      </w:r>
+      <w:proofErr w:type="spellEnd"/>
+      <w:r>
+        <w:t>}/{</w:t>
+      </w:r>
+      <w:r>
+        <w:t xml:space="preserve"> </w:t>
+      </w:r>
+      <w:proofErr w:type="spellStart"/>
+      <w:r>
+        <w:t>json</w:t>
+      </w:r>
+      <w:proofErr w:type="spellEnd"/>
+      <w:proofErr w:type="gramEnd"/>
+      <w:r>
+        <w:t xml:space="preserve"> </w:t>
+      </w:r>
+      <w:proofErr w:type="gramStart"/>
+      <w:r>
+        <w:t xml:space="preserve">file </w:t>
+      </w:r>
+      <w:r>
+        <w:t>}</w:t>
+      </w:r>
+      <w:proofErr w:type="gramEnd"/>
+    </w:p>
+    <w:p>
+      <w:pPr>
+        <w:pStyle w:val="Szakdolgozatbekezds"/>
+        <w:rPr>
+          <w:b/>
+          <w:bCs/>
+        </w:rPr>
+      </w:pPr>
+      <w:proofErr w:type="spellStart"/>
+      <w:r>
+        <w:rPr>
+          <w:b/>
+          <w:bCs/>
+        </w:rPr>
+        <w:t>Sprite</w:t>
+      </w:r>
+      <w:proofErr w:type="spellEnd"/>
+      <w:r>
+        <w:rPr>
+          <w:b/>
+          <w:bCs/>
+        </w:rPr>
+        <w:t xml:space="preserve"> file elérés:</w:t>
+      </w:r>
+    </w:p>
+    <w:p>
+      <w:pPr>
+        <w:pStyle w:val="Szakdolgozatbekezds"/>
+      </w:pPr>
+      <w:r>
+        <w:t>{STORAGE_PUBLIC_BASE_</w:t>
+      </w:r>
+      <w:proofErr w:type="gramStart"/>
+      <w:r>
+        <w:t>URL}/</w:t>
+      </w:r>
+      <w:proofErr w:type="gramEnd"/>
+      <w:r>
+        <w:t>{BUCKET_</w:t>
+      </w:r>
+      <w:proofErr w:type="gramStart"/>
+      <w:r>
+        <w:t>NAME}</w:t>
+      </w:r>
+      <w:r>
+        <w:t>/</w:t>
+      </w:r>
+      <w:proofErr w:type="gramEnd"/>
+      <w:r>
+        <w:t>{</w:t>
+      </w:r>
+      <w:proofErr w:type="spellStart"/>
+      <w:r>
+        <w:t>level_</w:t>
+      </w:r>
+      <w:proofErr w:type="gramStart"/>
+      <w:r>
+        <w:t>id</w:t>
+      </w:r>
+      <w:proofErr w:type="spellEnd"/>
+      <w:r>
+        <w:t>}/</w:t>
+      </w:r>
+      <w:proofErr w:type="spellStart"/>
+      <w:proofErr w:type="gramEnd"/>
+      <w:r>
+        <w:t>sprites</w:t>
+      </w:r>
+      <w:proofErr w:type="spellEnd"/>
+      <w:proofErr w:type="gramStart"/>
+      <w:r>
+        <w:t>/</w:t>
+      </w:r>
+      <w:r>
+        <w:t>{</w:t>
+      </w:r>
+      <w:proofErr w:type="spellStart"/>
+      <w:proofErr w:type="gramEnd"/>
+      <w:r>
+        <w:t>png</w:t>
+      </w:r>
+      <w:proofErr w:type="spellEnd"/>
+      <w:r>
+        <w:t xml:space="preserve"> file}</w:t>
+      </w:r>
+    </w:p>
+    <w:p>
+      <w:pPr>
+        <w:pStyle w:val="Szakdolgozath2"/>
+      </w:pPr>
+      <w:bookmarkStart w:id="23" w:name="_Toc225505743"/>
+      <w:r>
+        <w:t>Biztonság</w:t>
+      </w:r>
+      <w:r>
+        <w:t xml:space="preserve">, JWT </w:t>
+      </w:r>
+      <w:proofErr w:type="spellStart"/>
+      <w:r>
+        <w:t>token</w:t>
+      </w:r>
+      <w:proofErr w:type="spellEnd"/>
+      <w:r>
+        <w:t xml:space="preserve"> </w:t>
+      </w:r>
+      <w:proofErr w:type="spellStart"/>
+      <w:r>
+        <w:t>authentikáció</w:t>
+      </w:r>
+      <w:bookmarkEnd w:id="23"/>
+      <w:proofErr w:type="spellEnd"/>
+      <w:r>
+        <w:t xml:space="preserve"> </w:t>
+      </w:r>
+    </w:p>
+    <w:p>
+      <w:pPr>
+        <w:pStyle w:val="Szakdolgozatbekezds"/>
+      </w:pPr>
+      <w:r>
+        <w:t xml:space="preserve">A felhasználók hitelesítése JSON Web </w:t>
+      </w:r>
+      <w:proofErr w:type="spellStart"/>
+      <w:r>
+        <w:t>Token</w:t>
+      </w:r>
+      <w:proofErr w:type="spellEnd"/>
+      <w:r>
+        <w:t xml:space="preserve"> (JWT) alapú megoldással történik, amely RS256 algoritmust alkalmazó, nyilvános és privát kulcspáron alapuló aláírással került megvalósításra. Ez biztosítja, hogy a kliensoldali alkalmazás a bejelentkezést követően biztonságos módon férjen hozzá a védett erőforrásokhoz, miközben a szerver ellenőrizni tudja a </w:t>
+      </w:r>
+      <w:proofErr w:type="spellStart"/>
+      <w:r>
+        <w:t>tokenek</w:t>
+      </w:r>
+      <w:proofErr w:type="spellEnd"/>
+      <w:r>
+        <w:t xml:space="preserve"> hitelességét és érvényességét.</w:t>
+      </w:r>
+    </w:p>
+    <w:p>
+      <w:pPr>
+        <w:pStyle w:val="Szakdolgozatbekezds"/>
+      </w:pPr>
+      <w:r>
+        <w:t xml:space="preserve">Bejelentkezéskor a backend egy rövid élettartamú </w:t>
+      </w:r>
+      <w:proofErr w:type="spellStart"/>
+      <w:r>
+        <w:t>access</w:t>
+      </w:r>
+      <w:proofErr w:type="spellEnd"/>
+      <w:r>
+        <w:t xml:space="preserve"> </w:t>
+      </w:r>
+      <w:proofErr w:type="spellStart"/>
+      <w:r>
+        <w:t>token</w:t>
+      </w:r>
+      <w:proofErr w:type="spellEnd"/>
+      <w:r>
+        <w:t xml:space="preserve">-t és egy hosszabb élettartamú </w:t>
+      </w:r>
+      <w:proofErr w:type="spellStart"/>
+      <w:r>
+        <w:t>refresh</w:t>
+      </w:r>
+      <w:proofErr w:type="spellEnd"/>
+      <w:r>
+        <w:t xml:space="preserve"> </w:t>
+      </w:r>
+      <w:proofErr w:type="spellStart"/>
+      <w:r>
+        <w:t>token</w:t>
+      </w:r>
+      <w:proofErr w:type="spellEnd"/>
+      <w:r>
+        <w:t xml:space="preserve">-t ad vissza. Az </w:t>
+      </w:r>
+      <w:proofErr w:type="spellStart"/>
+      <w:r>
+        <w:t>access</w:t>
+      </w:r>
+      <w:proofErr w:type="spellEnd"/>
+      <w:r>
+        <w:t xml:space="preserve"> </w:t>
+      </w:r>
+      <w:proofErr w:type="spellStart"/>
+      <w:r>
+        <w:t>token</w:t>
+      </w:r>
+      <w:proofErr w:type="spellEnd"/>
+      <w:r>
+        <w:t xml:space="preserve"> szolgál a védett végpontok elérésére, míg a </w:t>
+      </w:r>
+      <w:proofErr w:type="spellStart"/>
+      <w:r>
+        <w:t>refresh</w:t>
+      </w:r>
+      <w:proofErr w:type="spellEnd"/>
+      <w:r>
+        <w:t xml:space="preserve"> </w:t>
+      </w:r>
+      <w:proofErr w:type="spellStart"/>
+      <w:r>
+        <w:t>token</w:t>
+      </w:r>
+      <w:proofErr w:type="spellEnd"/>
+      <w:r>
+        <w:t xml:space="preserve"> segítségével a kliens új </w:t>
+      </w:r>
+      <w:proofErr w:type="spellStart"/>
+      <w:r>
+        <w:t>tokenpárt</w:t>
+      </w:r>
+      <w:proofErr w:type="spellEnd"/>
+      <w:r>
+        <w:t xml:space="preserve"> kérhet anélkül, hogy a felhasználónak újra be kellene jelentkeznie. A frontend a </w:t>
+      </w:r>
+      <w:proofErr w:type="spellStart"/>
+      <w:r>
+        <w:t>tokeneket</w:t>
+      </w:r>
+      <w:proofErr w:type="spellEnd"/>
+      <w:r>
+        <w:t xml:space="preserve"> kliensoldalon tárolja, és minden védett API-hívásnál </w:t>
+      </w:r>
+      <w:proofErr w:type="spellStart"/>
+      <w:r>
+        <w:t>Bearer</w:t>
+      </w:r>
+      <w:proofErr w:type="spellEnd"/>
+      <w:r>
+        <w:t xml:space="preserve"> tokenként küldi az </w:t>
+      </w:r>
+      <w:proofErr w:type="spellStart"/>
+      <w:r>
+        <w:t>Authorization</w:t>
+      </w:r>
+      <w:proofErr w:type="spellEnd"/>
+      <w:r>
+        <w:t xml:space="preserve"> fejlécben. A backend minden védett kérésnél ellenőrzi a </w:t>
+      </w:r>
+      <w:proofErr w:type="spellStart"/>
+      <w:r>
+        <w:t>token</w:t>
+      </w:r>
+      <w:proofErr w:type="spellEnd"/>
+      <w:r>
+        <w:t xml:space="preserve"> típusát, lejáratát, valamint a benne szereplő felhasználói azonosítót. A jelenlegi működés előnye, hogy jól elkülöníti a hitelesítési réteget az üzleti logikától, és a </w:t>
+      </w:r>
+      <w:proofErr w:type="spellStart"/>
+      <w:r>
+        <w:t>refresh</w:t>
+      </w:r>
+      <w:proofErr w:type="spellEnd"/>
+      <w:r>
+        <w:t xml:space="preserve"> mechanizmus kényelmesebb felhasználói élményt biztosít. Architektúra szinten fontos még, hogy a </w:t>
+      </w:r>
+      <w:proofErr w:type="spellStart"/>
+      <w:r>
+        <w:t>refresh</w:t>
+      </w:r>
+      <w:proofErr w:type="spellEnd"/>
+      <w:r>
+        <w:t xml:space="preserve"> </w:t>
+      </w:r>
+      <w:proofErr w:type="spellStart"/>
+      <w:r>
+        <w:t>tokenek</w:t>
+      </w:r>
+      <w:proofErr w:type="spellEnd"/>
+      <w:r>
+        <w:t xml:space="preserve"> adatbázisban is nyilvántartásra kerülnek, így visszavonhatók, ami biztonsági szempontból kedvezőbb, mint a teljesen </w:t>
+      </w:r>
+      <w:proofErr w:type="spellStart"/>
+      <w:r>
+        <w:t>stateless</w:t>
+      </w:r>
+      <w:proofErr w:type="spellEnd"/>
+      <w:r>
+        <w:t xml:space="preserve"> megközelítés.</w:t>
       </w:r>
     </w:p>
     <w:p>
@@ -4787,7 +6758,7 @@
         </w:rPr>
       </w:pPr>
     </w:p>
-    <w:bookmarkStart w:id="22" w:name="_Toc225492665" w:displacedByCustomXml="next"/>
+    <w:bookmarkStart w:id="24" w:name="_Toc225505744" w:displacedByCustomXml="next"/>
     <w:sdt>
       <w:sdtPr>
         <w:rPr>
@@ -4813,7 +6784,7 @@
           <w:r>
             <w:t>Irodalomjegyzék</w:t>
           </w:r>
-          <w:bookmarkEnd w:id="22"/>
+          <w:bookmarkEnd w:id="24"/>
         </w:p>
         <w:sdt>
           <w:sdtPr>
@@ -5765,12 +7736,12 @@
       <w:pPr>
         <w:pStyle w:val="szmozatlanSzakdolgozath1"/>
       </w:pPr>
-      <w:bookmarkStart w:id="23" w:name="_Toc225492666"/>
+      <w:bookmarkStart w:id="25" w:name="_Toc225505745"/>
       <w:r>
         <w:lastRenderedPageBreak/>
         <w:t>Nyilatkozat</w:t>
       </w:r>
-      <w:bookmarkEnd w:id="23"/>
+      <w:bookmarkEnd w:id="25"/>
     </w:p>
     <w:p>
       <w:pPr>
@@ -5778,7 +7749,23 @@
         <w:ind w:firstLine="720"/>
       </w:pPr>
       <w:r>
-        <w:t>Alulírott Bacsur Martin programtervező informatikus BSc szakos hallgató, kijelentem, hogy a dolgozatomat a Szegedi Tudományegyetem, Informatikai Intézet Szoftverfejlesztés Tanszékén készítettem, programtervező informatikus BSc diploma megszerzése érdekében. </w:t>
+        <w:t xml:space="preserve">Alulírott Bacsur Martin programtervező informatikus </w:t>
+      </w:r>
+      <w:proofErr w:type="spellStart"/>
+      <w:r>
+        <w:t>BSc</w:t>
+      </w:r>
+      <w:proofErr w:type="spellEnd"/>
+      <w:r>
+        <w:t xml:space="preserve"> szakos hallgató, kijelentem, hogy a dolgozatomat a Szegedi Tudományegyetem, Informatikai Intézet Szoftverfejlesztés Tanszékén készítettem, programtervező informatikus </w:t>
+      </w:r>
+      <w:proofErr w:type="spellStart"/>
+      <w:r>
+        <w:t>BSc</w:t>
+      </w:r>
+      <w:proofErr w:type="spellEnd"/>
+      <w:r>
+        <w:t xml:space="preserve"> diploma megszerzése érdekében. </w:t>
       </w:r>
     </w:p>
     <w:p>
@@ -5787,7 +7774,15 @@
         <w:ind w:firstLine="720"/>
       </w:pPr>
       <w:r>
-        <w:t xml:space="preserve">Kijelentem, hogy a dolgozatot más szakon korábban nem védtem meg, saját munkám eredménye, és csak a hivatkozott forrásokat (szakirodalom, eszközök, stb.) használtam fel. </w:t>
+        <w:t xml:space="preserve">Kijelentem, hogy a dolgozatot más szakon korábban nem védtem meg, saját munkám eredménye, és csak a hivatkozott forrásokat (szakirodalom, </w:t>
+      </w:r>
+      <w:proofErr w:type="gramStart"/>
+      <w:r>
+        <w:t>eszközök,</w:t>
+      </w:r>
+      <w:proofErr w:type="gramEnd"/>
+      <w:r>
+        <w:t xml:space="preserve"> stb.) használtam fel. </w:t>
       </w:r>
     </w:p>
     <w:p>
@@ -5796,7 +7791,15 @@
         <w:ind w:firstLine="720"/>
       </w:pPr>
       <w:r>
-        <w:t>Tudomásul veszem, hogy szakdolgozatomat a Szegedi Tudományegyetem Diplomamunka Repozitóriumában tárolja.</w:t>
+        <w:t xml:space="preserve">Tudomásul veszem, hogy szakdolgozatomat a Szegedi Tudományegyetem Diplomamunka </w:t>
+      </w:r>
+      <w:proofErr w:type="spellStart"/>
+      <w:r>
+        <w:t>Repozitóriumában</w:t>
+      </w:r>
+      <w:proofErr w:type="spellEnd"/>
+      <w:r>
+        <w:t xml:space="preserve"> tárolja.</w:t>
       </w:r>
     </w:p>
     <w:p/>
@@ -5846,25 +7849,25 @@
       <w:pPr>
         <w:pStyle w:val="szmozatlanSzakdolgozath1"/>
       </w:pPr>
-      <w:bookmarkStart w:id="24" w:name="_Toc225492667"/>
+      <w:bookmarkStart w:id="26" w:name="_Toc225505746"/>
       <w:r>
         <w:lastRenderedPageBreak/>
         <w:t>Mellékletek</w:t>
       </w:r>
-      <w:bookmarkEnd w:id="24"/>
+      <w:bookmarkEnd w:id="26"/>
     </w:p>
     <w:p>
       <w:pPr>
         <w:pStyle w:val="Szakdolgozath2"/>
       </w:pPr>
-      <w:bookmarkStart w:id="25" w:name="_Toc225492668"/>
+      <w:bookmarkStart w:id="27" w:name="_Toc225505747"/>
       <w:r>
         <w:t>Adatbázis</w:t>
       </w:r>
       <w:r>
         <w:t xml:space="preserve"> relációk</w:t>
       </w:r>
-      <w:bookmarkEnd w:id="25"/>
+      <w:bookmarkEnd w:id="27"/>
     </w:p>
     <w:p>
       <w:pPr>
@@ -5872,7 +7875,15 @@
         <w:ind w:left="720"/>
       </w:pPr>
       <w:r>
-        <w:t>A diagram elkészítéséhez a Graphviz Online</w:t>
+        <w:t xml:space="preserve">A diagram elkészítéséhez a </w:t>
+      </w:r>
+      <w:proofErr w:type="spellStart"/>
+      <w:r>
+        <w:t>Graphviz</w:t>
+      </w:r>
+      <w:proofErr w:type="spellEnd"/>
+      <w:r>
+        <w:t xml:space="preserve"> Online</w:t>
       </w:r>
       <w:r>
         <w:t xml:space="preserve">-t </w:t>
@@ -8061,82 +10072,12 @@
 <file path=customXml/item1.xml><?xml version="1.0" encoding="utf-8"?>
 <b:Sources xmlns:b="http://schemas.openxmlformats.org/officeDocument/2006/bibliography" xmlns="http://schemas.openxmlformats.org/officeDocument/2006/bibliography" SelectedStyle="\IEEE2006OfficeOnline.xsl" StyleName="IEEE" Version="2006">
   <b:Source>
-    <b:Tag>Doc1</b:Tag>
-    <b:SourceType>InternetSite</b:SourceType>
-    <b:Guid>{7733383F-B40B-44CA-8589-0C8266A48B31}</b:Guid>
-    <b:Title>Docker Compose Dokumentáció</b:Title>
-    <b:ProductionCompany>Docker, Inc.</b:ProductionCompany>
-    <b:URL>https://docs.docker.com/compose/</b:URL>
-    <b:RefOrder>2</b:RefOrder>
-  </b:Source>
-  <b:Source>
-    <b:Tag>Doc</b:Tag>
-    <b:SourceType>InternetSite</b:SourceType>
-    <b:Guid>{BC9BC8CD-037F-49BC-B09C-6DABCA6C010C}</b:Guid>
-    <b:Title>Docker Dokumentáció</b:Title>
-    <b:URL>https://docs.docker.com/</b:URL>
-    <b:ProductionCompany>Docker, Inc.</b:ProductionCompany>
-    <b:RefOrder>1</b:RefOrder>
-  </b:Source>
-  <b:Source>
-    <b:Tag>Typ</b:Tag>
-    <b:SourceType>InternetSite</b:SourceType>
-    <b:Guid>{DA7BDE00-A562-400A-BB10-044078340854}</b:Guid>
-    <b:Title>TypeScript Dokumentáció</b:Title>
-    <b:URL>https://www.typescriptlang.org/docs/</b:URL>
-    <b:ProductionCompany>Microsoft</b:ProductionCompany>
-    <b:RefOrder>3</b:RefOrder>
-  </b:Source>
-  <b:Source>
-    <b:Tag>Rea</b:Tag>
-    <b:SourceType>InternetSite</b:SourceType>
-    <b:Guid>{A18859E1-50F2-446C-AD37-751B957DB9EF}</b:Guid>
-    <b:Title>React Dokumentáció</b:Title>
-    <b:ProductionCompany>Meta</b:ProductionCompany>
-    <b:URL>https://react.dev/</b:URL>
-    <b:RefOrder>4</b:RefOrder>
-  </b:Source>
-  <b:Source>
-    <b:Tag>Ang</b:Tag>
-    <b:SourceType>InternetSite</b:SourceType>
-    <b:Guid>{48568170-8D00-46F7-8659-D62A0CA4547A}</b:Guid>
-    <b:Title>Angular Dokumentáció</b:Title>
-    <b:ProductionCompany>Google</b:ProductionCompany>
-    <b:URL>https://angular.dev/</b:URL>
-    <b:RefOrder>5</b:RefOrder>
-  </b:Source>
-  <b:Source>
     <b:Tag>Vue</b:Tag>
     <b:SourceType>InternetSite</b:SourceType>
     <b:Guid>{591CDFB3-0992-4EF4-B389-C048772BA647}</b:Guid>
     <b:Title>VueJs Dokumentáció</b:Title>
     <b:URL>https://vuejs.org/</b:URL>
     <b:RefOrder>6</b:RefOrder>
-  </b:Source>
-  <b:Source>
-    <b:Tag>Pix</b:Tag>
-    <b:SourceType>InternetSite</b:SourceType>
-    <b:Guid>{C5FAB943-D741-4931-BC9F-F102A82D1852}</b:Guid>
-    <b:Title>PixiJs Dokumentáció</b:Title>
-    <b:URL>https://pixijs.com/8.x/guides/getting-started/intro</b:URL>
-    <b:RefOrder>7</b:RefOrder>
-  </b:Source>
-  <b:Source>
-    <b:Tag>Soc</b:Tag>
-    <b:SourceType>InternetSite</b:SourceType>
-    <b:Guid>{9BB0D08A-287B-451D-92EB-7C123461A1F8}</b:Guid>
-    <b:Title>Socket.IO Dokumentáció</b:Title>
-    <b:URL>https://socket.io/</b:URL>
-    <b:RefOrder>8</b:RefOrder>
-  </b:Source>
-  <b:Source>
-    <b:Tag>Pyt</b:Tag>
-    <b:SourceType>InternetSite</b:SourceType>
-    <b:Guid>{6093C1DF-ACBA-4145-B440-671CF45A0E88}</b:Guid>
-    <b:Title>Python Dokumentáció</b:Title>
-    <b:ProductionCompany> Python Software Foundation (PSF)</b:ProductionCompany>
-    <b:URL>https://docs.python.org/3/</b:URL>
-    <b:RefOrder>9</b:RefOrder>
   </b:Source>
   <b:Source>
     <b:Tag>Pyt1</b:Tag>
@@ -8147,82 +10088,168 @@
     <b:RefOrder>10</b:RefOrder>
   </b:Source>
   <b:Source>
-    <b:Tag>Fas</b:Tag>
+    <b:Tag>Alembic</b:Tag>
     <b:SourceType>InternetSite</b:SourceType>
-    <b:Guid>{1935E22C-2124-4DB0-B6DE-1B1E9F9C667F}</b:Guid>
+    <b:Guid>{7ACA1290-EC8A-458B-911F-F3023B58E235}</b:Guid>
+    <b:Title>Alembic Dokumentáció</b:Title>
+    <b:URL>https://alembic.sqlalchemy.org/en/latest/</b:URL>
+    <b:RefOrder>14</b:RefOrder>
+  </b:Source>
+  <b:Source>
+    <b:Tag>Angular</b:Tag>
+    <b:SourceType>InternetSite</b:SourceType>
+    <b:Guid>{0631E14A-7CBF-473A-8EC2-B7BD3FCE46E9}</b:Guid>
+    <b:Title>Angular Dokumentáció</b:Title>
+    <b:ProductionCompany>Google</b:ProductionCompany>
+    <b:URL>https://angular.dev/</b:URL>
+    <b:RefOrder>5</b:RefOrder>
+  </b:Source>
+  <b:Source>
+    <b:Tag>DockerCompose</b:Tag>
+    <b:SourceType>InternetSite</b:SourceType>
+    <b:Guid>{DA266792-EEF5-4FD5-8148-29F3CFE99426}</b:Guid>
+    <b:Title>Docker Compose Dokumentáció</b:Title>
+    <b:ProductionCompany>Docker, Inc.</b:ProductionCompany>
+    <b:URL>https://docs.docker.com/compose/</b:URL>
+    <b:RefOrder>2</b:RefOrder>
+  </b:Source>
+  <b:Source>
+    <b:Tag>Docker</b:Tag>
+    <b:SourceType>InternetSite</b:SourceType>
+    <b:Guid>{31C660C6-9050-4F4C-83EA-9DC4BCF37956}</b:Guid>
+    <b:Title>Docker Dokumentáció</b:Title>
+    <b:URL>https://docs.docker.com/</b:URL>
+    <b:ProductionCompany>Docker, Inc.</b:ProductionCompany>
+    <b:RefOrder>1</b:RefOrder>
+  </b:Source>
+  <b:Source>
+    <b:Tag>ExppressJs</b:Tag>
+    <b:SourceType>InternetSite</b:SourceType>
+    <b:Guid>{DDD3266D-120B-4355-BA92-B12A760131F3}</b:Guid>
+    <b:Title>ExpressJs Dokumentáció</b:Title>
+    <b:URL>https://expressjs.com/</b:URL>
+    <b:RefOrder>16</b:RefOrder>
+  </b:Source>
+  <b:Source>
+    <b:Tag>FastApi</b:Tag>
+    <b:SourceType>InternetSite</b:SourceType>
+    <b:Guid>{B399EB35-A241-408E-9BA8-6CA51A90F104}</b:Guid>
     <b:Title>FastAPI Dokumentáció</b:Title>
     <b:URL>https://fastapi.tiangolo.com/</b:URL>
     <b:RefOrder>11</b:RefOrder>
   </b:Source>
   <b:Source>
-    <b:Tag>Ope</b:Tag>
+    <b:Tag>MinIO</b:Tag>
     <b:SourceType>InternetSite</b:SourceType>
-    <b:Guid>{C81B3DA6-5397-4204-BB3B-ACD13A772DA6}</b:Guid>
+    <b:Guid>{836EE668-9D32-4A38-8506-69E5D4085B75}</b:Guid>
+    <b:Title>MinIO Dokumentáció</b:Title>
+    <b:URL>https://www.min.io/</b:URL>
+    <b:RefOrder>18</b:RefOrder>
+  </b:Source>
+  <b:Source>
+    <b:Tag>NodeJs</b:Tag>
+    <b:SourceType>InternetSite</b:SourceType>
+    <b:Guid>{C7E209B3-DA93-404E-989F-B739329B71DE}</b:Guid>
+    <b:Title>NodeJs Dokumentáció</b:Title>
+    <b:URL>https://nodejs.org/docs/latest/api/</b:URL>
+    <b:RefOrder>15</b:RefOrder>
+  </b:Source>
+  <b:Source>
+    <b:Tag>OpenAI</b:Tag>
+    <b:SourceType>InternetSite</b:SourceType>
+    <b:Guid>{F726F8EE-C101-4D24-8F15-18B509925ED2}</b:Guid>
+    <b:Title>OpenAI API Dokumentáció</b:Title>
+    <b:URL>https://openai.com/api/</b:URL>
+    <b:RefOrder>19</b:RefOrder>
+  </b:Source>
+  <b:Source>
+    <b:Tag>OpenAPI</b:Tag>
+    <b:SourceType>InternetSite</b:SourceType>
+    <b:Guid>{BAC24AB4-28FB-4511-8D5F-0E3FA9A90312}</b:Guid>
     <b:Title>OpenAPI Dokumentáció</b:Title>
     <b:URL>https://swagger.io/resources/open-api/</b:URL>
     <b:RefOrder>12</b:RefOrder>
   </b:Source>
   <b:Source>
-    <b:Tag>SQL</b:Tag>
+    <b:Tag>PixiJs</b:Tag>
     <b:SourceType>InternetSite</b:SourceType>
-    <b:Guid>{D198C192-9755-4307-A015-C5C43B3AB222}</b:Guid>
+    <b:Guid>{13D08687-43FE-41E8-8C92-3AE163648A3A}</b:Guid>
+    <b:Title>PixiJs Dokumentáció</b:Title>
+    <b:URL>https://pixijs.com/8.x/guides/getting-started/intro</b:URL>
+    <b:RefOrder>7</b:RefOrder>
+  </b:Source>
+  <b:Source>
+    <b:Tag>PostgreSQL</b:Tag>
+    <b:SourceType>InternetSite</b:SourceType>
+    <b:Guid>{C1DDBD23-B422-47CC-B6A1-549974392676}</b:Guid>
+    <b:Title>PostgreSQL Dokumentáció</b:Title>
+    <b:URL>https://www.postgresql.org/docs/</b:URL>
+    <b:RefOrder>17</b:RefOrder>
+  </b:Source>
+  <b:Source>
+    <b:Tag>Python</b:Tag>
+    <b:SourceType>InternetSite</b:SourceType>
+    <b:Guid>{0DBB9823-840A-43ED-8F68-1160A11FBC82}</b:Guid>
+    <b:Title>Python Dokumentáció</b:Title>
+    <b:ProductionCompany>Python Software Foundation (PSF)</b:ProductionCompany>
+    <b:URL>https://docs.python.org/3/</b:URL>
+    <b:RefOrder>9</b:RefOrder>
+  </b:Source>
+  <b:Source>
+    <b:Tag>React</b:Tag>
+    <b:SourceType>InternetSite</b:SourceType>
+    <b:Guid>{B1F2968B-4767-42E7-A016-9493C5909763}</b:Guid>
+    <b:Title>React Dokumentáció</b:Title>
+    <b:ProductionCompany>Meta</b:ProductionCompany>
+    <b:URL>https://react.dev/</b:URL>
+    <b:RefOrder>4</b:RefOrder>
+  </b:Source>
+  <b:Source>
+    <b:Tag>SocketIO</b:Tag>
+    <b:SourceType>InternetSite</b:SourceType>
+    <b:Guid>{B55D92D6-2EA1-4767-96E0-3A2BE3A1B492}</b:Guid>
+    <b:Title>Socket.IO Dokumentáció</b:Title>
+    <b:URL>https://socket.io/</b:URL>
+    <b:RefOrder>8</b:RefOrder>
+  </b:Source>
+  <b:Source>
+    <b:Tag>SQLAclhemy</b:Tag>
+    <b:SourceType>InternetSite</b:SourceType>
+    <b:Guid>{40861037-A4BA-459F-AE15-BB5CF9ADACDC}</b:Guid>
     <b:Title>SQLAlchemy Dokumentáció</b:Title>
     <b:URL>https://docs.sqlalchemy.org/en/20/</b:URL>
     <b:RefOrder>13</b:RefOrder>
   </b:Source>
   <b:Source>
-    <b:Tag>Ale</b:Tag>
+    <b:Tag>TypeScript</b:Tag>
     <b:SourceType>InternetSite</b:SourceType>
-    <b:Guid>{24F03E9C-5FBD-46F1-8144-D0F58E88FA87}</b:Guid>
-    <b:Title>Alembic Dokumentáció</b:Title>
-    <b:URL>https://alembic.sqlalchemy.org/en/latest/</b:URL>
-    <b:RefOrder>14</b:RefOrder>
+    <b:Guid>{D5C08F05-6039-4C6E-B8DA-37C33E7C1CE7}</b:Guid>
+    <b:Title>TypeScript Dokumentáció</b:Title>
+    <b:URL>https://www.typescriptlang.org/docs/</b:URL>
+    <b:ProductionCompany>Microsoft</b:ProductionCompany>
+    <b:RefOrder>3</b:RefOrder>
   </b:Source>
   <b:Source>
-    <b:Tag>Nod</b:Tag>
+    <b:Tag>ReactStoreReducer</b:Tag>
     <b:SourceType>InternetSite</b:SourceType>
-    <b:Guid>{CB6F4390-AA38-4171-BA05-4DF9F4AFD8FE}</b:Guid>
-    <b:Title>NodeJs Dokumentáció</b:Title>
-    <b:URL>https://nodejs.org/docs/latest/api/</b:URL>
-    <b:RefOrder>15</b:RefOrder>
+    <b:Guid>{B92EF131-AE09-4673-82BA-0F8EE56C2098}</b:Guid>
+    <b:Title>React Store/Reducer dokumentáció</b:Title>
+    <b:URL>https://react.dev/learn/extracting-state-logic-into-a-reducer</b:URL>
+    <b:RefOrder>20</b:RefOrder>
   </b:Source>
   <b:Source>
-    <b:Tag>Exp</b:Tag>
+    <b:Tag>AWS_S3</b:Tag>
     <b:SourceType>InternetSite</b:SourceType>
-    <b:Guid>{9106A091-E67A-4B65-93E1-14F9C0F4D0D9}</b:Guid>
-    <b:Title>ExpressJs Dokumentáció</b:Title>
-    <b:URL>https://expressjs.com/</b:URL>
-    <b:RefOrder>16</b:RefOrder>
-  </b:Source>
-  <b:Source>
-    <b:Tag>Pos</b:Tag>
-    <b:SourceType>InternetSite</b:SourceType>
-    <b:Guid>{C49FCFBC-32B7-45A0-A56F-A827D1057BED}</b:Guid>
-    <b:Title>PostgreSQL Dokumentáció</b:Title>
-    <b:URL>https://www.postgresql.org/docs/</b:URL>
-    <b:RefOrder>17</b:RefOrder>
-  </b:Source>
-  <b:Source>
-    <b:Tag>Min</b:Tag>
-    <b:SourceType>InternetSite</b:SourceType>
-    <b:Guid>{718A4E1A-325B-4CAA-87BD-D7A8045CB40A}</b:Guid>
-    <b:Title>MinIO Dokumentáció</b:Title>
-    <b:URL>https://www.min.io/</b:URL>
-    <b:RefOrder>18</b:RefOrder>
-  </b:Source>
-  <b:Source>
-    <b:Tag>Ope1</b:Tag>
-    <b:SourceType>InternetSite</b:SourceType>
-    <b:Guid>{E4A77374-81AF-4ED9-AD25-DB03462CC13C}</b:Guid>
-    <b:Title>OpenAI API Dokumentáció</b:Title>
-    <b:URL>https://openai.com/api/</b:URL>
-    <b:RefOrder>19</b:RefOrder>
+    <b:Guid>{BAEB1C79-52E5-4B82-9CD4-D678367FC3FC}</b:Guid>
+    <b:Title>Amazon Web Service S+ Storage Dokumentáció</b:Title>
+    <b:URL>https://docs.aws.amazon.com/AmazonS3/latest/userguide/Welcome.html</b:URL>
+    <b:RefOrder>21</b:RefOrder>
   </b:Source>
 </b:Sources>
 </file>
 
 <file path=customXml/itemProps1.xml><?xml version="1.0" encoding="utf-8"?>
-<ds:datastoreItem xmlns:ds="http://schemas.openxmlformats.org/officeDocument/2006/customXml" ds:itemID="{30EC2F1A-C9A1-4FE9-8DCA-3D508323EE7E}">
+<ds:datastoreItem xmlns:ds="http://schemas.openxmlformats.org/officeDocument/2006/customXml" ds:itemID="{1953A271-5F77-4C9C-AC26-D3533B5FDC33}">
   <ds:schemaRefs>
     <ds:schemaRef ds:uri="http://schemas.openxmlformats.org/officeDocument/2006/bibliography"/>
   </ds:schemaRefs>

</xml_diff>

<commit_message>
feat(szakdolgozat): pálya generálása - generális játék elemek
</commit_message>
<xml_diff>
--- a/Szakdolgozat.docx
+++ b/Szakdolgozat.docx
@@ -2,7 +2,11 @@
 <file path=word/document.xml><?xml version="1.0" encoding="utf-8"?>
 <w:document xmlns:wpc="http://schemas.microsoft.com/office/word/2010/wordprocessingCanvas" xmlns:cx="http://schemas.microsoft.com/office/drawing/2014/chartex" xmlns:cx1="http://schemas.microsoft.com/office/drawing/2015/9/8/chartex" xmlns:cx2="http://schemas.microsoft.com/office/drawing/2015/10/21/chartex" xmlns:cx3="http://schemas.microsoft.com/office/drawing/2016/5/9/chartex" xmlns:cx4="http://schemas.microsoft.com/office/drawing/2016/5/10/chartex" xmlns:cx5="http://schemas.microsoft.com/office/drawing/2016/5/11/chartex" xmlns:cx6="http://schemas.microsoft.com/office/drawing/2016/5/12/chartex" xmlns:cx7="http://schemas.microsoft.com/office/drawing/2016/5/13/chartex" xmlns:cx8="http://schemas.microsoft.com/office/drawing/2016/5/14/chartex" xmlns:mc="http://schemas.openxmlformats.org/markup-compatibility/2006" xmlns:aink="http://schemas.microsoft.com/office/drawing/2016/ink" xmlns:am3d="http://schemas.microsoft.com/office/drawing/2017/model3d" xmlns:o="urn:schemas-microsoft-com:office:office" xmlns:oel="http://schemas.microsoft.com/office/2019/extlst" xmlns:r="http://schemas.openxmlformats.org/officeDocument/2006/relationships" xmlns:m="http://schemas.openxmlformats.org/officeDocument/2006/math" xmlns:v="urn:schemas-microsoft-com:vml" xmlns:wp14="http://schemas.microsoft.com/office/word/2010/wordprocessingDrawing" xmlns:wp="http://schemas.openxmlformats.org/drawingml/2006/wordprocessingDrawing" xmlns:w10="urn:schemas-microsoft-com:office:word" xmlns:w="http://schemas.openxmlformats.org/wordprocessingml/2006/main" xmlns:w14="http://schemas.microsoft.com/office/word/2010/wordml" xmlns:w15="http://schemas.microsoft.com/office/word/2012/wordml" xmlns:w16cex="http://schemas.microsoft.com/office/word/2018/wordml/cex" xmlns:w16cid="http://schemas.microsoft.com/office/word/2016/wordml/cid" xmlns:w16="http://schemas.microsoft.com/office/word/2018/wordml" xmlns:w16du="http://schemas.microsoft.com/office/word/2023/wordml/word16du" xmlns:w16sdtdh="http://schemas.microsoft.com/office/word/2020/wordml/sdtdatahash" xmlns:w16sdtfl="http://schemas.microsoft.com/office/word/2024/wordml/sdtformatlock" xmlns:w16se="http://schemas.microsoft.com/office/word/2015/wordml/symex" xmlns:wpg="http://schemas.microsoft.com/office/word/2010/wordprocessingGroup" xmlns:wpi="http://schemas.microsoft.com/office/word/2010/wordprocessingInk" xmlns:wne="http://schemas.microsoft.com/office/word/2006/wordml" xmlns:wps="http://schemas.microsoft.com/office/word/2010/wordprocessingShape" mc:Ignorable="w14 w15 w16se w16cid w16 w16cex w16sdtdh w16sdtfl w16du wp14">
   <w:body>
-    <w:p/>
+    <w:p>
+      <w:r>
+        <w:t xml:space="preserve"> </w:t>
+      </w:r>
+    </w:p>
     <w:p/>
     <w:p/>
     <w:p/>
@@ -525,7 +529,7 @@
       <w:pPr>
         <w:pStyle w:val="szmozatlanSzakdolgozath1"/>
       </w:pPr>
-      <w:bookmarkStart w:id="0" w:name="_Toc225505728"/>
+      <w:bookmarkStart w:id="0" w:name="_Toc225520361"/>
       <w:r>
         <w:lastRenderedPageBreak/>
         <w:t>Feladatkiírás</w:t>
@@ -761,7 +765,7 @@
       <w:pPr>
         <w:pStyle w:val="szmozatlanSzakdolgozath1"/>
       </w:pPr>
-      <w:bookmarkStart w:id="1" w:name="_Toc225505729"/>
+      <w:bookmarkStart w:id="1" w:name="_Toc225520362"/>
       <w:r>
         <w:lastRenderedPageBreak/>
         <w:t>Tartalomjegyzék</w:t>
@@ -824,7 +828,7 @@
           <w:r>
             <w:fldChar w:fldCharType="separate"/>
           </w:r>
-          <w:hyperlink w:anchor="_Toc225505728" w:history="1">
+          <w:hyperlink w:anchor="_Toc225520361" w:history="1">
             <w:r>
               <w:rPr>
                 <w:rStyle w:val="Hyperlink"/>
@@ -851,7 +855,7 @@
                 <w:noProof/>
                 <w:webHidden/>
               </w:rPr>
-              <w:instrText xml:space="preserve"> PAGEREF _Toc225505728 \h </w:instrText>
+              <w:instrText xml:space="preserve"> PAGEREF _Toc225520361 \h </w:instrText>
             </w:r>
             <w:r>
               <w:rPr>
@@ -896,7 +900,7 @@
               <w:lang w:val="en-US"/>
             </w:rPr>
           </w:pPr>
-          <w:hyperlink w:anchor="_Toc225505729" w:history="1">
+          <w:hyperlink w:anchor="_Toc225520362" w:history="1">
             <w:r>
               <w:rPr>
                 <w:rStyle w:val="Hyperlink"/>
@@ -923,7 +927,7 @@
                 <w:noProof/>
                 <w:webHidden/>
               </w:rPr>
-              <w:instrText xml:space="preserve"> PAGEREF _Toc225505729 \h </w:instrText>
+              <w:instrText xml:space="preserve"> PAGEREF _Toc225520362 \h </w:instrText>
             </w:r>
             <w:r>
               <w:rPr>
@@ -969,7 +973,7 @@
               <w:lang w:val="en-US"/>
             </w:rPr>
           </w:pPr>
-          <w:hyperlink w:anchor="_Toc225505730" w:history="1">
+          <w:hyperlink w:anchor="_Toc225520363" w:history="1">
             <w:r>
               <w:rPr>
                 <w:rStyle w:val="Hyperlink"/>
@@ -1014,7 +1018,7 @@
                 <w:noProof/>
                 <w:webHidden/>
               </w:rPr>
-              <w:instrText xml:space="preserve"> PAGEREF _Toc225505730 \h </w:instrText>
+              <w:instrText xml:space="preserve"> PAGEREF _Toc225520363 \h </w:instrText>
             </w:r>
             <w:r>
               <w:rPr>
@@ -1060,7 +1064,7 @@
               <w:lang w:val="en-US"/>
             </w:rPr>
           </w:pPr>
-          <w:hyperlink w:anchor="_Toc225505731" w:history="1">
+          <w:hyperlink w:anchor="_Toc225520364" w:history="1">
             <w:r>
               <w:rPr>
                 <w:rStyle w:val="Hyperlink"/>
@@ -1104,7 +1108,7 @@
                 <w:noProof/>
                 <w:webHidden/>
               </w:rPr>
-              <w:instrText xml:space="preserve"> PAGEREF _Toc225505731 \h </w:instrText>
+              <w:instrText xml:space="preserve"> PAGEREF _Toc225520364 \h </w:instrText>
             </w:r>
             <w:r>
               <w:rPr>
@@ -1150,7 +1154,7 @@
               <w:lang w:val="en-US"/>
             </w:rPr>
           </w:pPr>
-          <w:hyperlink w:anchor="_Toc225505732" w:history="1">
+          <w:hyperlink w:anchor="_Toc225520365" w:history="1">
             <w:r>
               <w:rPr>
                 <w:rStyle w:val="Hyperlink"/>
@@ -1194,7 +1198,7 @@
                 <w:noProof/>
                 <w:webHidden/>
               </w:rPr>
-              <w:instrText xml:space="preserve"> PAGEREF _Toc225505732 \h </w:instrText>
+              <w:instrText xml:space="preserve"> PAGEREF _Toc225520365 \h </w:instrText>
             </w:r>
             <w:r>
               <w:rPr>
@@ -1240,7 +1244,7 @@
               <w:lang w:val="en-US"/>
             </w:rPr>
           </w:pPr>
-          <w:hyperlink w:anchor="_Toc225505733" w:history="1">
+          <w:hyperlink w:anchor="_Toc225520366" w:history="1">
             <w:r>
               <w:rPr>
                 <w:rStyle w:val="Hyperlink"/>
@@ -1284,7 +1288,7 @@
                 <w:noProof/>
                 <w:webHidden/>
               </w:rPr>
-              <w:instrText xml:space="preserve"> PAGEREF _Toc225505733 \h </w:instrText>
+              <w:instrText xml:space="preserve"> PAGEREF _Toc225520366 \h </w:instrText>
             </w:r>
             <w:r>
               <w:rPr>
@@ -1330,7 +1334,7 @@
               <w:lang w:val="en-US"/>
             </w:rPr>
           </w:pPr>
-          <w:hyperlink w:anchor="_Toc225505734" w:history="1">
+          <w:hyperlink w:anchor="_Toc225520367" w:history="1">
             <w:r>
               <w:rPr>
                 <w:rStyle w:val="Hyperlink"/>
@@ -1374,7 +1378,7 @@
                 <w:noProof/>
                 <w:webHidden/>
               </w:rPr>
-              <w:instrText xml:space="preserve"> PAGEREF _Toc225505734 \h </w:instrText>
+              <w:instrText xml:space="preserve"> PAGEREF _Toc225520367 \h </w:instrText>
             </w:r>
             <w:r>
               <w:rPr>
@@ -1420,7 +1424,7 @@
               <w:lang w:val="en-US"/>
             </w:rPr>
           </w:pPr>
-          <w:hyperlink w:anchor="_Toc225505735" w:history="1">
+          <w:hyperlink w:anchor="_Toc225520368" w:history="1">
             <w:r>
               <w:rPr>
                 <w:rStyle w:val="Hyperlink"/>
@@ -1464,7 +1468,7 @@
                 <w:noProof/>
                 <w:webHidden/>
               </w:rPr>
-              <w:instrText xml:space="preserve"> PAGEREF _Toc225505735 \h </w:instrText>
+              <w:instrText xml:space="preserve"> PAGEREF _Toc225520368 \h </w:instrText>
             </w:r>
             <w:r>
               <w:rPr>
@@ -1510,7 +1514,7 @@
               <w:lang w:val="en-US"/>
             </w:rPr>
           </w:pPr>
-          <w:hyperlink w:anchor="_Toc225505736" w:history="1">
+          <w:hyperlink w:anchor="_Toc225520369" w:history="1">
             <w:r>
               <w:rPr>
                 <w:rStyle w:val="Hyperlink"/>
@@ -1554,7 +1558,7 @@
                 <w:noProof/>
                 <w:webHidden/>
               </w:rPr>
-              <w:instrText xml:space="preserve"> PAGEREF _Toc225505736 \h </w:instrText>
+              <w:instrText xml:space="preserve"> PAGEREF _Toc225520369 \h </w:instrText>
             </w:r>
             <w:r>
               <w:rPr>
@@ -1600,7 +1604,7 @@
               <w:lang w:val="en-US"/>
             </w:rPr>
           </w:pPr>
-          <w:hyperlink w:anchor="_Toc225505737" w:history="1">
+          <w:hyperlink w:anchor="_Toc225520370" w:history="1">
             <w:r>
               <w:rPr>
                 <w:rStyle w:val="Hyperlink"/>
@@ -1644,7 +1648,7 @@
                 <w:noProof/>
                 <w:webHidden/>
               </w:rPr>
-              <w:instrText xml:space="preserve"> PAGEREF _Toc225505737 \h </w:instrText>
+              <w:instrText xml:space="preserve"> PAGEREF _Toc225520370 \h </w:instrText>
             </w:r>
             <w:r>
               <w:rPr>
@@ -1690,7 +1694,7 @@
               <w:lang w:val="en-US"/>
             </w:rPr>
           </w:pPr>
-          <w:hyperlink w:anchor="_Toc225505738" w:history="1">
+          <w:hyperlink w:anchor="_Toc225520371" w:history="1">
             <w:r>
               <w:rPr>
                 <w:rStyle w:val="Hyperlink"/>
@@ -1734,7 +1738,7 @@
                 <w:noProof/>
                 <w:webHidden/>
               </w:rPr>
-              <w:instrText xml:space="preserve"> PAGEREF _Toc225505738 \h </w:instrText>
+              <w:instrText xml:space="preserve"> PAGEREF _Toc225520371 \h </w:instrText>
             </w:r>
             <w:r>
               <w:rPr>
@@ -1780,7 +1784,7 @@
               <w:lang w:val="en-US"/>
             </w:rPr>
           </w:pPr>
-          <w:hyperlink w:anchor="_Toc225505739" w:history="1">
+          <w:hyperlink w:anchor="_Toc225520372" w:history="1">
             <w:r>
               <w:rPr>
                 <w:rStyle w:val="Hyperlink"/>
@@ -1824,7 +1828,7 @@
                 <w:noProof/>
                 <w:webHidden/>
               </w:rPr>
-              <w:instrText xml:space="preserve"> PAGEREF _Toc225505739 \h </w:instrText>
+              <w:instrText xml:space="preserve"> PAGEREF _Toc225520372 \h </w:instrText>
             </w:r>
             <w:r>
               <w:rPr>
@@ -1870,7 +1874,7 @@
               <w:lang w:val="en-US"/>
             </w:rPr>
           </w:pPr>
-          <w:hyperlink w:anchor="_Toc225505740" w:history="1">
+          <w:hyperlink w:anchor="_Toc225520373" w:history="1">
             <w:r>
               <w:rPr>
                 <w:rStyle w:val="Hyperlink"/>
@@ -1914,7 +1918,7 @@
                 <w:noProof/>
                 <w:webHidden/>
               </w:rPr>
-              <w:instrText xml:space="preserve"> PAGEREF _Toc225505740 \h </w:instrText>
+              <w:instrText xml:space="preserve"> PAGEREF _Toc225520373 \h </w:instrText>
             </w:r>
             <w:r>
               <w:rPr>
@@ -1960,7 +1964,7 @@
               <w:lang w:val="en-US"/>
             </w:rPr>
           </w:pPr>
-          <w:hyperlink w:anchor="_Toc225505741" w:history="1">
+          <w:hyperlink w:anchor="_Toc225520374" w:history="1">
             <w:r>
               <w:rPr>
                 <w:rStyle w:val="Hyperlink"/>
@@ -2004,7 +2008,7 @@
                 <w:noProof/>
                 <w:webHidden/>
               </w:rPr>
-              <w:instrText xml:space="preserve"> PAGEREF _Toc225505741 \h </w:instrText>
+              <w:instrText xml:space="preserve"> PAGEREF _Toc225520374 \h </w:instrText>
             </w:r>
             <w:r>
               <w:rPr>
@@ -2050,7 +2054,7 @@
               <w:lang w:val="en-US"/>
             </w:rPr>
           </w:pPr>
-          <w:hyperlink w:anchor="_Toc225505742" w:history="1">
+          <w:hyperlink w:anchor="_Toc225520375" w:history="1">
             <w:r>
               <w:rPr>
                 <w:rStyle w:val="Hyperlink"/>
@@ -2094,7 +2098,7 @@
                 <w:noProof/>
                 <w:webHidden/>
               </w:rPr>
-              <w:instrText xml:space="preserve"> PAGEREF _Toc225505742 \h </w:instrText>
+              <w:instrText xml:space="preserve"> PAGEREF _Toc225520375 \h </w:instrText>
             </w:r>
             <w:r>
               <w:rPr>
@@ -2140,7 +2144,7 @@
               <w:lang w:val="en-US"/>
             </w:rPr>
           </w:pPr>
-          <w:hyperlink w:anchor="_Toc225505743" w:history="1">
+          <w:hyperlink w:anchor="_Toc225520376" w:history="1">
             <w:r>
               <w:rPr>
                 <w:rStyle w:val="Hyperlink"/>
@@ -2184,7 +2188,7 @@
                 <w:noProof/>
                 <w:webHidden/>
               </w:rPr>
-              <w:instrText xml:space="preserve"> PAGEREF _Toc225505743 \h </w:instrText>
+              <w:instrText xml:space="preserve"> PAGEREF _Toc225520376 \h </w:instrText>
             </w:r>
             <w:r>
               <w:rPr>
@@ -2219,6 +2223,7 @@
           <w:pPr>
             <w:pStyle w:val="TOC1"/>
             <w:tabs>
+              <w:tab w:val="left" w:pos="440"/>
               <w:tab w:val="right" w:leader="dot" w:pos="8827"/>
             </w:tabs>
             <w:rPr>
@@ -2229,23 +2234,40 @@
               <w:lang w:val="en-US"/>
             </w:rPr>
           </w:pPr>
-          <w:hyperlink w:anchor="_Toc225505744" w:history="1">
+          <w:hyperlink w:anchor="_Toc225520377" w:history="1">
             <w:r>
               <w:rPr>
                 <w:rStyle w:val="Hyperlink"/>
                 <w:noProof/>
               </w:rPr>
-              <w:t>Irodalomjegyzék</w:t>
-            </w:r>
-            <w:r>
-              <w:rPr>
-                <w:noProof/>
-                <w:webHidden/>
+              <w:t>3.</w:t>
+            </w:r>
+            <w:r>
+              <w:rPr>
+                <w:rFonts w:eastAsiaTheme="minorEastAsia"/>
+                <w:noProof/>
+                <w:sz w:val="24"/>
+                <w:szCs w:val="24"/>
+                <w:lang w:val="en-US"/>
               </w:rPr>
               <w:tab/>
             </w:r>
             <w:r>
               <w:rPr>
+                <w:rStyle w:val="Hyperlink"/>
+                <w:noProof/>
+              </w:rPr>
+              <w:t>Pálya Generálása</w:t>
+            </w:r>
+            <w:r>
+              <w:rPr>
+                <w:noProof/>
+                <w:webHidden/>
+              </w:rPr>
+              <w:tab/>
+            </w:r>
+            <w:r>
+              <w:rPr>
                 <w:noProof/>
                 <w:webHidden/>
               </w:rPr>
@@ -2256,7 +2278,7 @@
                 <w:noProof/>
                 <w:webHidden/>
               </w:rPr>
-              <w:instrText xml:space="preserve"> PAGEREF _Toc225505744 \h </w:instrText>
+              <w:instrText xml:space="preserve"> PAGEREF _Toc225520377 \h </w:instrText>
             </w:r>
             <w:r>
               <w:rPr>
@@ -2277,150 +2299,6 @@
                 <w:webHidden/>
               </w:rPr>
               <w:t>14</w:t>
-            </w:r>
-            <w:r>
-              <w:rPr>
-                <w:noProof/>
-                <w:webHidden/>
-              </w:rPr>
-              <w:fldChar w:fldCharType="end"/>
-            </w:r>
-          </w:hyperlink>
-        </w:p>
-        <w:p>
-          <w:pPr>
-            <w:pStyle w:val="TOC1"/>
-            <w:tabs>
-              <w:tab w:val="right" w:leader="dot" w:pos="8827"/>
-            </w:tabs>
-            <w:rPr>
-              <w:rFonts w:eastAsiaTheme="minorEastAsia"/>
-              <w:noProof/>
-              <w:sz w:val="24"/>
-              <w:szCs w:val="24"/>
-              <w:lang w:val="en-US"/>
-            </w:rPr>
-          </w:pPr>
-          <w:hyperlink w:anchor="_Toc225505745" w:history="1">
-            <w:r>
-              <w:rPr>
-                <w:rStyle w:val="Hyperlink"/>
-                <w:noProof/>
-              </w:rPr>
-              <w:t>Nyilatkozat</w:t>
-            </w:r>
-            <w:r>
-              <w:rPr>
-                <w:noProof/>
-                <w:webHidden/>
-              </w:rPr>
-              <w:tab/>
-            </w:r>
-            <w:r>
-              <w:rPr>
-                <w:noProof/>
-                <w:webHidden/>
-              </w:rPr>
-              <w:fldChar w:fldCharType="begin"/>
-            </w:r>
-            <w:r>
-              <w:rPr>
-                <w:noProof/>
-                <w:webHidden/>
-              </w:rPr>
-              <w:instrText xml:space="preserve"> PAGEREF _Toc225505745 \h </w:instrText>
-            </w:r>
-            <w:r>
-              <w:rPr>
-                <w:noProof/>
-                <w:webHidden/>
-              </w:rPr>
-            </w:r>
-            <w:r>
-              <w:rPr>
-                <w:noProof/>
-                <w:webHidden/>
-              </w:rPr>
-              <w:fldChar w:fldCharType="separate"/>
-            </w:r>
-            <w:r>
-              <w:rPr>
-                <w:noProof/>
-                <w:webHidden/>
-              </w:rPr>
-              <w:t>15</w:t>
-            </w:r>
-            <w:r>
-              <w:rPr>
-                <w:noProof/>
-                <w:webHidden/>
-              </w:rPr>
-              <w:fldChar w:fldCharType="end"/>
-            </w:r>
-          </w:hyperlink>
-        </w:p>
-        <w:p>
-          <w:pPr>
-            <w:pStyle w:val="TOC1"/>
-            <w:tabs>
-              <w:tab w:val="right" w:leader="dot" w:pos="8827"/>
-            </w:tabs>
-            <w:rPr>
-              <w:rFonts w:eastAsiaTheme="minorEastAsia"/>
-              <w:noProof/>
-              <w:sz w:val="24"/>
-              <w:szCs w:val="24"/>
-              <w:lang w:val="en-US"/>
-            </w:rPr>
-          </w:pPr>
-          <w:hyperlink w:anchor="_Toc225505746" w:history="1">
-            <w:r>
-              <w:rPr>
-                <w:rStyle w:val="Hyperlink"/>
-                <w:noProof/>
-              </w:rPr>
-              <w:t>Mellékletek</w:t>
-            </w:r>
-            <w:r>
-              <w:rPr>
-                <w:noProof/>
-                <w:webHidden/>
-              </w:rPr>
-              <w:tab/>
-            </w:r>
-            <w:r>
-              <w:rPr>
-                <w:noProof/>
-                <w:webHidden/>
-              </w:rPr>
-              <w:fldChar w:fldCharType="begin"/>
-            </w:r>
-            <w:r>
-              <w:rPr>
-                <w:noProof/>
-                <w:webHidden/>
-              </w:rPr>
-              <w:instrText xml:space="preserve"> PAGEREF _Toc225505746 \h </w:instrText>
-            </w:r>
-            <w:r>
-              <w:rPr>
-                <w:noProof/>
-                <w:webHidden/>
-              </w:rPr>
-            </w:r>
-            <w:r>
-              <w:rPr>
-                <w:noProof/>
-                <w:webHidden/>
-              </w:rPr>
-              <w:fldChar w:fldCharType="separate"/>
-            </w:r>
-            <w:r>
-              <w:rPr>
-                <w:noProof/>
-                <w:webHidden/>
-              </w:rPr>
-              <w:t>16</w:t>
             </w:r>
             <w:r>
               <w:rPr>
@@ -2446,13 +2324,13 @@
               <w:lang w:val="en-US"/>
             </w:rPr>
           </w:pPr>
-          <w:hyperlink w:anchor="_Toc225505747" w:history="1">
+          <w:hyperlink w:anchor="_Toc225520378" w:history="1">
             <w:r>
               <w:rPr>
                 <w:rStyle w:val="Hyperlink"/>
                 <w:noProof/>
               </w:rPr>
-              <w:t>2.7.</w:t>
+              <w:t>3.1.</w:t>
             </w:r>
             <w:r>
               <w:rPr>
@@ -2469,6 +2347,312 @@
                 <w:rStyle w:val="Hyperlink"/>
                 <w:noProof/>
               </w:rPr>
+              <w:t>Generikus játék modellek</w:t>
+            </w:r>
+            <w:r>
+              <w:rPr>
+                <w:noProof/>
+                <w:webHidden/>
+              </w:rPr>
+              <w:tab/>
+            </w:r>
+            <w:r>
+              <w:rPr>
+                <w:noProof/>
+                <w:webHidden/>
+              </w:rPr>
+              <w:fldChar w:fldCharType="begin"/>
+            </w:r>
+            <w:r>
+              <w:rPr>
+                <w:noProof/>
+                <w:webHidden/>
+              </w:rPr>
+              <w:instrText xml:space="preserve"> PAGEREF _Toc225520378 \h </w:instrText>
+            </w:r>
+            <w:r>
+              <w:rPr>
+                <w:noProof/>
+                <w:webHidden/>
+              </w:rPr>
+            </w:r>
+            <w:r>
+              <w:rPr>
+                <w:noProof/>
+                <w:webHidden/>
+              </w:rPr>
+              <w:fldChar w:fldCharType="separate"/>
+            </w:r>
+            <w:r>
+              <w:rPr>
+                <w:noProof/>
+                <w:webHidden/>
+              </w:rPr>
+              <w:t>14</w:t>
+            </w:r>
+            <w:r>
+              <w:rPr>
+                <w:noProof/>
+                <w:webHidden/>
+              </w:rPr>
+              <w:fldChar w:fldCharType="end"/>
+            </w:r>
+          </w:hyperlink>
+        </w:p>
+        <w:p>
+          <w:pPr>
+            <w:pStyle w:val="TOC1"/>
+            <w:tabs>
+              <w:tab w:val="right" w:leader="dot" w:pos="8827"/>
+            </w:tabs>
+            <w:rPr>
+              <w:rFonts w:eastAsiaTheme="minorEastAsia"/>
+              <w:noProof/>
+              <w:sz w:val="24"/>
+              <w:szCs w:val="24"/>
+              <w:lang w:val="en-US"/>
+            </w:rPr>
+          </w:pPr>
+          <w:hyperlink w:anchor="_Toc225520379" w:history="1">
+            <w:r>
+              <w:rPr>
+                <w:rStyle w:val="Hyperlink"/>
+                <w:noProof/>
+              </w:rPr>
+              <w:t>Irodalomjegyzék</w:t>
+            </w:r>
+            <w:r>
+              <w:rPr>
+                <w:noProof/>
+                <w:webHidden/>
+              </w:rPr>
+              <w:tab/>
+            </w:r>
+            <w:r>
+              <w:rPr>
+                <w:noProof/>
+                <w:webHidden/>
+              </w:rPr>
+              <w:fldChar w:fldCharType="begin"/>
+            </w:r>
+            <w:r>
+              <w:rPr>
+                <w:noProof/>
+                <w:webHidden/>
+              </w:rPr>
+              <w:instrText xml:space="preserve"> PAGEREF _Toc225520379 \h </w:instrText>
+            </w:r>
+            <w:r>
+              <w:rPr>
+                <w:noProof/>
+                <w:webHidden/>
+              </w:rPr>
+            </w:r>
+            <w:r>
+              <w:rPr>
+                <w:noProof/>
+                <w:webHidden/>
+              </w:rPr>
+              <w:fldChar w:fldCharType="separate"/>
+            </w:r>
+            <w:r>
+              <w:rPr>
+                <w:noProof/>
+                <w:webHidden/>
+              </w:rPr>
+              <w:t>18</w:t>
+            </w:r>
+            <w:r>
+              <w:rPr>
+                <w:noProof/>
+                <w:webHidden/>
+              </w:rPr>
+              <w:fldChar w:fldCharType="end"/>
+            </w:r>
+          </w:hyperlink>
+        </w:p>
+        <w:p>
+          <w:pPr>
+            <w:pStyle w:val="TOC1"/>
+            <w:tabs>
+              <w:tab w:val="right" w:leader="dot" w:pos="8827"/>
+            </w:tabs>
+            <w:rPr>
+              <w:rFonts w:eastAsiaTheme="minorEastAsia"/>
+              <w:noProof/>
+              <w:sz w:val="24"/>
+              <w:szCs w:val="24"/>
+              <w:lang w:val="en-US"/>
+            </w:rPr>
+          </w:pPr>
+          <w:hyperlink w:anchor="_Toc225520380" w:history="1">
+            <w:r>
+              <w:rPr>
+                <w:rStyle w:val="Hyperlink"/>
+                <w:noProof/>
+              </w:rPr>
+              <w:t>Nyilatkozat</w:t>
+            </w:r>
+            <w:r>
+              <w:rPr>
+                <w:noProof/>
+                <w:webHidden/>
+              </w:rPr>
+              <w:tab/>
+            </w:r>
+            <w:r>
+              <w:rPr>
+                <w:noProof/>
+                <w:webHidden/>
+              </w:rPr>
+              <w:fldChar w:fldCharType="begin"/>
+            </w:r>
+            <w:r>
+              <w:rPr>
+                <w:noProof/>
+                <w:webHidden/>
+              </w:rPr>
+              <w:instrText xml:space="preserve"> PAGEREF _Toc225520380 \h </w:instrText>
+            </w:r>
+            <w:r>
+              <w:rPr>
+                <w:noProof/>
+                <w:webHidden/>
+              </w:rPr>
+            </w:r>
+            <w:r>
+              <w:rPr>
+                <w:noProof/>
+                <w:webHidden/>
+              </w:rPr>
+              <w:fldChar w:fldCharType="separate"/>
+            </w:r>
+            <w:r>
+              <w:rPr>
+                <w:noProof/>
+                <w:webHidden/>
+              </w:rPr>
+              <w:t>19</w:t>
+            </w:r>
+            <w:r>
+              <w:rPr>
+                <w:noProof/>
+                <w:webHidden/>
+              </w:rPr>
+              <w:fldChar w:fldCharType="end"/>
+            </w:r>
+          </w:hyperlink>
+        </w:p>
+        <w:p>
+          <w:pPr>
+            <w:pStyle w:val="TOC1"/>
+            <w:tabs>
+              <w:tab w:val="right" w:leader="dot" w:pos="8827"/>
+            </w:tabs>
+            <w:rPr>
+              <w:rFonts w:eastAsiaTheme="minorEastAsia"/>
+              <w:noProof/>
+              <w:sz w:val="24"/>
+              <w:szCs w:val="24"/>
+              <w:lang w:val="en-US"/>
+            </w:rPr>
+          </w:pPr>
+          <w:hyperlink w:anchor="_Toc225520381" w:history="1">
+            <w:r>
+              <w:rPr>
+                <w:rStyle w:val="Hyperlink"/>
+                <w:noProof/>
+              </w:rPr>
+              <w:t>Mellékletek</w:t>
+            </w:r>
+            <w:r>
+              <w:rPr>
+                <w:noProof/>
+                <w:webHidden/>
+              </w:rPr>
+              <w:tab/>
+            </w:r>
+            <w:r>
+              <w:rPr>
+                <w:noProof/>
+                <w:webHidden/>
+              </w:rPr>
+              <w:fldChar w:fldCharType="begin"/>
+            </w:r>
+            <w:r>
+              <w:rPr>
+                <w:noProof/>
+                <w:webHidden/>
+              </w:rPr>
+              <w:instrText xml:space="preserve"> PAGEREF _Toc225520381 \h </w:instrText>
+            </w:r>
+            <w:r>
+              <w:rPr>
+                <w:noProof/>
+                <w:webHidden/>
+              </w:rPr>
+            </w:r>
+            <w:r>
+              <w:rPr>
+                <w:noProof/>
+                <w:webHidden/>
+              </w:rPr>
+              <w:fldChar w:fldCharType="separate"/>
+            </w:r>
+            <w:r>
+              <w:rPr>
+                <w:noProof/>
+                <w:webHidden/>
+              </w:rPr>
+              <w:t>20</w:t>
+            </w:r>
+            <w:r>
+              <w:rPr>
+                <w:noProof/>
+                <w:webHidden/>
+              </w:rPr>
+              <w:fldChar w:fldCharType="end"/>
+            </w:r>
+          </w:hyperlink>
+        </w:p>
+        <w:p>
+          <w:pPr>
+            <w:pStyle w:val="TOC2"/>
+            <w:tabs>
+              <w:tab w:val="left" w:pos="960"/>
+              <w:tab w:val="right" w:leader="dot" w:pos="8827"/>
+            </w:tabs>
+            <w:rPr>
+              <w:rFonts w:eastAsiaTheme="minorEastAsia"/>
+              <w:noProof/>
+              <w:sz w:val="24"/>
+              <w:szCs w:val="24"/>
+              <w:lang w:val="en-US"/>
+            </w:rPr>
+          </w:pPr>
+          <w:hyperlink w:anchor="_Toc225520382" w:history="1">
+            <w:r>
+              <w:rPr>
+                <w:rStyle w:val="Hyperlink"/>
+                <w:noProof/>
+              </w:rPr>
+              <w:t>3.2.</w:t>
+            </w:r>
+            <w:r>
+              <w:rPr>
+                <w:rFonts w:eastAsiaTheme="minorEastAsia"/>
+                <w:noProof/>
+                <w:sz w:val="24"/>
+                <w:szCs w:val="24"/>
+                <w:lang w:val="en-US"/>
+              </w:rPr>
+              <w:tab/>
+            </w:r>
+            <w:r>
+              <w:rPr>
+                <w:rStyle w:val="Hyperlink"/>
+                <w:noProof/>
+              </w:rPr>
               <w:t>Adatbázis relációk</w:t>
             </w:r>
             <w:r>
@@ -2490,7 +2674,7 @@
                 <w:noProof/>
                 <w:webHidden/>
               </w:rPr>
-              <w:instrText xml:space="preserve"> PAGEREF _Toc225505747 \h </w:instrText>
+              <w:instrText xml:space="preserve"> PAGEREF _Toc225520382 \h </w:instrText>
             </w:r>
             <w:r>
               <w:rPr>
@@ -2510,7 +2694,7 @@
                 <w:noProof/>
                 <w:webHidden/>
               </w:rPr>
-              <w:t>16</w:t>
+              <w:t>20</w:t>
             </w:r>
             <w:r>
               <w:rPr>
@@ -2572,20 +2756,45 @@
         <w:jc w:val="both"/>
         <w:rPr>
           <w:rFonts w:ascii="Times New Roman" w:hAnsi="Times New Roman" w:cs="Times New Roman"/>
+          <w:strike/>
           <w:color w:val="EE0000"/>
           <w:sz w:val="24"/>
           <w:szCs w:val="24"/>
         </w:rPr>
       </w:pPr>
       <w:r>
+        <w:rPr>
+          <w:rFonts w:ascii="Times New Roman" w:hAnsi="Times New Roman" w:cs="Times New Roman"/>
+          <w:strike/>
+          <w:color w:val="EE0000"/>
+          <w:sz w:val="24"/>
+          <w:szCs w:val="24"/>
+        </w:rPr>
+        <w:t xml:space="preserve">Generikus </w:t>
+      </w:r>
+      <w:r>
+        <w:rPr>
+          <w:rFonts w:ascii="Times New Roman" w:hAnsi="Times New Roman" w:cs="Times New Roman"/>
+          <w:strike/>
+          <w:color w:val="EE0000"/>
+          <w:sz w:val="24"/>
+          <w:szCs w:val="24"/>
+        </w:rPr>
+        <w:t>játék modellek</w:t>
+      </w:r>
+    </w:p>
+    <w:p>
+      <w:pPr>
+        <w:spacing w:line="360" w:lineRule="auto"/>
+        <w:ind w:firstLine="720"/>
+        <w:jc w:val="both"/>
         <w:rPr>
           <w:rFonts w:ascii="Times New Roman" w:hAnsi="Times New Roman" w:cs="Times New Roman"/>
           <w:color w:val="EE0000"/>
           <w:sz w:val="24"/>
           <w:szCs w:val="24"/>
         </w:rPr>
-        <w:t xml:space="preserve">Generikus </w:t>
-      </w:r>
+      </w:pPr>
       <w:r>
         <w:rPr>
           <w:rFonts w:ascii="Times New Roman" w:hAnsi="Times New Roman" w:cs="Times New Roman"/>
@@ -2593,30 +2802,32 @@
           <w:sz w:val="24"/>
           <w:szCs w:val="24"/>
         </w:rPr>
-        <w:t>játék modellek</w:t>
-      </w:r>
-    </w:p>
-    <w:p>
-      <w:pPr>
-        <w:spacing w:line="360" w:lineRule="auto"/>
-        <w:ind w:firstLine="720"/>
-        <w:jc w:val="both"/>
+        <w:t xml:space="preserve">Gráf alapú struktúra </w:t>
+      </w:r>
+      <w:proofErr w:type="spellStart"/>
+      <w:r>
         <w:rPr>
           <w:rFonts w:ascii="Times New Roman" w:hAnsi="Times New Roman" w:cs="Times New Roman"/>
           <w:color w:val="EE0000"/>
           <w:sz w:val="24"/>
           <w:szCs w:val="24"/>
         </w:rPr>
-      </w:pPr>
-      <w:r>
+        <w:t>deffiniálása</w:t>
+      </w:r>
+      <w:proofErr w:type="spellEnd"/>
+    </w:p>
+    <w:p>
+      <w:pPr>
+        <w:spacing w:line="360" w:lineRule="auto"/>
+        <w:ind w:firstLine="720"/>
+        <w:jc w:val="both"/>
         <w:rPr>
           <w:rFonts w:ascii="Times New Roman" w:hAnsi="Times New Roman" w:cs="Times New Roman"/>
           <w:color w:val="EE0000"/>
           <w:sz w:val="24"/>
           <w:szCs w:val="24"/>
         </w:rPr>
-        <w:t xml:space="preserve">Gráf alapú struktúra </w:t>
-      </w:r>
+      </w:pPr>
       <w:proofErr w:type="spellStart"/>
       <w:r>
         <w:rPr>
@@ -2625,23 +2836,18 @@
           <w:sz w:val="24"/>
           <w:szCs w:val="24"/>
         </w:rPr>
-        <w:t>deffiniálása</w:t>
-      </w:r>
-      <w:proofErr w:type="spellEnd"/>
-    </w:p>
-    <w:p>
-      <w:pPr>
-        <w:spacing w:line="360" w:lineRule="auto"/>
-        <w:ind w:firstLine="720"/>
-        <w:jc w:val="both"/>
+        <w:t>Promtolás</w:t>
+      </w:r>
+      <w:proofErr w:type="spellEnd"/>
+      <w:r>
         <w:rPr>
           <w:rFonts w:ascii="Times New Roman" w:hAnsi="Times New Roman" w:cs="Times New Roman"/>
           <w:color w:val="EE0000"/>
           <w:sz w:val="24"/>
           <w:szCs w:val="24"/>
         </w:rPr>
-      </w:pPr>
-      <w:proofErr w:type="spellStart"/>
+        <w:t>, kipróbált és használt modellek</w:t>
+      </w:r>
       <w:r>
         <w:rPr>
           <w:rFonts w:ascii="Times New Roman" w:hAnsi="Times New Roman" w:cs="Times New Roman"/>
@@ -2649,18 +2855,20 @@
           <w:sz w:val="24"/>
           <w:szCs w:val="24"/>
         </w:rPr>
-        <w:t>Promtolás</w:t>
-      </w:r>
-      <w:proofErr w:type="spellEnd"/>
-      <w:r>
+        <w:t>, Prompt mint fekete mágia</w:t>
+      </w:r>
+    </w:p>
+    <w:p>
+      <w:pPr>
+        <w:spacing w:line="360" w:lineRule="auto"/>
+        <w:jc w:val="both"/>
         <w:rPr>
           <w:rFonts w:ascii="Times New Roman" w:hAnsi="Times New Roman" w:cs="Times New Roman"/>
           <w:color w:val="EE0000"/>
           <w:sz w:val="24"/>
           <w:szCs w:val="24"/>
         </w:rPr>
-        <w:t>, kipróbált és használt modellek</w:t>
-      </w:r>
+      </w:pPr>
       <w:r>
         <w:rPr>
           <w:rFonts w:ascii="Times New Roman" w:hAnsi="Times New Roman" w:cs="Times New Roman"/>
@@ -2668,20 +2876,20 @@
           <w:sz w:val="24"/>
           <w:szCs w:val="24"/>
         </w:rPr>
-        <w:t>, Prompt mint fekete mágia</w:t>
-      </w:r>
-    </w:p>
-    <w:p>
-      <w:pPr>
-        <w:spacing w:line="360" w:lineRule="auto"/>
-        <w:jc w:val="both"/>
+        <w:tab/>
+        <w:t xml:space="preserve">Milyen folyamatok és miért </w:t>
+      </w:r>
+      <w:proofErr w:type="spellStart"/>
+      <w:r>
         <w:rPr>
           <w:rFonts w:ascii="Times New Roman" w:hAnsi="Times New Roman" w:cs="Times New Roman"/>
           <w:color w:val="EE0000"/>
           <w:sz w:val="24"/>
           <w:szCs w:val="24"/>
         </w:rPr>
-      </w:pPr>
+        <w:t>csatolódtak</w:t>
+      </w:r>
+      <w:proofErr w:type="spellEnd"/>
       <w:r>
         <w:rPr>
           <w:rFonts w:ascii="Times New Roman" w:hAnsi="Times New Roman" w:cs="Times New Roman"/>
@@ -2689,20 +2897,20 @@
           <w:sz w:val="24"/>
           <w:szCs w:val="24"/>
         </w:rPr>
-        <w:tab/>
-        <w:t xml:space="preserve">Milyen folyamatok és miért </w:t>
-      </w:r>
-      <w:proofErr w:type="spellStart"/>
-      <w:r>
+        <w:t xml:space="preserve"> rá a pálya generálásra, hint rendszer</w:t>
+      </w:r>
+    </w:p>
+    <w:p>
+      <w:pPr>
+        <w:spacing w:line="360" w:lineRule="auto"/>
+        <w:jc w:val="both"/>
         <w:rPr>
           <w:rFonts w:ascii="Times New Roman" w:hAnsi="Times New Roman" w:cs="Times New Roman"/>
           <w:color w:val="EE0000"/>
           <w:sz w:val="24"/>
           <w:szCs w:val="24"/>
         </w:rPr>
-        <w:t>csatolódtak</w:t>
-      </w:r>
-      <w:proofErr w:type="spellEnd"/>
+      </w:pPr>
       <w:r>
         <w:rPr>
           <w:rFonts w:ascii="Times New Roman" w:hAnsi="Times New Roman" w:cs="Times New Roman"/>
@@ -2710,7 +2918,8 @@
           <w:sz w:val="24"/>
           <w:szCs w:val="24"/>
         </w:rPr>
-        <w:t xml:space="preserve"> rá a pálya generálásra, hint rendszer</w:t>
+        <w:tab/>
+        <w:t>Milyen modelleket használtam végül</w:t>
       </w:r>
     </w:p>
     <w:p>
@@ -2732,20 +2941,18 @@
           <w:szCs w:val="24"/>
         </w:rPr>
         <w:tab/>
-        <w:t>Milyen modelleket használtam végül</w:t>
-      </w:r>
-    </w:p>
-    <w:p>
-      <w:pPr>
-        <w:spacing w:line="360" w:lineRule="auto"/>
-        <w:jc w:val="both"/>
+      </w:r>
+      <w:proofErr w:type="spellStart"/>
+      <w:r>
         <w:rPr>
           <w:rFonts w:ascii="Times New Roman" w:hAnsi="Times New Roman" w:cs="Times New Roman"/>
           <w:color w:val="EE0000"/>
           <w:sz w:val="24"/>
           <w:szCs w:val="24"/>
         </w:rPr>
-      </w:pPr>
+        <w:t>Sprite</w:t>
+      </w:r>
+      <w:proofErr w:type="spellEnd"/>
       <w:r>
         <w:rPr>
           <w:rFonts w:ascii="Times New Roman" w:hAnsi="Times New Roman" w:cs="Times New Roman"/>
@@ -2753,7 +2960,7 @@
           <w:sz w:val="24"/>
           <w:szCs w:val="24"/>
         </w:rPr>
-        <w:tab/>
+        <w:t xml:space="preserve"> </w:t>
       </w:r>
       <w:proofErr w:type="spellStart"/>
       <w:r>
@@ -2763,7 +2970,7 @@
           <w:sz w:val="24"/>
           <w:szCs w:val="24"/>
         </w:rPr>
-        <w:t>Sprite</w:t>
+        <w:t>png</w:t>
       </w:r>
       <w:proofErr w:type="spellEnd"/>
       <w:r>
@@ -2775,7 +2982,7 @@
         </w:rPr>
         <w:t xml:space="preserve"> </w:t>
       </w:r>
-      <w:proofErr w:type="spellStart"/>
+      <w:proofErr w:type="gramStart"/>
       <w:r>
         <w:rPr>
           <w:rFonts w:ascii="Times New Roman" w:hAnsi="Times New Roman" w:cs="Times New Roman"/>
@@ -2783,9 +2990,9 @@
           <w:sz w:val="24"/>
           <w:szCs w:val="24"/>
         </w:rPr>
-        <w:t>png</w:t>
-      </w:r>
-      <w:proofErr w:type="spellEnd"/>
+        <w:t>generálása</w:t>
+      </w:r>
+      <w:proofErr w:type="gramEnd"/>
       <w:r>
         <w:rPr>
           <w:rFonts w:ascii="Times New Roman" w:hAnsi="Times New Roman" w:cs="Times New Roman"/>
@@ -2793,19 +3000,20 @@
           <w:sz w:val="24"/>
           <w:szCs w:val="24"/>
         </w:rPr>
-        <w:t xml:space="preserve"> </w:t>
-      </w:r>
-      <w:proofErr w:type="gramStart"/>
-      <w:r>
+        <w:t xml:space="preserve"> amit végül a modell megoldott</w:t>
+      </w:r>
+    </w:p>
+    <w:p>
+      <w:pPr>
+        <w:spacing w:line="360" w:lineRule="auto"/>
+        <w:jc w:val="both"/>
         <w:rPr>
           <w:rFonts w:ascii="Times New Roman" w:hAnsi="Times New Roman" w:cs="Times New Roman"/>
           <w:color w:val="EE0000"/>
           <w:sz w:val="24"/>
           <w:szCs w:val="24"/>
         </w:rPr>
-        <w:t>generálása</w:t>
-      </w:r>
-      <w:proofErr w:type="gramEnd"/>
+      </w:pPr>
       <w:r>
         <w:rPr>
           <w:rFonts w:ascii="Times New Roman" w:hAnsi="Times New Roman" w:cs="Times New Roman"/>
@@ -2813,7 +3021,7 @@
           <w:sz w:val="24"/>
           <w:szCs w:val="24"/>
         </w:rPr>
-        <w:t xml:space="preserve"> amit végül a modell megoldott</w:t>
+        <w:t>Költség elemzés</w:t>
       </w:r>
     </w:p>
     <w:p>
@@ -2834,7 +3042,9 @@
           <w:sz w:val="24"/>
           <w:szCs w:val="24"/>
         </w:rPr>
-        <w:t>Költség elemzés</w:t>
+        <w:lastRenderedPageBreak/>
+        <w:tab/>
+        <w:t>Mérési eredmények - statisztikák</w:t>
       </w:r>
     </w:p>
     <w:p>
@@ -2855,29 +3065,6 @@
           <w:sz w:val="24"/>
           <w:szCs w:val="24"/>
         </w:rPr>
-        <w:tab/>
-        <w:t>Mérési eredmények - statisztikák</w:t>
-      </w:r>
-    </w:p>
-    <w:p>
-      <w:pPr>
-        <w:spacing w:line="360" w:lineRule="auto"/>
-        <w:jc w:val="both"/>
-        <w:rPr>
-          <w:rFonts w:ascii="Times New Roman" w:hAnsi="Times New Roman" w:cs="Times New Roman"/>
-          <w:color w:val="EE0000"/>
-          <w:sz w:val="24"/>
-          <w:szCs w:val="24"/>
-        </w:rPr>
-      </w:pPr>
-      <w:r>
-        <w:rPr>
-          <w:rFonts w:ascii="Times New Roman" w:hAnsi="Times New Roman" w:cs="Times New Roman"/>
-          <w:color w:val="EE0000"/>
-          <w:sz w:val="24"/>
-          <w:szCs w:val="24"/>
-        </w:rPr>
-        <w:lastRenderedPageBreak/>
         <w:tab/>
         <w:t>Milyen költsége van egy pálya generálásának</w:t>
       </w:r>
@@ -3386,7 +3573,7 @@
           <w:i/>
         </w:rPr>
       </w:pPr>
-      <w:bookmarkStart w:id="2" w:name="_Toc225505730"/>
+      <w:bookmarkStart w:id="2" w:name="_Toc225520363"/>
       <w:r>
         <w:lastRenderedPageBreak/>
         <w:t>Technológiák</w:t>
@@ -3405,7 +3592,7 @@
       <w:pPr>
         <w:pStyle w:val="Szakdolgozath2"/>
       </w:pPr>
-      <w:bookmarkStart w:id="3" w:name="_Toc225505731"/>
+      <w:bookmarkStart w:id="3" w:name="_Toc225520364"/>
       <w:r>
         <w:t xml:space="preserve">Docker és </w:t>
       </w:r>
@@ -3548,7 +3735,7 @@
       <w:pPr>
         <w:pStyle w:val="Szakdolgozath2"/>
       </w:pPr>
-      <w:bookmarkStart w:id="4" w:name="_Toc225505732"/>
+      <w:bookmarkStart w:id="4" w:name="_Toc225520365"/>
       <w:r>
         <w:t>Frontend technológiák</w:t>
       </w:r>
@@ -4008,7 +4195,7 @@
       <w:pPr>
         <w:pStyle w:val="Szakdolgozath2"/>
       </w:pPr>
-      <w:bookmarkStart w:id="5" w:name="_Toc225505733"/>
+      <w:bookmarkStart w:id="5" w:name="_Toc225520366"/>
       <w:r>
         <w:t>Backend technológiák</w:t>
       </w:r>
@@ -4340,6 +4527,7 @@
     <w:p>
       <w:pPr>
         <w:pStyle w:val="Szakdolgozatbekezds"/>
+        <w:ind w:firstLine="357"/>
       </w:pPr>
       <w:r>
         <w:t xml:space="preserve">Az adatbázisséma változásainak nyomon követésére és a migrációk kezelésére az </w:t>
@@ -4397,7 +4585,7 @@
       <w:pPr>
         <w:pStyle w:val="Szakdolgozath2"/>
       </w:pPr>
-      <w:bookmarkStart w:id="6" w:name="_Toc225505734"/>
+      <w:bookmarkStart w:id="6" w:name="_Toc225520367"/>
       <w:r>
         <w:t>Valós idejű kommunikáció</w:t>
       </w:r>
@@ -4604,7 +4792,7 @@
       <w:pPr>
         <w:pStyle w:val="Szakdolgozath2"/>
       </w:pPr>
-      <w:bookmarkStart w:id="7" w:name="_Toc225505735"/>
+      <w:bookmarkStart w:id="7" w:name="_Toc225520368"/>
       <w:r>
         <w:t>Adatkezelés és tárolás</w:t>
       </w:r>
@@ -4762,7 +4950,7 @@
       <w:pPr>
         <w:pStyle w:val="Szakdolgozath2"/>
       </w:pPr>
-      <w:bookmarkStart w:id="8" w:name="_Toc225505736"/>
+      <w:bookmarkStart w:id="8" w:name="_Toc225520369"/>
       <w:r>
         <w:t>MI integráció</w:t>
       </w:r>
@@ -4843,77 +5031,73 @@
     </w:p>
     <w:p>
       <w:pPr>
+        <w:pStyle w:val="SzekdolgozatH1"/>
+      </w:pPr>
+      <w:bookmarkStart w:id="9" w:name="_Toc225520370"/>
+      <w:r>
+        <w:t>Architektúra</w:t>
+      </w:r>
+      <w:bookmarkEnd w:id="9"/>
+    </w:p>
+    <w:p>
+      <w:pPr>
+        <w:pStyle w:val="Szakdolgozath2"/>
+      </w:pPr>
+      <w:bookmarkStart w:id="10" w:name="_Toc225520371"/>
+      <w:r>
+        <w:t>Adatbázis felépítés –</w:t>
+      </w:r>
+      <w:r>
+        <w:t xml:space="preserve"> </w:t>
+      </w:r>
+      <w:r>
+        <w:t>entitások</w:t>
+      </w:r>
+      <w:r>
+        <w:t xml:space="preserve"> és relációk</w:t>
+      </w:r>
+      <w:bookmarkEnd w:id="10"/>
+    </w:p>
+    <w:p>
+      <w:pPr>
+        <w:pStyle w:val="Szakdolgozath3"/>
+      </w:pPr>
+      <w:bookmarkStart w:id="11" w:name="Db_User"/>
+      <w:proofErr w:type="spellStart"/>
+      <w:r>
+        <w:t>User</w:t>
+      </w:r>
+      <w:proofErr w:type="spellEnd"/>
+    </w:p>
+    <w:bookmarkEnd w:id="11"/>
+    <w:p>
+      <w:pPr>
         <w:pStyle w:val="Szakdolgozatbekezds"/>
       </w:pPr>
-    </w:p>
-    <w:p>
-      <w:pPr>
-        <w:pStyle w:val="SzekdolgozatH1"/>
-      </w:pPr>
-      <w:bookmarkStart w:id="9" w:name="_Toc225505737"/>
-      <w:r>
-        <w:t>Architektúra</w:t>
-      </w:r>
-      <w:bookmarkEnd w:id="9"/>
-    </w:p>
-    <w:p>
-      <w:pPr>
-        <w:pStyle w:val="Szakdolgozath2"/>
-      </w:pPr>
-      <w:bookmarkStart w:id="10" w:name="_Toc225505738"/>
-      <w:r>
-        <w:t>Adatbázis felépítés –</w:t>
-      </w:r>
-      <w:r>
-        <w:t xml:space="preserve"> </w:t>
-      </w:r>
-      <w:r>
-        <w:t>entitások</w:t>
-      </w:r>
-      <w:r>
-        <w:t xml:space="preserve"> és relációk</w:t>
-      </w:r>
-      <w:bookmarkEnd w:id="10"/>
-    </w:p>
-    <w:p>
-      <w:pPr>
-        <w:pStyle w:val="Szakdolgozath3"/>
-      </w:pPr>
-      <w:bookmarkStart w:id="11" w:name="Db_User"/>
-      <w:proofErr w:type="spellStart"/>
-      <w:r>
-        <w:t>User</w:t>
-      </w:r>
-      <w:proofErr w:type="spellEnd"/>
-    </w:p>
-    <w:bookmarkEnd w:id="11"/>
+      <w:r>
+        <w:t xml:space="preserve">A rendszer felhasználóit reprezentáló alapentitás. Az </w:t>
+      </w:r>
+      <w:proofErr w:type="spellStart"/>
+      <w:r>
+        <w:t>autentikációhoz</w:t>
+      </w:r>
+      <w:proofErr w:type="spellEnd"/>
+      <w:r>
+        <w:t xml:space="preserve"> szükséges azonosító adatokat tárolja, vagyis az e-mail címet, a felhasználónevet és a jelszó </w:t>
+      </w:r>
+      <w:proofErr w:type="spellStart"/>
+      <w:r>
+        <w:t>hash</w:t>
+      </w:r>
+      <w:proofErr w:type="spellEnd"/>
+      <w:r>
+        <w:t>-ét.</w:t>
+      </w:r>
+    </w:p>
     <w:p>
       <w:pPr>
         <w:pStyle w:val="Szakdolgozatbekezds"/>
-      </w:pPr>
-      <w:r>
-        <w:t xml:space="preserve">A rendszer felhasználóit reprezentáló alapentitás. Az </w:t>
-      </w:r>
-      <w:proofErr w:type="spellStart"/>
-      <w:r>
-        <w:t>autentikációhoz</w:t>
-      </w:r>
-      <w:proofErr w:type="spellEnd"/>
-      <w:r>
-        <w:t xml:space="preserve"> szükséges azonosító adatokat tárolja, vagyis az e-mail címet, a felhasználónevet és a jelszó </w:t>
-      </w:r>
-      <w:proofErr w:type="spellStart"/>
-      <w:r>
-        <w:t>hash</w:t>
-      </w:r>
-      <w:proofErr w:type="spellEnd"/>
-      <w:r>
-        <w:t>-ét.</w:t>
-      </w:r>
-    </w:p>
-    <w:p>
-      <w:pPr>
-        <w:pStyle w:val="Szakdolgozatbekezds"/>
+        <w:ind w:firstLine="357"/>
       </w:pPr>
       <w:r>
         <w:t>Egy-a</w:t>
@@ -5052,6 +5236,7 @@
     <w:p>
       <w:pPr>
         <w:pStyle w:val="Szakdolgozatbekezds"/>
+        <w:ind w:firstLine="357"/>
       </w:pPr>
       <w:r>
         <w:t>Egy-a</w:t>
@@ -5135,6 +5320,7 @@
     <w:p>
       <w:pPr>
         <w:pStyle w:val="Szakdolgozatbekezds"/>
+        <w:ind w:firstLine="357"/>
       </w:pPr>
       <w:r>
         <w:t xml:space="preserve">Egy-a-többhöz kapcsolatban kapcsolódik a </w:t>
@@ -5255,6 +5441,7 @@
     <w:p>
       <w:pPr>
         <w:pStyle w:val="Szakdolgozatbekezds"/>
+        <w:ind w:firstLine="357"/>
       </w:pPr>
       <w:r>
         <w:lastRenderedPageBreak/>
@@ -5356,6 +5543,7 @@
     <w:p>
       <w:pPr>
         <w:pStyle w:val="Szakdolgozatbekezds"/>
+        <w:ind w:firstLine="357"/>
       </w:pPr>
       <w:r>
         <w:t>Több-a</w:t>
@@ -5429,6 +5617,7 @@
     <w:p>
       <w:pPr>
         <w:pStyle w:val="Szakdolgozatbekezds"/>
+        <w:ind w:firstLine="357"/>
       </w:pPr>
       <w:r>
         <w:t>Több-a</w:t>
@@ -5508,6 +5697,7 @@
     <w:p>
       <w:pPr>
         <w:pStyle w:val="Szakdolgozatbekezds"/>
+        <w:ind w:firstLine="357"/>
       </w:pPr>
       <w:r>
         <w:t>Több-a</w:t>
@@ -5622,6 +5812,7 @@
     <w:p>
       <w:pPr>
         <w:pStyle w:val="Szakdolgozatbekezds"/>
+        <w:ind w:firstLine="357"/>
       </w:pPr>
       <w:r>
         <w:t>Több-a</w:t>
@@ -5657,7 +5848,7 @@
       <w:pPr>
         <w:pStyle w:val="Szakdolgozath2"/>
       </w:pPr>
-      <w:bookmarkStart w:id="19" w:name="_Toc225505739"/>
+      <w:bookmarkStart w:id="19" w:name="_Toc225520372"/>
       <w:r>
         <w:t>Frontend</w:t>
       </w:r>
@@ -5722,6 +5913,7 @@
     <w:p>
       <w:pPr>
         <w:pStyle w:val="Szakdolgozatbekezds"/>
+        <w:ind w:firstLine="720"/>
       </w:pPr>
       <w:r>
         <w:lastRenderedPageBreak/>
@@ -5731,6 +5923,7 @@
     <w:p>
       <w:pPr>
         <w:pStyle w:val="Szakdolgozatbekezds"/>
+        <w:ind w:firstLine="720"/>
       </w:pPr>
       <w:r>
         <w:t xml:space="preserve">A frontend felépítése komponensalapú, ami elősegíti az egyes felületi egységek </w:t>
@@ -5805,10 +5998,7 @@
       </w:r>
       <w:proofErr w:type="spellEnd"/>
       <w:r>
-        <w:t xml:space="preserve"> felel többek között a modális ablakok, </w:t>
-      </w:r>
-      <w:r>
-        <w:t xml:space="preserve">és az </w:t>
+        <w:t xml:space="preserve"> felel többek között a modális ablakok, és az </w:t>
       </w:r>
       <w:proofErr w:type="spellStart"/>
       <w:r>
@@ -5822,6 +6012,7 @@
     <w:p>
       <w:pPr>
         <w:pStyle w:val="Szakdolgozatbekezds"/>
+        <w:ind w:firstLine="357"/>
       </w:pPr>
       <w:r>
         <w:t xml:space="preserve">Kódszinten a frontend struktúrája jól elkülöníti egymástól az oldalakat, a vizuális komponenseket és az állapotkezelési logikát. Az alkalmazás </w:t>
@@ -5919,7 +6110,7 @@
       <w:pPr>
         <w:pStyle w:val="Szakdolgozath2"/>
       </w:pPr>
-      <w:bookmarkStart w:id="20" w:name="_Toc225505740"/>
+      <w:bookmarkStart w:id="20" w:name="_Toc225520373"/>
       <w:r>
         <w:t>Backend API</w:t>
       </w:r>
@@ -5978,15 +6169,13 @@
         </w:sdtContent>
       </w:sdt>
       <w:r>
-        <w:t xml:space="preserve"> </w:t>
-      </w:r>
-      <w:r>
-        <w:t>alapokon épül fel, és több, funkció szerint szétválasztott routerre tagolódik. Az API elsődleges feladata az adatbázissal való kommunikáció, az üzleti szabályok érvényesítése, valamint a frontend számára szükséges szolgáltatások biztosítása.</w:t>
+        <w:t xml:space="preserve"> alapokon épül fel, és több, funkció szerint szétválasztott routerre tagolódik. Az API elsődleges feladata az adatbázissal való kommunikáció, az üzleti szabályok érvényesítése, valamint a frontend számára szükséges szolgáltatások biztosítása.</w:t>
       </w:r>
     </w:p>
     <w:p>
       <w:pPr>
         <w:pStyle w:val="Szakdolgozatbekezds"/>
+        <w:ind w:firstLine="720"/>
       </w:pPr>
       <w:r>
         <w:t xml:space="preserve">Jelenleg összesen 17 HTTP végponttal rendelkezik, amelyek a hitelesítéshez, felhasználói adatok kezeléséhez, </w:t>
@@ -5997,10 +6186,7 @@
       </w:r>
       <w:proofErr w:type="spellEnd"/>
       <w:r>
-        <w:t xml:space="preserve"> </w:t>
-      </w:r>
-      <w:r>
-        <w:t xml:space="preserve">műveletekhez, pályakezeléshez és </w:t>
+        <w:t xml:space="preserve"> műveletekhez, pályakezeléshez és </w:t>
       </w:r>
       <w:proofErr w:type="spellStart"/>
       <w:r>
@@ -6014,6 +6200,7 @@
     <w:p>
       <w:pPr>
         <w:pStyle w:val="Szakdolgozatbekezds"/>
+        <w:ind w:firstLine="720"/>
       </w:pPr>
       <w:r>
         <w:t xml:space="preserve">Az adatkezelés modellalapú megközelítéssel történik. A rendszer </w:t>
@@ -6070,11 +6257,7 @@
     <w:p>
       <w:pPr>
         <w:pStyle w:val="Szakdolgozatbekezds"/>
-      </w:pPr>
-    </w:p>
-    <w:p>
-      <w:pPr>
-        <w:pStyle w:val="Szakdolgozatbekezds"/>
+        <w:ind w:firstLine="357"/>
       </w:pPr>
       <w:r>
         <w:lastRenderedPageBreak/>
@@ -6101,7 +6284,7 @@
       <w:pPr>
         <w:pStyle w:val="Szakdolgozath2"/>
       </w:pPr>
-      <w:bookmarkStart w:id="21" w:name="_Toc225505741"/>
+      <w:bookmarkStart w:id="21" w:name="_Toc225520374"/>
       <w:proofErr w:type="spellStart"/>
       <w:r>
         <w:t>WebSocket</w:t>
@@ -6161,6 +6344,7 @@
     <w:p>
       <w:pPr>
         <w:pStyle w:val="Szakdolgozatbekezds"/>
+        <w:ind w:firstLine="357"/>
       </w:pPr>
       <w:proofErr w:type="spellStart"/>
       <w:r>
@@ -6207,7 +6391,7 @@
       <w:pPr>
         <w:pStyle w:val="Szakdolgozath2"/>
       </w:pPr>
-      <w:bookmarkStart w:id="22" w:name="_Toc225505742"/>
+      <w:bookmarkStart w:id="22" w:name="_Toc225520375"/>
       <w:r>
         <w:t xml:space="preserve">File </w:t>
       </w:r>
@@ -6243,7 +6427,7 @@
             <w:fldChar w:fldCharType="begin"/>
           </w:r>
           <w:r>
-            <w:instrText xml:space="preserve"> CITATION AWS_S3 \l 1038 </w:instrText>
+            <w:instrText xml:space="preserve">CITATION AWS_S3 \l 1038 </w:instrText>
           </w:r>
           <w:r>
             <w:fldChar w:fldCharType="separate"/>
@@ -6338,15 +6522,25 @@
     <w:p>
       <w:pPr>
         <w:pStyle w:val="Szakdolgozatbekezds"/>
-      </w:pPr>
-    </w:p>
-    <w:p>
-      <w:pPr>
-        <w:pStyle w:val="Szakdolgozatbekezds"/>
+        <w:ind w:firstLine="720"/>
       </w:pPr>
       <w:r>
         <w:lastRenderedPageBreak/>
-        <w:t xml:space="preserve">A JSON állományok szerepkör szerint is elkülönülnek. Egy részük a generálási folyamat köztes eredményeit tartalmazza, például a kezdeti generált pályaváltozatot, a validációs kimeneteket vagy az egyes javítási körök eredményeit. Más részük a véglegesített pályaleírást reprezentálja, amelyet a frontend a játékmenet során betölt és feldolgoz. Emellett a rendszer diagnosztikai célból hibás generálási kimeneteket is képes külön fájlban eltárolni. Ez a struktúra </w:t>
+        <w:t>A</w:t>
+      </w:r>
+      <w:r>
+        <w:t xml:space="preserve"> </w:t>
+      </w:r>
+      <w:proofErr w:type="spellStart"/>
+      <w:r>
+        <w:t>Json</w:t>
+      </w:r>
+      <w:proofErr w:type="spellEnd"/>
+      <w:r>
+        <w:t xml:space="preserve"> </w:t>
+      </w:r>
+      <w:r>
+        <w:t xml:space="preserve">állományok szerepkör szerint is elkülönülnek. Egy részük a generálási folyamat köztes eredményeit tartalmazza, például a kezdeti generált pályaváltozatot, a validációs kimeneteket vagy az egyes javítási körök eredményeit. Más részük a véglegesített pályaleírást reprezentálja, amelyet a frontend a játékmenet során betölt és feldolgoz. Emellett a rendszer diagnosztikai célból hibás generálási kimeneteket is képes külön fájlban eltárolni. Ez a struktúra </w:t>
       </w:r>
       <w:proofErr w:type="spellStart"/>
       <w:r>
@@ -6415,26 +6609,20 @@
       </w:r>
       <w:proofErr w:type="spellEnd"/>
       <w:r>
-        <w:t>}/{</w:t>
-      </w:r>
+        <w:t xml:space="preserve">}/{ </w:t>
+      </w:r>
+      <w:proofErr w:type="spellStart"/>
+      <w:r>
+        <w:t>json</w:t>
+      </w:r>
+      <w:proofErr w:type="spellEnd"/>
+      <w:proofErr w:type="gramEnd"/>
       <w:r>
         <w:t xml:space="preserve"> </w:t>
       </w:r>
-      <w:proofErr w:type="spellStart"/>
-      <w:r>
-        <w:t>json</w:t>
-      </w:r>
-      <w:proofErr w:type="spellEnd"/>
-      <w:proofErr w:type="gramEnd"/>
-      <w:r>
-        <w:t xml:space="preserve"> </w:t>
-      </w:r>
       <w:proofErr w:type="gramStart"/>
       <w:r>
-        <w:t xml:space="preserve">file </w:t>
-      </w:r>
-      <w:r>
-        <w:t>}</w:t>
+        <w:t>file }</w:t>
       </w:r>
       <w:proofErr w:type="gramEnd"/>
     </w:p>
@@ -6480,113 +6668,717 @@
       </w:r>
       <w:proofErr w:type="gramStart"/>
       <w:r>
-        <w:t>NAME}</w:t>
-      </w:r>
+        <w:t>NAME}/</w:t>
+      </w:r>
+      <w:proofErr w:type="gramEnd"/>
+      <w:r>
+        <w:t>{</w:t>
+      </w:r>
+      <w:proofErr w:type="spellStart"/>
+      <w:r>
+        <w:t>level_</w:t>
+      </w:r>
+      <w:proofErr w:type="gramStart"/>
+      <w:r>
+        <w:t>id</w:t>
+      </w:r>
+      <w:proofErr w:type="spellEnd"/>
+      <w:r>
+        <w:t>}/</w:t>
+      </w:r>
+      <w:proofErr w:type="spellStart"/>
+      <w:proofErr w:type="gramEnd"/>
+      <w:r>
+        <w:t>sprites</w:t>
+      </w:r>
+      <w:proofErr w:type="spellEnd"/>
+      <w:proofErr w:type="gramStart"/>
       <w:r>
         <w:t>/</w:t>
       </w:r>
+      <w:r>
+        <w:t>{</w:t>
+      </w:r>
+      <w:proofErr w:type="spellStart"/>
       <w:proofErr w:type="gramEnd"/>
       <w:r>
-        <w:t>{</w:t>
-      </w:r>
-      <w:proofErr w:type="spellStart"/>
-      <w:r>
-        <w:t>level_</w:t>
+        <w:t>png</w:t>
+      </w:r>
+      <w:proofErr w:type="spellEnd"/>
+      <w:r>
+        <w:t xml:space="preserve"> file}</w:t>
+      </w:r>
+    </w:p>
+    <w:p>
+      <w:pPr>
+        <w:pStyle w:val="Szakdolgozath2"/>
+      </w:pPr>
+      <w:bookmarkStart w:id="23" w:name="_Toc225520376"/>
+      <w:r>
+        <w:t>Biztonság</w:t>
+      </w:r>
+      <w:r>
+        <w:t xml:space="preserve">, JWT </w:t>
+      </w:r>
+      <w:proofErr w:type="spellStart"/>
+      <w:r>
+        <w:t>token</w:t>
+      </w:r>
+      <w:proofErr w:type="spellEnd"/>
+      <w:r>
+        <w:t xml:space="preserve"> </w:t>
+      </w:r>
+      <w:proofErr w:type="spellStart"/>
+      <w:r>
+        <w:t>authentikáció</w:t>
+      </w:r>
+      <w:bookmarkEnd w:id="23"/>
+      <w:proofErr w:type="spellEnd"/>
+      <w:r>
+        <w:t xml:space="preserve"> </w:t>
+      </w:r>
+    </w:p>
+    <w:p>
+      <w:pPr>
+        <w:pStyle w:val="Szakdolgozatbekezds"/>
+      </w:pPr>
+      <w:r>
+        <w:t xml:space="preserve">A felhasználók hitelesítése JSON Web </w:t>
+      </w:r>
+      <w:proofErr w:type="spellStart"/>
+      <w:r>
+        <w:t>Token</w:t>
+      </w:r>
+      <w:proofErr w:type="spellEnd"/>
+      <w:r>
+        <w:t xml:space="preserve"> (JWT) alapú megoldással történik, amely RS256 algoritmust alkalmazó, nyilvános és privát kulcspáron alapuló aláírással került megvalósításra. Ez biztosítja, hogy a kliensoldali alkalmazás a bejelentkezést követően biztonságos módon férjen hozzá a védett erőforrásokhoz, miközben a szerver ellenőrizni tudja a </w:t>
+      </w:r>
+      <w:proofErr w:type="spellStart"/>
+      <w:r>
+        <w:t>tokenek</w:t>
+      </w:r>
+      <w:proofErr w:type="spellEnd"/>
+      <w:r>
+        <w:t xml:space="preserve"> hitelességét és érvényességét.</w:t>
+      </w:r>
+    </w:p>
+    <w:p>
+      <w:pPr>
+        <w:pStyle w:val="Szakdolgozatbekezds"/>
+        <w:ind w:firstLine="357"/>
+      </w:pPr>
+      <w:r>
+        <w:t xml:space="preserve">Bejelentkezéskor a backend egy rövid élettartamú </w:t>
+      </w:r>
+      <w:proofErr w:type="spellStart"/>
+      <w:r>
+        <w:t>access</w:t>
+      </w:r>
+      <w:proofErr w:type="spellEnd"/>
+      <w:r>
+        <w:t xml:space="preserve"> </w:t>
+      </w:r>
+      <w:proofErr w:type="spellStart"/>
+      <w:r>
+        <w:t>token</w:t>
+      </w:r>
+      <w:proofErr w:type="spellEnd"/>
+      <w:r>
+        <w:t xml:space="preserve">-t és egy hosszabb élettartamú </w:t>
+      </w:r>
+      <w:proofErr w:type="spellStart"/>
+      <w:r>
+        <w:t>refresh</w:t>
+      </w:r>
+      <w:proofErr w:type="spellEnd"/>
+      <w:r>
+        <w:t xml:space="preserve"> </w:t>
+      </w:r>
+      <w:proofErr w:type="spellStart"/>
+      <w:r>
+        <w:t>token</w:t>
+      </w:r>
+      <w:proofErr w:type="spellEnd"/>
+      <w:r>
+        <w:t xml:space="preserve">-t ad vissza. Az </w:t>
+      </w:r>
+      <w:proofErr w:type="spellStart"/>
+      <w:r>
+        <w:t>access</w:t>
+      </w:r>
+      <w:proofErr w:type="spellEnd"/>
+      <w:r>
+        <w:t xml:space="preserve"> </w:t>
+      </w:r>
+      <w:proofErr w:type="spellStart"/>
+      <w:r>
+        <w:t>token</w:t>
+      </w:r>
+      <w:proofErr w:type="spellEnd"/>
+      <w:r>
+        <w:t xml:space="preserve"> szolgál a védett végpontok elérésére, míg a </w:t>
+      </w:r>
+      <w:proofErr w:type="spellStart"/>
+      <w:r>
+        <w:t>refresh</w:t>
+      </w:r>
+      <w:proofErr w:type="spellEnd"/>
+      <w:r>
+        <w:t xml:space="preserve"> </w:t>
+      </w:r>
+      <w:proofErr w:type="spellStart"/>
+      <w:r>
+        <w:t>token</w:t>
+      </w:r>
+      <w:proofErr w:type="spellEnd"/>
+      <w:r>
+        <w:t xml:space="preserve"> segítségével a kliens új </w:t>
+      </w:r>
+      <w:proofErr w:type="spellStart"/>
+      <w:r>
+        <w:t>tokenpárt</w:t>
+      </w:r>
+      <w:proofErr w:type="spellEnd"/>
+      <w:r>
+        <w:t xml:space="preserve"> kérhet anélkül, hogy a felhasználónak újra be kellene jelentkeznie. A frontend a </w:t>
+      </w:r>
+      <w:proofErr w:type="spellStart"/>
+      <w:r>
+        <w:t>tokeneket</w:t>
+      </w:r>
+      <w:proofErr w:type="spellEnd"/>
+      <w:r>
+        <w:t xml:space="preserve"> kliensoldalon tárolja, és minden védett API-hívásnál </w:t>
+      </w:r>
+      <w:proofErr w:type="spellStart"/>
+      <w:r>
+        <w:t>Bearer</w:t>
+      </w:r>
+      <w:proofErr w:type="spellEnd"/>
+      <w:r>
+        <w:t xml:space="preserve"> tokenként küldi az </w:t>
+      </w:r>
+      <w:proofErr w:type="spellStart"/>
+      <w:r>
+        <w:t>Authorization</w:t>
+      </w:r>
+      <w:proofErr w:type="spellEnd"/>
+      <w:r>
+        <w:t xml:space="preserve"> fejlécben. A backend minden védett kérésnél ellenőrzi a </w:t>
+      </w:r>
+      <w:proofErr w:type="spellStart"/>
+      <w:r>
+        <w:t>token</w:t>
+      </w:r>
+      <w:proofErr w:type="spellEnd"/>
+      <w:r>
+        <w:t xml:space="preserve"> típusát, lejáratát, valamint a benne szereplő felhasználói azonosítót. A jelenlegi működés előnye, hogy jól elkülöníti a hitelesítési réteget az üzleti logikától, és a </w:t>
+      </w:r>
+      <w:proofErr w:type="spellStart"/>
+      <w:r>
+        <w:t>refresh</w:t>
+      </w:r>
+      <w:proofErr w:type="spellEnd"/>
+      <w:r>
+        <w:t xml:space="preserve"> mechanizmus kényelmesebb felhasználói élményt biztosít. Architektúra szinten fontos még, hogy a </w:t>
+      </w:r>
+      <w:proofErr w:type="spellStart"/>
+      <w:r>
+        <w:t>refresh</w:t>
+      </w:r>
+      <w:proofErr w:type="spellEnd"/>
+      <w:r>
+        <w:t xml:space="preserve"> </w:t>
+      </w:r>
+      <w:proofErr w:type="spellStart"/>
+      <w:r>
+        <w:t>tokenek</w:t>
+      </w:r>
+      <w:proofErr w:type="spellEnd"/>
+      <w:r>
+        <w:t xml:space="preserve"> adatbázisban is nyilvántartásra kerülnek, így visszavonhatók, ami biztonsági szempontból kedvezőbb, mint a teljesen </w:t>
+      </w:r>
+      <w:proofErr w:type="spellStart"/>
+      <w:r>
+        <w:t>stateless</w:t>
+      </w:r>
+      <w:proofErr w:type="spellEnd"/>
+      <w:r>
+        <w:t xml:space="preserve"> megközelítés.</w:t>
+      </w:r>
+    </w:p>
+    <w:p>
+      <w:pPr>
+        <w:pStyle w:val="SzekdolgozatH1"/>
+      </w:pPr>
+      <w:bookmarkStart w:id="24" w:name="_Toc225520377"/>
+      <w:r>
+        <w:lastRenderedPageBreak/>
+        <w:t>Pálya Generálása</w:t>
+      </w:r>
+      <w:bookmarkEnd w:id="24"/>
+    </w:p>
+    <w:p>
+      <w:pPr>
+        <w:pStyle w:val="Szakdolgozath2"/>
+      </w:pPr>
+      <w:bookmarkStart w:id="25" w:name="_Toc225520378"/>
+      <w:r>
+        <w:t>Generikus játék modellek</w:t>
+      </w:r>
+      <w:bookmarkEnd w:id="25"/>
+    </w:p>
+    <w:p>
+      <w:pPr>
+        <w:pStyle w:val="Szakdolgozatbekezds"/>
+      </w:pPr>
+      <w:r>
+        <w:t xml:space="preserve">A projekt kezdeti szakaszában az egyik legösszetettebb tervezési feladat annak meghatározása volt, hogy a mesterséges intelligencia milyen módon állítsa elő a szabadulószoba-pályákat. El kellett dönteni, hogy a rendszer pontosan milyen mechanizmusokat kezeljen, és milyen szinten kapjon szabadságot a generálás során. Kérdésként merült fel például, hogy az AI képes legyen-e animációk, összetett </w:t>
       </w:r>
       <w:proofErr w:type="gramStart"/>
       <w:r>
-        <w:t>id</w:t>
-      </w:r>
-      <w:proofErr w:type="spellEnd"/>
-      <w:r>
-        <w:t>}/</w:t>
-      </w:r>
-      <w:proofErr w:type="spellStart"/>
+        <w:t>játékmechanikák</w:t>
+      </w:r>
       <w:proofErr w:type="gramEnd"/>
       <w:r>
-        <w:t>sprites</w:t>
-      </w:r>
-      <w:proofErr w:type="spellEnd"/>
-      <w:proofErr w:type="gramStart"/>
-      <w:r>
-        <w:t>/</w:t>
-      </w:r>
-      <w:r>
-        <w:t>{</w:t>
-      </w:r>
-      <w:proofErr w:type="spellStart"/>
-      <w:proofErr w:type="gramEnd"/>
-      <w:r>
-        <w:t>png</w:t>
-      </w:r>
-      <w:proofErr w:type="spellEnd"/>
-      <w:r>
-        <w:t xml:space="preserve"> file}</w:t>
-      </w:r>
-    </w:p>
-    <w:p>
-      <w:pPr>
-        <w:pStyle w:val="Szakdolgozath2"/>
-      </w:pPr>
-      <w:bookmarkStart w:id="23" w:name="_Toc225505743"/>
-      <w:r>
-        <w:t>Biztonság</w:t>
-      </w:r>
-      <w:r>
-        <w:t xml:space="preserve">, JWT </w:t>
-      </w:r>
-      <w:proofErr w:type="spellStart"/>
-      <w:r>
-        <w:t>token</w:t>
-      </w:r>
-      <w:proofErr w:type="spellEnd"/>
+        <w:t xml:space="preserve"> vagy csak statikus leírások, feliratok és interaktív objektumok létrehozására és módosítására.</w:t>
+      </w:r>
+    </w:p>
+    <w:p>
+      <w:pPr>
+        <w:pStyle w:val="Szakdolgozatbekezds"/>
+        <w:ind w:firstLine="720"/>
+      </w:pPr>
+      <w:r>
+        <w:t>A tervezés során igyekeztem a valós szabadulószobákból</w:t>
+      </w:r>
+      <w:sdt>
+        <w:sdtPr>
+          <w:id w:val="-1753045254"/>
+          <w:citation/>
+        </w:sdtPr>
+        <w:sdtContent>
+          <w:r>
+            <w:fldChar w:fldCharType="begin"/>
+          </w:r>
+          <w:r>
+            <w:instrText xml:space="preserve">CITATION exitgame \l 1038 </w:instrText>
+          </w:r>
+          <w:r>
+            <w:fldChar w:fldCharType="separate"/>
+          </w:r>
+          <w:r>
+            <w:rPr>
+              <w:noProof/>
+            </w:rPr>
+            <w:t xml:space="preserve"> </w:t>
+          </w:r>
+          <w:r>
+            <w:rPr>
+              <w:noProof/>
+            </w:rPr>
+            <w:t>[22]</w:t>
+          </w:r>
+          <w:r>
+            <w:fldChar w:fldCharType="end"/>
+          </w:r>
+        </w:sdtContent>
+      </w:sdt>
+      <w:sdt>
+        <w:sdtPr>
+          <w:id w:val="-370310509"/>
+          <w:citation/>
+        </w:sdtPr>
+        <w:sdtContent>
+          <w:r>
+            <w:fldChar w:fldCharType="begin"/>
+          </w:r>
+          <w:r>
+            <w:instrText xml:space="preserve">CITATION Sze \l 1038 </w:instrText>
+          </w:r>
+          <w:r>
+            <w:fldChar w:fldCharType="separate"/>
+          </w:r>
+          <w:r>
+            <w:rPr>
+              <w:noProof/>
+            </w:rPr>
+            <w:t xml:space="preserve"> </w:t>
+          </w:r>
+          <w:r>
+            <w:rPr>
+              <w:noProof/>
+            </w:rPr>
+            <w:t>[23]</w:t>
+          </w:r>
+          <w:r>
+            <w:fldChar w:fldCharType="end"/>
+          </w:r>
+        </w:sdtContent>
+      </w:sdt>
+      <w:r>
+        <w:t>, valamint az interneten elérhető nagyszámú</w:t>
+      </w:r>
       <w:r>
         <w:t xml:space="preserve"> </w:t>
       </w:r>
       <w:proofErr w:type="spellStart"/>
       <w:r>
-        <w:t>authentikáció</w:t>
-      </w:r>
-      <w:bookmarkEnd w:id="23"/>
+        <w:t>játékbó</w:t>
+      </w:r>
+      <w:proofErr w:type="spellEnd"/>
+      <w:sdt>
+        <w:sdtPr>
+          <w:id w:val="-82849941"/>
+          <w:citation/>
+        </w:sdtPr>
+        <w:sdtContent>
+          <w:r>
+            <w:fldChar w:fldCharType="begin"/>
+          </w:r>
+          <w:r>
+            <w:instrText xml:space="preserve"> CITATION Rus \l 1038 </w:instrText>
+          </w:r>
+          <w:r>
+            <w:fldChar w:fldCharType="separate"/>
+          </w:r>
+          <w:r>
+            <w:rPr>
+              <w:noProof/>
+            </w:rPr>
+            <w:t xml:space="preserve"> </w:t>
+          </w:r>
+          <w:r>
+            <w:rPr>
+              <w:noProof/>
+            </w:rPr>
+            <w:t>[25]</w:t>
+          </w:r>
+          <w:r>
+            <w:fldChar w:fldCharType="end"/>
+          </w:r>
+        </w:sdtContent>
+      </w:sdt>
+      <w:sdt>
+        <w:sdtPr>
+          <w:id w:val="-938981943"/>
+          <w:citation/>
+        </w:sdtPr>
+        <w:sdtContent>
+          <w:r>
+            <w:fldChar w:fldCharType="begin"/>
+          </w:r>
+          <w:r>
+            <w:instrText xml:space="preserve"> CITATION Esc \l 1038 </w:instrText>
+          </w:r>
+          <w:r>
+            <w:fldChar w:fldCharType="separate"/>
+          </w:r>
+          <w:r>
+            <w:rPr>
+              <w:noProof/>
+            </w:rPr>
+            <w:t xml:space="preserve"> </w:t>
+          </w:r>
+          <w:r>
+            <w:rPr>
+              <w:noProof/>
+            </w:rPr>
+            <w:t>[26]</w:t>
+          </w:r>
+          <w:r>
+            <w:fldChar w:fldCharType="end"/>
+          </w:r>
+        </w:sdtContent>
+      </w:sdt>
+      <w:r>
+        <w:t xml:space="preserve"> inspirációt meríteni. Hamar nyilvánvalóvá vált azonban, hogy a legtöbb ilyen játék erősen egyedi logikai feladványokra, sajátos környezetre és speciális interakciókra épül. Ezek egyenként jól működnek egy konkrét pályában, ugyanakkor nehezen alakíthatók át olyan általános modellé, amelyet egy generatív rendszer megbízhatóan és újrahasznosítható módon tud kezelni. Egy olyan feladványlánc például, amelyben a játékosnak egy könyvespolc adott szintjén található könyveket kell meghatározott sorrendbe rendeznie, majd ezzel egy rejtett reteszt aktiválnia, azon keresztül kulcshoz jutnia, később egy kapcsolót elérnie, végül pedig egy hibás digitális óra tükörképéből számsort kiolvasnia, teljes egészében túl specifikus ahhoz, hogy közvetlenül generikus formában lehessen reprezentálni.</w:t>
+      </w:r>
+    </w:p>
+    <w:p>
+      <w:pPr>
+        <w:pStyle w:val="Szakdolgozatbekezds"/>
+        <w:ind w:firstLine="720"/>
+      </w:pPr>
+      <w:r>
+        <w:t xml:space="preserve">Bár az ilyen összetett folyamatok egyes részletei kiemelhetők és általánosíthatók, a teljes lánc egésze már nehezen írható le egységes, </w:t>
+      </w:r>
+      <w:proofErr w:type="spellStart"/>
+      <w:r>
+        <w:t>újrafelhasználható</w:t>
+      </w:r>
+      <w:proofErr w:type="spellEnd"/>
+      <w:r>
+        <w:t xml:space="preserve"> absztrakcióként. A szabadulószobás játékok esetében gyakran elhangzik, hogy aki több hasonló játékkal játszott már, annak idővel „rááll az agya” ezekre a helyzetekre. Ez nem véletlen, hiszen a különböző szobák mögött rendszerint visszatérő logikai minták és interakciós elemek jelennek meg, még akkor is, ha ezek eltérő tematikus környezetbe vannak ágyazva. Ennek megfelelően a tervezés során az volt a célom, hogy ne teljes, konkrét feladványláncokat próbáljak általánosítani, hanem elemi szintű, generikus játékelemeket definiáljak. Ezek működése állandó marad, miközben megjelenésük, narratív szerepük és vizuális „csomagolásuk” változatos lehet. Ez a megközelítés lehetővé teszi, hogy a rendszer megőrizze a változatosság érzetét, miközben a generálás mögött mégis egy stabil, jól kezelhető modellrendszer áll.</w:t>
+      </w:r>
+    </w:p>
+    <w:p>
+      <w:pPr>
+        <w:pStyle w:val="Szakdolgozath3"/>
+      </w:pPr>
+      <w:proofErr w:type="spellStart"/>
+      <w:r>
+        <w:lastRenderedPageBreak/>
+        <w:t>Level</w:t>
+      </w:r>
+      <w:proofErr w:type="spellEnd"/>
+      <w:r>
+        <w:t xml:space="preserve"> és Wall</w:t>
+      </w:r>
+    </w:p>
+    <w:p>
+      <w:pPr>
+        <w:pStyle w:val="Szakdolgozatbekezds"/>
+      </w:pPr>
+      <w:r>
+        <w:t xml:space="preserve">A pályák reprezentációjának alapja egy egyszobás modell, amely minden esetben pontosan négy falból áll. A teljes pályát a </w:t>
+      </w:r>
+      <w:proofErr w:type="spellStart"/>
+      <w:r>
+        <w:t>Level</w:t>
+      </w:r>
+      <w:proofErr w:type="spellEnd"/>
+      <w:r>
+        <w:t xml:space="preserve"> objektum írja le, amely cím, történet és a négy Wall elem gyűjteményét tartalmazza. Minden fal önálló azonosítóval és színnel rendelkezik, továbbá külön listákban tárolja az adott falhoz tartozó interaktív objektumokat. A falszerkezethez tartozhat kijárat (</w:t>
+      </w:r>
+      <w:proofErr w:type="spellStart"/>
+      <w:r>
+        <w:t>exit</w:t>
+      </w:r>
+      <w:proofErr w:type="spellEnd"/>
+      <w:r>
+        <w:t>), felvehető tárgy (</w:t>
+      </w:r>
+      <w:proofErr w:type="spellStart"/>
+      <w:r>
+        <w:t>pickable</w:t>
+      </w:r>
+      <w:proofErr w:type="spellEnd"/>
+      <w:r>
+        <w:t>), megfigyelhető tárgy (</w:t>
+      </w:r>
+      <w:proofErr w:type="spellStart"/>
+      <w:r>
+        <w:t>inspectable</w:t>
+      </w:r>
+      <w:proofErr w:type="spellEnd"/>
+      <w:r>
+        <w:t>), konténer (</w:t>
+      </w:r>
+      <w:proofErr w:type="spellStart"/>
+      <w:r>
+        <w:t>container</w:t>
+      </w:r>
+      <w:proofErr w:type="spellEnd"/>
+      <w:r>
+        <w:t>) és mozgatható fedőelem (</w:t>
+      </w:r>
+      <w:proofErr w:type="spellStart"/>
+      <w:r>
+        <w:t>movable</w:t>
+      </w:r>
       <w:proofErr w:type="spellEnd"/>
       <w:r>
         <w:t xml:space="preserve"> </w:t>
       </w:r>
+      <w:proofErr w:type="spellStart"/>
+      <w:r>
+        <w:t>cover</w:t>
+      </w:r>
+      <w:proofErr w:type="spellEnd"/>
+      <w:r>
+        <w:t>). Ez a felosztás azért előnyös, mert a szoba minden fontos játékeleme egységes térbeli és logikai keretben kezelhető.</w:t>
+      </w:r>
+    </w:p>
+    <w:p>
+      <w:pPr>
+        <w:pStyle w:val="Szakdolgozath3"/>
+      </w:pPr>
+      <w:proofErr w:type="spellStart"/>
+      <w:r>
+        <w:t>Position</w:t>
+      </w:r>
+      <w:proofErr w:type="spellEnd"/>
+      <w:r>
+        <w:t xml:space="preserve"> </w:t>
+      </w:r>
+      <w:proofErr w:type="spellStart"/>
+      <w:r>
+        <w:t>enum</w:t>
+      </w:r>
+      <w:proofErr w:type="spellEnd"/>
     </w:p>
     <w:p>
       <w:pPr>
         <w:pStyle w:val="Szakdolgozatbekezds"/>
       </w:pPr>
       <w:r>
-        <w:t xml:space="preserve">A felhasználók hitelesítése JSON Web </w:t>
-      </w:r>
-      <w:proofErr w:type="spellStart"/>
-      <w:r>
-        <w:t>Token</w:t>
-      </w:r>
-      <w:proofErr w:type="spellEnd"/>
-      <w:r>
-        <w:t xml:space="preserve"> (JWT) alapú megoldással történik, amely RS256 algoritmust alkalmazó, nyilvános és privát kulcspáron alapuló aláírással került megvalósításra. Ez biztosítja, hogy a kliensoldali alkalmazás a bejelentkezést követően biztonságos módon férjen hozzá a védett erőforrásokhoz, miközben a szerver ellenőrizni tudja a </w:t>
-      </w:r>
-      <w:proofErr w:type="spellStart"/>
-      <w:r>
-        <w:t>tokenek</w:t>
-      </w:r>
-      <w:proofErr w:type="spellEnd"/>
-      <w:r>
-        <w:t xml:space="preserve"> hitelességét és érvényességét.</w:t>
-      </w:r>
+        <w:t>A rendszer a falakon és a padlón előre definiált pozíciókat használ. A felső falsávot a WT1-3, a középső falsávot a W1-3, az alsó falsávot a WB1-3, míg a padlószintet az F1-3 pozíciók jelölik. Ez a megoldás leegyszerűsíti a generálást, mert az AI nem folytonos koordinátarendszerben helyezi el az objektumokat, hanem jól behatárolt helyekre. Emellett bizonyos térbeli szabályok is érvényesülnek: ha egy nagy méretű objektum a padlón helyezkedik el, akkor ugyanazon fal azonos indexű középső és alsó pozíciói nem használhatók, illetve a kijáratot tartalmazó fal középső területe szintén részben fenntartott.</w:t>
+      </w:r>
+    </w:p>
+    <w:p>
+      <w:pPr>
+        <w:pStyle w:val="Szakdolgozath3"/>
+      </w:pPr>
+      <w:proofErr w:type="spellStart"/>
+      <w:r>
+        <w:t>Exit</w:t>
+      </w:r>
+      <w:proofErr w:type="spellEnd"/>
     </w:p>
     <w:p>
       <w:pPr>
         <w:pStyle w:val="Szakdolgozatbekezds"/>
       </w:pPr>
       <w:r>
-        <w:t xml:space="preserve">Bejelentkezéskor a backend egy rövid élettartamú </w:t>
-      </w:r>
-      <w:proofErr w:type="spellStart"/>
-      <w:r>
-        <w:t>access</w:t>
+        <w:t xml:space="preserve">A legfontosabb generikus játékelemek közül a kijárat kiemelt szerepet kap. Az </w:t>
+      </w:r>
+      <w:proofErr w:type="spellStart"/>
+      <w:r>
+        <w:t>Exit</w:t>
+      </w:r>
+      <w:proofErr w:type="spellEnd"/>
+      <w:r>
+        <w:t xml:space="preserve"> nem pusztán dekoráció vagy egyszerű ajtó, hanem a pálya végső célja, egyben önálló logikai egység is. Saját zárral, saját leíró adatokkal és külön </w:t>
+      </w:r>
+      <w:proofErr w:type="spellStart"/>
+      <w:r>
+        <w:t>sprite-tal</w:t>
+      </w:r>
+      <w:proofErr w:type="spellEnd"/>
+      <w:r>
+        <w:t xml:space="preserve"> rendelkezik. A generálási szabályok szerint a kijárat mindig a végső puzzle része, vagyis csak az összes többi feladvány megoldása után válhat ténylegesen használhatóvá. Ezzel biztosítható, hogy a játékos ne tudja idő előtt lezárni a pályát.</w:t>
+      </w:r>
+    </w:p>
+    <w:p>
+      <w:pPr>
+        <w:pStyle w:val="Szakdolgozath3"/>
+      </w:pPr>
+      <w:proofErr w:type="spellStart"/>
+      <w:r>
+        <w:t>Pickable</w:t>
+      </w:r>
+      <w:proofErr w:type="spellEnd"/>
+    </w:p>
+    <w:p>
+      <w:pPr>
+        <w:pStyle w:val="Szakdolgozatbekezds"/>
+      </w:pPr>
+      <w:r>
+        <w:t xml:space="preserve">A felvehető tárgyak, vagyis a </w:t>
+      </w:r>
+      <w:proofErr w:type="spellStart"/>
+      <w:r>
+        <w:t>Pickable</w:t>
+      </w:r>
+      <w:proofErr w:type="spellEnd"/>
+      <w:r>
+        <w:t xml:space="preserve"> objektumok olyan elemek, amelyeket a játékos megszerezhet és jellemzően az </w:t>
+      </w:r>
+      <w:proofErr w:type="spellStart"/>
+      <w:r>
+        <w:t>inventory-ba</w:t>
+      </w:r>
+      <w:proofErr w:type="spellEnd"/>
+      <w:r>
+        <w:t xml:space="preserve"> helyezhet. Ezek lehetnek kulcsok, eszközök, kisebb információhordozók vagy egyéb, a </w:t>
+      </w:r>
+      <w:proofErr w:type="spellStart"/>
+      <w:r>
+        <w:t>továbbhaladást</w:t>
+      </w:r>
+      <w:proofErr w:type="spellEnd"/>
+      <w:r>
+        <w:t xml:space="preserve"> szolgáló elemek. A felvehető tárgyakhoz tartozik egy </w:t>
+      </w:r>
+      <w:proofErr w:type="spellStart"/>
+      <w:r>
+        <w:t>reusable</w:t>
+      </w:r>
+      <w:proofErr w:type="spellEnd"/>
+      <w:r>
+        <w:t xml:space="preserve"> tulajdonság is, amely meghatározza, hogy az adott elem </w:t>
+      </w:r>
+      <w:r>
+        <w:lastRenderedPageBreak/>
+        <w:t xml:space="preserve">egyszer használható-e, vagy több helyzetben is szerepet kaphat. A generikus modellben ezek a tárgyak testesítik meg leginkább azokat az erőforrásokat, amelyek a puzzle-lánc későbbi pontjain </w:t>
+      </w:r>
+      <w:proofErr w:type="spellStart"/>
+      <w:r>
+        <w:t>aktivátorként</w:t>
+      </w:r>
+      <w:proofErr w:type="spellEnd"/>
+      <w:r>
+        <w:t xml:space="preserve"> vagy köztes eszközként funkcionálnak.</w:t>
+      </w:r>
+    </w:p>
+    <w:p>
+      <w:pPr>
+        <w:pStyle w:val="Szakdolgozath3"/>
+      </w:pPr>
+      <w:proofErr w:type="spellStart"/>
+      <w:r>
+        <w:t>Inspectable</w:t>
+      </w:r>
+      <w:proofErr w:type="spellEnd"/>
+    </w:p>
+    <w:p>
+      <w:pPr>
+        <w:pStyle w:val="Szakdolgozatbekezds"/>
+      </w:pPr>
+      <w:r>
+        <w:t xml:space="preserve">A </w:t>
+      </w:r>
+      <w:proofErr w:type="spellStart"/>
+      <w:r>
+        <w:t>Inspectable</w:t>
+      </w:r>
+      <w:proofErr w:type="spellEnd"/>
+      <w:r>
+        <w:t xml:space="preserve"> objektumok ezzel szemben nem felvehető, helyhez kötött elemek. Elsődleges szerepük az információközlés: vizuális nyomokat, szöveges részleteket, történeti háttérelemeket vagy rejtvényhez kapcsolódó részleges adatokat hordoznak. Ilyen objektum lehet például egy falióra, festmény, felirat, jegyzet vagy más megfigyelhető elem. Ezek a tárgyak különösen </w:t>
+      </w:r>
+      <w:proofErr w:type="spellStart"/>
+      <w:r>
+        <w:t>fontosak</w:t>
+      </w:r>
+      <w:proofErr w:type="spellEnd"/>
+      <w:r>
+        <w:t xml:space="preserve"> a rendszerben, mert a feladványok megoldásához szükséges információk jelentős része ilyen formában jelenik meg.</w:t>
+      </w:r>
+    </w:p>
+    <w:p>
+      <w:pPr>
+        <w:pStyle w:val="Szakdolgozath3"/>
+      </w:pPr>
+      <w:proofErr w:type="spellStart"/>
+      <w:r>
+        <w:t>Container</w:t>
+      </w:r>
+      <w:proofErr w:type="spellEnd"/>
+    </w:p>
+    <w:p>
+      <w:pPr>
+        <w:pStyle w:val="Szakdolgozatbekezds"/>
+      </w:pPr>
+      <w:r>
+        <w:t xml:space="preserve">A </w:t>
+      </w:r>
+      <w:proofErr w:type="spellStart"/>
+      <w:r>
+        <w:t>Container</w:t>
+      </w:r>
+      <w:proofErr w:type="spellEnd"/>
+      <w:r>
+        <w:t xml:space="preserve"> objektumok olyan tárolóelemek, amelyek egy vagy több további játékelemet rejthetnek. A konténer lehet nyitott vagy zárt, utóbbi esetben zárral is rendelkezhet. Tartalma többféle dinamikus objektumot foglalhat magában, például felvehető tárgyakat vagy további megfigyelhető elemeket. A konténer tehát egyszerre szolgálhat fizikai akadályként és információs csomópontként. Generikus szempontból különösen hasznos, mert jól modellezhetők vele azok a tipikus szabadulószobás helyzetek, amikor egy fiók, doboz, szekrény vagy széf csak egy korábbi puzzle megoldása után válik hozzáférhetővé.</w:t>
+      </w:r>
+    </w:p>
+    <w:p>
+      <w:pPr>
+        <w:pStyle w:val="Szakdolgozath3"/>
+      </w:pPr>
+      <w:proofErr w:type="spellStart"/>
+      <w:r>
+        <w:t>Movable</w:t>
       </w:r>
       <w:proofErr w:type="spellEnd"/>
       <w:r>
@@ -6594,171 +7386,122 @@
       </w:r>
       <w:proofErr w:type="spellStart"/>
       <w:r>
-        <w:t>token</w:t>
-      </w:r>
-      <w:proofErr w:type="spellEnd"/>
-      <w:r>
-        <w:t xml:space="preserve">-t és egy hosszabb élettartamú </w:t>
-      </w:r>
-      <w:proofErr w:type="spellStart"/>
-      <w:r>
-        <w:t>refresh</w:t>
+        <w:t>Cover</w:t>
+      </w:r>
+      <w:proofErr w:type="spellEnd"/>
+    </w:p>
+    <w:p>
+      <w:pPr>
+        <w:pStyle w:val="Szakdolgozatbekezds"/>
+      </w:pPr>
+      <w:r>
+        <w:t xml:space="preserve">A </w:t>
+      </w:r>
+      <w:proofErr w:type="spellStart"/>
+      <w:r>
+        <w:t>MovableCover</w:t>
+      </w:r>
+      <w:proofErr w:type="spellEnd"/>
+      <w:r>
+        <w:t>, azaz mozgatható fedőelem olyan objektum, amely pontosan egy másik interaktív elemet takar el. Ez lehet például egy szőnyeg, poszter, képkeret vagy laza padlólap, amely mögött egy kulcs, egy felirat vagy akár egy teljes konténer is rejtőzhet. A mozgatható fedőelem fontos sajátossága, hogy nem egyszerű tárolóként működik, hanem egy rejtési mechanizmust valósít meg. Ez a kategória alkalmas arra, hogy a klasszikus „valami mögött van elrejtve” típusú játékhelyzeteket egységes formában reprezentálja.</w:t>
+      </w:r>
+    </w:p>
+    <w:p>
+      <w:pPr>
+        <w:pStyle w:val="Szakdolgozath3"/>
+      </w:pPr>
+      <w:proofErr w:type="spellStart"/>
+      <w:r>
+        <w:t>Lock</w:t>
       </w:r>
       <w:proofErr w:type="spellEnd"/>
       <w:r>
         <w:t xml:space="preserve"> </w:t>
       </w:r>
-      <w:proofErr w:type="spellStart"/>
-      <w:r>
-        <w:t>token</w:t>
-      </w:r>
-      <w:proofErr w:type="spellEnd"/>
-      <w:r>
-        <w:t xml:space="preserve">-t ad vissza. Az </w:t>
-      </w:r>
-      <w:proofErr w:type="spellStart"/>
-      <w:r>
-        <w:t>access</w:t>
-      </w:r>
-      <w:proofErr w:type="spellEnd"/>
-      <w:r>
-        <w:t xml:space="preserve"> </w:t>
-      </w:r>
-      <w:proofErr w:type="spellStart"/>
-      <w:r>
-        <w:t>token</w:t>
-      </w:r>
-      <w:proofErr w:type="spellEnd"/>
-      <w:r>
-        <w:t xml:space="preserve"> szolgál a védett végpontok elérésére, míg a </w:t>
-      </w:r>
-      <w:proofErr w:type="spellStart"/>
-      <w:r>
-        <w:t>refresh</w:t>
-      </w:r>
-      <w:proofErr w:type="spellEnd"/>
-      <w:r>
-        <w:t xml:space="preserve"> </w:t>
-      </w:r>
-      <w:proofErr w:type="spellStart"/>
-      <w:r>
-        <w:t>token</w:t>
-      </w:r>
-      <w:proofErr w:type="spellEnd"/>
-      <w:r>
-        <w:t xml:space="preserve"> segítségével a kliens új </w:t>
-      </w:r>
-      <w:proofErr w:type="spellStart"/>
-      <w:r>
-        <w:t>tokenpárt</w:t>
-      </w:r>
-      <w:proofErr w:type="spellEnd"/>
-      <w:r>
-        <w:t xml:space="preserve"> kérhet anélkül, hogy a felhasználónak újra be kellene jelentkeznie. A frontend a </w:t>
-      </w:r>
-      <w:proofErr w:type="spellStart"/>
-      <w:r>
-        <w:t>tokeneket</w:t>
-      </w:r>
-      <w:proofErr w:type="spellEnd"/>
-      <w:r>
-        <w:t xml:space="preserve"> kliensoldalon tárolja, és minden védett API-hívásnál </w:t>
-      </w:r>
-      <w:proofErr w:type="spellStart"/>
-      <w:r>
-        <w:t>Bearer</w:t>
-      </w:r>
-      <w:proofErr w:type="spellEnd"/>
-      <w:r>
-        <w:t xml:space="preserve"> tokenként küldi az </w:t>
-      </w:r>
-      <w:proofErr w:type="spellStart"/>
-      <w:r>
-        <w:t>Authorization</w:t>
-      </w:r>
-      <w:proofErr w:type="spellEnd"/>
-      <w:r>
-        <w:t xml:space="preserve"> fejlécben. A backend minden védett kérésnél ellenőrzi a </w:t>
-      </w:r>
-      <w:proofErr w:type="spellStart"/>
-      <w:r>
-        <w:t>token</w:t>
-      </w:r>
-      <w:proofErr w:type="spellEnd"/>
-      <w:r>
-        <w:t xml:space="preserve"> típusát, lejáratát, valamint a benne szereplő felhasználói azonosítót. A jelenlegi működés előnye, hogy jól elkülöníti a hitelesítési réteget az üzleti logikától, és a </w:t>
-      </w:r>
-      <w:proofErr w:type="spellStart"/>
-      <w:r>
-        <w:t>refresh</w:t>
-      </w:r>
-      <w:proofErr w:type="spellEnd"/>
-      <w:r>
-        <w:t xml:space="preserve"> mechanizmus kényelmesebb felhasználói élményt biztosít. Architektúra szinten fontos még, hogy a </w:t>
-      </w:r>
-      <w:proofErr w:type="spellStart"/>
-      <w:r>
-        <w:t>refresh</w:t>
-      </w:r>
-      <w:proofErr w:type="spellEnd"/>
-      <w:r>
-        <w:t xml:space="preserve"> </w:t>
-      </w:r>
-      <w:proofErr w:type="spellStart"/>
-      <w:r>
-        <w:t>tokenek</w:t>
-      </w:r>
-      <w:proofErr w:type="spellEnd"/>
-      <w:r>
-        <w:t xml:space="preserve"> adatbázisban is nyilvántartásra kerülnek, így visszavonhatók, ami biztonsági szempontból kedvezőbb, mint a teljesen </w:t>
-      </w:r>
-      <w:proofErr w:type="spellStart"/>
-      <w:r>
-        <w:t>stateless</w:t>
-      </w:r>
-      <w:proofErr w:type="spellEnd"/>
-      <w:r>
-        <w:t xml:space="preserve"> megközelítés.</w:t>
-      </w:r>
-    </w:p>
-    <w:p>
-      <w:pPr>
-        <w:spacing w:line="360" w:lineRule="auto"/>
-        <w:jc w:val="both"/>
-        <w:rPr>
-          <w:rFonts w:ascii="Times New Roman" w:hAnsi="Times New Roman" w:cs="Times New Roman"/>
-          <w:sz w:val="24"/>
-          <w:szCs w:val="24"/>
-        </w:rPr>
-      </w:pPr>
-    </w:p>
-    <w:p>
-      <w:pPr>
-        <w:rPr>
-          <w:rFonts w:ascii="Times New Roman" w:hAnsi="Times New Roman" w:cs="Times New Roman"/>
-          <w:sz w:val="24"/>
-          <w:szCs w:val="24"/>
-        </w:rPr>
-      </w:pPr>
-      <w:r>
-        <w:rPr>
-          <w:rFonts w:ascii="Times New Roman" w:hAnsi="Times New Roman" w:cs="Times New Roman"/>
-          <w:sz w:val="24"/>
-          <w:szCs w:val="24"/>
-        </w:rPr>
+    </w:p>
+    <w:p>
+      <w:pPr>
+        <w:pStyle w:val="Szakdolgozatbekezds"/>
+      </w:pPr>
+      <w:r>
+        <w:t>Ezeket a</w:t>
+      </w:r>
+      <w:r>
+        <w:t xml:space="preserve"> játék </w:t>
+      </w:r>
+      <w:r>
+        <w:t xml:space="preserve">elemeket a rendszer közös absztrakciókon keresztül fogja össze. Az egyik ilyen a </w:t>
+      </w:r>
+      <w:proofErr w:type="spellStart"/>
+      <w:r>
+        <w:t>Lock</w:t>
+      </w:r>
+      <w:proofErr w:type="spellEnd"/>
+      <w:r>
+        <w:t xml:space="preserve">, vagyis a zár, amely különböző objektumokhoz, például konténerekhez vagy a </w:t>
+      </w:r>
+      <w:r>
+        <w:lastRenderedPageBreak/>
+        <w:t xml:space="preserve">kijárathoz kapcsolható. A zár típusa határozza meg, hogy a hozzáférés milyen </w:t>
+      </w:r>
+      <w:proofErr w:type="spellStart"/>
+      <w:r>
+        <w:t>aktivátorral</w:t>
+      </w:r>
+      <w:proofErr w:type="spellEnd"/>
+      <w:r>
+        <w:t xml:space="preserve"> történik: ez lehet kulcsazonosító, csak számjegyekből álló kód, csak betűkből álló kód vagy összetett jelszó. A </w:t>
+      </w:r>
+      <w:proofErr w:type="spellStart"/>
+      <w:r>
+        <w:t>Lock</w:t>
+      </w:r>
+      <w:proofErr w:type="spellEnd"/>
+      <w:r>
+        <w:t xml:space="preserve"> így nem egy konkrét vizuális tárgyat, hanem egy általános hozzáférés-szabályozó mechanizmust jelent.</w:t>
+      </w:r>
+    </w:p>
+    <w:p>
+      <w:pPr>
+        <w:pStyle w:val="Szakdolgozath3"/>
+      </w:pPr>
+      <w:proofErr w:type="spellStart"/>
+      <w:r>
+        <w:t>Inspection</w:t>
+      </w:r>
+      <w:proofErr w:type="spellEnd"/>
+      <w:r>
+        <w:t xml:space="preserve"> Data</w:t>
+      </w:r>
+    </w:p>
+    <w:p>
+      <w:pPr>
+        <w:pStyle w:val="Szakdolgozatbekezds"/>
+      </w:pPr>
+      <w:r>
+        <w:t xml:space="preserve">A másik központi absztrakció az </w:t>
+      </w:r>
+      <w:proofErr w:type="spellStart"/>
+      <w:r>
+        <w:t>InspectionData</w:t>
+      </w:r>
+      <w:proofErr w:type="spellEnd"/>
+      <w:r>
+        <w:t xml:space="preserve">, amely gyakorlatilag minden fontos játékelemhez kapcsolódik. Két mezőt tartalmaz: egy megnevezést és egy részletesebb információs leírást. Ez az adatstruktúra azért lényeges, mert egyszerre szolgál játéklogikai és prezentációs célokat. Egyrészt ebből kap a játékos szöveges információt az objektumról, másrészt ugyanez az adat ad alapot az objektumok képi reprezentációjának generálásához is. Vagyis az </w:t>
+      </w:r>
+      <w:proofErr w:type="spellStart"/>
+      <w:r>
+        <w:t>InspectionData</w:t>
+      </w:r>
+      <w:proofErr w:type="spellEnd"/>
+      <w:r>
+        <w:t xml:space="preserve"> hidat képez a játékmenet, a narratíva és a vizuális megjelenítés között.</w:t>
+      </w:r>
+      <w:r>
         <w:br w:type="page"/>
       </w:r>
     </w:p>
-    <w:p>
-      <w:pPr>
-        <w:rPr>
-          <w:rFonts w:ascii="Times New Roman" w:hAnsi="Times New Roman" w:cs="Times New Roman"/>
-          <w:sz w:val="24"/>
-          <w:szCs w:val="24"/>
-        </w:rPr>
-      </w:pPr>
-    </w:p>
-    <w:bookmarkStart w:id="24" w:name="_Toc225505744" w:displacedByCustomXml="next"/>
+    <w:bookmarkStart w:id="26" w:name="_Toc225520379" w:displacedByCustomXml="next"/>
     <w:sdt>
       <w:sdtPr>
         <w:rPr>
@@ -6784,7 +7527,7 @@
           <w:r>
             <w:t>Irodalomjegyzék</w:t>
           </w:r>
-          <w:bookmarkEnd w:id="24"/>
+          <w:bookmarkEnd w:id="26"/>
         </w:p>
         <w:sdt>
           <w:sdtPr>
@@ -7736,12 +8479,12 @@
       <w:pPr>
         <w:pStyle w:val="szmozatlanSzakdolgozath1"/>
       </w:pPr>
-      <w:bookmarkStart w:id="25" w:name="_Toc225505745"/>
+      <w:bookmarkStart w:id="27" w:name="_Toc225520380"/>
       <w:r>
         <w:lastRenderedPageBreak/>
         <w:t>Nyilatkozat</w:t>
       </w:r>
-      <w:bookmarkEnd w:id="25"/>
+      <w:bookmarkEnd w:id="27"/>
     </w:p>
     <w:p>
       <w:pPr>
@@ -7849,25 +8592,25 @@
       <w:pPr>
         <w:pStyle w:val="szmozatlanSzakdolgozath1"/>
       </w:pPr>
-      <w:bookmarkStart w:id="26" w:name="_Toc225505746"/>
+      <w:bookmarkStart w:id="28" w:name="_Toc225520381"/>
       <w:r>
         <w:lastRenderedPageBreak/>
         <w:t>Mellékletek</w:t>
       </w:r>
-      <w:bookmarkEnd w:id="26"/>
+      <w:bookmarkEnd w:id="28"/>
     </w:p>
     <w:p>
       <w:pPr>
         <w:pStyle w:val="Szakdolgozath2"/>
       </w:pPr>
-      <w:bookmarkStart w:id="27" w:name="_Toc225505747"/>
+      <w:bookmarkStart w:id="29" w:name="_Toc225520382"/>
       <w:r>
         <w:t>Adatbázis</w:t>
       </w:r>
       <w:r>
         <w:t xml:space="preserve"> relációk</w:t>
       </w:r>
-      <w:bookmarkEnd w:id="27"/>
+      <w:bookmarkEnd w:id="29"/>
     </w:p>
     <w:p>
       <w:pPr>
@@ -8984,6 +9727,7 @@
   <w:style w:type="character" w:default="1" w:styleId="DefaultParagraphFont">
     <w:name w:val="Default Paragraph Font"/>
     <w:uiPriority w:val="1"/>
+    <w:semiHidden/>
     <w:unhideWhenUsed/>
   </w:style>
   <w:style w:type="table" w:default="1" w:styleId="TableNormal">
@@ -10238,18 +10982,58 @@
     <b:RefOrder>20</b:RefOrder>
   </b:Source>
   <b:Source>
+    <b:Tag>Sze</b:Tag>
+    <b:SourceType>InternetSite</b:SourceType>
+    <b:Guid>{5C5B9D44-C4FC-462A-9FC1-B46BE647B329}</b:Guid>
+    <b:Title>Hauntedhouse Szabaduló szoba weboldala</b:Title>
+    <b:URL>https://hauntedhouse.hu/</b:URL>
+    <b:RefOrder>23</b:RefOrder>
+  </b:Source>
+  <b:Source>
+    <b:Tag>exitgame</b:Tag>
+    <b:SourceType>InternetSite</b:SourceType>
+    <b:Guid>{0B12899C-694F-4191-819E-D83BB49A2F3D}</b:Guid>
+    <b:Title>Exit Szaabduló szoba weboldala</b:Title>
+    <b:URL>https://www.exitgame.hu/</b:URL>
+    <b:RefOrder>22</b:RefOrder>
+  </b:Source>
+  <b:Source>
+    <b:Tag>Cod</b:Tag>
+    <b:SourceType>InternetSite</b:SourceType>
+    <b:Guid>{DD0B38D9-A2E6-489C-9084-B127B64A88F7}</b:Guid>
+    <b:Title>CodeGame Szabaduló szoba weboldala</b:Title>
+    <b:URL>https://www.codegame.hu/</b:URL>
+    <b:RefOrder>24</b:RefOrder>
+  </b:Source>
+  <b:Source>
     <b:Tag>AWS_S3</b:Tag>
     <b:SourceType>InternetSite</b:SourceType>
-    <b:Guid>{BAEB1C79-52E5-4B82-9CD4-D678367FC3FC}</b:Guid>
-    <b:Title>Amazon Web Service S+ Storage Dokumentáció</b:Title>
+    <b:Guid>{975C721E-9A79-44EF-AC26-063592D6C765}</b:Guid>
+    <b:Title>Amazon Web Service S3 Storage Dokumentáció</b:Title>
     <b:URL>https://docs.aws.amazon.com/AmazonS3/latest/userguide/Welcome.html</b:URL>
     <b:RefOrder>21</b:RefOrder>
+  </b:Source>
+  <b:Source>
+    <b:Tag>Rus</b:Tag>
+    <b:SourceType>InternetSite</b:SourceType>
+    <b:Guid>{83E88005-A1CA-4307-8215-206ECF581500}</b:Guid>
+    <b:Title>Rusty Lake weboldala</b:Title>
+    <b:URL>https://www.rustylake.com/</b:URL>
+    <b:RefOrder>25</b:RefOrder>
+  </b:Source>
+  <b:Source>
+    <b:Tag>Esc</b:Tag>
+    <b:SourceType>InternetSite</b:SourceType>
+    <b:Guid>{D76D941F-1C62-46A4-BE8F-633D495E7560}</b:Guid>
+    <b:Title>Escape Simulator weboldala</b:Title>
+    <b:URL>https://pinestudio.com/games/escape-simulator/</b:URL>
+    <b:RefOrder>26</b:RefOrder>
   </b:Source>
 </b:Sources>
 </file>
 
 <file path=customXml/itemProps1.xml><?xml version="1.0" encoding="utf-8"?>
-<ds:datastoreItem xmlns:ds="http://schemas.openxmlformats.org/officeDocument/2006/customXml" ds:itemID="{1953A271-5F77-4C9C-AC26-D3533B5FDC33}">
+<ds:datastoreItem xmlns:ds="http://schemas.openxmlformats.org/officeDocument/2006/customXml" ds:itemID="{4F2AD012-3EFF-4271-8379-4173B730AF8D}">
   <ds:schemaRefs>
     <ds:schemaRef ds:uri="http://schemas.openxmlformats.org/officeDocument/2006/bibliography"/>
   </ds:schemaRefs>

</xml_diff>

<commit_message>
feat(szakdolgozat): pálya generálása - Gráf alapú pálya struktúra definiálása
</commit_message>
<xml_diff>
--- a/Szakdolgozat.docx
+++ b/Szakdolgozat.docx
@@ -529,7 +529,7 @@
       <w:pPr>
         <w:pStyle w:val="szmozatlanSzakdolgozath1"/>
       </w:pPr>
-      <w:bookmarkStart w:id="0" w:name="_Toc225520361"/>
+      <w:bookmarkStart w:id="0" w:name="_Toc225527477"/>
       <w:r>
         <w:lastRenderedPageBreak/>
         <w:t>Feladatkiírás</w:t>
@@ -765,7 +765,7 @@
       <w:pPr>
         <w:pStyle w:val="szmozatlanSzakdolgozath1"/>
       </w:pPr>
-      <w:bookmarkStart w:id="1" w:name="_Toc225520362"/>
+      <w:bookmarkStart w:id="1" w:name="_Toc225527478"/>
       <w:r>
         <w:lastRenderedPageBreak/>
         <w:t>Tartalomjegyzék</w:t>
@@ -828,7 +828,7 @@
           <w:r>
             <w:fldChar w:fldCharType="separate"/>
           </w:r>
-          <w:hyperlink w:anchor="_Toc225520361" w:history="1">
+          <w:hyperlink w:anchor="_Toc225527477" w:history="1">
             <w:r>
               <w:rPr>
                 <w:rStyle w:val="Hyperlink"/>
@@ -855,7 +855,7 @@
                 <w:noProof/>
                 <w:webHidden/>
               </w:rPr>
-              <w:instrText xml:space="preserve"> PAGEREF _Toc225520361 \h </w:instrText>
+              <w:instrText xml:space="preserve"> PAGEREF _Toc225527477 \h </w:instrText>
             </w:r>
             <w:r>
               <w:rPr>
@@ -900,7 +900,7 @@
               <w:lang w:val="en-US"/>
             </w:rPr>
           </w:pPr>
-          <w:hyperlink w:anchor="_Toc225520362" w:history="1">
+          <w:hyperlink w:anchor="_Toc225527478" w:history="1">
             <w:r>
               <w:rPr>
                 <w:rStyle w:val="Hyperlink"/>
@@ -927,7 +927,7 @@
                 <w:noProof/>
                 <w:webHidden/>
               </w:rPr>
-              <w:instrText xml:space="preserve"> PAGEREF _Toc225520362 \h </w:instrText>
+              <w:instrText xml:space="preserve"> PAGEREF _Toc225527478 \h </w:instrText>
             </w:r>
             <w:r>
               <w:rPr>
@@ -973,7 +973,7 @@
               <w:lang w:val="en-US"/>
             </w:rPr>
           </w:pPr>
-          <w:hyperlink w:anchor="_Toc225520363" w:history="1">
+          <w:hyperlink w:anchor="_Toc225527479" w:history="1">
             <w:r>
               <w:rPr>
                 <w:rStyle w:val="Hyperlink"/>
@@ -1018,7 +1018,7 @@
                 <w:noProof/>
                 <w:webHidden/>
               </w:rPr>
-              <w:instrText xml:space="preserve"> PAGEREF _Toc225520363 \h </w:instrText>
+              <w:instrText xml:space="preserve"> PAGEREF _Toc225527479 \h </w:instrText>
             </w:r>
             <w:r>
               <w:rPr>
@@ -1064,7 +1064,7 @@
               <w:lang w:val="en-US"/>
             </w:rPr>
           </w:pPr>
-          <w:hyperlink w:anchor="_Toc225520364" w:history="1">
+          <w:hyperlink w:anchor="_Toc225527480" w:history="1">
             <w:r>
               <w:rPr>
                 <w:rStyle w:val="Hyperlink"/>
@@ -1108,7 +1108,7 @@
                 <w:noProof/>
                 <w:webHidden/>
               </w:rPr>
-              <w:instrText xml:space="preserve"> PAGEREF _Toc225520364 \h </w:instrText>
+              <w:instrText xml:space="preserve"> PAGEREF _Toc225527480 \h </w:instrText>
             </w:r>
             <w:r>
               <w:rPr>
@@ -1154,7 +1154,7 @@
               <w:lang w:val="en-US"/>
             </w:rPr>
           </w:pPr>
-          <w:hyperlink w:anchor="_Toc225520365" w:history="1">
+          <w:hyperlink w:anchor="_Toc225527481" w:history="1">
             <w:r>
               <w:rPr>
                 <w:rStyle w:val="Hyperlink"/>
@@ -1198,7 +1198,7 @@
                 <w:noProof/>
                 <w:webHidden/>
               </w:rPr>
-              <w:instrText xml:space="preserve"> PAGEREF _Toc225520365 \h </w:instrText>
+              <w:instrText xml:space="preserve"> PAGEREF _Toc225527481 \h </w:instrText>
             </w:r>
             <w:r>
               <w:rPr>
@@ -1244,7 +1244,7 @@
               <w:lang w:val="en-US"/>
             </w:rPr>
           </w:pPr>
-          <w:hyperlink w:anchor="_Toc225520366" w:history="1">
+          <w:hyperlink w:anchor="_Toc225527482" w:history="1">
             <w:r>
               <w:rPr>
                 <w:rStyle w:val="Hyperlink"/>
@@ -1288,7 +1288,7 @@
                 <w:noProof/>
                 <w:webHidden/>
               </w:rPr>
-              <w:instrText xml:space="preserve"> PAGEREF _Toc225520366 \h </w:instrText>
+              <w:instrText xml:space="preserve"> PAGEREF _Toc225527482 \h </w:instrText>
             </w:r>
             <w:r>
               <w:rPr>
@@ -1334,7 +1334,7 @@
               <w:lang w:val="en-US"/>
             </w:rPr>
           </w:pPr>
-          <w:hyperlink w:anchor="_Toc225520367" w:history="1">
+          <w:hyperlink w:anchor="_Toc225527483" w:history="1">
             <w:r>
               <w:rPr>
                 <w:rStyle w:val="Hyperlink"/>
@@ -1378,7 +1378,7 @@
                 <w:noProof/>
                 <w:webHidden/>
               </w:rPr>
-              <w:instrText xml:space="preserve"> PAGEREF _Toc225520367 \h </w:instrText>
+              <w:instrText xml:space="preserve"> PAGEREF _Toc225527483 \h </w:instrText>
             </w:r>
             <w:r>
               <w:rPr>
@@ -1424,7 +1424,7 @@
               <w:lang w:val="en-US"/>
             </w:rPr>
           </w:pPr>
-          <w:hyperlink w:anchor="_Toc225520368" w:history="1">
+          <w:hyperlink w:anchor="_Toc225527484" w:history="1">
             <w:r>
               <w:rPr>
                 <w:rStyle w:val="Hyperlink"/>
@@ -1468,7 +1468,7 @@
                 <w:noProof/>
                 <w:webHidden/>
               </w:rPr>
-              <w:instrText xml:space="preserve"> PAGEREF _Toc225520368 \h </w:instrText>
+              <w:instrText xml:space="preserve"> PAGEREF _Toc225527484 \h </w:instrText>
             </w:r>
             <w:r>
               <w:rPr>
@@ -1514,7 +1514,7 @@
               <w:lang w:val="en-US"/>
             </w:rPr>
           </w:pPr>
-          <w:hyperlink w:anchor="_Toc225520369" w:history="1">
+          <w:hyperlink w:anchor="_Toc225527485" w:history="1">
             <w:r>
               <w:rPr>
                 <w:rStyle w:val="Hyperlink"/>
@@ -1558,7 +1558,7 @@
                 <w:noProof/>
                 <w:webHidden/>
               </w:rPr>
-              <w:instrText xml:space="preserve"> PAGEREF _Toc225520369 \h </w:instrText>
+              <w:instrText xml:space="preserve"> PAGEREF _Toc225527485 \h </w:instrText>
             </w:r>
             <w:r>
               <w:rPr>
@@ -1604,7 +1604,7 @@
               <w:lang w:val="en-US"/>
             </w:rPr>
           </w:pPr>
-          <w:hyperlink w:anchor="_Toc225520370" w:history="1">
+          <w:hyperlink w:anchor="_Toc225527486" w:history="1">
             <w:r>
               <w:rPr>
                 <w:rStyle w:val="Hyperlink"/>
@@ -1648,7 +1648,7 @@
                 <w:noProof/>
                 <w:webHidden/>
               </w:rPr>
-              <w:instrText xml:space="preserve"> PAGEREF _Toc225520370 \h </w:instrText>
+              <w:instrText xml:space="preserve"> PAGEREF _Toc225527486 \h </w:instrText>
             </w:r>
             <w:r>
               <w:rPr>
@@ -1694,7 +1694,7 @@
               <w:lang w:val="en-US"/>
             </w:rPr>
           </w:pPr>
-          <w:hyperlink w:anchor="_Toc225520371" w:history="1">
+          <w:hyperlink w:anchor="_Toc225527487" w:history="1">
             <w:r>
               <w:rPr>
                 <w:rStyle w:val="Hyperlink"/>
@@ -1738,7 +1738,7 @@
                 <w:noProof/>
                 <w:webHidden/>
               </w:rPr>
-              <w:instrText xml:space="preserve"> PAGEREF _Toc225520371 \h </w:instrText>
+              <w:instrText xml:space="preserve"> PAGEREF _Toc225527487 \h </w:instrText>
             </w:r>
             <w:r>
               <w:rPr>
@@ -1784,7 +1784,7 @@
               <w:lang w:val="en-US"/>
             </w:rPr>
           </w:pPr>
-          <w:hyperlink w:anchor="_Toc225520372" w:history="1">
+          <w:hyperlink w:anchor="_Toc225527488" w:history="1">
             <w:r>
               <w:rPr>
                 <w:rStyle w:val="Hyperlink"/>
@@ -1828,7 +1828,7 @@
                 <w:noProof/>
                 <w:webHidden/>
               </w:rPr>
-              <w:instrText xml:space="preserve"> PAGEREF _Toc225520372 \h </w:instrText>
+              <w:instrText xml:space="preserve"> PAGEREF _Toc225527488 \h </w:instrText>
             </w:r>
             <w:r>
               <w:rPr>
@@ -1874,7 +1874,7 @@
               <w:lang w:val="en-US"/>
             </w:rPr>
           </w:pPr>
-          <w:hyperlink w:anchor="_Toc225520373" w:history="1">
+          <w:hyperlink w:anchor="_Toc225527489" w:history="1">
             <w:r>
               <w:rPr>
                 <w:rStyle w:val="Hyperlink"/>
@@ -1918,7 +1918,7 @@
                 <w:noProof/>
                 <w:webHidden/>
               </w:rPr>
-              <w:instrText xml:space="preserve"> PAGEREF _Toc225520373 \h </w:instrText>
+              <w:instrText xml:space="preserve"> PAGEREF _Toc225527489 \h </w:instrText>
             </w:r>
             <w:r>
               <w:rPr>
@@ -1964,7 +1964,7 @@
               <w:lang w:val="en-US"/>
             </w:rPr>
           </w:pPr>
-          <w:hyperlink w:anchor="_Toc225520374" w:history="1">
+          <w:hyperlink w:anchor="_Toc225527490" w:history="1">
             <w:r>
               <w:rPr>
                 <w:rStyle w:val="Hyperlink"/>
@@ -2008,7 +2008,7 @@
                 <w:noProof/>
                 <w:webHidden/>
               </w:rPr>
-              <w:instrText xml:space="preserve"> PAGEREF _Toc225520374 \h </w:instrText>
+              <w:instrText xml:space="preserve"> PAGEREF _Toc225527490 \h </w:instrText>
             </w:r>
             <w:r>
               <w:rPr>
@@ -2054,7 +2054,7 @@
               <w:lang w:val="en-US"/>
             </w:rPr>
           </w:pPr>
-          <w:hyperlink w:anchor="_Toc225520375" w:history="1">
+          <w:hyperlink w:anchor="_Toc225527491" w:history="1">
             <w:r>
               <w:rPr>
                 <w:rStyle w:val="Hyperlink"/>
@@ -2098,7 +2098,7 @@
                 <w:noProof/>
                 <w:webHidden/>
               </w:rPr>
-              <w:instrText xml:space="preserve"> PAGEREF _Toc225520375 \h </w:instrText>
+              <w:instrText xml:space="preserve"> PAGEREF _Toc225527491 \h </w:instrText>
             </w:r>
             <w:r>
               <w:rPr>
@@ -2144,7 +2144,7 @@
               <w:lang w:val="en-US"/>
             </w:rPr>
           </w:pPr>
-          <w:hyperlink w:anchor="_Toc225520376" w:history="1">
+          <w:hyperlink w:anchor="_Toc225527492" w:history="1">
             <w:r>
               <w:rPr>
                 <w:rStyle w:val="Hyperlink"/>
@@ -2188,7 +2188,7 @@
                 <w:noProof/>
                 <w:webHidden/>
               </w:rPr>
-              <w:instrText xml:space="preserve"> PAGEREF _Toc225520376 \h </w:instrText>
+              <w:instrText xml:space="preserve"> PAGEREF _Toc225527492 \h </w:instrText>
             </w:r>
             <w:r>
               <w:rPr>
@@ -2234,7 +2234,7 @@
               <w:lang w:val="en-US"/>
             </w:rPr>
           </w:pPr>
-          <w:hyperlink w:anchor="_Toc225520377" w:history="1">
+          <w:hyperlink w:anchor="_Toc225527493" w:history="1">
             <w:r>
               <w:rPr>
                 <w:rStyle w:val="Hyperlink"/>
@@ -2278,7 +2278,7 @@
                 <w:noProof/>
                 <w:webHidden/>
               </w:rPr>
-              <w:instrText xml:space="preserve"> PAGEREF _Toc225520377 \h </w:instrText>
+              <w:instrText xml:space="preserve"> PAGEREF _Toc225527493 \h </w:instrText>
             </w:r>
             <w:r>
               <w:rPr>
@@ -2324,7 +2324,7 @@
               <w:lang w:val="en-US"/>
             </w:rPr>
           </w:pPr>
-          <w:hyperlink w:anchor="_Toc225520378" w:history="1">
+          <w:hyperlink w:anchor="_Toc225527494" w:history="1">
             <w:r>
               <w:rPr>
                 <w:rStyle w:val="Hyperlink"/>
@@ -2368,7 +2368,7 @@
                 <w:noProof/>
                 <w:webHidden/>
               </w:rPr>
-              <w:instrText xml:space="preserve"> PAGEREF _Toc225520378 \h </w:instrText>
+              <w:instrText xml:space="preserve"> PAGEREF _Toc225527494 \h </w:instrText>
             </w:r>
             <w:r>
               <w:rPr>
@@ -2389,222 +2389,6 @@
                 <w:webHidden/>
               </w:rPr>
               <w:t>14</w:t>
-            </w:r>
-            <w:r>
-              <w:rPr>
-                <w:noProof/>
-                <w:webHidden/>
-              </w:rPr>
-              <w:fldChar w:fldCharType="end"/>
-            </w:r>
-          </w:hyperlink>
-        </w:p>
-        <w:p>
-          <w:pPr>
-            <w:pStyle w:val="TOC1"/>
-            <w:tabs>
-              <w:tab w:val="right" w:leader="dot" w:pos="8827"/>
-            </w:tabs>
-            <w:rPr>
-              <w:rFonts w:eastAsiaTheme="minorEastAsia"/>
-              <w:noProof/>
-              <w:sz w:val="24"/>
-              <w:szCs w:val="24"/>
-              <w:lang w:val="en-US"/>
-            </w:rPr>
-          </w:pPr>
-          <w:hyperlink w:anchor="_Toc225520379" w:history="1">
-            <w:r>
-              <w:rPr>
-                <w:rStyle w:val="Hyperlink"/>
-                <w:noProof/>
-              </w:rPr>
-              <w:t>Irodalomjegyzék</w:t>
-            </w:r>
-            <w:r>
-              <w:rPr>
-                <w:noProof/>
-                <w:webHidden/>
-              </w:rPr>
-              <w:tab/>
-            </w:r>
-            <w:r>
-              <w:rPr>
-                <w:noProof/>
-                <w:webHidden/>
-              </w:rPr>
-              <w:fldChar w:fldCharType="begin"/>
-            </w:r>
-            <w:r>
-              <w:rPr>
-                <w:noProof/>
-                <w:webHidden/>
-              </w:rPr>
-              <w:instrText xml:space="preserve"> PAGEREF _Toc225520379 \h </w:instrText>
-            </w:r>
-            <w:r>
-              <w:rPr>
-                <w:noProof/>
-                <w:webHidden/>
-              </w:rPr>
-            </w:r>
-            <w:r>
-              <w:rPr>
-                <w:noProof/>
-                <w:webHidden/>
-              </w:rPr>
-              <w:fldChar w:fldCharType="separate"/>
-            </w:r>
-            <w:r>
-              <w:rPr>
-                <w:noProof/>
-                <w:webHidden/>
-              </w:rPr>
-              <w:t>18</w:t>
-            </w:r>
-            <w:r>
-              <w:rPr>
-                <w:noProof/>
-                <w:webHidden/>
-              </w:rPr>
-              <w:fldChar w:fldCharType="end"/>
-            </w:r>
-          </w:hyperlink>
-        </w:p>
-        <w:p>
-          <w:pPr>
-            <w:pStyle w:val="TOC1"/>
-            <w:tabs>
-              <w:tab w:val="right" w:leader="dot" w:pos="8827"/>
-            </w:tabs>
-            <w:rPr>
-              <w:rFonts w:eastAsiaTheme="minorEastAsia"/>
-              <w:noProof/>
-              <w:sz w:val="24"/>
-              <w:szCs w:val="24"/>
-              <w:lang w:val="en-US"/>
-            </w:rPr>
-          </w:pPr>
-          <w:hyperlink w:anchor="_Toc225520380" w:history="1">
-            <w:r>
-              <w:rPr>
-                <w:rStyle w:val="Hyperlink"/>
-                <w:noProof/>
-              </w:rPr>
-              <w:t>Nyilatkozat</w:t>
-            </w:r>
-            <w:r>
-              <w:rPr>
-                <w:noProof/>
-                <w:webHidden/>
-              </w:rPr>
-              <w:tab/>
-            </w:r>
-            <w:r>
-              <w:rPr>
-                <w:noProof/>
-                <w:webHidden/>
-              </w:rPr>
-              <w:fldChar w:fldCharType="begin"/>
-            </w:r>
-            <w:r>
-              <w:rPr>
-                <w:noProof/>
-                <w:webHidden/>
-              </w:rPr>
-              <w:instrText xml:space="preserve"> PAGEREF _Toc225520380 \h </w:instrText>
-            </w:r>
-            <w:r>
-              <w:rPr>
-                <w:noProof/>
-                <w:webHidden/>
-              </w:rPr>
-            </w:r>
-            <w:r>
-              <w:rPr>
-                <w:noProof/>
-                <w:webHidden/>
-              </w:rPr>
-              <w:fldChar w:fldCharType="separate"/>
-            </w:r>
-            <w:r>
-              <w:rPr>
-                <w:noProof/>
-                <w:webHidden/>
-              </w:rPr>
-              <w:t>19</w:t>
-            </w:r>
-            <w:r>
-              <w:rPr>
-                <w:noProof/>
-                <w:webHidden/>
-              </w:rPr>
-              <w:fldChar w:fldCharType="end"/>
-            </w:r>
-          </w:hyperlink>
-        </w:p>
-        <w:p>
-          <w:pPr>
-            <w:pStyle w:val="TOC1"/>
-            <w:tabs>
-              <w:tab w:val="right" w:leader="dot" w:pos="8827"/>
-            </w:tabs>
-            <w:rPr>
-              <w:rFonts w:eastAsiaTheme="minorEastAsia"/>
-              <w:noProof/>
-              <w:sz w:val="24"/>
-              <w:szCs w:val="24"/>
-              <w:lang w:val="en-US"/>
-            </w:rPr>
-          </w:pPr>
-          <w:hyperlink w:anchor="_Toc225520381" w:history="1">
-            <w:r>
-              <w:rPr>
-                <w:rStyle w:val="Hyperlink"/>
-                <w:noProof/>
-              </w:rPr>
-              <w:t>Mellékletek</w:t>
-            </w:r>
-            <w:r>
-              <w:rPr>
-                <w:noProof/>
-                <w:webHidden/>
-              </w:rPr>
-              <w:tab/>
-            </w:r>
-            <w:r>
-              <w:rPr>
-                <w:noProof/>
-                <w:webHidden/>
-              </w:rPr>
-              <w:fldChar w:fldCharType="begin"/>
-            </w:r>
-            <w:r>
-              <w:rPr>
-                <w:noProof/>
-                <w:webHidden/>
-              </w:rPr>
-              <w:instrText xml:space="preserve"> PAGEREF _Toc225520381 \h </w:instrText>
-            </w:r>
-            <w:r>
-              <w:rPr>
-                <w:noProof/>
-                <w:webHidden/>
-              </w:rPr>
-            </w:r>
-            <w:r>
-              <w:rPr>
-                <w:noProof/>
-                <w:webHidden/>
-              </w:rPr>
-              <w:fldChar w:fldCharType="separate"/>
-            </w:r>
-            <w:r>
-              <w:rPr>
-                <w:noProof/>
-                <w:webHidden/>
-              </w:rPr>
-              <w:t>20</w:t>
             </w:r>
             <w:r>
               <w:rPr>
@@ -2630,7 +2414,7 @@
               <w:lang w:val="en-US"/>
             </w:rPr>
           </w:pPr>
-          <w:hyperlink w:anchor="_Toc225520382" w:history="1">
+          <w:hyperlink w:anchor="_Toc225527495" w:history="1">
             <w:r>
               <w:rPr>
                 <w:rStyle w:val="Hyperlink"/>
@@ -2653,6 +2437,402 @@
                 <w:rStyle w:val="Hyperlink"/>
                 <w:noProof/>
               </w:rPr>
+              <w:t>Gráf alapú pálya struktúra definiálása</w:t>
+            </w:r>
+            <w:r>
+              <w:rPr>
+                <w:noProof/>
+                <w:webHidden/>
+              </w:rPr>
+              <w:tab/>
+            </w:r>
+            <w:r>
+              <w:rPr>
+                <w:noProof/>
+                <w:webHidden/>
+              </w:rPr>
+              <w:fldChar w:fldCharType="begin"/>
+            </w:r>
+            <w:r>
+              <w:rPr>
+                <w:noProof/>
+                <w:webHidden/>
+              </w:rPr>
+              <w:instrText xml:space="preserve"> PAGEREF _Toc225527495 \h </w:instrText>
+            </w:r>
+            <w:r>
+              <w:rPr>
+                <w:noProof/>
+                <w:webHidden/>
+              </w:rPr>
+            </w:r>
+            <w:r>
+              <w:rPr>
+                <w:noProof/>
+                <w:webHidden/>
+              </w:rPr>
+              <w:fldChar w:fldCharType="separate"/>
+            </w:r>
+            <w:r>
+              <w:rPr>
+                <w:noProof/>
+                <w:webHidden/>
+              </w:rPr>
+              <w:t>17</w:t>
+            </w:r>
+            <w:r>
+              <w:rPr>
+                <w:noProof/>
+                <w:webHidden/>
+              </w:rPr>
+              <w:fldChar w:fldCharType="end"/>
+            </w:r>
+          </w:hyperlink>
+        </w:p>
+        <w:p>
+          <w:pPr>
+            <w:pStyle w:val="TOC2"/>
+            <w:tabs>
+              <w:tab w:val="left" w:pos="960"/>
+              <w:tab w:val="right" w:leader="dot" w:pos="8827"/>
+            </w:tabs>
+            <w:rPr>
+              <w:rFonts w:eastAsiaTheme="minorEastAsia"/>
+              <w:noProof/>
+              <w:sz w:val="24"/>
+              <w:szCs w:val="24"/>
+              <w:lang w:val="en-US"/>
+            </w:rPr>
+          </w:pPr>
+          <w:hyperlink w:anchor="_Toc225527496" w:history="1">
+            <w:r>
+              <w:rPr>
+                <w:rStyle w:val="Hyperlink"/>
+                <w:noProof/>
+              </w:rPr>
+              <w:t>3.3.</w:t>
+            </w:r>
+            <w:r>
+              <w:rPr>
+                <w:rFonts w:eastAsiaTheme="minorEastAsia"/>
+                <w:noProof/>
+                <w:sz w:val="24"/>
+                <w:szCs w:val="24"/>
+                <w:lang w:val="en-US"/>
+              </w:rPr>
+              <w:tab/>
+            </w:r>
+            <w:r>
+              <w:rPr>
+                <w:rStyle w:val="Hyperlink"/>
+                <w:noProof/>
+              </w:rPr>
+              <w:t>Pálya generálás folyamatai, többlépcsős generálás oka</w:t>
+            </w:r>
+            <w:r>
+              <w:rPr>
+                <w:noProof/>
+                <w:webHidden/>
+              </w:rPr>
+              <w:tab/>
+            </w:r>
+            <w:r>
+              <w:rPr>
+                <w:noProof/>
+                <w:webHidden/>
+              </w:rPr>
+              <w:fldChar w:fldCharType="begin"/>
+            </w:r>
+            <w:r>
+              <w:rPr>
+                <w:noProof/>
+                <w:webHidden/>
+              </w:rPr>
+              <w:instrText xml:space="preserve"> PAGEREF _Toc225527496 \h </w:instrText>
+            </w:r>
+            <w:r>
+              <w:rPr>
+                <w:noProof/>
+                <w:webHidden/>
+              </w:rPr>
+            </w:r>
+            <w:r>
+              <w:rPr>
+                <w:noProof/>
+                <w:webHidden/>
+              </w:rPr>
+              <w:fldChar w:fldCharType="separate"/>
+            </w:r>
+            <w:r>
+              <w:rPr>
+                <w:noProof/>
+                <w:webHidden/>
+              </w:rPr>
+              <w:t>19</w:t>
+            </w:r>
+            <w:r>
+              <w:rPr>
+                <w:noProof/>
+                <w:webHidden/>
+              </w:rPr>
+              <w:fldChar w:fldCharType="end"/>
+            </w:r>
+          </w:hyperlink>
+        </w:p>
+        <w:p>
+          <w:pPr>
+            <w:pStyle w:val="TOC1"/>
+            <w:tabs>
+              <w:tab w:val="right" w:leader="dot" w:pos="8827"/>
+            </w:tabs>
+            <w:rPr>
+              <w:rFonts w:eastAsiaTheme="minorEastAsia"/>
+              <w:noProof/>
+              <w:sz w:val="24"/>
+              <w:szCs w:val="24"/>
+              <w:lang w:val="en-US"/>
+            </w:rPr>
+          </w:pPr>
+          <w:hyperlink w:anchor="_Toc225527497" w:history="1">
+            <w:r>
+              <w:rPr>
+                <w:rStyle w:val="Hyperlink"/>
+                <w:noProof/>
+              </w:rPr>
+              <w:t>Irodalomjegyzék</w:t>
+            </w:r>
+            <w:r>
+              <w:rPr>
+                <w:noProof/>
+                <w:webHidden/>
+              </w:rPr>
+              <w:tab/>
+            </w:r>
+            <w:r>
+              <w:rPr>
+                <w:noProof/>
+                <w:webHidden/>
+              </w:rPr>
+              <w:fldChar w:fldCharType="begin"/>
+            </w:r>
+            <w:r>
+              <w:rPr>
+                <w:noProof/>
+                <w:webHidden/>
+              </w:rPr>
+              <w:instrText xml:space="preserve"> PAGEREF _Toc225527497 \h </w:instrText>
+            </w:r>
+            <w:r>
+              <w:rPr>
+                <w:noProof/>
+                <w:webHidden/>
+              </w:rPr>
+            </w:r>
+            <w:r>
+              <w:rPr>
+                <w:noProof/>
+                <w:webHidden/>
+              </w:rPr>
+              <w:fldChar w:fldCharType="separate"/>
+            </w:r>
+            <w:r>
+              <w:rPr>
+                <w:noProof/>
+                <w:webHidden/>
+              </w:rPr>
+              <w:t>20</w:t>
+            </w:r>
+            <w:r>
+              <w:rPr>
+                <w:noProof/>
+                <w:webHidden/>
+              </w:rPr>
+              <w:fldChar w:fldCharType="end"/>
+            </w:r>
+          </w:hyperlink>
+        </w:p>
+        <w:p>
+          <w:pPr>
+            <w:pStyle w:val="TOC1"/>
+            <w:tabs>
+              <w:tab w:val="right" w:leader="dot" w:pos="8827"/>
+            </w:tabs>
+            <w:rPr>
+              <w:rFonts w:eastAsiaTheme="minorEastAsia"/>
+              <w:noProof/>
+              <w:sz w:val="24"/>
+              <w:szCs w:val="24"/>
+              <w:lang w:val="en-US"/>
+            </w:rPr>
+          </w:pPr>
+          <w:hyperlink w:anchor="_Toc225527498" w:history="1">
+            <w:r>
+              <w:rPr>
+                <w:rStyle w:val="Hyperlink"/>
+                <w:noProof/>
+              </w:rPr>
+              <w:t>Nyilatkozat</w:t>
+            </w:r>
+            <w:r>
+              <w:rPr>
+                <w:noProof/>
+                <w:webHidden/>
+              </w:rPr>
+              <w:tab/>
+            </w:r>
+            <w:r>
+              <w:rPr>
+                <w:noProof/>
+                <w:webHidden/>
+              </w:rPr>
+              <w:fldChar w:fldCharType="begin"/>
+            </w:r>
+            <w:r>
+              <w:rPr>
+                <w:noProof/>
+                <w:webHidden/>
+              </w:rPr>
+              <w:instrText xml:space="preserve"> PAGEREF _Toc225527498 \h </w:instrText>
+            </w:r>
+            <w:r>
+              <w:rPr>
+                <w:noProof/>
+                <w:webHidden/>
+              </w:rPr>
+            </w:r>
+            <w:r>
+              <w:rPr>
+                <w:noProof/>
+                <w:webHidden/>
+              </w:rPr>
+              <w:fldChar w:fldCharType="separate"/>
+            </w:r>
+            <w:r>
+              <w:rPr>
+                <w:noProof/>
+                <w:webHidden/>
+              </w:rPr>
+              <w:t>21</w:t>
+            </w:r>
+            <w:r>
+              <w:rPr>
+                <w:noProof/>
+                <w:webHidden/>
+              </w:rPr>
+              <w:fldChar w:fldCharType="end"/>
+            </w:r>
+          </w:hyperlink>
+        </w:p>
+        <w:p>
+          <w:pPr>
+            <w:pStyle w:val="TOC1"/>
+            <w:tabs>
+              <w:tab w:val="right" w:leader="dot" w:pos="8827"/>
+            </w:tabs>
+            <w:rPr>
+              <w:rFonts w:eastAsiaTheme="minorEastAsia"/>
+              <w:noProof/>
+              <w:sz w:val="24"/>
+              <w:szCs w:val="24"/>
+              <w:lang w:val="en-US"/>
+            </w:rPr>
+          </w:pPr>
+          <w:hyperlink w:anchor="_Toc225527499" w:history="1">
+            <w:r>
+              <w:rPr>
+                <w:rStyle w:val="Hyperlink"/>
+                <w:noProof/>
+              </w:rPr>
+              <w:t>Mellékletek</w:t>
+            </w:r>
+            <w:r>
+              <w:rPr>
+                <w:noProof/>
+                <w:webHidden/>
+              </w:rPr>
+              <w:tab/>
+            </w:r>
+            <w:r>
+              <w:rPr>
+                <w:noProof/>
+                <w:webHidden/>
+              </w:rPr>
+              <w:fldChar w:fldCharType="begin"/>
+            </w:r>
+            <w:r>
+              <w:rPr>
+                <w:noProof/>
+                <w:webHidden/>
+              </w:rPr>
+              <w:instrText xml:space="preserve"> PAGEREF _Toc225527499 \h </w:instrText>
+            </w:r>
+            <w:r>
+              <w:rPr>
+                <w:noProof/>
+                <w:webHidden/>
+              </w:rPr>
+            </w:r>
+            <w:r>
+              <w:rPr>
+                <w:noProof/>
+                <w:webHidden/>
+              </w:rPr>
+              <w:fldChar w:fldCharType="separate"/>
+            </w:r>
+            <w:r>
+              <w:rPr>
+                <w:noProof/>
+                <w:webHidden/>
+              </w:rPr>
+              <w:t>22</w:t>
+            </w:r>
+            <w:r>
+              <w:rPr>
+                <w:noProof/>
+                <w:webHidden/>
+              </w:rPr>
+              <w:fldChar w:fldCharType="end"/>
+            </w:r>
+          </w:hyperlink>
+        </w:p>
+        <w:p>
+          <w:pPr>
+            <w:pStyle w:val="TOC2"/>
+            <w:tabs>
+              <w:tab w:val="left" w:pos="960"/>
+              <w:tab w:val="right" w:leader="dot" w:pos="8827"/>
+            </w:tabs>
+            <w:rPr>
+              <w:rFonts w:eastAsiaTheme="minorEastAsia"/>
+              <w:noProof/>
+              <w:sz w:val="24"/>
+              <w:szCs w:val="24"/>
+              <w:lang w:val="en-US"/>
+            </w:rPr>
+          </w:pPr>
+          <w:hyperlink w:anchor="_Toc225527500" w:history="1">
+            <w:r>
+              <w:rPr>
+                <w:rStyle w:val="Hyperlink"/>
+                <w:noProof/>
+              </w:rPr>
+              <w:t>3.4.</w:t>
+            </w:r>
+            <w:r>
+              <w:rPr>
+                <w:rFonts w:eastAsiaTheme="minorEastAsia"/>
+                <w:noProof/>
+                <w:sz w:val="24"/>
+                <w:szCs w:val="24"/>
+                <w:lang w:val="en-US"/>
+              </w:rPr>
+              <w:tab/>
+            </w:r>
+            <w:r>
+              <w:rPr>
+                <w:rStyle w:val="Hyperlink"/>
+                <w:noProof/>
+              </w:rPr>
               <w:t>Adatbázis relációk</w:t>
             </w:r>
             <w:r>
@@ -2674,7 +2854,7 @@
                 <w:noProof/>
                 <w:webHidden/>
               </w:rPr>
-              <w:instrText xml:space="preserve"> PAGEREF _Toc225520382 \h </w:instrText>
+              <w:instrText xml:space="preserve"> PAGEREF _Toc225527500 \h </w:instrText>
             </w:r>
             <w:r>
               <w:rPr>
@@ -2694,7 +2874,97 @@
                 <w:noProof/>
                 <w:webHidden/>
               </w:rPr>
-              <w:t>20</w:t>
+              <w:t>22</w:t>
+            </w:r>
+            <w:r>
+              <w:rPr>
+                <w:noProof/>
+                <w:webHidden/>
+              </w:rPr>
+              <w:fldChar w:fldCharType="end"/>
+            </w:r>
+          </w:hyperlink>
+        </w:p>
+        <w:p>
+          <w:pPr>
+            <w:pStyle w:val="TOC2"/>
+            <w:tabs>
+              <w:tab w:val="left" w:pos="960"/>
+              <w:tab w:val="right" w:leader="dot" w:pos="8827"/>
+            </w:tabs>
+            <w:rPr>
+              <w:rFonts w:eastAsiaTheme="minorEastAsia"/>
+              <w:noProof/>
+              <w:sz w:val="24"/>
+              <w:szCs w:val="24"/>
+              <w:lang w:val="en-US"/>
+            </w:rPr>
+          </w:pPr>
+          <w:hyperlink w:anchor="_Toc225527501" w:history="1">
+            <w:r>
+              <w:rPr>
+                <w:rStyle w:val="Hyperlink"/>
+                <w:noProof/>
+              </w:rPr>
+              <w:t>3.5.</w:t>
+            </w:r>
+            <w:r>
+              <w:rPr>
+                <w:rFonts w:eastAsiaTheme="minorEastAsia"/>
+                <w:noProof/>
+                <w:sz w:val="24"/>
+                <w:szCs w:val="24"/>
+                <w:lang w:val="en-US"/>
+              </w:rPr>
+              <w:tab/>
+            </w:r>
+            <w:r>
+              <w:rPr>
+                <w:rStyle w:val="Hyperlink"/>
+                <w:noProof/>
+              </w:rPr>
+              <w:t>Gráf alapú pálya struktúra definiálása</w:t>
+            </w:r>
+            <w:r>
+              <w:rPr>
+                <w:noProof/>
+                <w:webHidden/>
+              </w:rPr>
+              <w:tab/>
+            </w:r>
+            <w:r>
+              <w:rPr>
+                <w:noProof/>
+                <w:webHidden/>
+              </w:rPr>
+              <w:fldChar w:fldCharType="begin"/>
+            </w:r>
+            <w:r>
+              <w:rPr>
+                <w:noProof/>
+                <w:webHidden/>
+              </w:rPr>
+              <w:instrText xml:space="preserve"> PAGEREF _Toc225527501 \h </w:instrText>
+            </w:r>
+            <w:r>
+              <w:rPr>
+                <w:noProof/>
+                <w:webHidden/>
+              </w:rPr>
+            </w:r>
+            <w:r>
+              <w:rPr>
+                <w:noProof/>
+                <w:webHidden/>
+              </w:rPr>
+              <w:fldChar w:fldCharType="separate"/>
+            </w:r>
+            <w:r>
+              <w:rPr>
+                <w:noProof/>
+                <w:webHidden/>
+              </w:rPr>
+              <w:t>23</w:t>
             </w:r>
             <w:r>
               <w:rPr>
@@ -2790,20 +3060,47 @@
         <w:jc w:val="both"/>
         <w:rPr>
           <w:rFonts w:ascii="Times New Roman" w:hAnsi="Times New Roman" w:cs="Times New Roman"/>
+          <w:strike/>
           <w:color w:val="EE0000"/>
           <w:sz w:val="24"/>
           <w:szCs w:val="24"/>
         </w:rPr>
       </w:pPr>
       <w:r>
+        <w:rPr>
+          <w:rFonts w:ascii="Times New Roman" w:hAnsi="Times New Roman" w:cs="Times New Roman"/>
+          <w:strike/>
+          <w:color w:val="EE0000"/>
+          <w:sz w:val="24"/>
+          <w:szCs w:val="24"/>
+        </w:rPr>
+        <w:t xml:space="preserve">Gráf alapú struktúra </w:t>
+      </w:r>
+      <w:proofErr w:type="spellStart"/>
+      <w:r>
+        <w:rPr>
+          <w:rFonts w:ascii="Times New Roman" w:hAnsi="Times New Roman" w:cs="Times New Roman"/>
+          <w:strike/>
+          <w:color w:val="EE0000"/>
+          <w:sz w:val="24"/>
+          <w:szCs w:val="24"/>
+        </w:rPr>
+        <w:t>deffiniálása</w:t>
+      </w:r>
+      <w:proofErr w:type="spellEnd"/>
+    </w:p>
+    <w:p>
+      <w:pPr>
+        <w:spacing w:line="360" w:lineRule="auto"/>
+        <w:ind w:firstLine="720"/>
+        <w:jc w:val="both"/>
         <w:rPr>
           <w:rFonts w:ascii="Times New Roman" w:hAnsi="Times New Roman" w:cs="Times New Roman"/>
           <w:color w:val="EE0000"/>
           <w:sz w:val="24"/>
           <w:szCs w:val="24"/>
         </w:rPr>
-        <w:t xml:space="preserve">Gráf alapú struktúra </w:t>
-      </w:r>
+      </w:pPr>
       <w:proofErr w:type="spellStart"/>
       <w:r>
         <w:rPr>
@@ -2812,23 +3109,18 @@
           <w:sz w:val="24"/>
           <w:szCs w:val="24"/>
         </w:rPr>
-        <w:t>deffiniálása</w:t>
-      </w:r>
-      <w:proofErr w:type="spellEnd"/>
-    </w:p>
-    <w:p>
-      <w:pPr>
-        <w:spacing w:line="360" w:lineRule="auto"/>
-        <w:ind w:firstLine="720"/>
-        <w:jc w:val="both"/>
+        <w:t>Promtolás</w:t>
+      </w:r>
+      <w:proofErr w:type="spellEnd"/>
+      <w:r>
         <w:rPr>
           <w:rFonts w:ascii="Times New Roman" w:hAnsi="Times New Roman" w:cs="Times New Roman"/>
           <w:color w:val="EE0000"/>
           <w:sz w:val="24"/>
           <w:szCs w:val="24"/>
         </w:rPr>
-      </w:pPr>
-      <w:proofErr w:type="spellStart"/>
+        <w:t>, kipróbált és használt modellek</w:t>
+      </w:r>
       <w:r>
         <w:rPr>
           <w:rFonts w:ascii="Times New Roman" w:hAnsi="Times New Roman" w:cs="Times New Roman"/>
@@ -2836,18 +3128,20 @@
           <w:sz w:val="24"/>
           <w:szCs w:val="24"/>
         </w:rPr>
-        <w:t>Promtolás</w:t>
-      </w:r>
-      <w:proofErr w:type="spellEnd"/>
-      <w:r>
+        <w:t>, Prompt mint fekete mágia</w:t>
+      </w:r>
+    </w:p>
+    <w:p>
+      <w:pPr>
+        <w:spacing w:line="360" w:lineRule="auto"/>
+        <w:jc w:val="both"/>
         <w:rPr>
           <w:rFonts w:ascii="Times New Roman" w:hAnsi="Times New Roman" w:cs="Times New Roman"/>
           <w:color w:val="EE0000"/>
           <w:sz w:val="24"/>
           <w:szCs w:val="24"/>
         </w:rPr>
-        <w:t>, kipróbált és használt modellek</w:t>
-      </w:r>
+      </w:pPr>
       <w:r>
         <w:rPr>
           <w:rFonts w:ascii="Times New Roman" w:hAnsi="Times New Roman" w:cs="Times New Roman"/>
@@ -2855,20 +3149,20 @@
           <w:sz w:val="24"/>
           <w:szCs w:val="24"/>
         </w:rPr>
-        <w:t>, Prompt mint fekete mágia</w:t>
-      </w:r>
-    </w:p>
-    <w:p>
-      <w:pPr>
-        <w:spacing w:line="360" w:lineRule="auto"/>
-        <w:jc w:val="both"/>
+        <w:tab/>
+        <w:t xml:space="preserve">Milyen folyamatok és miért </w:t>
+      </w:r>
+      <w:proofErr w:type="spellStart"/>
+      <w:r>
         <w:rPr>
           <w:rFonts w:ascii="Times New Roman" w:hAnsi="Times New Roman" w:cs="Times New Roman"/>
           <w:color w:val="EE0000"/>
           <w:sz w:val="24"/>
           <w:szCs w:val="24"/>
         </w:rPr>
-      </w:pPr>
+        <w:t>csatolódtak</w:t>
+      </w:r>
+      <w:proofErr w:type="spellEnd"/>
       <w:r>
         <w:rPr>
           <w:rFonts w:ascii="Times New Roman" w:hAnsi="Times New Roman" w:cs="Times New Roman"/>
@@ -2876,20 +3170,20 @@
           <w:sz w:val="24"/>
           <w:szCs w:val="24"/>
         </w:rPr>
-        <w:tab/>
-        <w:t xml:space="preserve">Milyen folyamatok és miért </w:t>
-      </w:r>
-      <w:proofErr w:type="spellStart"/>
-      <w:r>
+        <w:t xml:space="preserve"> rá a pálya generálásra, hint rendszer</w:t>
+      </w:r>
+    </w:p>
+    <w:p>
+      <w:pPr>
+        <w:spacing w:line="360" w:lineRule="auto"/>
+        <w:jc w:val="both"/>
         <w:rPr>
           <w:rFonts w:ascii="Times New Roman" w:hAnsi="Times New Roman" w:cs="Times New Roman"/>
           <w:color w:val="EE0000"/>
           <w:sz w:val="24"/>
           <w:szCs w:val="24"/>
         </w:rPr>
-        <w:t>csatolódtak</w:t>
-      </w:r>
-      <w:proofErr w:type="spellEnd"/>
+      </w:pPr>
       <w:r>
         <w:rPr>
           <w:rFonts w:ascii="Times New Roman" w:hAnsi="Times New Roman" w:cs="Times New Roman"/>
@@ -2897,7 +3191,9 @@
           <w:sz w:val="24"/>
           <w:szCs w:val="24"/>
         </w:rPr>
-        <w:t xml:space="preserve"> rá a pálya generálásra, hint rendszer</w:t>
+        <w:lastRenderedPageBreak/>
+        <w:tab/>
+        <w:t>Milyen modelleket használtam végül</w:t>
       </w:r>
     </w:p>
     <w:p>
@@ -2919,20 +3215,18 @@
           <w:szCs w:val="24"/>
         </w:rPr>
         <w:tab/>
-        <w:t>Milyen modelleket használtam végül</w:t>
-      </w:r>
-    </w:p>
-    <w:p>
-      <w:pPr>
-        <w:spacing w:line="360" w:lineRule="auto"/>
-        <w:jc w:val="both"/>
+      </w:r>
+      <w:proofErr w:type="spellStart"/>
+      <w:r>
         <w:rPr>
           <w:rFonts w:ascii="Times New Roman" w:hAnsi="Times New Roman" w:cs="Times New Roman"/>
           <w:color w:val="EE0000"/>
           <w:sz w:val="24"/>
           <w:szCs w:val="24"/>
         </w:rPr>
-      </w:pPr>
+        <w:t>Sprite</w:t>
+      </w:r>
+      <w:proofErr w:type="spellEnd"/>
       <w:r>
         <w:rPr>
           <w:rFonts w:ascii="Times New Roman" w:hAnsi="Times New Roman" w:cs="Times New Roman"/>
@@ -2940,7 +3234,7 @@
           <w:sz w:val="24"/>
           <w:szCs w:val="24"/>
         </w:rPr>
-        <w:tab/>
+        <w:t xml:space="preserve"> </w:t>
       </w:r>
       <w:proofErr w:type="spellStart"/>
       <w:r>
@@ -2950,7 +3244,7 @@
           <w:sz w:val="24"/>
           <w:szCs w:val="24"/>
         </w:rPr>
-        <w:t>Sprite</w:t>
+        <w:t>png</w:t>
       </w:r>
       <w:proofErr w:type="spellEnd"/>
       <w:r>
@@ -2962,7 +3256,7 @@
         </w:rPr>
         <w:t xml:space="preserve"> </w:t>
       </w:r>
-      <w:proofErr w:type="spellStart"/>
+      <w:proofErr w:type="gramStart"/>
       <w:r>
         <w:rPr>
           <w:rFonts w:ascii="Times New Roman" w:hAnsi="Times New Roman" w:cs="Times New Roman"/>
@@ -2970,9 +3264,9 @@
           <w:sz w:val="24"/>
           <w:szCs w:val="24"/>
         </w:rPr>
-        <w:t>png</w:t>
-      </w:r>
-      <w:proofErr w:type="spellEnd"/>
+        <w:t>generálása</w:t>
+      </w:r>
+      <w:proofErr w:type="gramEnd"/>
       <w:r>
         <w:rPr>
           <w:rFonts w:ascii="Times New Roman" w:hAnsi="Times New Roman" w:cs="Times New Roman"/>
@@ -2980,19 +3274,20 @@
           <w:sz w:val="24"/>
           <w:szCs w:val="24"/>
         </w:rPr>
-        <w:t xml:space="preserve"> </w:t>
-      </w:r>
-      <w:proofErr w:type="gramStart"/>
-      <w:r>
+        <w:t xml:space="preserve"> amit végül a modell megoldott</w:t>
+      </w:r>
+    </w:p>
+    <w:p>
+      <w:pPr>
+        <w:spacing w:line="360" w:lineRule="auto"/>
+        <w:jc w:val="both"/>
         <w:rPr>
           <w:rFonts w:ascii="Times New Roman" w:hAnsi="Times New Roman" w:cs="Times New Roman"/>
           <w:color w:val="EE0000"/>
           <w:sz w:val="24"/>
           <w:szCs w:val="24"/>
         </w:rPr>
-        <w:t>generálása</w:t>
-      </w:r>
-      <w:proofErr w:type="gramEnd"/>
+      </w:pPr>
       <w:r>
         <w:rPr>
           <w:rFonts w:ascii="Times New Roman" w:hAnsi="Times New Roman" w:cs="Times New Roman"/>
@@ -3000,7 +3295,7 @@
           <w:sz w:val="24"/>
           <w:szCs w:val="24"/>
         </w:rPr>
-        <w:t xml:space="preserve"> amit végül a modell megoldott</w:t>
+        <w:t>Költség elemzés</w:t>
       </w:r>
     </w:p>
     <w:p>
@@ -3021,28 +3316,6 @@
           <w:sz w:val="24"/>
           <w:szCs w:val="24"/>
         </w:rPr>
-        <w:t>Költség elemzés</w:t>
-      </w:r>
-    </w:p>
-    <w:p>
-      <w:pPr>
-        <w:spacing w:line="360" w:lineRule="auto"/>
-        <w:jc w:val="both"/>
-        <w:rPr>
-          <w:rFonts w:ascii="Times New Roman" w:hAnsi="Times New Roman" w:cs="Times New Roman"/>
-          <w:color w:val="EE0000"/>
-          <w:sz w:val="24"/>
-          <w:szCs w:val="24"/>
-        </w:rPr>
-      </w:pPr>
-      <w:r>
-        <w:rPr>
-          <w:rFonts w:ascii="Times New Roman" w:hAnsi="Times New Roman" w:cs="Times New Roman"/>
-          <w:color w:val="EE0000"/>
-          <w:sz w:val="24"/>
-          <w:szCs w:val="24"/>
-        </w:rPr>
-        <w:lastRenderedPageBreak/>
         <w:tab/>
         <w:t>Mérési eredmények - statisztikák</w:t>
       </w:r>
@@ -3573,7 +3846,7 @@
           <w:i/>
         </w:rPr>
       </w:pPr>
-      <w:bookmarkStart w:id="2" w:name="_Toc225520363"/>
+      <w:bookmarkStart w:id="2" w:name="_Toc225527479"/>
       <w:r>
         <w:lastRenderedPageBreak/>
         <w:t>Technológiák</w:t>
@@ -3592,7 +3865,7 @@
       <w:pPr>
         <w:pStyle w:val="Szakdolgozath2"/>
       </w:pPr>
-      <w:bookmarkStart w:id="3" w:name="_Toc225520364"/>
+      <w:bookmarkStart w:id="3" w:name="_Toc225527480"/>
       <w:r>
         <w:t xml:space="preserve">Docker és </w:t>
       </w:r>
@@ -3735,7 +4008,7 @@
       <w:pPr>
         <w:pStyle w:val="Szakdolgozath2"/>
       </w:pPr>
-      <w:bookmarkStart w:id="4" w:name="_Toc225520365"/>
+      <w:bookmarkStart w:id="4" w:name="_Toc225527481"/>
       <w:r>
         <w:t>Frontend technológiák</w:t>
       </w:r>
@@ -4195,7 +4468,7 @@
       <w:pPr>
         <w:pStyle w:val="Szakdolgozath2"/>
       </w:pPr>
-      <w:bookmarkStart w:id="5" w:name="_Toc225520366"/>
+      <w:bookmarkStart w:id="5" w:name="_Toc225527482"/>
       <w:r>
         <w:t>Backend technológiák</w:t>
       </w:r>
@@ -4585,7 +4858,7 @@
       <w:pPr>
         <w:pStyle w:val="Szakdolgozath2"/>
       </w:pPr>
-      <w:bookmarkStart w:id="6" w:name="_Toc225520367"/>
+      <w:bookmarkStart w:id="6" w:name="_Toc225527483"/>
       <w:r>
         <w:t>Valós idejű kommunikáció</w:t>
       </w:r>
@@ -4792,7 +5065,7 @@
       <w:pPr>
         <w:pStyle w:val="Szakdolgozath2"/>
       </w:pPr>
-      <w:bookmarkStart w:id="7" w:name="_Toc225520368"/>
+      <w:bookmarkStart w:id="7" w:name="_Toc225527484"/>
       <w:r>
         <w:t>Adatkezelés és tárolás</w:t>
       </w:r>
@@ -4950,7 +5223,7 @@
       <w:pPr>
         <w:pStyle w:val="Szakdolgozath2"/>
       </w:pPr>
-      <w:bookmarkStart w:id="8" w:name="_Toc225520369"/>
+      <w:bookmarkStart w:id="8" w:name="_Toc225527485"/>
       <w:r>
         <w:t>MI integráció</w:t>
       </w:r>
@@ -5033,7 +5306,7 @@
       <w:pPr>
         <w:pStyle w:val="SzekdolgozatH1"/>
       </w:pPr>
-      <w:bookmarkStart w:id="9" w:name="_Toc225520370"/>
+      <w:bookmarkStart w:id="9" w:name="_Toc225527486"/>
       <w:r>
         <w:t>Architektúra</w:t>
       </w:r>
@@ -5043,7 +5316,7 @@
       <w:pPr>
         <w:pStyle w:val="Szakdolgozath2"/>
       </w:pPr>
-      <w:bookmarkStart w:id="10" w:name="_Toc225520371"/>
+      <w:bookmarkStart w:id="10" w:name="_Toc225527487"/>
       <w:r>
         <w:t>Adatbázis felépítés –</w:t>
       </w:r>
@@ -5848,7 +6121,7 @@
       <w:pPr>
         <w:pStyle w:val="Szakdolgozath2"/>
       </w:pPr>
-      <w:bookmarkStart w:id="19" w:name="_Toc225520372"/>
+      <w:bookmarkStart w:id="19" w:name="_Toc225527488"/>
       <w:r>
         <w:t>Frontend</w:t>
       </w:r>
@@ -6110,7 +6383,7 @@
       <w:pPr>
         <w:pStyle w:val="Szakdolgozath2"/>
       </w:pPr>
-      <w:bookmarkStart w:id="20" w:name="_Toc225520373"/>
+      <w:bookmarkStart w:id="20" w:name="_Toc225527489"/>
       <w:r>
         <w:t>Backend API</w:t>
       </w:r>
@@ -6284,7 +6557,7 @@
       <w:pPr>
         <w:pStyle w:val="Szakdolgozath2"/>
       </w:pPr>
-      <w:bookmarkStart w:id="21" w:name="_Toc225520374"/>
+      <w:bookmarkStart w:id="21" w:name="_Toc225527490"/>
       <w:proofErr w:type="spellStart"/>
       <w:r>
         <w:t>WebSocket</w:t>
@@ -6391,7 +6664,7 @@
       <w:pPr>
         <w:pStyle w:val="Szakdolgozath2"/>
       </w:pPr>
-      <w:bookmarkStart w:id="22" w:name="_Toc225520375"/>
+      <w:bookmarkStart w:id="22" w:name="_Toc225527491"/>
       <w:r>
         <w:t xml:space="preserve">File </w:t>
       </w:r>
@@ -6713,7 +6986,7 @@
       <w:pPr>
         <w:pStyle w:val="Szakdolgozath2"/>
       </w:pPr>
-      <w:bookmarkStart w:id="23" w:name="_Toc225520376"/>
+      <w:bookmarkStart w:id="23" w:name="_Toc225527492"/>
       <w:r>
         <w:t>Biztonság</w:t>
       </w:r>
@@ -6911,7 +7184,7 @@
       <w:pPr>
         <w:pStyle w:val="SzekdolgozatH1"/>
       </w:pPr>
-      <w:bookmarkStart w:id="24" w:name="_Toc225520377"/>
+      <w:bookmarkStart w:id="24" w:name="_Toc225527493"/>
       <w:r>
         <w:lastRenderedPageBreak/>
         <w:t>Pálya Generálása</w:t>
@@ -6922,7 +7195,7 @@
       <w:pPr>
         <w:pStyle w:val="Szakdolgozath2"/>
       </w:pPr>
-      <w:bookmarkStart w:id="25" w:name="_Toc225520378"/>
+      <w:bookmarkStart w:id="25" w:name="_Toc225527494"/>
       <w:r>
         <w:t>Generikus játék modellek</w:t>
       </w:r>
@@ -7497,11 +7770,309 @@
       <w:r>
         <w:t xml:space="preserve"> hidat képez a játékmenet, a narratíva és a vizuális megjelenítés között.</w:t>
       </w:r>
+    </w:p>
+    <w:p>
+      <w:pPr>
+        <w:pStyle w:val="Szakdolgozath2"/>
+      </w:pPr>
+      <w:bookmarkStart w:id="26" w:name="_Toc225527495"/>
+      <w:r>
+        <w:t>Gráf alapú pálya struktúra definiálása</w:t>
+      </w:r>
+      <w:bookmarkEnd w:id="26"/>
+    </w:p>
+    <w:p>
+      <w:pPr>
+        <w:pStyle w:val="Szakdolgozath3"/>
+      </w:pPr>
+      <w:r>
+        <w:t>Alap probléma</w:t>
+      </w:r>
+    </w:p>
+    <w:p>
+      <w:pPr>
+        <w:pStyle w:val="Szakdolgozatbekezds"/>
+      </w:pPr>
+      <w:r>
+        <w:t xml:space="preserve">A pályagenerálás egyik legfontosabb kérdése az volt, hogyan lehet a feladatok közötti kapcsolatokat úgy leírni, hogy a létrejövő szoba logikailag következetes és </w:t>
+      </w:r>
+      <w:proofErr w:type="spellStart"/>
+      <w:r>
+        <w:t>végigjátszható</w:t>
+      </w:r>
+      <w:proofErr w:type="spellEnd"/>
+      <w:r>
+        <w:t xml:space="preserve"> maradjon. A korai kísérletek során a modell számára gyakran csak általános utasítások kerültek megadásra, </w:t>
+      </w:r>
+      <w:proofErr w:type="gramStart"/>
+      <w:r>
+        <w:t>például</w:t>
+      </w:r>
+      <w:proofErr w:type="gramEnd"/>
+      <w:r>
+        <w:t xml:space="preserve"> hogy találjon ki egy vagy több egymásra épülő, változó komplexitású feladatot. Ez a megközelítés első ránézésre elegendőnek tűnt, a gyakorlatban azonban rendszeresen olyan pályák születtek, amelyek szerkezete hibás volt. Előfordult, hogy egy részfeladathoz szükséges információ fizikailag vagy logikailag elérhetetlenné vált, ezért egy puzzle megoldhatatlanná vált. Más esetekben a kijárat túl korán megnyitható volt, így a pályán elhelyezett további feladatok elvesztették funkciójukat.</w:t>
+      </w:r>
+    </w:p>
+    <w:p>
+      <w:pPr>
+        <w:pStyle w:val="Szakdolgozatbekezds"/>
+        <w:ind w:firstLine="720"/>
+      </w:pPr>
+      <w:r>
+        <w:t xml:space="preserve">Ennek a problémának a kezelésére a pálya szerkezetét nem pusztán objektumlistaként, hanem irányított függőségi gráfként célszerű definiálni. Ebben a megközelítésben a gráf nem a játékos fizikai mozgását írja le, hanem azt, hogy egy adott információ vagy játékelem mikor válik értelmezhetővé, illetve használhatóvá. A csúcsok a pálya logikai egységeit reprezentálják, az élek pedig azt a függőségi viszonyt jelentik, hogy egy későbbi elem megértéséhez vagy alkalmazásához egy korábbi elem megoldása </w:t>
+      </w:r>
+      <w:r>
+        <w:lastRenderedPageBreak/>
+        <w:t>szükséges. A gráf alkalmazásának legnagyobb előnye, hogy a generálás során egyértelműen meghatározható, mely elemeknek kell egymásra épülniük, és ezáltal kizárhatók a megoldhatatlan vagy a túl korán lezárható pályák.</w:t>
+      </w:r>
+    </w:p>
+    <w:p>
+      <w:pPr>
+        <w:pStyle w:val="Szakdolgozath3"/>
+      </w:pPr>
+      <w:r>
+        <w:t>Puzzle</w:t>
+      </w:r>
+    </w:p>
+    <w:p>
+      <w:pPr>
+        <w:pStyle w:val="Szakdolgozatbekezds"/>
+      </w:pPr>
+      <w:r>
+        <w:t>A modellben puzzle alatt nem egyetlen objektumot, hanem egy önálló logikai feladat-egységet értek. Egy puzzle célja mindig valamilyen új állapot előidézése: egy zár feloldása, egy konténer megnyitása, egy újabb nyom megszerzése, vagy végső esetben a kijárat aktiválása. Egy puzzle tehát több kisebb információelemből épül fel, és ezek együttes feldolgozása vezet el a megoldáshoz. A gráf szempontjából a puzzle egy olyan csomópontként fogható fel, amelyhez több bemenet tartozik, és amelynek teljesítése után a játékos új logikai állapotba kerül.</w:t>
+      </w:r>
+    </w:p>
+    <w:p>
+      <w:pPr>
+        <w:pStyle w:val="Szakdolgozath3"/>
+      </w:pPr>
+      <w:r>
+        <w:t>Részinformáció</w:t>
+      </w:r>
+    </w:p>
+    <w:p>
+      <w:pPr>
+        <w:pStyle w:val="Szakdolgozatbekezds"/>
+      </w:pPr>
+      <w:r>
+        <w:t>A részinformáció olyan önmagában még nem feltétlenül elegendő nyomelem, amely hozzájárul egy puzzle megoldásához. Ilyen lehet például egy számsor, egy szimbólum, egy feljegyzés, egy dátum, egy tárgyon látható jelölés vagy egy korábban megszerzett szabály, amely egy másik elem értelmezését teszi lehetővé. Fontos, hogy a részinformáció nem feltétlenül jelent azonnal megoldást: a játékos már a pálya elején is találkozhat vele, de a jelentése csak később válik világossá.</w:t>
+      </w:r>
+    </w:p>
+    <w:p>
+      <w:pPr>
+        <w:pStyle w:val="Szakdolgozath3"/>
+      </w:pPr>
+      <w:r>
+        <w:t xml:space="preserve">Kulcs </w:t>
+      </w:r>
+    </w:p>
+    <w:p>
+      <w:pPr>
+        <w:pStyle w:val="Szakdolgozatbekezds"/>
+      </w:pPr>
+      <w:r>
+        <w:t xml:space="preserve">A kulcs fogalma a rendszerben kétféleképpen jelenhet meg. Egyrészt jelenthet konkrét, felvehető </w:t>
+      </w:r>
+      <w:proofErr w:type="spellStart"/>
+      <w:r>
+        <w:t>játékbeli</w:t>
+      </w:r>
+      <w:proofErr w:type="spellEnd"/>
+      <w:r>
+        <w:t xml:space="preserve"> tárgyat, amely egy zár </w:t>
+      </w:r>
+      <w:proofErr w:type="spellStart"/>
+      <w:r>
+        <w:t>aktivátora</w:t>
+      </w:r>
+      <w:proofErr w:type="spellEnd"/>
+      <w:r>
+        <w:t xml:space="preserve">, vagyis egy </w:t>
+      </w:r>
+      <w:proofErr w:type="spellStart"/>
+      <w:r>
+        <w:t>Pickable</w:t>
+      </w:r>
+      <w:proofErr w:type="spellEnd"/>
+      <w:r>
+        <w:t xml:space="preserve"> típusú objektumként viselkedik. Másrészt tágabb értelemben kulcsnak tekinthető minden olyan végső információ is, amely közvetlenül felold egy </w:t>
+      </w:r>
+      <w:proofErr w:type="spellStart"/>
+      <w:r>
+        <w:t>zárat</w:t>
+      </w:r>
+      <w:proofErr w:type="spellEnd"/>
+      <w:r>
+        <w:t>, például egy számszerű kód, betűkombináció vagy jelszó. Ennek megfelelően a kulcs nem kizárólag fizikai tárgy, hanem a puzzle eredményeként előálló, közvetlenül felhasználható megoldási elem. A gráfban ezért a kulcs inkább funkcionális szerepként értelmezhető: olyan kimenet, amely egy következő csomópont aktiválását teszi lehetővé.</w:t>
+      </w:r>
+    </w:p>
+    <w:p>
+      <w:pPr>
+        <w:pStyle w:val="Szakdolgozatbekezds"/>
+      </w:pPr>
+    </w:p>
+    <w:p>
+      <w:pPr>
+        <w:pStyle w:val="Szakdolgozath3"/>
+      </w:pPr>
+      <w:r>
+        <w:lastRenderedPageBreak/>
+        <w:t>Generális játék objektumok és gráf közti párhuzam</w:t>
+      </w:r>
+    </w:p>
+    <w:p>
+      <w:pPr>
+        <w:pStyle w:val="Szakdolgozatbekezds"/>
+      </w:pPr>
+      <w:r>
+        <w:t xml:space="preserve">A korábban definiált generális játékelemek, mint a </w:t>
+      </w:r>
+      <w:proofErr w:type="spellStart"/>
+      <w:r>
+        <w:t>Pickable</w:t>
+      </w:r>
+      <w:proofErr w:type="spellEnd"/>
+      <w:r>
+        <w:t xml:space="preserve">, </w:t>
+      </w:r>
+      <w:proofErr w:type="spellStart"/>
+      <w:r>
+        <w:t>Inspectable</w:t>
+      </w:r>
+      <w:proofErr w:type="spellEnd"/>
+      <w:r>
+        <w:t xml:space="preserve">, </w:t>
+      </w:r>
+      <w:proofErr w:type="spellStart"/>
+      <w:r>
+        <w:t>Container</w:t>
+      </w:r>
+      <w:proofErr w:type="spellEnd"/>
+      <w:r>
+        <w:t xml:space="preserve">, </w:t>
+      </w:r>
+      <w:proofErr w:type="spellStart"/>
+      <w:r>
+        <w:t>MovableCover</w:t>
+      </w:r>
+      <w:proofErr w:type="spellEnd"/>
+      <w:r>
+        <w:t xml:space="preserve"> és </w:t>
+      </w:r>
+      <w:proofErr w:type="spellStart"/>
+      <w:r>
+        <w:t>Exit</w:t>
+      </w:r>
+      <w:proofErr w:type="spellEnd"/>
+      <w:r>
+        <w:t xml:space="preserve">, ebben a modellben a gráf absztrakt csomópontjainak konkrét </w:t>
+      </w:r>
+      <w:proofErr w:type="spellStart"/>
+      <w:r>
+        <w:t>játékbeli</w:t>
+      </w:r>
+      <w:proofErr w:type="spellEnd"/>
+      <w:r>
+        <w:t xml:space="preserve"> megvalósításai. A részinformáció tipikusan egy </w:t>
+      </w:r>
+      <w:proofErr w:type="spellStart"/>
+      <w:r>
+        <w:t>Inspectable</w:t>
+      </w:r>
+      <w:proofErr w:type="spellEnd"/>
+      <w:r>
+        <w:t xml:space="preserve"> objektumhoz kapcsolódik, például egy jegyzethez, festményhez vagy órához, de megjelenhet egy konténer tartalmaként is. Egy fizikai kulcs többnyire </w:t>
+      </w:r>
+      <w:proofErr w:type="spellStart"/>
+      <w:r>
+        <w:t>Pickable</w:t>
+      </w:r>
+      <w:proofErr w:type="spellEnd"/>
+      <w:r>
+        <w:t xml:space="preserve"> objektum formájában létezik. Egy puzzle lezárása gyakran valamely </w:t>
+      </w:r>
+      <w:proofErr w:type="spellStart"/>
+      <w:r>
+        <w:t>Lock</w:t>
+      </w:r>
+      <w:proofErr w:type="spellEnd"/>
+      <w:r>
+        <w:t xml:space="preserve"> feloldásával történik, amely egy </w:t>
+      </w:r>
+      <w:proofErr w:type="spellStart"/>
+      <w:r>
+        <w:t>Container</w:t>
+      </w:r>
+      <w:proofErr w:type="spellEnd"/>
+      <w:r>
+        <w:t xml:space="preserve"> vagy végső esetben az </w:t>
+      </w:r>
+      <w:proofErr w:type="spellStart"/>
+      <w:r>
+        <w:t>Exit</w:t>
+      </w:r>
+      <w:proofErr w:type="spellEnd"/>
+      <w:r>
+        <w:t xml:space="preserve"> állapotát változtatja meg. Így a gráf magas szintű logikai szerkezete és a játékmotor konkrét objektumrendszere között közvetlen megfeleltetés hozható létre, ami jelentősen megkönnyíti a generálás és az ellenőrzés folyamatát.</w:t>
+      </w:r>
+    </w:p>
+    <w:p>
+      <w:pPr>
+        <w:pStyle w:val="Szakdolgozath3"/>
+      </w:pPr>
+      <w:r>
+        <w:t>Konklúzió</w:t>
+      </w:r>
+    </w:p>
+    <w:p>
+      <w:pPr>
+        <w:pStyle w:val="Szakdolgozatbekezds"/>
+      </w:pPr>
+      <w:r>
+        <w:t xml:space="preserve">A gráf alapú leírás bevezetésével a pályagenerálás lényegesen megbízhatóbbá vált. A modell számára így már nem csupán az a feladat, hogy érdekes feladványokat hozzon létre, hanem az is, hogy ezeket egy konzisztens, sorrendhelyes függőségi rendszerbe rendezze. </w:t>
+      </w:r>
+      <w:r>
+        <w:t>Elméleti szinten e</w:t>
+      </w:r>
+      <w:r>
+        <w:t xml:space="preserve">z a megközelítés </w:t>
+      </w:r>
+      <w:proofErr w:type="gramStart"/>
+      <w:r>
+        <w:t>biztosítja</w:t>
+      </w:r>
+      <w:proofErr w:type="gramEnd"/>
+      <w:r>
+        <w:t xml:space="preserve"> </w:t>
+      </w:r>
+      <w:r>
+        <w:t>hogy minden puzzle megoldható legyen, minden szükséges információ rendelkezésre álljon, és a kijárat valóban a teljes pálya lezárását jelentse.</w:t>
+      </w:r>
+    </w:p>
+    <w:p>
+      <w:pPr>
+        <w:pStyle w:val="Szakdolgozath2"/>
+      </w:pPr>
+      <w:bookmarkStart w:id="27" w:name="_Toc225527496"/>
+      <w:r>
+        <w:t>Pálya generálás folyamatai, többlépcsős generálás oka</w:t>
+      </w:r>
+      <w:bookmarkEnd w:id="27"/>
+    </w:p>
+    <w:p>
+      <w:pPr>
+        <w:pStyle w:val="Szakdolgozatbekezds"/>
+      </w:pPr>
+    </w:p>
+    <w:p>
+      <w:pPr>
+        <w:pStyle w:val="Szakdolgozatbekezds"/>
+      </w:pPr>
       <w:r>
         <w:br w:type="page"/>
       </w:r>
     </w:p>
-    <w:bookmarkStart w:id="26" w:name="_Toc225520379" w:displacedByCustomXml="next"/>
+    <w:bookmarkStart w:id="28" w:name="_Toc225527497" w:displacedByCustomXml="next"/>
     <w:sdt>
       <w:sdtPr>
         <w:rPr>
@@ -7527,7 +8098,7 @@
           <w:r>
             <w:t>Irodalomjegyzék</w:t>
           </w:r>
-          <w:bookmarkEnd w:id="26"/>
+          <w:bookmarkEnd w:id="28"/>
         </w:p>
         <w:sdt>
           <w:sdtPr>
@@ -8479,12 +9050,12 @@
       <w:pPr>
         <w:pStyle w:val="szmozatlanSzakdolgozath1"/>
       </w:pPr>
-      <w:bookmarkStart w:id="27" w:name="_Toc225520380"/>
+      <w:bookmarkStart w:id="29" w:name="_Toc225527498"/>
       <w:r>
         <w:lastRenderedPageBreak/>
         <w:t>Nyilatkozat</w:t>
       </w:r>
-      <w:bookmarkEnd w:id="27"/>
+      <w:bookmarkEnd w:id="29"/>
     </w:p>
     <w:p>
       <w:pPr>
@@ -8592,25 +9163,25 @@
       <w:pPr>
         <w:pStyle w:val="szmozatlanSzakdolgozath1"/>
       </w:pPr>
-      <w:bookmarkStart w:id="28" w:name="_Toc225520381"/>
+      <w:bookmarkStart w:id="30" w:name="_Toc225527499"/>
       <w:r>
         <w:lastRenderedPageBreak/>
         <w:t>Mellékletek</w:t>
       </w:r>
-      <w:bookmarkEnd w:id="28"/>
+      <w:bookmarkEnd w:id="30"/>
     </w:p>
     <w:p>
       <w:pPr>
         <w:pStyle w:val="Szakdolgozath2"/>
       </w:pPr>
-      <w:bookmarkStart w:id="29" w:name="_Toc225520382"/>
+      <w:bookmarkStart w:id="31" w:name="_Toc225527500"/>
       <w:r>
         <w:t>Adatbázis</w:t>
       </w:r>
       <w:r>
         <w:t xml:space="preserve"> relációk</w:t>
       </w:r>
-      <w:bookmarkEnd w:id="29"/>
+      <w:bookmarkEnd w:id="31"/>
     </w:p>
     <w:p>
       <w:pPr>
@@ -8700,8 +9271,78 @@
         </w:drawing>
       </w:r>
     </w:p>
+    <w:p>
+      <w:pPr>
+        <w:pStyle w:val="Szakdolgozath2"/>
+      </w:pPr>
+      <w:bookmarkStart w:id="32" w:name="_Toc225527501"/>
+      <w:r>
+        <w:lastRenderedPageBreak/>
+        <w:t>Gráf alapú pálya struktúra definiálása</w:t>
+      </w:r>
+      <w:bookmarkEnd w:id="32"/>
+    </w:p>
+    <w:p>
+      <w:pPr>
+        <w:pStyle w:val="Szakdolgozatbekezds"/>
+        <w:jc w:val="center"/>
+      </w:pPr>
+      <w:r>
+        <w:rPr>
+          <w:noProof/>
+        </w:rPr>
+        <w:drawing>
+          <wp:inline distT="0" distB="0" distL="0" distR="0" wp14:anchorId="1D8F9020" wp14:editId="7812D055">
+            <wp:extent cx="5610860" cy="6878955"/>
+            <wp:effectExtent l="0" t="0" r="8890" b="0"/>
+            <wp:docPr id="1793856804" name="Picture 2"/>
+            <wp:cNvGraphicFramePr>
+              <a:graphicFrameLocks xmlns:a="http://schemas.openxmlformats.org/drawingml/2006/main" noChangeAspect="1"/>
+            </wp:cNvGraphicFramePr>
+            <a:graphic xmlns:a="http://schemas.openxmlformats.org/drawingml/2006/main">
+              <a:graphicData uri="http://schemas.openxmlformats.org/drawingml/2006/picture">
+                <pic:pic xmlns:pic="http://schemas.openxmlformats.org/drawingml/2006/picture">
+                  <pic:nvPicPr>
+                    <pic:cNvPr id="0" name="Picture 2"/>
+                    <pic:cNvPicPr>
+                      <a:picLocks noChangeAspect="1" noChangeArrowheads="1"/>
+                    </pic:cNvPicPr>
+                  </pic:nvPicPr>
+                  <pic:blipFill>
+                    <a:blip r:embed="rId9" cstate="print">
+                      <a:extLst>
+                        <a:ext uri="{28A0092B-C50C-407E-A947-70E740481C1C}">
+                          <a14:useLocalDpi xmlns:a14="http://schemas.microsoft.com/office/drawing/2010/main" val="0"/>
+                        </a:ext>
+                      </a:extLst>
+                    </a:blip>
+                    <a:srcRect/>
+                    <a:stretch>
+                      <a:fillRect/>
+                    </a:stretch>
+                  </pic:blipFill>
+                  <pic:spPr bwMode="auto">
+                    <a:xfrm>
+                      <a:off x="0" y="0"/>
+                      <a:ext cx="5610860" cy="6878955"/>
+                    </a:xfrm>
+                    <a:prstGeom prst="rect">
+                      <a:avLst/>
+                    </a:prstGeom>
+                    <a:noFill/>
+                    <a:ln>
+                      <a:noFill/>
+                    </a:ln>
+                  </pic:spPr>
+                </pic:pic>
+              </a:graphicData>
+            </a:graphic>
+          </wp:inline>
+        </w:drawing>
+      </w:r>
+    </w:p>
     <w:sectPr>
-      <w:footerReference w:type="default" r:id="rId9"/>
+      <w:footerReference w:type="default" r:id="rId10"/>
       <w:pgSz w:w="12240" w:h="15840" w:code="1"/>
       <w:pgMar w:top="1418" w:right="1418" w:bottom="1418" w:left="1418" w:header="720" w:footer="720" w:gutter="567"/>
       <w:pgNumType w:start="2"/>

</xml_diff>

<commit_message>
feat(szakdolgozat): pálya generálása - Több lépcsős generálás folyamata
</commit_message>
<xml_diff>
--- a/Szakdolgozat.docx
+++ b/Szakdolgozat.docx
@@ -529,7 +529,7 @@
       <w:pPr>
         <w:pStyle w:val="szmozatlanSzakdolgozath1"/>
       </w:pPr>
-      <w:bookmarkStart w:id="0" w:name="_Toc225527477"/>
+      <w:bookmarkStart w:id="0" w:name="_Toc225600699"/>
       <w:r>
         <w:lastRenderedPageBreak/>
         <w:t>Feladatkiírás</w:t>
@@ -765,7 +765,7 @@
       <w:pPr>
         <w:pStyle w:val="szmozatlanSzakdolgozath1"/>
       </w:pPr>
-      <w:bookmarkStart w:id="1" w:name="_Toc225527478"/>
+      <w:bookmarkStart w:id="1" w:name="_Toc225600700"/>
       <w:r>
         <w:lastRenderedPageBreak/>
         <w:t>Tartalomjegyzék</w:t>
@@ -828,7 +828,7 @@
           <w:r>
             <w:fldChar w:fldCharType="separate"/>
           </w:r>
-          <w:hyperlink w:anchor="_Toc225527477" w:history="1">
+          <w:hyperlink w:anchor="_Toc225600699" w:history="1">
             <w:r>
               <w:rPr>
                 <w:rStyle w:val="Hyperlink"/>
@@ -855,7 +855,7 @@
                 <w:noProof/>
                 <w:webHidden/>
               </w:rPr>
-              <w:instrText xml:space="preserve"> PAGEREF _Toc225527477 \h </w:instrText>
+              <w:instrText xml:space="preserve"> PAGEREF _Toc225600699 \h </w:instrText>
             </w:r>
             <w:r>
               <w:rPr>
@@ -900,7 +900,7 @@
               <w:lang w:val="en-US"/>
             </w:rPr>
           </w:pPr>
-          <w:hyperlink w:anchor="_Toc225527478" w:history="1">
+          <w:hyperlink w:anchor="_Toc225600700" w:history="1">
             <w:r>
               <w:rPr>
                 <w:rStyle w:val="Hyperlink"/>
@@ -927,7 +927,7 @@
                 <w:noProof/>
                 <w:webHidden/>
               </w:rPr>
-              <w:instrText xml:space="preserve"> PAGEREF _Toc225527478 \h </w:instrText>
+              <w:instrText xml:space="preserve"> PAGEREF _Toc225600700 \h </w:instrText>
             </w:r>
             <w:r>
               <w:rPr>
@@ -973,7 +973,7 @@
               <w:lang w:val="en-US"/>
             </w:rPr>
           </w:pPr>
-          <w:hyperlink w:anchor="_Toc225527479" w:history="1">
+          <w:hyperlink w:anchor="_Toc225600701" w:history="1">
             <w:r>
               <w:rPr>
                 <w:rStyle w:val="Hyperlink"/>
@@ -1018,7 +1018,7 @@
                 <w:noProof/>
                 <w:webHidden/>
               </w:rPr>
-              <w:instrText xml:space="preserve"> PAGEREF _Toc225527479 \h </w:instrText>
+              <w:instrText xml:space="preserve"> PAGEREF _Toc225600701 \h </w:instrText>
             </w:r>
             <w:r>
               <w:rPr>
@@ -1064,7 +1064,7 @@
               <w:lang w:val="en-US"/>
             </w:rPr>
           </w:pPr>
-          <w:hyperlink w:anchor="_Toc225527480" w:history="1">
+          <w:hyperlink w:anchor="_Toc225600702" w:history="1">
             <w:r>
               <w:rPr>
                 <w:rStyle w:val="Hyperlink"/>
@@ -1108,7 +1108,7 @@
                 <w:noProof/>
                 <w:webHidden/>
               </w:rPr>
-              <w:instrText xml:space="preserve"> PAGEREF _Toc225527480 \h </w:instrText>
+              <w:instrText xml:space="preserve"> PAGEREF _Toc225600702 \h </w:instrText>
             </w:r>
             <w:r>
               <w:rPr>
@@ -1154,7 +1154,7 @@
               <w:lang w:val="en-US"/>
             </w:rPr>
           </w:pPr>
-          <w:hyperlink w:anchor="_Toc225527481" w:history="1">
+          <w:hyperlink w:anchor="_Toc225600703" w:history="1">
             <w:r>
               <w:rPr>
                 <w:rStyle w:val="Hyperlink"/>
@@ -1198,7 +1198,7 @@
                 <w:noProof/>
                 <w:webHidden/>
               </w:rPr>
-              <w:instrText xml:space="preserve"> PAGEREF _Toc225527481 \h </w:instrText>
+              <w:instrText xml:space="preserve"> PAGEREF _Toc225600703 \h </w:instrText>
             </w:r>
             <w:r>
               <w:rPr>
@@ -1244,7 +1244,7 @@
               <w:lang w:val="en-US"/>
             </w:rPr>
           </w:pPr>
-          <w:hyperlink w:anchor="_Toc225527482" w:history="1">
+          <w:hyperlink w:anchor="_Toc225600704" w:history="1">
             <w:r>
               <w:rPr>
                 <w:rStyle w:val="Hyperlink"/>
@@ -1288,7 +1288,7 @@
                 <w:noProof/>
                 <w:webHidden/>
               </w:rPr>
-              <w:instrText xml:space="preserve"> PAGEREF _Toc225527482 \h </w:instrText>
+              <w:instrText xml:space="preserve"> PAGEREF _Toc225600704 \h </w:instrText>
             </w:r>
             <w:r>
               <w:rPr>
@@ -1334,7 +1334,7 @@
               <w:lang w:val="en-US"/>
             </w:rPr>
           </w:pPr>
-          <w:hyperlink w:anchor="_Toc225527483" w:history="1">
+          <w:hyperlink w:anchor="_Toc225600705" w:history="1">
             <w:r>
               <w:rPr>
                 <w:rStyle w:val="Hyperlink"/>
@@ -1378,7 +1378,7 @@
                 <w:noProof/>
                 <w:webHidden/>
               </w:rPr>
-              <w:instrText xml:space="preserve"> PAGEREF _Toc225527483 \h </w:instrText>
+              <w:instrText xml:space="preserve"> PAGEREF _Toc225600705 \h </w:instrText>
             </w:r>
             <w:r>
               <w:rPr>
@@ -1424,7 +1424,7 @@
               <w:lang w:val="en-US"/>
             </w:rPr>
           </w:pPr>
-          <w:hyperlink w:anchor="_Toc225527484" w:history="1">
+          <w:hyperlink w:anchor="_Toc225600706" w:history="1">
             <w:r>
               <w:rPr>
                 <w:rStyle w:val="Hyperlink"/>
@@ -1468,7 +1468,7 @@
                 <w:noProof/>
                 <w:webHidden/>
               </w:rPr>
-              <w:instrText xml:space="preserve"> PAGEREF _Toc225527484 \h </w:instrText>
+              <w:instrText xml:space="preserve"> PAGEREF _Toc225600706 \h </w:instrText>
             </w:r>
             <w:r>
               <w:rPr>
@@ -1514,7 +1514,7 @@
               <w:lang w:val="en-US"/>
             </w:rPr>
           </w:pPr>
-          <w:hyperlink w:anchor="_Toc225527485" w:history="1">
+          <w:hyperlink w:anchor="_Toc225600707" w:history="1">
             <w:r>
               <w:rPr>
                 <w:rStyle w:val="Hyperlink"/>
@@ -1558,7 +1558,7 @@
                 <w:noProof/>
                 <w:webHidden/>
               </w:rPr>
-              <w:instrText xml:space="preserve"> PAGEREF _Toc225527485 \h </w:instrText>
+              <w:instrText xml:space="preserve"> PAGEREF _Toc225600707 \h </w:instrText>
             </w:r>
             <w:r>
               <w:rPr>
@@ -1604,7 +1604,7 @@
               <w:lang w:val="en-US"/>
             </w:rPr>
           </w:pPr>
-          <w:hyperlink w:anchor="_Toc225527486" w:history="1">
+          <w:hyperlink w:anchor="_Toc225600708" w:history="1">
             <w:r>
               <w:rPr>
                 <w:rStyle w:val="Hyperlink"/>
@@ -1648,7 +1648,7 @@
                 <w:noProof/>
                 <w:webHidden/>
               </w:rPr>
-              <w:instrText xml:space="preserve"> PAGEREF _Toc225527486 \h </w:instrText>
+              <w:instrText xml:space="preserve"> PAGEREF _Toc225600708 \h </w:instrText>
             </w:r>
             <w:r>
               <w:rPr>
@@ -1694,7 +1694,7 @@
               <w:lang w:val="en-US"/>
             </w:rPr>
           </w:pPr>
-          <w:hyperlink w:anchor="_Toc225527487" w:history="1">
+          <w:hyperlink w:anchor="_Toc225600709" w:history="1">
             <w:r>
               <w:rPr>
                 <w:rStyle w:val="Hyperlink"/>
@@ -1738,7 +1738,7 @@
                 <w:noProof/>
                 <w:webHidden/>
               </w:rPr>
-              <w:instrText xml:space="preserve"> PAGEREF _Toc225527487 \h </w:instrText>
+              <w:instrText xml:space="preserve"> PAGEREF _Toc225600709 \h </w:instrText>
             </w:r>
             <w:r>
               <w:rPr>
@@ -1784,7 +1784,7 @@
               <w:lang w:val="en-US"/>
             </w:rPr>
           </w:pPr>
-          <w:hyperlink w:anchor="_Toc225527488" w:history="1">
+          <w:hyperlink w:anchor="_Toc225600710" w:history="1">
             <w:r>
               <w:rPr>
                 <w:rStyle w:val="Hyperlink"/>
@@ -1828,7 +1828,7 @@
                 <w:noProof/>
                 <w:webHidden/>
               </w:rPr>
-              <w:instrText xml:space="preserve"> PAGEREF _Toc225527488 \h </w:instrText>
+              <w:instrText xml:space="preserve"> PAGEREF _Toc225600710 \h </w:instrText>
             </w:r>
             <w:r>
               <w:rPr>
@@ -1874,7 +1874,7 @@
               <w:lang w:val="en-US"/>
             </w:rPr>
           </w:pPr>
-          <w:hyperlink w:anchor="_Toc225527489" w:history="1">
+          <w:hyperlink w:anchor="_Toc225600711" w:history="1">
             <w:r>
               <w:rPr>
                 <w:rStyle w:val="Hyperlink"/>
@@ -1918,7 +1918,7 @@
                 <w:noProof/>
                 <w:webHidden/>
               </w:rPr>
-              <w:instrText xml:space="preserve"> PAGEREF _Toc225527489 \h </w:instrText>
+              <w:instrText xml:space="preserve"> PAGEREF _Toc225600711 \h </w:instrText>
             </w:r>
             <w:r>
               <w:rPr>
@@ -1964,7 +1964,7 @@
               <w:lang w:val="en-US"/>
             </w:rPr>
           </w:pPr>
-          <w:hyperlink w:anchor="_Toc225527490" w:history="1">
+          <w:hyperlink w:anchor="_Toc225600712" w:history="1">
             <w:r>
               <w:rPr>
                 <w:rStyle w:val="Hyperlink"/>
@@ -2008,7 +2008,7 @@
                 <w:noProof/>
                 <w:webHidden/>
               </w:rPr>
-              <w:instrText xml:space="preserve"> PAGEREF _Toc225527490 \h </w:instrText>
+              <w:instrText xml:space="preserve"> PAGEREF _Toc225600712 \h </w:instrText>
             </w:r>
             <w:r>
               <w:rPr>
@@ -2054,7 +2054,7 @@
               <w:lang w:val="en-US"/>
             </w:rPr>
           </w:pPr>
-          <w:hyperlink w:anchor="_Toc225527491" w:history="1">
+          <w:hyperlink w:anchor="_Toc225600713" w:history="1">
             <w:r>
               <w:rPr>
                 <w:rStyle w:val="Hyperlink"/>
@@ -2098,7 +2098,7 @@
                 <w:noProof/>
                 <w:webHidden/>
               </w:rPr>
-              <w:instrText xml:space="preserve"> PAGEREF _Toc225527491 \h </w:instrText>
+              <w:instrText xml:space="preserve"> PAGEREF _Toc225600713 \h </w:instrText>
             </w:r>
             <w:r>
               <w:rPr>
@@ -2144,7 +2144,7 @@
               <w:lang w:val="en-US"/>
             </w:rPr>
           </w:pPr>
-          <w:hyperlink w:anchor="_Toc225527492" w:history="1">
+          <w:hyperlink w:anchor="_Toc225600714" w:history="1">
             <w:r>
               <w:rPr>
                 <w:rStyle w:val="Hyperlink"/>
@@ -2188,7 +2188,7 @@
                 <w:noProof/>
                 <w:webHidden/>
               </w:rPr>
-              <w:instrText xml:space="preserve"> PAGEREF _Toc225527492 \h </w:instrText>
+              <w:instrText xml:space="preserve"> PAGEREF _Toc225600714 \h </w:instrText>
             </w:r>
             <w:r>
               <w:rPr>
@@ -2234,7 +2234,7 @@
               <w:lang w:val="en-US"/>
             </w:rPr>
           </w:pPr>
-          <w:hyperlink w:anchor="_Toc225527493" w:history="1">
+          <w:hyperlink w:anchor="_Toc225600715" w:history="1">
             <w:r>
               <w:rPr>
                 <w:rStyle w:val="Hyperlink"/>
@@ -2278,7 +2278,7 @@
                 <w:noProof/>
                 <w:webHidden/>
               </w:rPr>
-              <w:instrText xml:space="preserve"> PAGEREF _Toc225527493 \h </w:instrText>
+              <w:instrText xml:space="preserve"> PAGEREF _Toc225600715 \h </w:instrText>
             </w:r>
             <w:r>
               <w:rPr>
@@ -2324,7 +2324,7 @@
               <w:lang w:val="en-US"/>
             </w:rPr>
           </w:pPr>
-          <w:hyperlink w:anchor="_Toc225527494" w:history="1">
+          <w:hyperlink w:anchor="_Toc225600716" w:history="1">
             <w:r>
               <w:rPr>
                 <w:rStyle w:val="Hyperlink"/>
@@ -2368,7 +2368,7 @@
                 <w:noProof/>
                 <w:webHidden/>
               </w:rPr>
-              <w:instrText xml:space="preserve"> PAGEREF _Toc225527494 \h </w:instrText>
+              <w:instrText xml:space="preserve"> PAGEREF _Toc225600716 \h </w:instrText>
             </w:r>
             <w:r>
               <w:rPr>
@@ -2414,7 +2414,7 @@
               <w:lang w:val="en-US"/>
             </w:rPr>
           </w:pPr>
-          <w:hyperlink w:anchor="_Toc225527495" w:history="1">
+          <w:hyperlink w:anchor="_Toc225600717" w:history="1">
             <w:r>
               <w:rPr>
                 <w:rStyle w:val="Hyperlink"/>
@@ -2458,7 +2458,7 @@
                 <w:noProof/>
                 <w:webHidden/>
               </w:rPr>
-              <w:instrText xml:space="preserve"> PAGEREF _Toc225527495 \h </w:instrText>
+              <w:instrText xml:space="preserve"> PAGEREF _Toc225600717 \h </w:instrText>
             </w:r>
             <w:r>
               <w:rPr>
@@ -2504,7 +2504,7 @@
               <w:lang w:val="en-US"/>
             </w:rPr>
           </w:pPr>
-          <w:hyperlink w:anchor="_Toc225527496" w:history="1">
+          <w:hyperlink w:anchor="_Toc225600718" w:history="1">
             <w:r>
               <w:rPr>
                 <w:rStyle w:val="Hyperlink"/>
@@ -2527,7 +2527,7 @@
                 <w:rStyle w:val="Hyperlink"/>
                 <w:noProof/>
               </w:rPr>
-              <w:t>Pálya generálás folyamatai, többlépcsős generálás oka</w:t>
+              <w:t>Pálya generálás folyamatai, többlépcsős generálás</w:t>
             </w:r>
             <w:r>
               <w:rPr>
@@ -2548,7 +2548,7 @@
                 <w:noProof/>
                 <w:webHidden/>
               </w:rPr>
-              <w:instrText xml:space="preserve"> PAGEREF _Toc225527496 \h </w:instrText>
+              <w:instrText xml:space="preserve"> PAGEREF _Toc225600718 \h </w:instrText>
             </w:r>
             <w:r>
               <w:rPr>
@@ -2593,7 +2593,7 @@
               <w:lang w:val="en-US"/>
             </w:rPr>
           </w:pPr>
-          <w:hyperlink w:anchor="_Toc225527497" w:history="1">
+          <w:hyperlink w:anchor="_Toc225600719" w:history="1">
             <w:r>
               <w:rPr>
                 <w:rStyle w:val="Hyperlink"/>
@@ -2620,7 +2620,7 @@
                 <w:noProof/>
                 <w:webHidden/>
               </w:rPr>
-              <w:instrText xml:space="preserve"> PAGEREF _Toc225527497 \h </w:instrText>
+              <w:instrText xml:space="preserve"> PAGEREF _Toc225600719 \h </w:instrText>
             </w:r>
             <w:r>
               <w:rPr>
@@ -2640,7 +2640,7 @@
                 <w:noProof/>
                 <w:webHidden/>
               </w:rPr>
-              <w:t>20</w:t>
+              <w:t>23</w:t>
             </w:r>
             <w:r>
               <w:rPr>
@@ -2665,7 +2665,7 @@
               <w:lang w:val="en-US"/>
             </w:rPr>
           </w:pPr>
-          <w:hyperlink w:anchor="_Toc225527498" w:history="1">
+          <w:hyperlink w:anchor="_Toc225600720" w:history="1">
             <w:r>
               <w:rPr>
                 <w:rStyle w:val="Hyperlink"/>
@@ -2692,7 +2692,7 @@
                 <w:noProof/>
                 <w:webHidden/>
               </w:rPr>
-              <w:instrText xml:space="preserve"> PAGEREF _Toc225527498 \h </w:instrText>
+              <w:instrText xml:space="preserve"> PAGEREF _Toc225600720 \h </w:instrText>
             </w:r>
             <w:r>
               <w:rPr>
@@ -2712,7 +2712,7 @@
                 <w:noProof/>
                 <w:webHidden/>
               </w:rPr>
-              <w:t>21</w:t>
+              <w:t>24</w:t>
             </w:r>
             <w:r>
               <w:rPr>
@@ -2737,7 +2737,7 @@
               <w:lang w:val="en-US"/>
             </w:rPr>
           </w:pPr>
-          <w:hyperlink w:anchor="_Toc225527499" w:history="1">
+          <w:hyperlink w:anchor="_Toc225600721" w:history="1">
             <w:r>
               <w:rPr>
                 <w:rStyle w:val="Hyperlink"/>
@@ -2764,7 +2764,7 @@
                 <w:noProof/>
                 <w:webHidden/>
               </w:rPr>
-              <w:instrText xml:space="preserve"> PAGEREF _Toc225527499 \h </w:instrText>
+              <w:instrText xml:space="preserve"> PAGEREF _Toc225600721 \h </w:instrText>
             </w:r>
             <w:r>
               <w:rPr>
@@ -2784,7 +2784,7 @@
                 <w:noProof/>
                 <w:webHidden/>
               </w:rPr>
-              <w:t>22</w:t>
+              <w:t>25</w:t>
             </w:r>
             <w:r>
               <w:rPr>
@@ -2810,7 +2810,7 @@
               <w:lang w:val="en-US"/>
             </w:rPr>
           </w:pPr>
-          <w:hyperlink w:anchor="_Toc225527500" w:history="1">
+          <w:hyperlink w:anchor="_Toc225600722" w:history="1">
             <w:r>
               <w:rPr>
                 <w:rStyle w:val="Hyperlink"/>
@@ -2854,7 +2854,7 @@
                 <w:noProof/>
                 <w:webHidden/>
               </w:rPr>
-              <w:instrText xml:space="preserve"> PAGEREF _Toc225527500 \h </w:instrText>
+              <w:instrText xml:space="preserve"> PAGEREF _Toc225600722 \h </w:instrText>
             </w:r>
             <w:r>
               <w:rPr>
@@ -2874,7 +2874,7 @@
                 <w:noProof/>
                 <w:webHidden/>
               </w:rPr>
-              <w:t>22</w:t>
+              <w:t>25</w:t>
             </w:r>
             <w:r>
               <w:rPr>
@@ -2900,7 +2900,7 @@
               <w:lang w:val="en-US"/>
             </w:rPr>
           </w:pPr>
-          <w:hyperlink w:anchor="_Toc225527501" w:history="1">
+          <w:hyperlink w:anchor="_Toc225600723" w:history="1">
             <w:r>
               <w:rPr>
                 <w:rStyle w:val="Hyperlink"/>
@@ -2944,7 +2944,7 @@
                 <w:noProof/>
                 <w:webHidden/>
               </w:rPr>
-              <w:instrText xml:space="preserve"> PAGEREF _Toc225527501 \h </w:instrText>
+              <w:instrText xml:space="preserve"> PAGEREF _Toc225600723 \h </w:instrText>
             </w:r>
             <w:r>
               <w:rPr>
@@ -2964,7 +2964,7 @@
                 <w:noProof/>
                 <w:webHidden/>
               </w:rPr>
-              <w:t>23</w:t>
+              <w:t>26</w:t>
             </w:r>
             <w:r>
               <w:rPr>
@@ -3137,6 +3137,7 @@
         <w:jc w:val="both"/>
         <w:rPr>
           <w:rFonts w:ascii="Times New Roman" w:hAnsi="Times New Roman" w:cs="Times New Roman"/>
+          <w:strike/>
           <w:color w:val="EE0000"/>
           <w:sz w:val="24"/>
           <w:szCs w:val="24"/>
@@ -3145,6 +3146,7 @@
       <w:r>
         <w:rPr>
           <w:rFonts w:ascii="Times New Roman" w:hAnsi="Times New Roman" w:cs="Times New Roman"/>
+          <w:strike/>
           <w:color w:val="EE0000"/>
           <w:sz w:val="24"/>
           <w:szCs w:val="24"/>
@@ -3156,6 +3158,7 @@
       <w:r>
         <w:rPr>
           <w:rFonts w:ascii="Times New Roman" w:hAnsi="Times New Roman" w:cs="Times New Roman"/>
+          <w:strike/>
           <w:color w:val="EE0000"/>
           <w:sz w:val="24"/>
           <w:szCs w:val="24"/>
@@ -3166,6 +3169,7 @@
       <w:r>
         <w:rPr>
           <w:rFonts w:ascii="Times New Roman" w:hAnsi="Times New Roman" w:cs="Times New Roman"/>
+          <w:strike/>
           <w:color w:val="EE0000"/>
           <w:sz w:val="24"/>
           <w:szCs w:val="24"/>
@@ -3846,7 +3850,7 @@
           <w:i/>
         </w:rPr>
       </w:pPr>
-      <w:bookmarkStart w:id="2" w:name="_Toc225527479"/>
+      <w:bookmarkStart w:id="2" w:name="_Toc225600701"/>
       <w:r>
         <w:lastRenderedPageBreak/>
         <w:t>Technológiák</w:t>
@@ -3865,7 +3869,7 @@
       <w:pPr>
         <w:pStyle w:val="Szakdolgozath2"/>
       </w:pPr>
-      <w:bookmarkStart w:id="3" w:name="_Toc225527480"/>
+      <w:bookmarkStart w:id="3" w:name="_Toc225600702"/>
       <w:r>
         <w:t xml:space="preserve">Docker és </w:t>
       </w:r>
@@ -4008,7 +4012,7 @@
       <w:pPr>
         <w:pStyle w:val="Szakdolgozath2"/>
       </w:pPr>
-      <w:bookmarkStart w:id="4" w:name="_Toc225527481"/>
+      <w:bookmarkStart w:id="4" w:name="_Toc225600703"/>
       <w:r>
         <w:t>Frontend technológiák</w:t>
       </w:r>
@@ -4468,7 +4472,7 @@
       <w:pPr>
         <w:pStyle w:val="Szakdolgozath2"/>
       </w:pPr>
-      <w:bookmarkStart w:id="5" w:name="_Toc225527482"/>
+      <w:bookmarkStart w:id="5" w:name="_Toc225600704"/>
       <w:r>
         <w:t>Backend technológiák</w:t>
       </w:r>
@@ -4858,7 +4862,7 @@
       <w:pPr>
         <w:pStyle w:val="Szakdolgozath2"/>
       </w:pPr>
-      <w:bookmarkStart w:id="6" w:name="_Toc225527483"/>
+      <w:bookmarkStart w:id="6" w:name="_Toc225600705"/>
       <w:r>
         <w:t>Valós idejű kommunikáció</w:t>
       </w:r>
@@ -5065,7 +5069,7 @@
       <w:pPr>
         <w:pStyle w:val="Szakdolgozath2"/>
       </w:pPr>
-      <w:bookmarkStart w:id="7" w:name="_Toc225527484"/>
+      <w:bookmarkStart w:id="7" w:name="_Toc225600706"/>
       <w:r>
         <w:t>Adatkezelés és tárolás</w:t>
       </w:r>
@@ -5223,7 +5227,7 @@
       <w:pPr>
         <w:pStyle w:val="Szakdolgozath2"/>
       </w:pPr>
-      <w:bookmarkStart w:id="8" w:name="_Toc225527485"/>
+      <w:bookmarkStart w:id="8" w:name="_Toc225600707"/>
       <w:r>
         <w:t>MI integráció</w:t>
       </w:r>
@@ -5306,7 +5310,7 @@
       <w:pPr>
         <w:pStyle w:val="SzekdolgozatH1"/>
       </w:pPr>
-      <w:bookmarkStart w:id="9" w:name="_Toc225527486"/>
+      <w:bookmarkStart w:id="9" w:name="_Toc225600708"/>
       <w:r>
         <w:t>Architektúra</w:t>
       </w:r>
@@ -5316,7 +5320,7 @@
       <w:pPr>
         <w:pStyle w:val="Szakdolgozath2"/>
       </w:pPr>
-      <w:bookmarkStart w:id="10" w:name="_Toc225527487"/>
+      <w:bookmarkStart w:id="10" w:name="_Toc225600709"/>
       <w:r>
         <w:t>Adatbázis felépítés –</w:t>
       </w:r>
@@ -6121,7 +6125,7 @@
       <w:pPr>
         <w:pStyle w:val="Szakdolgozath2"/>
       </w:pPr>
-      <w:bookmarkStart w:id="19" w:name="_Toc225527488"/>
+      <w:bookmarkStart w:id="19" w:name="_Toc225600710"/>
       <w:r>
         <w:t>Frontend</w:t>
       </w:r>
@@ -6383,7 +6387,7 @@
       <w:pPr>
         <w:pStyle w:val="Szakdolgozath2"/>
       </w:pPr>
-      <w:bookmarkStart w:id="20" w:name="_Toc225527489"/>
+      <w:bookmarkStart w:id="20" w:name="_Toc225600711"/>
       <w:r>
         <w:t>Backend API</w:t>
       </w:r>
@@ -6557,7 +6561,7 @@
       <w:pPr>
         <w:pStyle w:val="Szakdolgozath2"/>
       </w:pPr>
-      <w:bookmarkStart w:id="21" w:name="_Toc225527490"/>
+      <w:bookmarkStart w:id="21" w:name="_Toc225600712"/>
       <w:proofErr w:type="spellStart"/>
       <w:r>
         <w:t>WebSocket</w:t>
@@ -6664,7 +6668,7 @@
       <w:pPr>
         <w:pStyle w:val="Szakdolgozath2"/>
       </w:pPr>
-      <w:bookmarkStart w:id="22" w:name="_Toc225527491"/>
+      <w:bookmarkStart w:id="22" w:name="_Toc225600713"/>
       <w:r>
         <w:t xml:space="preserve">File </w:t>
       </w:r>
@@ -6986,7 +6990,7 @@
       <w:pPr>
         <w:pStyle w:val="Szakdolgozath2"/>
       </w:pPr>
-      <w:bookmarkStart w:id="23" w:name="_Toc225527492"/>
+      <w:bookmarkStart w:id="23" w:name="_Toc225600714"/>
       <w:r>
         <w:t>Biztonság</w:t>
       </w:r>
@@ -7184,7 +7188,7 @@
       <w:pPr>
         <w:pStyle w:val="SzekdolgozatH1"/>
       </w:pPr>
-      <w:bookmarkStart w:id="24" w:name="_Toc225527493"/>
+      <w:bookmarkStart w:id="24" w:name="_Toc225600715"/>
       <w:r>
         <w:lastRenderedPageBreak/>
         <w:t>Pálya Generálása</w:t>
@@ -7195,7 +7199,7 @@
       <w:pPr>
         <w:pStyle w:val="Szakdolgozath2"/>
       </w:pPr>
-      <w:bookmarkStart w:id="25" w:name="_Toc225527494"/>
+      <w:bookmarkStart w:id="25" w:name="_Toc225600716"/>
       <w:r>
         <w:t>Generikus játék modellek</w:t>
       </w:r>
@@ -7775,7 +7779,7 @@
       <w:pPr>
         <w:pStyle w:val="Szakdolgozath2"/>
       </w:pPr>
-      <w:bookmarkStart w:id="26" w:name="_Toc225527495"/>
+      <w:bookmarkStart w:id="26" w:name="_Toc225600717"/>
       <w:r>
         <w:t>Gráf alapú pálya struktúra definiálása</w:t>
       </w:r>
@@ -8053,26 +8057,421 @@
       <w:pPr>
         <w:pStyle w:val="Szakdolgozath2"/>
       </w:pPr>
-      <w:bookmarkStart w:id="27" w:name="_Toc225527496"/>
-      <w:r>
-        <w:t>Pálya generálás folyamatai, többlépcsős generálás oka</w:t>
+      <w:bookmarkStart w:id="27" w:name="_Toc225600718"/>
+      <w:r>
+        <w:t>Pálya generálás folyamatai, többlépcsős generálás</w:t>
       </w:r>
       <w:bookmarkEnd w:id="27"/>
     </w:p>
     <w:p>
       <w:pPr>
+        <w:pStyle w:val="Szakdolgozath3"/>
+      </w:pPr>
+      <w:r>
+        <w:t>Probléma</w:t>
+      </w:r>
+    </w:p>
+    <w:p>
+      <w:pPr>
         <w:pStyle w:val="Szakdolgozatbekezds"/>
       </w:pPr>
+      <w:r>
+        <w:t>Miután sikerült az egymásra épülő feladatok koncepcióját megfelelően megértetni a nyelvi modellel, a következő jelentős probléma már nem a gráf szerkezetében, hanem az egyes puzzle-</w:t>
+      </w:r>
+      <w:proofErr w:type="spellStart"/>
+      <w:r>
+        <w:t>ök</w:t>
+      </w:r>
+      <w:proofErr w:type="spellEnd"/>
+      <w:r>
+        <w:t xml:space="preserve"> konkrét levezetésében jelent meg. A modell gyakran képes volt logikusan felépíteni a részinformációk láncolatát, mégis hibás zár</w:t>
+      </w:r>
+      <w:r>
+        <w:t xml:space="preserve"> </w:t>
+      </w:r>
+      <w:proofErr w:type="spellStart"/>
+      <w:r>
+        <w:t>aktivátort</w:t>
+      </w:r>
+      <w:proofErr w:type="spellEnd"/>
+      <w:r>
+        <w:t xml:space="preserve"> rendelt a feladathoz. Tipikus eset volt, hogy rendelkezésre állt egy ábécé, egy nyom, amely megadta, mely betűket kell kiolvasni, valamint egy másik nyom, amely a helyes sorrendet írta le, a játékos számára így a levezetett megoldás például APPLE volt, miközben a LOCK objektum </w:t>
+      </w:r>
+      <w:proofErr w:type="spellStart"/>
+      <w:r>
+        <w:t>aktivátora</w:t>
+      </w:r>
+      <w:proofErr w:type="spellEnd"/>
+      <w:r>
+        <w:t xml:space="preserve"> APPLO maradt. Ezek a hibák különösen gyakran úgy jelentek meg, hogy a modell csupán egy-két karaktert tévesztett el, ezért a puzzle emberi szemmel szinte helyesnek tűnt, a rendszer szempontjából azonban mégis megoldhatatlanná vált.</w:t>
+      </w:r>
     </w:p>
     <w:p>
       <w:pPr>
         <w:pStyle w:val="Szakdolgozatbekezds"/>
       </w:pPr>
+    </w:p>
+    <w:p>
+      <w:pPr>
+        <w:pStyle w:val="Szakdolgozatbekezds"/>
+      </w:pPr>
+      <w:r>
+        <w:t>A kezdeti feltételezés az volt, hogy a hiba a gráf alapú szerkezetben keresendő, ezért a generáló prompt többszöri finomítás</w:t>
+      </w:r>
+      <w:r>
+        <w:t xml:space="preserve">ával próbálkoztam </w:t>
+      </w:r>
+      <w:r>
+        <w:t>meg. A prompt egyre részletesebben írta elő a puzzle-</w:t>
+      </w:r>
+      <w:proofErr w:type="spellStart"/>
+      <w:r>
+        <w:t>ök</w:t>
+      </w:r>
+      <w:proofErr w:type="spellEnd"/>
+      <w:r>
+        <w:t xml:space="preserve"> felépítését, a részinformációk és a végső információ kapcsolatát, valamint a </w:t>
+      </w:r>
+      <w:proofErr w:type="spellStart"/>
+      <w:r>
+        <w:t>zárakhoz</w:t>
+      </w:r>
+      <w:proofErr w:type="spellEnd"/>
+      <w:r>
+        <w:t xml:space="preserve"> tartozó logikai függőségeket. Egy idő után azonban nyilvánvalóvá vált, hogy nem szerkezeti, hanem verifikációs problémáról van szó: a modell ugyan elő tudott állítani egy konzisztensnek látszó feladatsort, de nem minden esetben biztosította, hogy a részfeladatokból ténylegesen pontosan az a kulcs legyen levezethető, amit a zár vár. Emiatt a pályastruktúra előállítását nem lehetett egyetlen AI-hívásra bízni.</w:t>
+      </w:r>
+    </w:p>
+    <w:p>
+      <w:pPr>
+        <w:pStyle w:val="Szakdolgozath3"/>
+      </w:pPr>
+      <w:r>
+        <w:t>Generált pálya</w:t>
+      </w:r>
+    </w:p>
+    <w:p>
+      <w:pPr>
+        <w:pStyle w:val="Szakdolgozatbekezds"/>
+      </w:pPr>
+      <w:r>
+        <w:t xml:space="preserve">Ennek eredményeként a pályagenerálás többlépcsős folyamattá alakult. Az első lépésben a rendszer létrehozza a pálya kezdeti változatát. Ez a fázis a korábban bemutatott általános játékelemekre, a gráf alapú logikai szerkezetre, valamint a JSON-kimenet formai szabályaira támaszkodik. A generálás eredménye tehát egy olyan nyers pályaleírás, amely már tartalmazza a falakat, az objektumokat, a </w:t>
+      </w:r>
+      <w:proofErr w:type="spellStart"/>
+      <w:r>
+        <w:t>zárakat</w:t>
+      </w:r>
+      <w:proofErr w:type="spellEnd"/>
+      <w:r>
+        <w:t xml:space="preserve"> és a hozzájuk kapcsolódó információkat, de még nem tekinthető automatikusan </w:t>
+      </w:r>
+      <w:proofErr w:type="spellStart"/>
+      <w:r>
+        <w:t>végigjátszhatónak</w:t>
+      </w:r>
+      <w:proofErr w:type="spellEnd"/>
+      <w:r>
+        <w:t>. A rendszer éppen ezért ezt az állapotot nem végleges pályának, hanem első tervezetnek kezeli.</w:t>
+      </w:r>
+    </w:p>
+    <w:p>
+      <w:pPr>
+        <w:pStyle w:val="Szakdolgozath3"/>
+      </w:pPr>
+      <w:r>
+        <w:t>Validáció</w:t>
+      </w:r>
+    </w:p>
+    <w:p>
+      <w:pPr>
+        <w:pStyle w:val="Szakdolgozatbekezds"/>
+      </w:pPr>
+      <w:r>
+        <w:t xml:space="preserve">A második lépés a validáció. Itt egy újabb, a generálástól független AI-hívás kapja meg a teljes pálya JSON-reprezentációját, és feladata annak eldöntése, hogy a pálya determinisztikusan </w:t>
+      </w:r>
+      <w:proofErr w:type="spellStart"/>
+      <w:r>
+        <w:t>végigjátszható</w:t>
+      </w:r>
+      <w:proofErr w:type="spellEnd"/>
+      <w:r>
+        <w:t xml:space="preserve">-e. A </w:t>
+      </w:r>
+      <w:proofErr w:type="spellStart"/>
+      <w:r>
+        <w:t>validátor</w:t>
+      </w:r>
+      <w:proofErr w:type="spellEnd"/>
+      <w:r>
+        <w:t xml:space="preserve"> nem módosítja a pályát, kizárólag elemzi azt. Ellenőrzi, hogy minden zár </w:t>
+      </w:r>
+      <w:proofErr w:type="spellStart"/>
+      <w:r>
+        <w:t>aktivátora</w:t>
+      </w:r>
+      <w:proofErr w:type="spellEnd"/>
+      <w:r>
+        <w:t xml:space="preserve"> egyértelműen levezethető-e a hozzá tartozó részinformációkból, hogy a KEY típusú </w:t>
+      </w:r>
+      <w:proofErr w:type="spellStart"/>
+      <w:r>
+        <w:t>zárak</w:t>
+      </w:r>
+      <w:proofErr w:type="spellEnd"/>
+      <w:r>
+        <w:t xml:space="preserve"> valóban létező és megszerezhető objektumokra hivatkoznak-e, hogy a kijárat csak az összes előző puzzle teljesítése után válik megoldhatóvá, valamint azt is, hogy a struktúra ne tartalmazzon többféleképpen értelmezhető, felesleges vagy félrevezető nyomokat. A validáció kimenete egy külön objektum, amely siker esetén </w:t>
+      </w:r>
+      <w:proofErr w:type="spellStart"/>
+      <w:r>
+        <w:t>solvable</w:t>
+      </w:r>
+      <w:proofErr w:type="spellEnd"/>
+      <w:r>
+        <w:t xml:space="preserve"> = </w:t>
+      </w:r>
+      <w:proofErr w:type="spellStart"/>
+      <w:r>
+        <w:t>true</w:t>
+      </w:r>
+      <w:proofErr w:type="spellEnd"/>
+      <w:r>
+        <w:t xml:space="preserve"> értéket ad vissza, hiba esetén pedig </w:t>
+      </w:r>
+      <w:proofErr w:type="spellStart"/>
+      <w:r>
+        <w:t>solvable</w:t>
+      </w:r>
+      <w:proofErr w:type="spellEnd"/>
+      <w:r>
+        <w:t xml:space="preserve"> = </w:t>
+      </w:r>
+      <w:proofErr w:type="spellStart"/>
+      <w:r>
+        <w:t>false</w:t>
+      </w:r>
+      <w:proofErr w:type="spellEnd"/>
+      <w:r>
+        <w:t xml:space="preserve"> mellett konkrét problémalistát is készít.</w:t>
+      </w:r>
+    </w:p>
+    <w:p>
+      <w:pPr>
+        <w:pStyle w:val="Szakdolgozatbekezds"/>
+      </w:pPr>
+    </w:p>
+    <w:p>
+      <w:pPr>
+        <w:pStyle w:val="Szakdolgozath3"/>
+      </w:pPr>
+      <w:r>
+        <w:lastRenderedPageBreak/>
+        <w:t xml:space="preserve">Hint Rendszer mint </w:t>
+      </w:r>
+      <w:proofErr w:type="gramStart"/>
+      <w:r>
+        <w:t>mellék termék</w:t>
+      </w:r>
+      <w:proofErr w:type="gramEnd"/>
+    </w:p>
+    <w:p>
+      <w:pPr>
+        <w:pStyle w:val="Szakdolgozatbekezds"/>
+      </w:pPr>
+      <w:r>
+        <w:t xml:space="preserve">A validáció egyik fontos mellékterméke a súgórendszer. A </w:t>
+      </w:r>
+      <w:proofErr w:type="spellStart"/>
+      <w:r>
+        <w:t>validátor</w:t>
+      </w:r>
+      <w:proofErr w:type="spellEnd"/>
+      <w:r>
+        <w:t xml:space="preserve"> nem csupán azt mondja meg, hogy a pálya helyes-e, hanem elkészíti az egyes puzzle-</w:t>
+      </w:r>
+      <w:proofErr w:type="spellStart"/>
+      <w:r>
+        <w:t>ök</w:t>
+      </w:r>
+      <w:proofErr w:type="spellEnd"/>
+      <w:r>
+        <w:t xml:space="preserve"> mechanikus levezetését is. Ez a levezetés több lépésből állhat: megmutatja, mely részinformációból milyen köztes adat következik, ezek hogyan állnak össze, és végül mi lesz a zár vagy puzzle megoldása. Ebből épül fel a hint rendszer, amely játék közben segítséget tud adni a felhasználónak. Ennek jelentősége kettős: egyrészt ellenőrzési célt szolgál a generálás során, másrészt közvetlenül felhasználható játékmechanikai funkcióként is.</w:t>
+      </w:r>
+    </w:p>
+    <w:p>
+      <w:pPr>
+        <w:pStyle w:val="Szakdolgozath3"/>
+      </w:pPr>
+      <w:proofErr w:type="spellStart"/>
+      <w:r>
+        <w:t>Invalid</w:t>
+      </w:r>
+      <w:proofErr w:type="spellEnd"/>
+      <w:r>
+        <w:t xml:space="preserve"> pálya javítása</w:t>
+      </w:r>
+    </w:p>
+    <w:p>
+      <w:pPr>
+        <w:pStyle w:val="Szakdolgozatbekezds"/>
+      </w:pPr>
+      <w:r>
+        <w:t xml:space="preserve">Amennyiben a </w:t>
+      </w:r>
+      <w:proofErr w:type="spellStart"/>
+      <w:r>
+        <w:t>validátor</w:t>
+      </w:r>
+      <w:proofErr w:type="spellEnd"/>
+      <w:r>
+        <w:t xml:space="preserve"> hibát talál, a harmadik lépés a javítás. Ebben a fázisban egy újabb AI-hívás már nem a teljes pályát generálja újra, hanem a hibajegyzék alapján igyekszik a lehető legkisebb módosítással kijavítani a problémás részeket. A javító modell bemenetként megkapja az aktuális pályaállapotot és a </w:t>
+      </w:r>
+      <w:proofErr w:type="spellStart"/>
+      <w:r>
+        <w:t>validátor</w:t>
+      </w:r>
+      <w:proofErr w:type="spellEnd"/>
+      <w:r>
+        <w:t xml:space="preserve"> által előállított </w:t>
+      </w:r>
+      <w:proofErr w:type="spellStart"/>
+      <w:r>
+        <w:t>issues</w:t>
+      </w:r>
+      <w:proofErr w:type="spellEnd"/>
+      <w:r>
+        <w:t xml:space="preserve"> listát. A cél ilyenkor nem új puzzle-</w:t>
+      </w:r>
+      <w:proofErr w:type="spellStart"/>
+      <w:r>
+        <w:t>ök</w:t>
+      </w:r>
+      <w:proofErr w:type="spellEnd"/>
+      <w:r>
+        <w:t xml:space="preserve"> kitalálása, hanem az, hogy a hibás zár</w:t>
+      </w:r>
+      <w:r>
+        <w:t xml:space="preserve"> </w:t>
+      </w:r>
+      <w:proofErr w:type="spellStart"/>
+      <w:r>
+        <w:t>aktivátorok</w:t>
+      </w:r>
+      <w:proofErr w:type="spellEnd"/>
+      <w:r>
+        <w:t>, hiányzó információk, pontatlan utalások vagy strukturális inkonzisztenciák célzott korrekciója történjen meg. A javított pálya ezután ismét validációra kerül, tehát a rendszer egy iteratív validáció-javítás ciklust valósít meg.</w:t>
+      </w:r>
+    </w:p>
+    <w:p>
+      <w:pPr>
+        <w:pStyle w:val="Szakdolgozath3"/>
+      </w:pPr>
+      <w:r>
+        <w:t>Kevesebb néha több</w:t>
+      </w:r>
+    </w:p>
+    <w:p>
+      <w:pPr>
+        <w:pStyle w:val="Szakdolgozatbekezds"/>
+      </w:pPr>
+      <w:r>
+        <w:t xml:space="preserve">A fejlesztés során különösen érdekes tapasztalat volt, hogy a legerősebb modellek használata nem minden esetben eredményezett jobb működést. Több konfigurációban azt lehetett megfigyelni, hogy a modellek túlgondolták a javítási feladatot, és a rendszer ismétlődő javítási ciklusokba került. Emiatt szükségessé vált a költségek és a javítási körök felső korlátjának bevezetése. A jelen implementáció ezt explicit módon is tartalmazza: a rendszer legfeljebb meghatározott számú javítási kört engedélyez, amelyet a konfigurációs szinten definiált érték szab meg. Ha a pálya ennyi iteráció után sem válik </w:t>
+      </w:r>
+      <w:proofErr w:type="spellStart"/>
+      <w:r>
+        <w:t>végigjátszhatóvá</w:t>
+      </w:r>
+      <w:proofErr w:type="spellEnd"/>
+      <w:r>
+        <w:t>, a folyamat leáll, és a rendszer nem próbálja tovább erőltetni a javítást, hanem hibát jelez a kliens felé.</w:t>
+      </w:r>
+    </w:p>
+    <w:p>
+      <w:pPr>
+        <w:pStyle w:val="Szakdolgozath3"/>
+      </w:pPr>
+      <w:r>
+        <w:t>Skálázás problémája</w:t>
+      </w:r>
+    </w:p>
+    <w:p>
+      <w:pPr>
+        <w:pStyle w:val="Szakdolgozatbekezds"/>
+      </w:pPr>
+      <w:r>
+        <w:lastRenderedPageBreak/>
+        <w:t xml:space="preserve">A generálás meghiúsulásának nem kizárólag logikai oka lehet. </w:t>
+      </w:r>
+      <w:r>
+        <w:t xml:space="preserve">Az a </w:t>
+      </w:r>
+      <w:proofErr w:type="gramStart"/>
+      <w:r>
+        <w:t>tapasztalat</w:t>
+      </w:r>
+      <w:proofErr w:type="gramEnd"/>
+      <w:r>
+        <w:t xml:space="preserve"> </w:t>
+      </w:r>
+      <w:proofErr w:type="gramStart"/>
+      <w:r>
+        <w:t>hogy,</w:t>
+      </w:r>
+      <w:proofErr w:type="gramEnd"/>
+      <w:r>
+        <w:t xml:space="preserve"> a</w:t>
+      </w:r>
+      <w:r>
+        <w:t>hogy növekszik a pályán szereplő puzzle-</w:t>
+      </w:r>
+      <w:proofErr w:type="spellStart"/>
+      <w:r>
+        <w:t>ök</w:t>
+      </w:r>
+      <w:proofErr w:type="spellEnd"/>
+      <w:r>
+        <w:t xml:space="preserve"> száma és ezzel együtt a pálya komplexitása, úgy egyre gyakoribbá válnak a strukturális hibák is. Ilyenkor nemcsak az fordulhat elő, hogy a modell nem </w:t>
+      </w:r>
+      <w:proofErr w:type="spellStart"/>
+      <w:r>
+        <w:t>végigjátszható</w:t>
+      </w:r>
+      <w:proofErr w:type="spellEnd"/>
+      <w:r>
+        <w:t xml:space="preserve"> feladatsort generál, hanem az is, hogy az API-válasz hiányos vagy sérült JSON-t tartalmaz. Ez különösen problémás, mert ilyen esetben nem csupán a pálya hibás, hanem maga a reprezentáció sem feldolgozható. A rendszer ezért a nyers választ először formai szempontból is ellenőrzi. Ha a visszakapott szöveg nem érvényes JSON, akkor a feldolgozás megszakad, a hibás kimenet elmentésre kerül diagnosztikai célból, és a folyamat nem folytatható javítással, hiszen hiányos adatból már nem lehet megbízhatóan rekonstruálni a hiányzó puzzle-elemeket.</w:t>
+      </w:r>
+    </w:p>
+    <w:p>
+      <w:pPr>
+        <w:pStyle w:val="Szakdolgozath3"/>
+      </w:pPr>
+      <w:r>
+        <w:t>Összegzés</w:t>
+      </w:r>
+    </w:p>
+    <w:p>
+      <w:pPr>
+        <w:pStyle w:val="Szakdolgozatbekezds"/>
+      </w:pPr>
+      <w:r>
+        <w:t xml:space="preserve">A többlépcsős működés gyakorlati oka tehát az, hogy a nyelvi modell által előállított első megoldás gyakran csak látszólag helyes. A puzzle szerkezete, történeti beágyazottsága és nehézségi íve megfelelő lehet, de ettől még könnyen előfordulhat, hogy a végső zárkód egy-két karakter eltérés miatt hibás. Az ilyen hibák kézi ellenőrzés nélkül nehezen észlelhetők, automatizált validáció nélkül pedig a rendszer megbízhatatlanná válna. A külön validációs lépés ezt a problémát kezeli azzal, hogy egy második modell explicit módon </w:t>
+      </w:r>
+      <w:proofErr w:type="spellStart"/>
+      <w:r>
+        <w:t>végigjátssza</w:t>
+      </w:r>
+      <w:proofErr w:type="spellEnd"/>
+      <w:r>
+        <w:t xml:space="preserve"> és levezeti a pályát.</w:t>
+      </w:r>
+    </w:p>
+    <w:p>
+      <w:pPr>
+        <w:pStyle w:val="Szakdolgozatbekezds"/>
+      </w:pPr>
       <w:r>
         <w:br w:type="page"/>
       </w:r>
     </w:p>
-    <w:bookmarkStart w:id="28" w:name="_Toc225527497" w:displacedByCustomXml="next"/>
+    <w:bookmarkStart w:id="28" w:name="_Toc225600719" w:displacedByCustomXml="next"/>
     <w:sdt>
       <w:sdtPr>
         <w:rPr>
@@ -9050,7 +9449,7 @@
       <w:pPr>
         <w:pStyle w:val="szmozatlanSzakdolgozath1"/>
       </w:pPr>
-      <w:bookmarkStart w:id="29" w:name="_Toc225527498"/>
+      <w:bookmarkStart w:id="29" w:name="_Toc225600720"/>
       <w:r>
         <w:lastRenderedPageBreak/>
         <w:t>Nyilatkozat</w:t>
@@ -9163,7 +9562,7 @@
       <w:pPr>
         <w:pStyle w:val="szmozatlanSzakdolgozath1"/>
       </w:pPr>
-      <w:bookmarkStart w:id="30" w:name="_Toc225527499"/>
+      <w:bookmarkStart w:id="30" w:name="_Toc225600721"/>
       <w:r>
         <w:lastRenderedPageBreak/>
         <w:t>Mellékletek</w:t>
@@ -9174,7 +9573,7 @@
       <w:pPr>
         <w:pStyle w:val="Szakdolgozath2"/>
       </w:pPr>
-      <w:bookmarkStart w:id="31" w:name="_Toc225527500"/>
+      <w:bookmarkStart w:id="31" w:name="_Toc225600722"/>
       <w:r>
         <w:t>Adatbázis</w:t>
       </w:r>
@@ -9275,7 +9674,7 @@
       <w:pPr>
         <w:pStyle w:val="Szakdolgozath2"/>
       </w:pPr>
-      <w:bookmarkStart w:id="32" w:name="_Toc225527501"/>
+      <w:bookmarkStart w:id="32" w:name="_Toc225600723"/>
       <w:r>
         <w:lastRenderedPageBreak/>
         <w:t>Gráf alapú pálya struktúra definiálása</w:t>

</xml_diff>

<commit_message>
feat(szakdolgozat): pálya generálása - Használt nyelvi modellek
</commit_message>
<xml_diff>
--- a/Szakdolgozat.docx
+++ b/Szakdolgozat.docx
@@ -529,7 +529,7 @@
       <w:pPr>
         <w:pStyle w:val="szmozatlanSzakdolgozath1"/>
       </w:pPr>
-      <w:bookmarkStart w:id="0" w:name="_Toc225600699"/>
+      <w:bookmarkStart w:id="0" w:name="_Toc225610603"/>
       <w:r>
         <w:lastRenderedPageBreak/>
         <w:t>Feladatkiírás</w:t>
@@ -765,7 +765,7 @@
       <w:pPr>
         <w:pStyle w:val="szmozatlanSzakdolgozath1"/>
       </w:pPr>
-      <w:bookmarkStart w:id="1" w:name="_Toc225600700"/>
+      <w:bookmarkStart w:id="1" w:name="_Toc225610604"/>
       <w:r>
         <w:lastRenderedPageBreak/>
         <w:t>Tartalomjegyzék</w:t>
@@ -828,7 +828,7 @@
           <w:r>
             <w:fldChar w:fldCharType="separate"/>
           </w:r>
-          <w:hyperlink w:anchor="_Toc225600699" w:history="1">
+          <w:hyperlink w:anchor="_Toc225610603" w:history="1">
             <w:r>
               <w:rPr>
                 <w:rStyle w:val="Hyperlink"/>
@@ -855,7 +855,7 @@
                 <w:noProof/>
                 <w:webHidden/>
               </w:rPr>
-              <w:instrText xml:space="preserve"> PAGEREF _Toc225600699 \h </w:instrText>
+              <w:instrText xml:space="preserve"> PAGEREF _Toc225610603 \h </w:instrText>
             </w:r>
             <w:r>
               <w:rPr>
@@ -900,7 +900,7 @@
               <w:lang w:val="en-US"/>
             </w:rPr>
           </w:pPr>
-          <w:hyperlink w:anchor="_Toc225600700" w:history="1">
+          <w:hyperlink w:anchor="_Toc225610604" w:history="1">
             <w:r>
               <w:rPr>
                 <w:rStyle w:val="Hyperlink"/>
@@ -927,7 +927,7 @@
                 <w:noProof/>
                 <w:webHidden/>
               </w:rPr>
-              <w:instrText xml:space="preserve"> PAGEREF _Toc225600700 \h </w:instrText>
+              <w:instrText xml:space="preserve"> PAGEREF _Toc225610604 \h </w:instrText>
             </w:r>
             <w:r>
               <w:rPr>
@@ -973,7 +973,7 @@
               <w:lang w:val="en-US"/>
             </w:rPr>
           </w:pPr>
-          <w:hyperlink w:anchor="_Toc225600701" w:history="1">
+          <w:hyperlink w:anchor="_Toc225610605" w:history="1">
             <w:r>
               <w:rPr>
                 <w:rStyle w:val="Hyperlink"/>
@@ -1018,7 +1018,7 @@
                 <w:noProof/>
                 <w:webHidden/>
               </w:rPr>
-              <w:instrText xml:space="preserve"> PAGEREF _Toc225600701 \h </w:instrText>
+              <w:instrText xml:space="preserve"> PAGEREF _Toc225610605 \h </w:instrText>
             </w:r>
             <w:r>
               <w:rPr>
@@ -1064,7 +1064,7 @@
               <w:lang w:val="en-US"/>
             </w:rPr>
           </w:pPr>
-          <w:hyperlink w:anchor="_Toc225600702" w:history="1">
+          <w:hyperlink w:anchor="_Toc225610606" w:history="1">
             <w:r>
               <w:rPr>
                 <w:rStyle w:val="Hyperlink"/>
@@ -1108,7 +1108,7 @@
                 <w:noProof/>
                 <w:webHidden/>
               </w:rPr>
-              <w:instrText xml:space="preserve"> PAGEREF _Toc225600702 \h </w:instrText>
+              <w:instrText xml:space="preserve"> PAGEREF _Toc225610606 \h </w:instrText>
             </w:r>
             <w:r>
               <w:rPr>
@@ -1154,7 +1154,7 @@
               <w:lang w:val="en-US"/>
             </w:rPr>
           </w:pPr>
-          <w:hyperlink w:anchor="_Toc225600703" w:history="1">
+          <w:hyperlink w:anchor="_Toc225610607" w:history="1">
             <w:r>
               <w:rPr>
                 <w:rStyle w:val="Hyperlink"/>
@@ -1198,7 +1198,7 @@
                 <w:noProof/>
                 <w:webHidden/>
               </w:rPr>
-              <w:instrText xml:space="preserve"> PAGEREF _Toc225600703 \h </w:instrText>
+              <w:instrText xml:space="preserve"> PAGEREF _Toc225610607 \h </w:instrText>
             </w:r>
             <w:r>
               <w:rPr>
@@ -1244,7 +1244,7 @@
               <w:lang w:val="en-US"/>
             </w:rPr>
           </w:pPr>
-          <w:hyperlink w:anchor="_Toc225600704" w:history="1">
+          <w:hyperlink w:anchor="_Toc225610608" w:history="1">
             <w:r>
               <w:rPr>
                 <w:rStyle w:val="Hyperlink"/>
@@ -1288,7 +1288,7 @@
                 <w:noProof/>
                 <w:webHidden/>
               </w:rPr>
-              <w:instrText xml:space="preserve"> PAGEREF _Toc225600704 \h </w:instrText>
+              <w:instrText xml:space="preserve"> PAGEREF _Toc225610608 \h </w:instrText>
             </w:r>
             <w:r>
               <w:rPr>
@@ -1334,7 +1334,7 @@
               <w:lang w:val="en-US"/>
             </w:rPr>
           </w:pPr>
-          <w:hyperlink w:anchor="_Toc225600705" w:history="1">
+          <w:hyperlink w:anchor="_Toc225610609" w:history="1">
             <w:r>
               <w:rPr>
                 <w:rStyle w:val="Hyperlink"/>
@@ -1378,7 +1378,7 @@
                 <w:noProof/>
                 <w:webHidden/>
               </w:rPr>
-              <w:instrText xml:space="preserve"> PAGEREF _Toc225600705 \h </w:instrText>
+              <w:instrText xml:space="preserve"> PAGEREF _Toc225610609 \h </w:instrText>
             </w:r>
             <w:r>
               <w:rPr>
@@ -1424,7 +1424,7 @@
               <w:lang w:val="en-US"/>
             </w:rPr>
           </w:pPr>
-          <w:hyperlink w:anchor="_Toc225600706" w:history="1">
+          <w:hyperlink w:anchor="_Toc225610610" w:history="1">
             <w:r>
               <w:rPr>
                 <w:rStyle w:val="Hyperlink"/>
@@ -1468,7 +1468,7 @@
                 <w:noProof/>
                 <w:webHidden/>
               </w:rPr>
-              <w:instrText xml:space="preserve"> PAGEREF _Toc225600706 \h </w:instrText>
+              <w:instrText xml:space="preserve"> PAGEREF _Toc225610610 \h </w:instrText>
             </w:r>
             <w:r>
               <w:rPr>
@@ -1514,7 +1514,7 @@
               <w:lang w:val="en-US"/>
             </w:rPr>
           </w:pPr>
-          <w:hyperlink w:anchor="_Toc225600707" w:history="1">
+          <w:hyperlink w:anchor="_Toc225610611" w:history="1">
             <w:r>
               <w:rPr>
                 <w:rStyle w:val="Hyperlink"/>
@@ -1558,7 +1558,7 @@
                 <w:noProof/>
                 <w:webHidden/>
               </w:rPr>
-              <w:instrText xml:space="preserve"> PAGEREF _Toc225600707 \h </w:instrText>
+              <w:instrText xml:space="preserve"> PAGEREF _Toc225610611 \h </w:instrText>
             </w:r>
             <w:r>
               <w:rPr>
@@ -1604,7 +1604,7 @@
               <w:lang w:val="en-US"/>
             </w:rPr>
           </w:pPr>
-          <w:hyperlink w:anchor="_Toc225600708" w:history="1">
+          <w:hyperlink w:anchor="_Toc225610612" w:history="1">
             <w:r>
               <w:rPr>
                 <w:rStyle w:val="Hyperlink"/>
@@ -1648,7 +1648,7 @@
                 <w:noProof/>
                 <w:webHidden/>
               </w:rPr>
-              <w:instrText xml:space="preserve"> PAGEREF _Toc225600708 \h </w:instrText>
+              <w:instrText xml:space="preserve"> PAGEREF _Toc225610612 \h </w:instrText>
             </w:r>
             <w:r>
               <w:rPr>
@@ -1694,7 +1694,7 @@
               <w:lang w:val="en-US"/>
             </w:rPr>
           </w:pPr>
-          <w:hyperlink w:anchor="_Toc225600709" w:history="1">
+          <w:hyperlink w:anchor="_Toc225610613" w:history="1">
             <w:r>
               <w:rPr>
                 <w:rStyle w:val="Hyperlink"/>
@@ -1738,7 +1738,7 @@
                 <w:noProof/>
                 <w:webHidden/>
               </w:rPr>
-              <w:instrText xml:space="preserve"> PAGEREF _Toc225600709 \h </w:instrText>
+              <w:instrText xml:space="preserve"> PAGEREF _Toc225610613 \h </w:instrText>
             </w:r>
             <w:r>
               <w:rPr>
@@ -1784,7 +1784,7 @@
               <w:lang w:val="en-US"/>
             </w:rPr>
           </w:pPr>
-          <w:hyperlink w:anchor="_Toc225600710" w:history="1">
+          <w:hyperlink w:anchor="_Toc225610614" w:history="1">
             <w:r>
               <w:rPr>
                 <w:rStyle w:val="Hyperlink"/>
@@ -1828,7 +1828,7 @@
                 <w:noProof/>
                 <w:webHidden/>
               </w:rPr>
-              <w:instrText xml:space="preserve"> PAGEREF _Toc225600710 \h </w:instrText>
+              <w:instrText xml:space="preserve"> PAGEREF _Toc225610614 \h </w:instrText>
             </w:r>
             <w:r>
               <w:rPr>
@@ -1874,7 +1874,7 @@
               <w:lang w:val="en-US"/>
             </w:rPr>
           </w:pPr>
-          <w:hyperlink w:anchor="_Toc225600711" w:history="1">
+          <w:hyperlink w:anchor="_Toc225610615" w:history="1">
             <w:r>
               <w:rPr>
                 <w:rStyle w:val="Hyperlink"/>
@@ -1918,7 +1918,7 @@
                 <w:noProof/>
                 <w:webHidden/>
               </w:rPr>
-              <w:instrText xml:space="preserve"> PAGEREF _Toc225600711 \h </w:instrText>
+              <w:instrText xml:space="preserve"> PAGEREF _Toc225610615 \h </w:instrText>
             </w:r>
             <w:r>
               <w:rPr>
@@ -1964,7 +1964,7 @@
               <w:lang w:val="en-US"/>
             </w:rPr>
           </w:pPr>
-          <w:hyperlink w:anchor="_Toc225600712" w:history="1">
+          <w:hyperlink w:anchor="_Toc225610616" w:history="1">
             <w:r>
               <w:rPr>
                 <w:rStyle w:val="Hyperlink"/>
@@ -2008,7 +2008,7 @@
                 <w:noProof/>
                 <w:webHidden/>
               </w:rPr>
-              <w:instrText xml:space="preserve"> PAGEREF _Toc225600712 \h </w:instrText>
+              <w:instrText xml:space="preserve"> PAGEREF _Toc225610616 \h </w:instrText>
             </w:r>
             <w:r>
               <w:rPr>
@@ -2054,7 +2054,7 @@
               <w:lang w:val="en-US"/>
             </w:rPr>
           </w:pPr>
-          <w:hyperlink w:anchor="_Toc225600713" w:history="1">
+          <w:hyperlink w:anchor="_Toc225610617" w:history="1">
             <w:r>
               <w:rPr>
                 <w:rStyle w:val="Hyperlink"/>
@@ -2098,7 +2098,7 @@
                 <w:noProof/>
                 <w:webHidden/>
               </w:rPr>
-              <w:instrText xml:space="preserve"> PAGEREF _Toc225600713 \h </w:instrText>
+              <w:instrText xml:space="preserve"> PAGEREF _Toc225610617 \h </w:instrText>
             </w:r>
             <w:r>
               <w:rPr>
@@ -2144,7 +2144,7 @@
               <w:lang w:val="en-US"/>
             </w:rPr>
           </w:pPr>
-          <w:hyperlink w:anchor="_Toc225600714" w:history="1">
+          <w:hyperlink w:anchor="_Toc225610618" w:history="1">
             <w:r>
               <w:rPr>
                 <w:rStyle w:val="Hyperlink"/>
@@ -2188,7 +2188,7 @@
                 <w:noProof/>
                 <w:webHidden/>
               </w:rPr>
-              <w:instrText xml:space="preserve"> PAGEREF _Toc225600714 \h </w:instrText>
+              <w:instrText xml:space="preserve"> PAGEREF _Toc225610618 \h </w:instrText>
             </w:r>
             <w:r>
               <w:rPr>
@@ -2234,7 +2234,7 @@
               <w:lang w:val="en-US"/>
             </w:rPr>
           </w:pPr>
-          <w:hyperlink w:anchor="_Toc225600715" w:history="1">
+          <w:hyperlink w:anchor="_Toc225610619" w:history="1">
             <w:r>
               <w:rPr>
                 <w:rStyle w:val="Hyperlink"/>
@@ -2278,7 +2278,7 @@
                 <w:noProof/>
                 <w:webHidden/>
               </w:rPr>
-              <w:instrText xml:space="preserve"> PAGEREF _Toc225600715 \h </w:instrText>
+              <w:instrText xml:space="preserve"> PAGEREF _Toc225610619 \h </w:instrText>
             </w:r>
             <w:r>
               <w:rPr>
@@ -2324,7 +2324,7 @@
               <w:lang w:val="en-US"/>
             </w:rPr>
           </w:pPr>
-          <w:hyperlink w:anchor="_Toc225600716" w:history="1">
+          <w:hyperlink w:anchor="_Toc225610620" w:history="1">
             <w:r>
               <w:rPr>
                 <w:rStyle w:val="Hyperlink"/>
@@ -2368,7 +2368,7 @@
                 <w:noProof/>
                 <w:webHidden/>
               </w:rPr>
-              <w:instrText xml:space="preserve"> PAGEREF _Toc225600716 \h </w:instrText>
+              <w:instrText xml:space="preserve"> PAGEREF _Toc225610620 \h </w:instrText>
             </w:r>
             <w:r>
               <w:rPr>
@@ -2414,7 +2414,7 @@
               <w:lang w:val="en-US"/>
             </w:rPr>
           </w:pPr>
-          <w:hyperlink w:anchor="_Toc225600717" w:history="1">
+          <w:hyperlink w:anchor="_Toc225610621" w:history="1">
             <w:r>
               <w:rPr>
                 <w:rStyle w:val="Hyperlink"/>
@@ -2458,7 +2458,7 @@
                 <w:noProof/>
                 <w:webHidden/>
               </w:rPr>
-              <w:instrText xml:space="preserve"> PAGEREF _Toc225600717 \h </w:instrText>
+              <w:instrText xml:space="preserve"> PAGEREF _Toc225610621 \h </w:instrText>
             </w:r>
             <w:r>
               <w:rPr>
@@ -2504,7 +2504,7 @@
               <w:lang w:val="en-US"/>
             </w:rPr>
           </w:pPr>
-          <w:hyperlink w:anchor="_Toc225600718" w:history="1">
+          <w:hyperlink w:anchor="_Toc225610622" w:history="1">
             <w:r>
               <w:rPr>
                 <w:rStyle w:val="Hyperlink"/>
@@ -2548,7 +2548,7 @@
                 <w:noProof/>
                 <w:webHidden/>
               </w:rPr>
-              <w:instrText xml:space="preserve"> PAGEREF _Toc225600718 \h </w:instrText>
+              <w:instrText xml:space="preserve"> PAGEREF _Toc225610622 \h </w:instrText>
             </w:r>
             <w:r>
               <w:rPr>
@@ -2569,222 +2569,6 @@
                 <w:webHidden/>
               </w:rPr>
               <w:t>19</w:t>
-            </w:r>
-            <w:r>
-              <w:rPr>
-                <w:noProof/>
-                <w:webHidden/>
-              </w:rPr>
-              <w:fldChar w:fldCharType="end"/>
-            </w:r>
-          </w:hyperlink>
-        </w:p>
-        <w:p>
-          <w:pPr>
-            <w:pStyle w:val="TOC1"/>
-            <w:tabs>
-              <w:tab w:val="right" w:leader="dot" w:pos="8827"/>
-            </w:tabs>
-            <w:rPr>
-              <w:rFonts w:eastAsiaTheme="minorEastAsia"/>
-              <w:noProof/>
-              <w:sz w:val="24"/>
-              <w:szCs w:val="24"/>
-              <w:lang w:val="en-US"/>
-            </w:rPr>
-          </w:pPr>
-          <w:hyperlink w:anchor="_Toc225600719" w:history="1">
-            <w:r>
-              <w:rPr>
-                <w:rStyle w:val="Hyperlink"/>
-                <w:noProof/>
-              </w:rPr>
-              <w:t>Irodalomjegyzék</w:t>
-            </w:r>
-            <w:r>
-              <w:rPr>
-                <w:noProof/>
-                <w:webHidden/>
-              </w:rPr>
-              <w:tab/>
-            </w:r>
-            <w:r>
-              <w:rPr>
-                <w:noProof/>
-                <w:webHidden/>
-              </w:rPr>
-              <w:fldChar w:fldCharType="begin"/>
-            </w:r>
-            <w:r>
-              <w:rPr>
-                <w:noProof/>
-                <w:webHidden/>
-              </w:rPr>
-              <w:instrText xml:space="preserve"> PAGEREF _Toc225600719 \h </w:instrText>
-            </w:r>
-            <w:r>
-              <w:rPr>
-                <w:noProof/>
-                <w:webHidden/>
-              </w:rPr>
-            </w:r>
-            <w:r>
-              <w:rPr>
-                <w:noProof/>
-                <w:webHidden/>
-              </w:rPr>
-              <w:fldChar w:fldCharType="separate"/>
-            </w:r>
-            <w:r>
-              <w:rPr>
-                <w:noProof/>
-                <w:webHidden/>
-              </w:rPr>
-              <w:t>23</w:t>
-            </w:r>
-            <w:r>
-              <w:rPr>
-                <w:noProof/>
-                <w:webHidden/>
-              </w:rPr>
-              <w:fldChar w:fldCharType="end"/>
-            </w:r>
-          </w:hyperlink>
-        </w:p>
-        <w:p>
-          <w:pPr>
-            <w:pStyle w:val="TOC1"/>
-            <w:tabs>
-              <w:tab w:val="right" w:leader="dot" w:pos="8827"/>
-            </w:tabs>
-            <w:rPr>
-              <w:rFonts w:eastAsiaTheme="minorEastAsia"/>
-              <w:noProof/>
-              <w:sz w:val="24"/>
-              <w:szCs w:val="24"/>
-              <w:lang w:val="en-US"/>
-            </w:rPr>
-          </w:pPr>
-          <w:hyperlink w:anchor="_Toc225600720" w:history="1">
-            <w:r>
-              <w:rPr>
-                <w:rStyle w:val="Hyperlink"/>
-                <w:noProof/>
-              </w:rPr>
-              <w:t>Nyilatkozat</w:t>
-            </w:r>
-            <w:r>
-              <w:rPr>
-                <w:noProof/>
-                <w:webHidden/>
-              </w:rPr>
-              <w:tab/>
-            </w:r>
-            <w:r>
-              <w:rPr>
-                <w:noProof/>
-                <w:webHidden/>
-              </w:rPr>
-              <w:fldChar w:fldCharType="begin"/>
-            </w:r>
-            <w:r>
-              <w:rPr>
-                <w:noProof/>
-                <w:webHidden/>
-              </w:rPr>
-              <w:instrText xml:space="preserve"> PAGEREF _Toc225600720 \h </w:instrText>
-            </w:r>
-            <w:r>
-              <w:rPr>
-                <w:noProof/>
-                <w:webHidden/>
-              </w:rPr>
-            </w:r>
-            <w:r>
-              <w:rPr>
-                <w:noProof/>
-                <w:webHidden/>
-              </w:rPr>
-              <w:fldChar w:fldCharType="separate"/>
-            </w:r>
-            <w:r>
-              <w:rPr>
-                <w:noProof/>
-                <w:webHidden/>
-              </w:rPr>
-              <w:t>24</w:t>
-            </w:r>
-            <w:r>
-              <w:rPr>
-                <w:noProof/>
-                <w:webHidden/>
-              </w:rPr>
-              <w:fldChar w:fldCharType="end"/>
-            </w:r>
-          </w:hyperlink>
-        </w:p>
-        <w:p>
-          <w:pPr>
-            <w:pStyle w:val="TOC1"/>
-            <w:tabs>
-              <w:tab w:val="right" w:leader="dot" w:pos="8827"/>
-            </w:tabs>
-            <w:rPr>
-              <w:rFonts w:eastAsiaTheme="minorEastAsia"/>
-              <w:noProof/>
-              <w:sz w:val="24"/>
-              <w:szCs w:val="24"/>
-              <w:lang w:val="en-US"/>
-            </w:rPr>
-          </w:pPr>
-          <w:hyperlink w:anchor="_Toc225600721" w:history="1">
-            <w:r>
-              <w:rPr>
-                <w:rStyle w:val="Hyperlink"/>
-                <w:noProof/>
-              </w:rPr>
-              <w:t>Mellékletek</w:t>
-            </w:r>
-            <w:r>
-              <w:rPr>
-                <w:noProof/>
-                <w:webHidden/>
-              </w:rPr>
-              <w:tab/>
-            </w:r>
-            <w:r>
-              <w:rPr>
-                <w:noProof/>
-                <w:webHidden/>
-              </w:rPr>
-              <w:fldChar w:fldCharType="begin"/>
-            </w:r>
-            <w:r>
-              <w:rPr>
-                <w:noProof/>
-                <w:webHidden/>
-              </w:rPr>
-              <w:instrText xml:space="preserve"> PAGEREF _Toc225600721 \h </w:instrText>
-            </w:r>
-            <w:r>
-              <w:rPr>
-                <w:noProof/>
-                <w:webHidden/>
-              </w:rPr>
-            </w:r>
-            <w:r>
-              <w:rPr>
-                <w:noProof/>
-                <w:webHidden/>
-              </w:rPr>
-              <w:fldChar w:fldCharType="separate"/>
-            </w:r>
-            <w:r>
-              <w:rPr>
-                <w:noProof/>
-                <w:webHidden/>
-              </w:rPr>
-              <w:t>25</w:t>
             </w:r>
             <w:r>
               <w:rPr>
@@ -2810,7 +2594,7 @@
               <w:lang w:val="en-US"/>
             </w:rPr>
           </w:pPr>
-          <w:hyperlink w:anchor="_Toc225600722" w:history="1">
+          <w:hyperlink w:anchor="_Toc225610623" w:history="1">
             <w:r>
               <w:rPr>
                 <w:rStyle w:val="Hyperlink"/>
@@ -2833,7 +2617,7 @@
                 <w:rStyle w:val="Hyperlink"/>
                 <w:noProof/>
               </w:rPr>
-              <w:t>Adatbázis relációk</w:t>
+              <w:t>Promptolás és LLM modell választása</w:t>
             </w:r>
             <w:r>
               <w:rPr>
@@ -2854,7 +2638,7 @@
                 <w:noProof/>
                 <w:webHidden/>
               </w:rPr>
-              <w:instrText xml:space="preserve"> PAGEREF _Toc225600722 \h </w:instrText>
+              <w:instrText xml:space="preserve"> PAGEREF _Toc225610623 \h </w:instrText>
             </w:r>
             <w:r>
               <w:rPr>
@@ -2874,7 +2658,223 @@
                 <w:noProof/>
                 <w:webHidden/>
               </w:rPr>
-              <w:t>25</w:t>
+              <w:t>22</w:t>
+            </w:r>
+            <w:r>
+              <w:rPr>
+                <w:noProof/>
+                <w:webHidden/>
+              </w:rPr>
+              <w:fldChar w:fldCharType="end"/>
+            </w:r>
+          </w:hyperlink>
+        </w:p>
+        <w:p>
+          <w:pPr>
+            <w:pStyle w:val="TOC1"/>
+            <w:tabs>
+              <w:tab w:val="right" w:leader="dot" w:pos="8827"/>
+            </w:tabs>
+            <w:rPr>
+              <w:rFonts w:eastAsiaTheme="minorEastAsia"/>
+              <w:noProof/>
+              <w:sz w:val="24"/>
+              <w:szCs w:val="24"/>
+              <w:lang w:val="en-US"/>
+            </w:rPr>
+          </w:pPr>
+          <w:hyperlink w:anchor="_Toc225610624" w:history="1">
+            <w:r>
+              <w:rPr>
+                <w:rStyle w:val="Hyperlink"/>
+                <w:noProof/>
+              </w:rPr>
+              <w:t>Irodalomjegyzék</w:t>
+            </w:r>
+            <w:r>
+              <w:rPr>
+                <w:noProof/>
+                <w:webHidden/>
+              </w:rPr>
+              <w:tab/>
+            </w:r>
+            <w:r>
+              <w:rPr>
+                <w:noProof/>
+                <w:webHidden/>
+              </w:rPr>
+              <w:fldChar w:fldCharType="begin"/>
+            </w:r>
+            <w:r>
+              <w:rPr>
+                <w:noProof/>
+                <w:webHidden/>
+              </w:rPr>
+              <w:instrText xml:space="preserve"> PAGEREF _Toc225610624 \h </w:instrText>
+            </w:r>
+            <w:r>
+              <w:rPr>
+                <w:noProof/>
+                <w:webHidden/>
+              </w:rPr>
+            </w:r>
+            <w:r>
+              <w:rPr>
+                <w:noProof/>
+                <w:webHidden/>
+              </w:rPr>
+              <w:fldChar w:fldCharType="separate"/>
+            </w:r>
+            <w:r>
+              <w:rPr>
+                <w:noProof/>
+                <w:webHidden/>
+              </w:rPr>
+              <w:t>27</w:t>
+            </w:r>
+            <w:r>
+              <w:rPr>
+                <w:noProof/>
+                <w:webHidden/>
+              </w:rPr>
+              <w:fldChar w:fldCharType="end"/>
+            </w:r>
+          </w:hyperlink>
+        </w:p>
+        <w:p>
+          <w:pPr>
+            <w:pStyle w:val="TOC1"/>
+            <w:tabs>
+              <w:tab w:val="right" w:leader="dot" w:pos="8827"/>
+            </w:tabs>
+            <w:rPr>
+              <w:rFonts w:eastAsiaTheme="minorEastAsia"/>
+              <w:noProof/>
+              <w:sz w:val="24"/>
+              <w:szCs w:val="24"/>
+              <w:lang w:val="en-US"/>
+            </w:rPr>
+          </w:pPr>
+          <w:hyperlink w:anchor="_Toc225610625" w:history="1">
+            <w:r>
+              <w:rPr>
+                <w:rStyle w:val="Hyperlink"/>
+                <w:noProof/>
+              </w:rPr>
+              <w:t>Nyilatkozat</w:t>
+            </w:r>
+            <w:r>
+              <w:rPr>
+                <w:noProof/>
+                <w:webHidden/>
+              </w:rPr>
+              <w:tab/>
+            </w:r>
+            <w:r>
+              <w:rPr>
+                <w:noProof/>
+                <w:webHidden/>
+              </w:rPr>
+              <w:fldChar w:fldCharType="begin"/>
+            </w:r>
+            <w:r>
+              <w:rPr>
+                <w:noProof/>
+                <w:webHidden/>
+              </w:rPr>
+              <w:instrText xml:space="preserve"> PAGEREF _Toc225610625 \h </w:instrText>
+            </w:r>
+            <w:r>
+              <w:rPr>
+                <w:noProof/>
+                <w:webHidden/>
+              </w:rPr>
+            </w:r>
+            <w:r>
+              <w:rPr>
+                <w:noProof/>
+                <w:webHidden/>
+              </w:rPr>
+              <w:fldChar w:fldCharType="separate"/>
+            </w:r>
+            <w:r>
+              <w:rPr>
+                <w:noProof/>
+                <w:webHidden/>
+              </w:rPr>
+              <w:t>29</w:t>
+            </w:r>
+            <w:r>
+              <w:rPr>
+                <w:noProof/>
+                <w:webHidden/>
+              </w:rPr>
+              <w:fldChar w:fldCharType="end"/>
+            </w:r>
+          </w:hyperlink>
+        </w:p>
+        <w:p>
+          <w:pPr>
+            <w:pStyle w:val="TOC1"/>
+            <w:tabs>
+              <w:tab w:val="right" w:leader="dot" w:pos="8827"/>
+            </w:tabs>
+            <w:rPr>
+              <w:rFonts w:eastAsiaTheme="minorEastAsia"/>
+              <w:noProof/>
+              <w:sz w:val="24"/>
+              <w:szCs w:val="24"/>
+              <w:lang w:val="en-US"/>
+            </w:rPr>
+          </w:pPr>
+          <w:hyperlink w:anchor="_Toc225610626" w:history="1">
+            <w:r>
+              <w:rPr>
+                <w:rStyle w:val="Hyperlink"/>
+                <w:noProof/>
+              </w:rPr>
+              <w:t>Mellékletek</w:t>
+            </w:r>
+            <w:r>
+              <w:rPr>
+                <w:noProof/>
+                <w:webHidden/>
+              </w:rPr>
+              <w:tab/>
+            </w:r>
+            <w:r>
+              <w:rPr>
+                <w:noProof/>
+                <w:webHidden/>
+              </w:rPr>
+              <w:fldChar w:fldCharType="begin"/>
+            </w:r>
+            <w:r>
+              <w:rPr>
+                <w:noProof/>
+                <w:webHidden/>
+              </w:rPr>
+              <w:instrText xml:space="preserve"> PAGEREF _Toc225610626 \h </w:instrText>
+            </w:r>
+            <w:r>
+              <w:rPr>
+                <w:noProof/>
+                <w:webHidden/>
+              </w:rPr>
+            </w:r>
+            <w:r>
+              <w:rPr>
+                <w:noProof/>
+                <w:webHidden/>
+              </w:rPr>
+              <w:fldChar w:fldCharType="separate"/>
+            </w:r>
+            <w:r>
+              <w:rPr>
+                <w:noProof/>
+                <w:webHidden/>
+              </w:rPr>
+              <w:t>30</w:t>
             </w:r>
             <w:r>
               <w:rPr>
@@ -2900,7 +2900,7 @@
               <w:lang w:val="en-US"/>
             </w:rPr>
           </w:pPr>
-          <w:hyperlink w:anchor="_Toc225600723" w:history="1">
+          <w:hyperlink w:anchor="_Toc225610627" w:history="1">
             <w:r>
               <w:rPr>
                 <w:rStyle w:val="Hyperlink"/>
@@ -2923,6 +2923,96 @@
                 <w:rStyle w:val="Hyperlink"/>
                 <w:noProof/>
               </w:rPr>
+              <w:t>Adatbázis relációk</w:t>
+            </w:r>
+            <w:r>
+              <w:rPr>
+                <w:noProof/>
+                <w:webHidden/>
+              </w:rPr>
+              <w:tab/>
+            </w:r>
+            <w:r>
+              <w:rPr>
+                <w:noProof/>
+                <w:webHidden/>
+              </w:rPr>
+              <w:fldChar w:fldCharType="begin"/>
+            </w:r>
+            <w:r>
+              <w:rPr>
+                <w:noProof/>
+                <w:webHidden/>
+              </w:rPr>
+              <w:instrText xml:space="preserve"> PAGEREF _Toc225610627 \h </w:instrText>
+            </w:r>
+            <w:r>
+              <w:rPr>
+                <w:noProof/>
+                <w:webHidden/>
+              </w:rPr>
+            </w:r>
+            <w:r>
+              <w:rPr>
+                <w:noProof/>
+                <w:webHidden/>
+              </w:rPr>
+              <w:fldChar w:fldCharType="separate"/>
+            </w:r>
+            <w:r>
+              <w:rPr>
+                <w:noProof/>
+                <w:webHidden/>
+              </w:rPr>
+              <w:t>30</w:t>
+            </w:r>
+            <w:r>
+              <w:rPr>
+                <w:noProof/>
+                <w:webHidden/>
+              </w:rPr>
+              <w:fldChar w:fldCharType="end"/>
+            </w:r>
+          </w:hyperlink>
+        </w:p>
+        <w:p>
+          <w:pPr>
+            <w:pStyle w:val="TOC2"/>
+            <w:tabs>
+              <w:tab w:val="left" w:pos="960"/>
+              <w:tab w:val="right" w:leader="dot" w:pos="8827"/>
+            </w:tabs>
+            <w:rPr>
+              <w:rFonts w:eastAsiaTheme="minorEastAsia"/>
+              <w:noProof/>
+              <w:sz w:val="24"/>
+              <w:szCs w:val="24"/>
+              <w:lang w:val="en-US"/>
+            </w:rPr>
+          </w:pPr>
+          <w:hyperlink w:anchor="_Toc225610628" w:history="1">
+            <w:r>
+              <w:rPr>
+                <w:rStyle w:val="Hyperlink"/>
+                <w:noProof/>
+              </w:rPr>
+              <w:t>3.6.</w:t>
+            </w:r>
+            <w:r>
+              <w:rPr>
+                <w:rFonts w:eastAsiaTheme="minorEastAsia"/>
+                <w:noProof/>
+                <w:sz w:val="24"/>
+                <w:szCs w:val="24"/>
+                <w:lang w:val="en-US"/>
+              </w:rPr>
+              <w:tab/>
+            </w:r>
+            <w:r>
+              <w:rPr>
+                <w:rStyle w:val="Hyperlink"/>
+                <w:noProof/>
+              </w:rPr>
               <w:t>Gráf alapú pálya struktúra definiálása</w:t>
             </w:r>
             <w:r>
@@ -2944,7 +3034,7 @@
                 <w:noProof/>
                 <w:webHidden/>
               </w:rPr>
-              <w:instrText xml:space="preserve"> PAGEREF _Toc225600723 \h </w:instrText>
+              <w:instrText xml:space="preserve"> PAGEREF _Toc225610628 \h </w:instrText>
             </w:r>
             <w:r>
               <w:rPr>
@@ -2964,7 +3054,7 @@
                 <w:noProof/>
                 <w:webHidden/>
               </w:rPr>
-              <w:t>26</w:t>
+              <w:t>31</w:t>
             </w:r>
             <w:r>
               <w:rPr>
@@ -3096,6 +3186,7 @@
         <w:jc w:val="both"/>
         <w:rPr>
           <w:rFonts w:ascii="Times New Roman" w:hAnsi="Times New Roman" w:cs="Times New Roman"/>
+          <w:strike/>
           <w:color w:val="EE0000"/>
           <w:sz w:val="24"/>
           <w:szCs w:val="24"/>
@@ -3103,38 +3194,6 @@
       </w:pPr>
       <w:proofErr w:type="spellStart"/>
       <w:r>
-        <w:rPr>
-          <w:rFonts w:ascii="Times New Roman" w:hAnsi="Times New Roman" w:cs="Times New Roman"/>
-          <w:color w:val="EE0000"/>
-          <w:sz w:val="24"/>
-          <w:szCs w:val="24"/>
-        </w:rPr>
-        <w:t>Promtolás</w:t>
-      </w:r>
-      <w:proofErr w:type="spellEnd"/>
-      <w:r>
-        <w:rPr>
-          <w:rFonts w:ascii="Times New Roman" w:hAnsi="Times New Roman" w:cs="Times New Roman"/>
-          <w:color w:val="EE0000"/>
-          <w:sz w:val="24"/>
-          <w:szCs w:val="24"/>
-        </w:rPr>
-        <w:t>, kipróbált és használt modellek</w:t>
-      </w:r>
-      <w:r>
-        <w:rPr>
-          <w:rFonts w:ascii="Times New Roman" w:hAnsi="Times New Roman" w:cs="Times New Roman"/>
-          <w:color w:val="EE0000"/>
-          <w:sz w:val="24"/>
-          <w:szCs w:val="24"/>
-        </w:rPr>
-        <w:t>, Prompt mint fekete mágia</w:t>
-      </w:r>
-    </w:p>
-    <w:p>
-      <w:pPr>
-        <w:spacing w:line="360" w:lineRule="auto"/>
-        <w:jc w:val="both"/>
         <w:rPr>
           <w:rFonts w:ascii="Times New Roman" w:hAnsi="Times New Roman" w:cs="Times New Roman"/>
           <w:strike/>
@@ -3142,7 +3201,9 @@
           <w:sz w:val="24"/>
           <w:szCs w:val="24"/>
         </w:rPr>
-      </w:pPr>
+        <w:t>Promtolás</w:t>
+      </w:r>
+      <w:proofErr w:type="spellEnd"/>
       <w:r>
         <w:rPr>
           <w:rFonts w:ascii="Times New Roman" w:hAnsi="Times New Roman" w:cs="Times New Roman"/>
@@ -3151,10 +3212,8 @@
           <w:sz w:val="24"/>
           <w:szCs w:val="24"/>
         </w:rPr>
-        <w:tab/>
-        <w:t xml:space="preserve">Milyen folyamatok és miért </w:t>
-      </w:r>
-      <w:proofErr w:type="spellStart"/>
+        <w:t>, kipróbált és használt modellek</w:t>
+      </w:r>
       <w:r>
         <w:rPr>
           <w:rFonts w:ascii="Times New Roman" w:hAnsi="Times New Roman" w:cs="Times New Roman"/>
@@ -3163,10 +3222,36 @@
           <w:sz w:val="24"/>
           <w:szCs w:val="24"/>
         </w:rPr>
-        <w:t>csatolódtak</w:t>
-      </w:r>
-      <w:proofErr w:type="spellEnd"/>
-      <w:r>
+        <w:t>,</w:t>
+      </w:r>
+    </w:p>
+    <w:p>
+      <w:pPr>
+        <w:spacing w:line="360" w:lineRule="auto"/>
+        <w:ind w:firstLine="720"/>
+        <w:jc w:val="both"/>
+        <w:rPr>
+          <w:rFonts w:ascii="Times New Roman" w:hAnsi="Times New Roman" w:cs="Times New Roman"/>
+          <w:color w:val="EE0000"/>
+          <w:sz w:val="24"/>
+          <w:szCs w:val="24"/>
+        </w:rPr>
+      </w:pPr>
+      <w:r>
+        <w:rPr>
+          <w:rFonts w:ascii="Times New Roman" w:hAnsi="Times New Roman" w:cs="Times New Roman"/>
+          <w:color w:val="EE0000"/>
+          <w:sz w:val="24"/>
+          <w:szCs w:val="24"/>
+        </w:rPr>
+        <w:lastRenderedPageBreak/>
+        <w:t>Prompt mint fekete mágia</w:t>
+      </w:r>
+    </w:p>
+    <w:p>
+      <w:pPr>
+        <w:spacing w:line="360" w:lineRule="auto"/>
+        <w:jc w:val="both"/>
         <w:rPr>
           <w:rFonts w:ascii="Times New Roman" w:hAnsi="Times New Roman" w:cs="Times New Roman"/>
           <w:strike/>
@@ -3174,28 +3259,61 @@
           <w:sz w:val="24"/>
           <w:szCs w:val="24"/>
         </w:rPr>
-        <w:t xml:space="preserve"> rá a pálya generálásra, hint rendszer</w:t>
-      </w:r>
-    </w:p>
-    <w:p>
-      <w:pPr>
-        <w:spacing w:line="360" w:lineRule="auto"/>
-        <w:jc w:val="both"/>
+      </w:pPr>
+      <w:r>
         <w:rPr>
           <w:rFonts w:ascii="Times New Roman" w:hAnsi="Times New Roman" w:cs="Times New Roman"/>
+          <w:strike/>
           <w:color w:val="EE0000"/>
           <w:sz w:val="24"/>
           <w:szCs w:val="24"/>
         </w:rPr>
-      </w:pPr>
+        <w:tab/>
+        <w:t xml:space="preserve">Milyen folyamatok és miért </w:t>
+      </w:r>
+      <w:proofErr w:type="spellStart"/>
       <w:r>
         <w:rPr>
           <w:rFonts w:ascii="Times New Roman" w:hAnsi="Times New Roman" w:cs="Times New Roman"/>
+          <w:strike/>
           <w:color w:val="EE0000"/>
           <w:sz w:val="24"/>
           <w:szCs w:val="24"/>
         </w:rPr>
-        <w:lastRenderedPageBreak/>
+        <w:t>csatolódtak</w:t>
+      </w:r>
+      <w:proofErr w:type="spellEnd"/>
+      <w:r>
+        <w:rPr>
+          <w:rFonts w:ascii="Times New Roman" w:hAnsi="Times New Roman" w:cs="Times New Roman"/>
+          <w:strike/>
+          <w:color w:val="EE0000"/>
+          <w:sz w:val="24"/>
+          <w:szCs w:val="24"/>
+        </w:rPr>
+        <w:t xml:space="preserve"> rá a pálya generálásra, hint rendszer</w:t>
+      </w:r>
+    </w:p>
+    <w:p>
+      <w:pPr>
+        <w:spacing w:line="360" w:lineRule="auto"/>
+        <w:jc w:val="both"/>
+        <w:rPr>
+          <w:rFonts w:ascii="Times New Roman" w:hAnsi="Times New Roman" w:cs="Times New Roman"/>
+          <w:strike/>
+          <w:color w:val="EE0000"/>
+          <w:sz w:val="24"/>
+          <w:szCs w:val="24"/>
+        </w:rPr>
+      </w:pPr>
+      <w:r>
+        <w:rPr>
+          <w:rFonts w:ascii="Times New Roman" w:hAnsi="Times New Roman" w:cs="Times New Roman"/>
+          <w:strike/>
+          <w:color w:val="EE0000"/>
+          <w:sz w:val="24"/>
+          <w:szCs w:val="24"/>
+        </w:rPr>
         <w:tab/>
         <w:t>Milyen modelleket használtam végül</w:t>
       </w:r>
@@ -3850,7 +3968,7 @@
           <w:i/>
         </w:rPr>
       </w:pPr>
-      <w:bookmarkStart w:id="2" w:name="_Toc225600701"/>
+      <w:bookmarkStart w:id="2" w:name="_Toc225610605"/>
       <w:r>
         <w:lastRenderedPageBreak/>
         <w:t>Technológiák</w:t>
@@ -3869,7 +3987,7 @@
       <w:pPr>
         <w:pStyle w:val="Szakdolgozath2"/>
       </w:pPr>
-      <w:bookmarkStart w:id="3" w:name="_Toc225600702"/>
+      <w:bookmarkStart w:id="3" w:name="_Toc225610606"/>
       <w:r>
         <w:t xml:space="preserve">Docker és </w:t>
       </w:r>
@@ -4012,7 +4130,7 @@
       <w:pPr>
         <w:pStyle w:val="Szakdolgozath2"/>
       </w:pPr>
-      <w:bookmarkStart w:id="4" w:name="_Toc225600703"/>
+      <w:bookmarkStart w:id="4" w:name="_Toc225610607"/>
       <w:r>
         <w:t>Frontend technológiák</w:t>
       </w:r>
@@ -4472,7 +4590,7 @@
       <w:pPr>
         <w:pStyle w:val="Szakdolgozath2"/>
       </w:pPr>
-      <w:bookmarkStart w:id="5" w:name="_Toc225600704"/>
+      <w:bookmarkStart w:id="5" w:name="_Toc225610608"/>
       <w:r>
         <w:t>Backend technológiák</w:t>
       </w:r>
@@ -4862,7 +4980,7 @@
       <w:pPr>
         <w:pStyle w:val="Szakdolgozath2"/>
       </w:pPr>
-      <w:bookmarkStart w:id="6" w:name="_Toc225600705"/>
+      <w:bookmarkStart w:id="6" w:name="_Toc225610609"/>
       <w:r>
         <w:t>Valós idejű kommunikáció</w:t>
       </w:r>
@@ -5069,7 +5187,7 @@
       <w:pPr>
         <w:pStyle w:val="Szakdolgozath2"/>
       </w:pPr>
-      <w:bookmarkStart w:id="7" w:name="_Toc225600706"/>
+      <w:bookmarkStart w:id="7" w:name="_Toc225610610"/>
       <w:r>
         <w:t>Adatkezelés és tárolás</w:t>
       </w:r>
@@ -5227,7 +5345,7 @@
       <w:pPr>
         <w:pStyle w:val="Szakdolgozath2"/>
       </w:pPr>
-      <w:bookmarkStart w:id="8" w:name="_Toc225600707"/>
+      <w:bookmarkStart w:id="8" w:name="_Toc225610611"/>
       <w:r>
         <w:t>MI integráció</w:t>
       </w:r>
@@ -5310,7 +5428,7 @@
       <w:pPr>
         <w:pStyle w:val="SzekdolgozatH1"/>
       </w:pPr>
-      <w:bookmarkStart w:id="9" w:name="_Toc225600708"/>
+      <w:bookmarkStart w:id="9" w:name="_Toc225610612"/>
       <w:r>
         <w:t>Architektúra</w:t>
       </w:r>
@@ -5320,7 +5438,7 @@
       <w:pPr>
         <w:pStyle w:val="Szakdolgozath2"/>
       </w:pPr>
-      <w:bookmarkStart w:id="10" w:name="_Toc225600709"/>
+      <w:bookmarkStart w:id="10" w:name="_Toc225610613"/>
       <w:r>
         <w:t>Adatbázis felépítés –</w:t>
       </w:r>
@@ -6125,7 +6243,7 @@
       <w:pPr>
         <w:pStyle w:val="Szakdolgozath2"/>
       </w:pPr>
-      <w:bookmarkStart w:id="19" w:name="_Toc225600710"/>
+      <w:bookmarkStart w:id="19" w:name="_Toc225610614"/>
       <w:r>
         <w:t>Frontend</w:t>
       </w:r>
@@ -6387,7 +6505,7 @@
       <w:pPr>
         <w:pStyle w:val="Szakdolgozath2"/>
       </w:pPr>
-      <w:bookmarkStart w:id="20" w:name="_Toc225600711"/>
+      <w:bookmarkStart w:id="20" w:name="_Toc225610615"/>
       <w:r>
         <w:t>Backend API</w:t>
       </w:r>
@@ -6561,7 +6679,7 @@
       <w:pPr>
         <w:pStyle w:val="Szakdolgozath2"/>
       </w:pPr>
-      <w:bookmarkStart w:id="21" w:name="_Toc225600712"/>
+      <w:bookmarkStart w:id="21" w:name="_Toc225610616"/>
       <w:proofErr w:type="spellStart"/>
       <w:r>
         <w:t>WebSocket</w:t>
@@ -6668,7 +6786,7 @@
       <w:pPr>
         <w:pStyle w:val="Szakdolgozath2"/>
       </w:pPr>
-      <w:bookmarkStart w:id="22" w:name="_Toc225600713"/>
+      <w:bookmarkStart w:id="22" w:name="_Toc225610617"/>
       <w:r>
         <w:t xml:space="preserve">File </w:t>
       </w:r>
@@ -6990,7 +7108,7 @@
       <w:pPr>
         <w:pStyle w:val="Szakdolgozath2"/>
       </w:pPr>
-      <w:bookmarkStart w:id="23" w:name="_Toc225600714"/>
+      <w:bookmarkStart w:id="23" w:name="_Toc225610618"/>
       <w:r>
         <w:t>Biztonság</w:t>
       </w:r>
@@ -7188,7 +7306,7 @@
       <w:pPr>
         <w:pStyle w:val="SzekdolgozatH1"/>
       </w:pPr>
-      <w:bookmarkStart w:id="24" w:name="_Toc225600715"/>
+      <w:bookmarkStart w:id="24" w:name="_Toc225610619"/>
       <w:r>
         <w:lastRenderedPageBreak/>
         <w:t>Pálya Generálása</w:t>
@@ -7199,7 +7317,7 @@
       <w:pPr>
         <w:pStyle w:val="Szakdolgozath2"/>
       </w:pPr>
-      <w:bookmarkStart w:id="25" w:name="_Toc225600716"/>
+      <w:bookmarkStart w:id="25" w:name="_Toc225610620"/>
       <w:r>
         <w:t>Generikus játék modellek</w:t>
       </w:r>
@@ -7329,7 +7447,7 @@
             <w:rPr>
               <w:noProof/>
             </w:rPr>
-            <w:t>[25]</w:t>
+            <w:t>[24]</w:t>
           </w:r>
           <w:r>
             <w:fldChar w:fldCharType="end"/>
@@ -7361,7 +7479,7 @@
             <w:rPr>
               <w:noProof/>
             </w:rPr>
-            <w:t>[26]</w:t>
+            <w:t>[25]</w:t>
           </w:r>
           <w:r>
             <w:fldChar w:fldCharType="end"/>
@@ -7779,7 +7897,7 @@
       <w:pPr>
         <w:pStyle w:val="Szakdolgozath2"/>
       </w:pPr>
-      <w:bookmarkStart w:id="26" w:name="_Toc225600717"/>
+      <w:bookmarkStart w:id="26" w:name="_Toc225610621"/>
       <w:r>
         <w:t>Gráf alapú pálya struktúra definiálása</w:t>
       </w:r>
@@ -8057,7 +8175,7 @@
       <w:pPr>
         <w:pStyle w:val="Szakdolgozath2"/>
       </w:pPr>
-      <w:bookmarkStart w:id="27" w:name="_Toc225600718"/>
+      <w:bookmarkStart w:id="27" w:name="_Toc225610622"/>
       <w:r>
         <w:t>Pálya generálás folyamatai, többlépcsős generálás</w:t>
       </w:r>
@@ -8465,13 +8583,718 @@
     </w:p>
     <w:p>
       <w:pPr>
+        <w:pStyle w:val="Szakdolgozath2"/>
+      </w:pPr>
+      <w:bookmarkStart w:id="28" w:name="_Toc225610623"/>
+      <w:proofErr w:type="spellStart"/>
+      <w:r>
+        <w:t>Promptolás</w:t>
+      </w:r>
+      <w:proofErr w:type="spellEnd"/>
+      <w:r>
+        <w:t xml:space="preserve"> és LLM modell választása</w:t>
+      </w:r>
+      <w:bookmarkEnd w:id="28"/>
+    </w:p>
+    <w:p>
+      <w:pPr>
         <w:pStyle w:val="Szakdolgozatbekezds"/>
       </w:pPr>
       <w:r>
+        <w:t xml:space="preserve">Ahogyan az előző fejezetben be lett mutatva a többlépcsős generálás így, a </w:t>
+      </w:r>
+      <w:r>
+        <w:t>pályagenerálás során alkalmazott prompt</w:t>
+      </w:r>
+      <w:r>
+        <w:t xml:space="preserve"> </w:t>
+      </w:r>
+      <w:r>
+        <w:t>készlet nem egyetlen hosszú utasításból áll, hanem több, jól elkülönített részre bontott szövegállományból. Ennek megfelelően a rendszer prompt</w:t>
+      </w:r>
+      <w:r>
+        <w:t xml:space="preserve"> </w:t>
+      </w:r>
+      <w:r>
+        <w:t>szinten is moduláris felépítést követ.</w:t>
+      </w:r>
+    </w:p>
+    <w:p>
+      <w:pPr>
+        <w:pStyle w:val="Szakdolgozath3"/>
+      </w:pPr>
+      <w:r>
+        <w:t xml:space="preserve">Pályát leíró </w:t>
+      </w:r>
+      <w:proofErr w:type="spellStart"/>
+      <w:r>
+        <w:t>pszeudo</w:t>
+      </w:r>
+      <w:proofErr w:type="spellEnd"/>
+      <w:r>
+        <w:t xml:space="preserve"> kód</w:t>
+      </w:r>
+    </w:p>
+    <w:p>
+      <w:pPr>
+        <w:pStyle w:val="Szakdolgozatbekezds"/>
+      </w:pPr>
+      <w:r>
+        <w:t xml:space="preserve">A </w:t>
+      </w:r>
+      <w:proofErr w:type="spellStart"/>
+      <w:r>
+        <w:t>prompt_pseudo_code</w:t>
+      </w:r>
+      <w:proofErr w:type="spellEnd"/>
+      <w:r>
+        <w:t xml:space="preserve"> a legterjedelmesebb állomány</w:t>
+      </w:r>
+      <w:r>
+        <w:t xml:space="preserve"> 206 sorból áll</w:t>
+      </w:r>
+      <w:r>
+        <w:t xml:space="preserve">, mivel ez írja le a JSON-kimenet teljes szerkezetét, az objektumtípusokat, azok mezőit, az </w:t>
+      </w:r>
+      <w:proofErr w:type="spellStart"/>
+      <w:r>
+        <w:t>enumokat</w:t>
+      </w:r>
+      <w:proofErr w:type="spellEnd"/>
+      <w:r>
+        <w:t>, valamint a pozíció- és elhelyezési szabályokat. Gyakorlatilag ez tekinthető a pálya adatszerkezeti specifikációjának.</w:t>
+      </w:r>
+    </w:p>
+    <w:p>
+      <w:pPr>
+        <w:pStyle w:val="Szakdolgozath3"/>
+      </w:pPr>
+      <w:r>
+        <w:lastRenderedPageBreak/>
+        <w:t>Pályát definiáló szabály</w:t>
+      </w:r>
+    </w:p>
+    <w:p>
+      <w:pPr>
+        <w:pStyle w:val="Szakdolgozatbekezds"/>
+      </w:pPr>
+      <w:r>
+        <w:t xml:space="preserve">A </w:t>
+      </w:r>
+      <w:proofErr w:type="spellStart"/>
+      <w:r>
+        <w:t>prompt_principals</w:t>
+      </w:r>
+      <w:proofErr w:type="spellEnd"/>
+      <w:r>
+        <w:t>, 130 sorával</w:t>
+      </w:r>
+      <w:r>
+        <w:t xml:space="preserve"> ezzel szemben nem az adatmodellt részletezi, hanem a generálás logikai alapelveit fogalmazza meg. Itt jelenik meg például a nég</w:t>
+      </w:r>
+      <w:r>
+        <w:t xml:space="preserve">y </w:t>
+      </w:r>
+      <w:r>
+        <w:t>fal</w:t>
+      </w:r>
+      <w:r>
+        <w:t>ú</w:t>
+      </w:r>
+      <w:r>
+        <w:t>, egyetlen kijárattal rendelkező szoba modellje, a puzzle-</w:t>
+      </w:r>
+      <w:proofErr w:type="spellStart"/>
+      <w:r>
+        <w:t>ök</w:t>
+      </w:r>
+      <w:proofErr w:type="spellEnd"/>
+      <w:r>
+        <w:t xml:space="preserve"> láncolata, a logikai függőségi gráf szemantikája, a lágy zárolás, a nehézségi szintezés, az információs szabályok, a </w:t>
+      </w:r>
+      <w:proofErr w:type="spellStart"/>
+      <w:r>
+        <w:t>zárak</w:t>
+      </w:r>
+      <w:proofErr w:type="spellEnd"/>
+      <w:r>
+        <w:t xml:space="preserve"> konzisztenciája és a kijáratra vonatkozó korlátozások.</w:t>
+      </w:r>
+    </w:p>
+    <w:p>
+      <w:pPr>
+        <w:pStyle w:val="Szakdolgozatbekezds"/>
+        <w:ind w:firstLine="720"/>
+      </w:pPr>
+      <w:r>
+        <w:t xml:space="preserve">A </w:t>
+      </w:r>
+      <w:proofErr w:type="spellStart"/>
+      <w:r>
+        <w:t>prompt_graph</w:t>
+      </w:r>
+      <w:proofErr w:type="spellEnd"/>
+      <w:r>
+        <w:t xml:space="preserve"> ehhez egy konkrét,</w:t>
+      </w:r>
+      <w:r>
+        <w:t xml:space="preserve"> 79 soros</w:t>
+      </w:r>
+      <w:r>
+        <w:t xml:space="preserve"> G</w:t>
+      </w:r>
+      <w:proofErr w:type="spellStart"/>
+      <w:r>
+        <w:t>raphviz</w:t>
+      </w:r>
+      <w:proofErr w:type="spellEnd"/>
+      <w:r>
+        <w:t xml:space="preserve"> DOT formátumú mintát ad, amely szemléletesen mutatja meg, hogyan épül egymásra több puzzle, és miként válik a kijárat az utolsó logikai függőséggé.</w:t>
+      </w:r>
+    </w:p>
+    <w:p>
+      <w:pPr>
+        <w:pStyle w:val="Szakdolgozath3"/>
+      </w:pPr>
+      <w:r>
+        <w:t>Példa pálya</w:t>
+      </w:r>
+    </w:p>
+    <w:p>
+      <w:pPr>
+        <w:pStyle w:val="Szakdolgozatbekezds"/>
+      </w:pPr>
+      <w:r>
+        <w:t xml:space="preserve">A generálást támogató további </w:t>
+      </w:r>
+      <w:proofErr w:type="spellStart"/>
+      <w:r>
+        <w:t>promptok</w:t>
+      </w:r>
+      <w:proofErr w:type="spellEnd"/>
+      <w:r>
+        <w:t xml:space="preserve"> már specializált szerepet töltenek be. A </w:t>
+      </w:r>
+      <w:proofErr w:type="spellStart"/>
+      <w:r>
+        <w:t>prompt_level_examples</w:t>
+      </w:r>
+      <w:proofErr w:type="spellEnd"/>
+      <w:r>
+        <w:t xml:space="preserve"> egy rövid, 25 soros referenciaanyag, amely nem másolható példaként, hanem inspirációs mintaként szolgál a többlépcsős, rétegzett puzzle-struktúra bemutatására.</w:t>
+      </w:r>
+    </w:p>
+    <w:p>
+      <w:pPr>
+        <w:pStyle w:val="Szakdolgozath3"/>
+      </w:pPr>
+      <w:r>
+        <w:t>Validációs és javítás</w:t>
+      </w:r>
+    </w:p>
+    <w:p>
+      <w:pPr>
+        <w:pStyle w:val="Szakdolgozatbekezds"/>
+      </w:pPr>
+      <w:r>
+        <w:t xml:space="preserve">A </w:t>
+      </w:r>
+      <w:proofErr w:type="spellStart"/>
+      <w:r>
+        <w:t>prompt_level_validate</w:t>
+      </w:r>
+      <w:proofErr w:type="spellEnd"/>
+      <w:r>
+        <w:t xml:space="preserve"> a </w:t>
+      </w:r>
+      <w:proofErr w:type="spellStart"/>
+      <w:r>
+        <w:t>validátor</w:t>
+      </w:r>
+      <w:proofErr w:type="spellEnd"/>
+      <w:r>
+        <w:t xml:space="preserve"> számára készült, és szigorúan előírja, hogy a modell milyen JSON-sémában adhat vissza ítéletet a pálya </w:t>
+      </w:r>
+      <w:proofErr w:type="spellStart"/>
+      <w:r>
+        <w:t>végigjátszhatóságáról</w:t>
+      </w:r>
+      <w:proofErr w:type="spellEnd"/>
+      <w:r>
+        <w:t xml:space="preserve">. Ez a prompt tartalmazza a </w:t>
+      </w:r>
+      <w:proofErr w:type="spellStart"/>
+      <w:r>
+        <w:t>solvable</w:t>
+      </w:r>
+      <w:proofErr w:type="spellEnd"/>
+      <w:r>
+        <w:t xml:space="preserve">, </w:t>
+      </w:r>
+      <w:proofErr w:type="spellStart"/>
+      <w:r>
+        <w:t>issues</w:t>
+      </w:r>
+      <w:proofErr w:type="spellEnd"/>
+      <w:r>
+        <w:t xml:space="preserve"> és </w:t>
+      </w:r>
+      <w:proofErr w:type="spellStart"/>
+      <w:r>
+        <w:t>derivation</w:t>
+      </w:r>
+      <w:proofErr w:type="spellEnd"/>
+      <w:r>
+        <w:t xml:space="preserve"> mezők szerepét, a determinisztikus levezetés követelményét, valamint a játékosnak később felhasználható rövid hi</w:t>
+      </w:r>
+      <w:r>
+        <w:t>n</w:t>
+      </w:r>
+      <w:r>
+        <w:t>tek előállítását is.</w:t>
+      </w:r>
+    </w:p>
+    <w:p>
+      <w:pPr>
+        <w:pStyle w:val="Szakdolgozatbekezds"/>
+        <w:ind w:firstLine="720"/>
+      </w:pPr>
+      <w:r>
+        <w:t xml:space="preserve">A </w:t>
+      </w:r>
+      <w:proofErr w:type="spellStart"/>
+      <w:r>
+        <w:t>prompt_level_repair</w:t>
+      </w:r>
+      <w:proofErr w:type="spellEnd"/>
+      <w:r>
+        <w:t xml:space="preserve"> ehhez illeszkedve már javítási utasításokat tartalmaz: nem teljes </w:t>
+      </w:r>
+      <w:proofErr w:type="spellStart"/>
+      <w:r>
+        <w:t>újragenerálást</w:t>
+      </w:r>
+      <w:proofErr w:type="spellEnd"/>
+      <w:r>
+        <w:t xml:space="preserve"> kér, hanem a hibajelentés alapján a lehető legkisebb módosítással próbálja korrigálni az aktuális pályát.</w:t>
+      </w:r>
+    </w:p>
+    <w:p>
+      <w:pPr>
+        <w:pStyle w:val="Szakdolgozath3"/>
+      </w:pPr>
+      <w:r>
+        <w:t>Modellek választása</w:t>
+      </w:r>
+    </w:p>
+    <w:p>
+      <w:pPr>
+        <w:pStyle w:val="Szakdolgozath3"/>
+      </w:pPr>
+      <w:r>
+        <w:t>Lokális futtatás</w:t>
+      </w:r>
+    </w:p>
+    <w:p>
+      <w:pPr>
+        <w:pStyle w:val="Szakdolgozatbekezds"/>
+      </w:pPr>
+      <w:r>
+        <w:t xml:space="preserve">A </w:t>
+      </w:r>
+      <w:proofErr w:type="spellStart"/>
+      <w:r>
+        <w:t>promptok</w:t>
+      </w:r>
+      <w:proofErr w:type="spellEnd"/>
+      <w:r>
+        <w:t xml:space="preserve"> ilyen szétválasztása előtt több alternatív modellhasználati irány is kipróbálásra került. Az első kísérletek között szerepelt egy lokálisan futtatott </w:t>
+      </w:r>
+      <w:proofErr w:type="spellStart"/>
+      <w:r>
+        <w:t>Qwen</w:t>
+      </w:r>
+      <w:proofErr w:type="spellEnd"/>
+      <w:r>
+        <w:t xml:space="preserve"> 2.5 1.5B</w:t>
+      </w:r>
+      <w:sdt>
+        <w:sdtPr>
+          <w:id w:val="1835026979"/>
+          <w:citation/>
+        </w:sdtPr>
+        <w:sdtContent>
+          <w:r>
+            <w:fldChar w:fldCharType="begin"/>
+          </w:r>
+          <w:r>
+            <w:instrText xml:space="preserve"> CITATION Qwen2_5 \l 1038 </w:instrText>
+          </w:r>
+          <w:r>
+            <w:fldChar w:fldCharType="separate"/>
+          </w:r>
+          <w:r>
+            <w:rPr>
+              <w:noProof/>
+            </w:rPr>
+            <w:t xml:space="preserve"> </w:t>
+          </w:r>
+          <w:r>
+            <w:rPr>
+              <w:noProof/>
+            </w:rPr>
+            <w:t>[26]</w:t>
+          </w:r>
+          <w:r>
+            <w:fldChar w:fldCharType="end"/>
+          </w:r>
+        </w:sdtContent>
+      </w:sdt>
+      <w:r>
+        <w:t xml:space="preserve"> modell, amely </w:t>
+      </w:r>
+      <w:proofErr w:type="spellStart"/>
+      <w:r>
+        <w:t>Hugging</w:t>
+      </w:r>
+      <w:proofErr w:type="spellEnd"/>
+      <w:r>
+        <w:t xml:space="preserve"> </w:t>
+      </w:r>
+      <w:proofErr w:type="spellStart"/>
+      <w:r>
+        <w:t>Face</w:t>
+      </w:r>
+      <w:proofErr w:type="spellEnd"/>
+      <w:sdt>
+        <w:sdtPr>
+          <w:id w:val="-100255671"/>
+          <w:citation/>
+        </w:sdtPr>
+        <w:sdtContent>
+          <w:r>
+            <w:fldChar w:fldCharType="begin"/>
+          </w:r>
+          <w:r>
+            <w:instrText xml:space="preserve"> CITATION HuggingFace \l 1038 </w:instrText>
+          </w:r>
+          <w:r>
+            <w:fldChar w:fldCharType="separate"/>
+          </w:r>
+          <w:r>
+            <w:rPr>
+              <w:noProof/>
+            </w:rPr>
+            <w:t xml:space="preserve"> </w:t>
+          </w:r>
+          <w:r>
+            <w:rPr>
+              <w:noProof/>
+            </w:rPr>
+            <w:t>[27]</w:t>
+          </w:r>
+          <w:r>
+            <w:fldChar w:fldCharType="end"/>
+          </w:r>
+        </w:sdtContent>
+      </w:sdt>
+      <w:r>
+        <w:t xml:space="preserve"> forrásból került letöltésre. Ez a modell azonban már az alapvető követelményeknél elégtelennek bizonyult. Nemcsak a magyar nyelv kezelésében mutatott </w:t>
+      </w:r>
+      <w:r>
+        <w:lastRenderedPageBreak/>
+        <w:t xml:space="preserve">gyengeséget, hanem már azt sem tudta stabilan értelmezni, hogy a pálya pontosan négy falból áll, és kizárólag egyetlen kijárattal rendelkezhet. Emiatt ezzel a modellel nem volt érdemes tovább építkezni. A következő próbálkozás a </w:t>
+      </w:r>
+      <w:proofErr w:type="spellStart"/>
+      <w:r>
+        <w:t>Qwen</w:t>
+      </w:r>
+      <w:proofErr w:type="spellEnd"/>
+      <w:r>
+        <w:t xml:space="preserve"> 2.5 3B modell volt, amely elméletben már alkalmasabbnak tűnt volna a feladatra, a gyakorlatban azonban hardveres korlátokba ütközött a futtatása, mivel a helyi környezet nem biztosított elegendő video</w:t>
+      </w:r>
+      <w:r>
+        <w:t xml:space="preserve"> </w:t>
+      </w:r>
+      <w:r>
+        <w:t>memóriát</w:t>
+      </w:r>
+      <w:r>
+        <w:t xml:space="preserve"> (minimum 16 </w:t>
+      </w:r>
+      <w:proofErr w:type="spellStart"/>
+      <w:r>
+        <w:t>Gb</w:t>
+      </w:r>
+      <w:proofErr w:type="spellEnd"/>
+      <w:r>
+        <w:t>)</w:t>
+      </w:r>
+      <w:r>
+        <w:t xml:space="preserve"> egy stabil használathoz. Ekkor két reális irány maradt: felhőalapú saját modellfuttatás vagy kész API használata. A választás végül az API-alapú megközelítésre esett, mivel ez kisebb üzemeltetési </w:t>
+      </w:r>
+      <w:proofErr w:type="spellStart"/>
+      <w:r>
+        <w:t>többletterhet</w:t>
+      </w:r>
+      <w:proofErr w:type="spellEnd"/>
+      <w:r>
+        <w:t xml:space="preserve"> jelentett, és nem igényelte külön </w:t>
+      </w:r>
+      <w:proofErr w:type="spellStart"/>
+      <w:r>
+        <w:t>inferenciaszerver</w:t>
+      </w:r>
+      <w:proofErr w:type="spellEnd"/>
+      <w:r>
+        <w:t>, telepítési környezet és publikus szolgáltatási réteg kialakítását.</w:t>
+      </w:r>
+    </w:p>
+    <w:p>
+      <w:pPr>
+        <w:pStyle w:val="Szakdolgozath3"/>
+      </w:pPr>
+      <w:proofErr w:type="spellStart"/>
+      <w:r>
+        <w:t>OpenAI</w:t>
+      </w:r>
+      <w:proofErr w:type="spellEnd"/>
+      <w:r>
+        <w:t xml:space="preserve"> &amp; gpt-5-nano</w:t>
+      </w:r>
+    </w:p>
+    <w:p>
+      <w:pPr>
+        <w:pStyle w:val="Szakdolgozatbekezds"/>
+      </w:pPr>
+      <w:r>
+        <w:t>Az API-alapú megközelítés</w:t>
+      </w:r>
+      <w:r>
+        <w:t xml:space="preserve">hez az </w:t>
+      </w:r>
+      <w:proofErr w:type="spellStart"/>
+      <w:r>
+        <w:t>OpenAI</w:t>
+      </w:r>
+      <w:proofErr w:type="spellEnd"/>
+      <w:r>
+        <w:t xml:space="preserve"> API szolgáltatását </w:t>
+      </w:r>
+      <w:proofErr w:type="spellStart"/>
+      <w:proofErr w:type="gramStart"/>
+      <w:r>
+        <w:t>választottam.Az</w:t>
+      </w:r>
+      <w:proofErr w:type="spellEnd"/>
+      <w:proofErr w:type="gramEnd"/>
+      <w:r>
+        <w:t xml:space="preserve"> ok egyszerű, ők indították be az AI versenyt, és mai napig a legnagyobb cég az AI szakmában.</w:t>
+      </w:r>
+      <w:r>
+        <w:t xml:space="preserve"> </w:t>
+      </w:r>
+      <w:r>
+        <w:t>A</w:t>
+      </w:r>
+      <w:r>
+        <w:t xml:space="preserve"> generálás kezdetben a gpt-5-nano modellel indult. Ennek egyik oka az volt, hogy a fejlesztés adott szakaszában ez számított az egyik legfrissebb és egyben legkedvezőbb költségű opciónak. Ezzel a modellel már felépíthetővé vált a pálya alapstruktúrája, azonban hamar megjelentek a minőségi korlátok. A modell sok esetben nem valódi GUID-</w:t>
+      </w:r>
+      <w:proofErr w:type="spellStart"/>
+      <w:r>
+        <w:t>okat</w:t>
+      </w:r>
+      <w:proofErr w:type="spellEnd"/>
+      <w:r>
+        <w:t>, hanem emberileg értelmezhető, szöveges azonosítókat hozott létre. Ez önmagában még nem feltétlenül tette működésképtelenné a pályát, de technikai szempontból instabil megoldásnak számított. Ennél is fontosabb probléma volt, hogy a kisebb modell hajlamos volt sekélyebb logikai struktúrát létrehozni: ugyan több nyomot generált, de ezek nem mindig épültek valódi függőségi láncba, ezért előfordulhatott, hogy a játékos túl korán megtalálta a kijutáshoz szükséges elemet. A komplexebb minták megadása önmagában nem bizonyult elegendőnek.</w:t>
+      </w:r>
+    </w:p>
+    <w:p>
+      <w:pPr>
+        <w:pStyle w:val="Szakdolgozath3"/>
+      </w:pPr>
+      <w:r>
+        <w:t>gpt-5-mini</w:t>
+      </w:r>
+    </w:p>
+    <w:p>
+      <w:pPr>
+        <w:pStyle w:val="Szakdolgozatbekezds"/>
+      </w:pPr>
+      <w:r>
+        <w:t>A következő fontos lépést a gpt-5-mini használata jelentette. Ez már költségesebb megoldás volt, ugyanakkor több korábbi korlátot sikerült vele átlépni. A modell megbízhatóbban kezelte a puzzle-</w:t>
+      </w:r>
+      <w:proofErr w:type="spellStart"/>
+      <w:r>
+        <w:t>ök</w:t>
+      </w:r>
+      <w:proofErr w:type="spellEnd"/>
+      <w:r>
+        <w:t xml:space="preserve"> egymásra épülését, és jobban tudta követni a gráfalapú struktúra logikáját. Ennek ellenére a nagyobb pályakomplexitás mellett ennél a modellnél is megjelentek üzleti logikai és technikai problémák. </w:t>
+      </w:r>
+      <w:r>
+        <w:t>Előbbire példa</w:t>
+      </w:r>
+      <w:r>
+        <w:t xml:space="preserve">, hogy egy puzzle elvileg három külön részinformációból állt, a modell azonban három </w:t>
+      </w:r>
+      <w:proofErr w:type="spellStart"/>
+      <w:r>
+        <w:t>tartalmilag</w:t>
+      </w:r>
+      <w:proofErr w:type="spellEnd"/>
+      <w:r>
+        <w:t xml:space="preserve"> redundáns nyomot </w:t>
+      </w:r>
+      <w:r>
+        <w:lastRenderedPageBreak/>
+        <w:t>készített, vagyis a feladat valójában jóval egyszerűbb lett a tervezettnél. Emellett továbbra sem volt teljesen megbízható az objektumokhoz tartozó UUID-k előállítása.</w:t>
+      </w:r>
+    </w:p>
+    <w:p>
+      <w:pPr>
+        <w:pStyle w:val="Szakdolgozath3"/>
+      </w:pPr>
+      <w:r>
+        <w:t>gpt-5.2</w:t>
+      </w:r>
+    </w:p>
+    <w:p>
+      <w:pPr>
+        <w:pStyle w:val="Szakdolgozatbekezds"/>
+      </w:pPr>
+      <w:r>
+        <w:t xml:space="preserve">A generálás következő szintjét a gpt-5.2 modell használata jelentette, amely a fejlesztés idején a legfrissebb rendelkezésre álló modell volt. </w:t>
+      </w:r>
+      <w:r>
+        <w:t>(</w:t>
+      </w:r>
+      <w:r>
+        <w:t>A dolgozat írásának időpontjában ezzel szemben már a gpt-5.4 tekinthető frissebb generációs modellnek.</w:t>
+      </w:r>
+      <w:r>
+        <w:t>)</w:t>
+      </w:r>
+      <w:r>
+        <w:t xml:space="preserve"> A gpt-5.2 a korábbi modellekhez képest több korlátot is csökkentett, különösen a komplexebb logikai szerkezetek kezelése terén. Ugyanakkor az azonosítógenerálás problémája magasabb pályakomplexitás mellett itt is újra megjelent. A modell alapvetően felismerte az UUID formátumot, de gyakran olyan, félig mesterséges azonosítókat hozott létre, amelyek ugyan szerkezetükben UUID-szerűek voltak, de adatbázis-azonosítóként nem voltak ideálisak. Ez vezetett ahhoz, hogy a generálási folyamatba egy külön mechanikus utófeldolgozási lépés került beépítésre.</w:t>
+      </w:r>
+    </w:p>
+    <w:p>
+      <w:pPr>
+        <w:pStyle w:val="Szakdolgozath3"/>
+      </w:pPr>
+      <w:r>
+        <w:t xml:space="preserve">Generált pálya post </w:t>
+      </w:r>
+      <w:proofErr w:type="spellStart"/>
+      <w:r>
+        <w:t>process</w:t>
+      </w:r>
+      <w:proofErr w:type="spellEnd"/>
+    </w:p>
+    <w:p>
+      <w:pPr>
+        <w:pStyle w:val="Szakdolgozatbekezds"/>
+      </w:pPr>
+      <w:r>
+        <w:t xml:space="preserve">Az utófeldolgozás feladata az azonosítók normalizálása. A folyamat első lépésben mély másolatot készít a teljes pályaobjektumról, hogy az eredeti generált adatstruktúrát közvetlenül ne módosítsa. Ezután bejárja az egész JSON-fát, és figyeli azokat a mezőket, amelyek azonosító jellegű adatot tartalmazhatnak. A jelenlegi implementáció három kulcsot kezel kiemelten: az </w:t>
+      </w:r>
+      <w:proofErr w:type="spellStart"/>
+      <w:r>
+        <w:t>id</w:t>
+      </w:r>
+      <w:proofErr w:type="spellEnd"/>
+      <w:r>
+        <w:t xml:space="preserve">, a </w:t>
+      </w:r>
+      <w:proofErr w:type="spellStart"/>
+      <w:r>
+        <w:t>targetId</w:t>
+      </w:r>
+      <w:proofErr w:type="spellEnd"/>
+      <w:r>
+        <w:t xml:space="preserve"> és a </w:t>
+      </w:r>
+      <w:proofErr w:type="spellStart"/>
+      <w:r>
+        <w:t>dependsOn</w:t>
+      </w:r>
+      <w:proofErr w:type="spellEnd"/>
+      <w:r>
+        <w:t xml:space="preserve"> </w:t>
+      </w:r>
+      <w:proofErr w:type="gramStart"/>
+      <w:r>
+        <w:t>mezőket</w:t>
+      </w:r>
+      <w:proofErr w:type="gramEnd"/>
+      <w:r>
+        <w:t xml:space="preserve"> ahol az előbbi a pálya struktúrához tartozik, utóbbi kettő pedig a hint rendszerhez</w:t>
+      </w:r>
+      <w:r>
+        <w:t>. Minden ilyen előfordulásnál ellenőrzi, hogy a kapott érték valódi UUID-e. Ha igen, akkor azt változatlanul hagyja. Ha nem, akkor létrehoz hozzá egy új uuid4 alapú azonosítót, és ezt egy belső megfeleltetési táblában eltárolja.</w:t>
+      </w:r>
+    </w:p>
+    <w:p>
+      <w:pPr>
+        <w:pStyle w:val="Szakdolgozatbekezds"/>
+        <w:ind w:firstLine="720"/>
+      </w:pPr>
+      <w:r>
+        <w:t xml:space="preserve">A második lépésben a függvény újra végigmegy a struktúrán, és minden olyan </w:t>
+      </w:r>
+      <w:proofErr w:type="spellStart"/>
+      <w:r>
+        <w:t>stringet</w:t>
+      </w:r>
+      <w:proofErr w:type="spellEnd"/>
+      <w:r>
+        <w:t xml:space="preserve"> lecserél, amely korábban nem szabványos azonosítóként szerepelt, de bekerült a megfeleltetési táblába. Ennek azért van jelentősége, mert az AI által generált JSON-ben ugyanaz az objektumazonosító gyakran több helyen is megjelenik: nemcsak az adott objektum </w:t>
+      </w:r>
+      <w:proofErr w:type="spellStart"/>
+      <w:r>
+        <w:t>id</w:t>
+      </w:r>
+      <w:proofErr w:type="spellEnd"/>
+      <w:r>
+        <w:t xml:space="preserve"> mezőjében, hanem például egy zárra, célobjektumra vagy függőségi listára mutató hivatkozásban is. Az utófeldolgozás így nem csupán új azonosítókat generál, hanem gondoskodik arról is, hogy az összes kapcsolódó referencia következetesen ugyanarra az új </w:t>
+      </w:r>
+      <w:r>
+        <w:lastRenderedPageBreak/>
+        <w:t>UUID-re mutasson. Ennek eredményeként az adatbázis és az alkalmazás többi része már egységes, gépileg stabil azonosítókkal dolgozhat.</w:t>
+      </w:r>
+    </w:p>
+    <w:p>
+      <w:pPr>
+        <w:pStyle w:val="Szakdolgozath3"/>
+      </w:pPr>
+      <w:r>
+        <w:t>Összegzés</w:t>
+      </w:r>
+    </w:p>
+    <w:p>
+      <w:pPr>
+        <w:pStyle w:val="Szakdolgozatbekezds"/>
+      </w:pPr>
+      <w:r>
+        <w:t xml:space="preserve">Ez a </w:t>
+      </w:r>
+      <w:r>
+        <w:t xml:space="preserve">UUID generálás probléma </w:t>
+      </w:r>
+      <w:r>
+        <w:t>jól példázza, hogy a nyelvi modell képes magas szintű szerkezetet létrehozni, de bizonyos technikai részletek, különösen az egyedi azonosítók következetes és szabványos kezelése, megbízhatóbban oldhatók meg hagyományos programkóddal. Ez a kettős megközelítés teszi lehetővé, hogy a pálya ne csak játéktervezési szempontból legyen használható, hanem alkalmazásoldali feldolgozásra, mentésre és hivatkozáskezelésre is alkalmas maradjon.</w:t>
+      </w:r>
+    </w:p>
+    <w:p>
+      <w:pPr>
+        <w:pStyle w:val="Szakdolgozatbekezds"/>
+      </w:pPr>
+      <w:r>
         <w:br w:type="page"/>
       </w:r>
     </w:p>
-    <w:bookmarkStart w:id="28" w:name="_Toc225600719" w:displacedByCustomXml="next"/>
+    <w:bookmarkStart w:id="29" w:name="_Toc225610624" w:displacedByCustomXml="next"/>
     <w:sdt>
       <w:sdtPr>
         <w:rPr>
@@ -8497,7 +9320,7 @@
           <w:r>
             <w:t>Irodalomjegyzék</w:t>
           </w:r>
-          <w:bookmarkEnd w:id="28"/>
+          <w:bookmarkEnd w:id="29"/>
         </w:p>
         <w:sdt>
           <w:sdtPr>
@@ -8540,7 +9363,7 @@
               </w:tblGrid>
               <w:tr>
                 <w:trPr>
-                  <w:divId w:val="868185270"/>
+                  <w:divId w:val="1635059212"/>
                   <w:tblCellSpacing w:w="15" w:type="dxa"/>
                 </w:trPr>
                 <w:tc>
@@ -8590,7 +9413,7 @@
               </w:tr>
               <w:tr>
                 <w:trPr>
-                  <w:divId w:val="868185270"/>
+                  <w:divId w:val="1635059212"/>
                   <w:tblCellSpacing w:w="15" w:type="dxa"/>
                 </w:trPr>
                 <w:tc>
@@ -8636,7 +9459,7 @@
               </w:tr>
               <w:tr>
                 <w:trPr>
-                  <w:divId w:val="868185270"/>
+                  <w:divId w:val="1635059212"/>
                   <w:tblCellSpacing w:w="15" w:type="dxa"/>
                 </w:trPr>
                 <w:tc>
@@ -8682,7 +9505,7 @@
               </w:tr>
               <w:tr>
                 <w:trPr>
-                  <w:divId w:val="868185270"/>
+                  <w:divId w:val="1635059212"/>
                   <w:tblCellSpacing w:w="15" w:type="dxa"/>
                 </w:trPr>
                 <w:tc>
@@ -8728,7 +9551,7 @@
               </w:tr>
               <w:tr>
                 <w:trPr>
-                  <w:divId w:val="868185270"/>
+                  <w:divId w:val="1635059212"/>
                   <w:tblCellSpacing w:w="15" w:type="dxa"/>
                 </w:trPr>
                 <w:tc>
@@ -8774,7 +9597,7 @@
               </w:tr>
               <w:tr>
                 <w:trPr>
-                  <w:divId w:val="868185270"/>
+                  <w:divId w:val="1635059212"/>
                   <w:tblCellSpacing w:w="15" w:type="dxa"/>
                 </w:trPr>
                 <w:tc>
@@ -8820,7 +9643,7 @@
               </w:tr>
               <w:tr>
                 <w:trPr>
-                  <w:divId w:val="868185270"/>
+                  <w:divId w:val="1635059212"/>
                   <w:tblCellSpacing w:w="15" w:type="dxa"/>
                 </w:trPr>
                 <w:tc>
@@ -8866,7 +9689,7 @@
               </w:tr>
               <w:tr>
                 <w:trPr>
-                  <w:divId w:val="868185270"/>
+                  <w:divId w:val="1635059212"/>
                   <w:tblCellSpacing w:w="15" w:type="dxa"/>
                 </w:trPr>
                 <w:tc>
@@ -8912,7 +9735,7 @@
               </w:tr>
               <w:tr>
                 <w:trPr>
-                  <w:divId w:val="868185270"/>
+                  <w:divId w:val="1635059212"/>
                   <w:tblCellSpacing w:w="15" w:type="dxa"/>
                 </w:trPr>
                 <w:tc>
@@ -8958,7 +9781,7 @@
               </w:tr>
               <w:tr>
                 <w:trPr>
-                  <w:divId w:val="868185270"/>
+                  <w:divId w:val="1635059212"/>
                   <w:tblCellSpacing w:w="15" w:type="dxa"/>
                 </w:trPr>
                 <w:tc>
@@ -9004,7 +9827,7 @@
               </w:tr>
               <w:tr>
                 <w:trPr>
-                  <w:divId w:val="868185270"/>
+                  <w:divId w:val="1635059212"/>
                   <w:tblCellSpacing w:w="15" w:type="dxa"/>
                 </w:trPr>
                 <w:tc>
@@ -9050,7 +9873,7 @@
               </w:tr>
               <w:tr>
                 <w:trPr>
-                  <w:divId w:val="868185270"/>
+                  <w:divId w:val="1635059212"/>
                   <w:tblCellSpacing w:w="15" w:type="dxa"/>
                 </w:trPr>
                 <w:tc>
@@ -9096,7 +9919,7 @@
               </w:tr>
               <w:tr>
                 <w:trPr>
-                  <w:divId w:val="868185270"/>
+                  <w:divId w:val="1635059212"/>
                   <w:tblCellSpacing w:w="15" w:type="dxa"/>
                 </w:trPr>
                 <w:tc>
@@ -9142,7 +9965,7 @@
               </w:tr>
               <w:tr>
                 <w:trPr>
-                  <w:divId w:val="868185270"/>
+                  <w:divId w:val="1635059212"/>
                   <w:tblCellSpacing w:w="15" w:type="dxa"/>
                 </w:trPr>
                 <w:tc>
@@ -9188,7 +10011,7 @@
               </w:tr>
               <w:tr>
                 <w:trPr>
-                  <w:divId w:val="868185270"/>
+                  <w:divId w:val="1635059212"/>
                   <w:tblCellSpacing w:w="15" w:type="dxa"/>
                 </w:trPr>
                 <w:tc>
@@ -9234,7 +10057,7 @@
               </w:tr>
               <w:tr>
                 <w:trPr>
-                  <w:divId w:val="868185270"/>
+                  <w:divId w:val="1635059212"/>
                   <w:tblCellSpacing w:w="15" w:type="dxa"/>
                 </w:trPr>
                 <w:tc>
@@ -9280,7 +10103,7 @@
               </w:tr>
               <w:tr>
                 <w:trPr>
-                  <w:divId w:val="868185270"/>
+                  <w:divId w:val="1635059212"/>
                   <w:tblCellSpacing w:w="15" w:type="dxa"/>
                 </w:trPr>
                 <w:tc>
@@ -9326,7 +10149,7 @@
               </w:tr>
               <w:tr>
                 <w:trPr>
-                  <w:divId w:val="868185270"/>
+                  <w:divId w:val="1635059212"/>
                   <w:tblCellSpacing w:w="15" w:type="dxa"/>
                 </w:trPr>
                 <w:tc>
@@ -9372,7 +10195,7 @@
               </w:tr>
               <w:tr>
                 <w:trPr>
-                  <w:divId w:val="868185270"/>
+                  <w:divId w:val="1635059212"/>
                   <w:tblCellSpacing w:w="15" w:type="dxa"/>
                 </w:trPr>
                 <w:tc>
@@ -9416,10 +10239,424 @@
                   </w:p>
                 </w:tc>
               </w:tr>
+              <w:tr>
+                <w:trPr>
+                  <w:divId w:val="1635059212"/>
+                  <w:tblCellSpacing w:w="15" w:type="dxa"/>
+                </w:trPr>
+                <w:tc>
+                  <w:tcPr>
+                    <w:tcW w:w="50" w:type="pct"/>
+                    <w:hideMark/>
+                  </w:tcPr>
+                  <w:p>
+                    <w:pPr>
+                      <w:pStyle w:val="Bibliography"/>
+                      <w:rPr>
+                        <w:noProof/>
+                      </w:rPr>
+                    </w:pPr>
+                    <w:r>
+                      <w:rPr>
+                        <w:noProof/>
+                      </w:rPr>
+                      <w:t xml:space="preserve">[20] </w:t>
+                    </w:r>
+                  </w:p>
+                </w:tc>
+                <w:tc>
+                  <w:tcPr>
+                    <w:tcW w:w="0" w:type="auto"/>
+                    <w:hideMark/>
+                  </w:tcPr>
+                  <w:p>
+                    <w:pPr>
+                      <w:pStyle w:val="Bibliography"/>
+                      <w:rPr>
+                        <w:noProof/>
+                      </w:rPr>
+                    </w:pPr>
+                    <w:r>
+                      <w:rPr>
+                        <w:noProof/>
+                      </w:rPr>
+                      <w:t>„React Store/Reducer dokumentáció,” [Online]. Available: https://react.dev/learn/extracting-state-logic-into-a-reducer.</w:t>
+                    </w:r>
+                  </w:p>
+                </w:tc>
+              </w:tr>
+              <w:tr>
+                <w:trPr>
+                  <w:divId w:val="1635059212"/>
+                  <w:tblCellSpacing w:w="15" w:type="dxa"/>
+                </w:trPr>
+                <w:tc>
+                  <w:tcPr>
+                    <w:tcW w:w="50" w:type="pct"/>
+                    <w:hideMark/>
+                  </w:tcPr>
+                  <w:p>
+                    <w:pPr>
+                      <w:pStyle w:val="Bibliography"/>
+                      <w:rPr>
+                        <w:noProof/>
+                      </w:rPr>
+                    </w:pPr>
+                    <w:r>
+                      <w:rPr>
+                        <w:noProof/>
+                      </w:rPr>
+                      <w:t xml:space="preserve">[21] </w:t>
+                    </w:r>
+                  </w:p>
+                </w:tc>
+                <w:tc>
+                  <w:tcPr>
+                    <w:tcW w:w="0" w:type="auto"/>
+                    <w:hideMark/>
+                  </w:tcPr>
+                  <w:p>
+                    <w:pPr>
+                      <w:pStyle w:val="Bibliography"/>
+                      <w:rPr>
+                        <w:noProof/>
+                      </w:rPr>
+                    </w:pPr>
+                    <w:r>
+                      <w:rPr>
+                        <w:noProof/>
+                      </w:rPr>
+                      <w:t>„Amazon Web Service S3 Storage Dokumentáció,” [Online]. Available: https://docs.aws.amazon.com/AmazonS3/latest/userguide/Welcome.html.</w:t>
+                    </w:r>
+                  </w:p>
+                </w:tc>
+              </w:tr>
+              <w:tr>
+                <w:trPr>
+                  <w:divId w:val="1635059212"/>
+                  <w:tblCellSpacing w:w="15" w:type="dxa"/>
+                </w:trPr>
+                <w:tc>
+                  <w:tcPr>
+                    <w:tcW w:w="50" w:type="pct"/>
+                    <w:hideMark/>
+                  </w:tcPr>
+                  <w:p>
+                    <w:pPr>
+                      <w:pStyle w:val="Bibliography"/>
+                      <w:rPr>
+                        <w:noProof/>
+                      </w:rPr>
+                    </w:pPr>
+                    <w:r>
+                      <w:rPr>
+                        <w:noProof/>
+                      </w:rPr>
+                      <w:t xml:space="preserve">[22] </w:t>
+                    </w:r>
+                  </w:p>
+                </w:tc>
+                <w:tc>
+                  <w:tcPr>
+                    <w:tcW w:w="0" w:type="auto"/>
+                    <w:hideMark/>
+                  </w:tcPr>
+                  <w:p>
+                    <w:pPr>
+                      <w:pStyle w:val="Bibliography"/>
+                      <w:rPr>
+                        <w:noProof/>
+                      </w:rPr>
+                    </w:pPr>
+                    <w:r>
+                      <w:rPr>
+                        <w:noProof/>
+                      </w:rPr>
+                      <w:t>„Exit Szaabduló szoba weboldala,” [Online]. Available: https://www.exitgame.hu/.</w:t>
+                    </w:r>
+                  </w:p>
+                </w:tc>
+              </w:tr>
+              <w:tr>
+                <w:trPr>
+                  <w:divId w:val="1635059212"/>
+                  <w:tblCellSpacing w:w="15" w:type="dxa"/>
+                </w:trPr>
+                <w:tc>
+                  <w:tcPr>
+                    <w:tcW w:w="50" w:type="pct"/>
+                    <w:hideMark/>
+                  </w:tcPr>
+                  <w:p>
+                    <w:pPr>
+                      <w:pStyle w:val="Bibliography"/>
+                      <w:rPr>
+                        <w:noProof/>
+                      </w:rPr>
+                    </w:pPr>
+                    <w:r>
+                      <w:rPr>
+                        <w:noProof/>
+                      </w:rPr>
+                      <w:t xml:space="preserve">[23] </w:t>
+                    </w:r>
+                  </w:p>
+                </w:tc>
+                <w:tc>
+                  <w:tcPr>
+                    <w:tcW w:w="0" w:type="auto"/>
+                    <w:hideMark/>
+                  </w:tcPr>
+                  <w:p>
+                    <w:pPr>
+                      <w:pStyle w:val="Bibliography"/>
+                      <w:rPr>
+                        <w:noProof/>
+                      </w:rPr>
+                    </w:pPr>
+                    <w:r>
+                      <w:rPr>
+                        <w:noProof/>
+                      </w:rPr>
+                      <w:t>„Hauntedhouse Szabaduló szoba weboldala,” [Online]. Available: https://hauntedhouse.hu/.</w:t>
+                    </w:r>
+                  </w:p>
+                </w:tc>
+              </w:tr>
+              <w:tr>
+                <w:trPr>
+                  <w:divId w:val="1635059212"/>
+                  <w:tblCellSpacing w:w="15" w:type="dxa"/>
+                </w:trPr>
+                <w:tc>
+                  <w:tcPr>
+                    <w:tcW w:w="50" w:type="pct"/>
+                    <w:hideMark/>
+                  </w:tcPr>
+                  <w:p>
+                    <w:pPr>
+                      <w:pStyle w:val="Bibliography"/>
+                      <w:rPr>
+                        <w:noProof/>
+                      </w:rPr>
+                    </w:pPr>
+                    <w:r>
+                      <w:rPr>
+                        <w:noProof/>
+                      </w:rPr>
+                      <w:t xml:space="preserve">[24] </w:t>
+                    </w:r>
+                  </w:p>
+                </w:tc>
+                <w:tc>
+                  <w:tcPr>
+                    <w:tcW w:w="0" w:type="auto"/>
+                    <w:hideMark/>
+                  </w:tcPr>
+                  <w:p>
+                    <w:pPr>
+                      <w:pStyle w:val="Bibliography"/>
+                      <w:rPr>
+                        <w:noProof/>
+                      </w:rPr>
+                    </w:pPr>
+                    <w:r>
+                      <w:rPr>
+                        <w:noProof/>
+                      </w:rPr>
+                      <w:t>„Rusty Lake weboldala,” [Online]. Available: https://www.rustylake.com/.</w:t>
+                    </w:r>
+                  </w:p>
+                </w:tc>
+              </w:tr>
+              <w:tr>
+                <w:trPr>
+                  <w:divId w:val="1635059212"/>
+                  <w:tblCellSpacing w:w="15" w:type="dxa"/>
+                </w:trPr>
+                <w:tc>
+                  <w:tcPr>
+                    <w:tcW w:w="50" w:type="pct"/>
+                    <w:hideMark/>
+                  </w:tcPr>
+                  <w:p>
+                    <w:pPr>
+                      <w:pStyle w:val="Bibliography"/>
+                      <w:rPr>
+                        <w:noProof/>
+                      </w:rPr>
+                    </w:pPr>
+                    <w:r>
+                      <w:rPr>
+                        <w:noProof/>
+                      </w:rPr>
+                      <w:t xml:space="preserve">[25] </w:t>
+                    </w:r>
+                  </w:p>
+                </w:tc>
+                <w:tc>
+                  <w:tcPr>
+                    <w:tcW w:w="0" w:type="auto"/>
+                    <w:hideMark/>
+                  </w:tcPr>
+                  <w:p>
+                    <w:pPr>
+                      <w:pStyle w:val="Bibliography"/>
+                      <w:rPr>
+                        <w:noProof/>
+                      </w:rPr>
+                    </w:pPr>
+                    <w:r>
+                      <w:rPr>
+                        <w:noProof/>
+                      </w:rPr>
+                      <w:t>„Escape Simulator weboldala,” [Online]. Available: https://pinestudio.com/games/escape-simulator/.</w:t>
+                    </w:r>
+                  </w:p>
+                </w:tc>
+              </w:tr>
+              <w:tr>
+                <w:trPr>
+                  <w:divId w:val="1635059212"/>
+                  <w:tblCellSpacing w:w="15" w:type="dxa"/>
+                </w:trPr>
+                <w:tc>
+                  <w:tcPr>
+                    <w:tcW w:w="50" w:type="pct"/>
+                    <w:hideMark/>
+                  </w:tcPr>
+                  <w:p>
+                    <w:pPr>
+                      <w:pStyle w:val="Bibliography"/>
+                      <w:rPr>
+                        <w:noProof/>
+                      </w:rPr>
+                    </w:pPr>
+                    <w:r>
+                      <w:rPr>
+                        <w:noProof/>
+                      </w:rPr>
+                      <w:t xml:space="preserve">[26] </w:t>
+                    </w:r>
+                  </w:p>
+                </w:tc>
+                <w:tc>
+                  <w:tcPr>
+                    <w:tcW w:w="0" w:type="auto"/>
+                    <w:hideMark/>
+                  </w:tcPr>
+                  <w:p>
+                    <w:pPr>
+                      <w:pStyle w:val="Bibliography"/>
+                      <w:rPr>
+                        <w:noProof/>
+                      </w:rPr>
+                    </w:pPr>
+                    <w:r>
+                      <w:rPr>
+                        <w:noProof/>
+                      </w:rPr>
+                      <w:t>„Qwen 2.5 1.5B modell dokumentációja,” [Online]. Available: https://huggingface.co/Qwen/Qwen2.5-1.5B.</w:t>
+                    </w:r>
+                  </w:p>
+                </w:tc>
+              </w:tr>
+              <w:tr>
+                <w:trPr>
+                  <w:divId w:val="1635059212"/>
+                  <w:tblCellSpacing w:w="15" w:type="dxa"/>
+                </w:trPr>
+                <w:tc>
+                  <w:tcPr>
+                    <w:tcW w:w="50" w:type="pct"/>
+                    <w:hideMark/>
+                  </w:tcPr>
+                  <w:p>
+                    <w:pPr>
+                      <w:pStyle w:val="Bibliography"/>
+                      <w:rPr>
+                        <w:noProof/>
+                      </w:rPr>
+                    </w:pPr>
+                    <w:r>
+                      <w:rPr>
+                        <w:noProof/>
+                      </w:rPr>
+                      <w:t xml:space="preserve">[27] </w:t>
+                    </w:r>
+                  </w:p>
+                </w:tc>
+                <w:tc>
+                  <w:tcPr>
+                    <w:tcW w:w="0" w:type="auto"/>
+                    <w:hideMark/>
+                  </w:tcPr>
+                  <w:p>
+                    <w:pPr>
+                      <w:pStyle w:val="Bibliography"/>
+                      <w:rPr>
+                        <w:noProof/>
+                      </w:rPr>
+                    </w:pPr>
+                    <w:r>
+                      <w:rPr>
+                        <w:noProof/>
+                      </w:rPr>
+                      <w:t>„Hugging Face weboldala,” [Online]. Available: https://huggingface.co/.</w:t>
+                    </w:r>
+                  </w:p>
+                </w:tc>
+              </w:tr>
+              <w:tr>
+                <w:trPr>
+                  <w:divId w:val="1635059212"/>
+                  <w:tblCellSpacing w:w="15" w:type="dxa"/>
+                </w:trPr>
+                <w:tc>
+                  <w:tcPr>
+                    <w:tcW w:w="50" w:type="pct"/>
+                    <w:hideMark/>
+                  </w:tcPr>
+                  <w:p>
+                    <w:pPr>
+                      <w:pStyle w:val="Bibliography"/>
+                      <w:rPr>
+                        <w:noProof/>
+                      </w:rPr>
+                    </w:pPr>
+                    <w:r>
+                      <w:rPr>
+                        <w:noProof/>
+                      </w:rPr>
+                      <w:t xml:space="preserve">[28] </w:t>
+                    </w:r>
+                  </w:p>
+                </w:tc>
+                <w:tc>
+                  <w:tcPr>
+                    <w:tcW w:w="0" w:type="auto"/>
+                    <w:hideMark/>
+                  </w:tcPr>
+                  <w:p>
+                    <w:pPr>
+                      <w:pStyle w:val="Bibliography"/>
+                      <w:rPr>
+                        <w:noProof/>
+                      </w:rPr>
+                    </w:pPr>
+                    <w:r>
+                      <w:rPr>
+                        <w:noProof/>
+                      </w:rPr>
+                      <w:t>„CodeGame Szabaduló szoba weboldala,” [Online]. Available: https://www.codegame.hu/.</w:t>
+                    </w:r>
+                  </w:p>
+                </w:tc>
+              </w:tr>
             </w:tbl>
             <w:p>
               <w:pPr>
-                <w:divId w:val="868185270"/>
+                <w:divId w:val="1635059212"/>
                 <w:rPr>
                   <w:rFonts w:eastAsia="Times New Roman"/>
                   <w:noProof/>
@@ -9442,6 +10679,7 @@
     </w:sdt>
     <w:p>
       <w:r>
+        <w:lastRenderedPageBreak/>
         <w:br w:type="page"/>
       </w:r>
     </w:p>
@@ -9449,12 +10687,12 @@
       <w:pPr>
         <w:pStyle w:val="szmozatlanSzakdolgozath1"/>
       </w:pPr>
-      <w:bookmarkStart w:id="29" w:name="_Toc225600720"/>
+      <w:bookmarkStart w:id="30" w:name="_Toc225610625"/>
       <w:r>
         <w:lastRenderedPageBreak/>
         <w:t>Nyilatkozat</w:t>
       </w:r>
-      <w:bookmarkEnd w:id="29"/>
+      <w:bookmarkEnd w:id="30"/>
     </w:p>
     <w:p>
       <w:pPr>
@@ -9562,25 +10800,25 @@
       <w:pPr>
         <w:pStyle w:val="szmozatlanSzakdolgozath1"/>
       </w:pPr>
-      <w:bookmarkStart w:id="30" w:name="_Toc225600721"/>
+      <w:bookmarkStart w:id="31" w:name="_Toc225610626"/>
       <w:r>
         <w:lastRenderedPageBreak/>
         <w:t>Mellékletek</w:t>
       </w:r>
-      <w:bookmarkEnd w:id="30"/>
+      <w:bookmarkEnd w:id="31"/>
     </w:p>
     <w:p>
       <w:pPr>
         <w:pStyle w:val="Szakdolgozath2"/>
       </w:pPr>
-      <w:bookmarkStart w:id="31" w:name="_Toc225600722"/>
+      <w:bookmarkStart w:id="32" w:name="_Toc225610627"/>
       <w:r>
         <w:t>Adatbázis</w:t>
       </w:r>
       <w:r>
         <w:t xml:space="preserve"> relációk</w:t>
       </w:r>
-      <w:bookmarkEnd w:id="31"/>
+      <w:bookmarkEnd w:id="32"/>
     </w:p>
     <w:p>
       <w:pPr>
@@ -9674,12 +10912,12 @@
       <w:pPr>
         <w:pStyle w:val="Szakdolgozath2"/>
       </w:pPr>
-      <w:bookmarkStart w:id="32" w:name="_Toc225600723"/>
+      <w:bookmarkStart w:id="33" w:name="_Toc225610628"/>
       <w:r>
         <w:lastRenderedPageBreak/>
         <w:t>Gráf alapú pálya struktúra definiálása</w:t>
       </w:r>
-      <w:bookmarkEnd w:id="32"/>
+      <w:bookmarkEnd w:id="33"/>
     </w:p>
     <w:p>
       <w:pPr>
@@ -10767,7 +12005,6 @@
   <w:style w:type="character" w:default="1" w:styleId="DefaultParagraphFont">
     <w:name w:val="Default Paragraph Font"/>
     <w:uiPriority w:val="1"/>
-    <w:semiHidden/>
     <w:unhideWhenUsed/>
   </w:style>
   <w:style w:type="table" w:default="1" w:styleId="TableNormal">
@@ -12043,7 +13280,7 @@
     <b:Guid>{DD0B38D9-A2E6-489C-9084-B127B64A88F7}</b:Guid>
     <b:Title>CodeGame Szabaduló szoba weboldala</b:Title>
     <b:URL>https://www.codegame.hu/</b:URL>
-    <b:RefOrder>24</b:RefOrder>
+    <b:RefOrder>28</b:RefOrder>
   </b:Source>
   <b:Source>
     <b:Tag>AWS_S3</b:Tag>
@@ -12059,7 +13296,7 @@
     <b:Guid>{83E88005-A1CA-4307-8215-206ECF581500}</b:Guid>
     <b:Title>Rusty Lake weboldala</b:Title>
     <b:URL>https://www.rustylake.com/</b:URL>
-    <b:RefOrder>25</b:RefOrder>
+    <b:RefOrder>24</b:RefOrder>
   </b:Source>
   <b:Source>
     <b:Tag>Esc</b:Tag>
@@ -12067,13 +13304,29 @@
     <b:Guid>{D76D941F-1C62-46A4-BE8F-633D495E7560}</b:Guid>
     <b:Title>Escape Simulator weboldala</b:Title>
     <b:URL>https://pinestudio.com/games/escape-simulator/</b:URL>
+    <b:RefOrder>25</b:RefOrder>
+  </b:Source>
+  <b:Source>
+    <b:Tag>HuggingFace</b:Tag>
+    <b:SourceType>InternetSite</b:SourceType>
+    <b:Guid>{089425C9-2BF6-4300-ACCA-A95FBCC56B22}</b:Guid>
+    <b:Title>Hugging Face weboldala</b:Title>
+    <b:URL>https://huggingface.co/</b:URL>
+    <b:RefOrder>27</b:RefOrder>
+  </b:Source>
+  <b:Source>
+    <b:Tag>Qwen2_5</b:Tag>
+    <b:SourceType>InternetSite</b:SourceType>
+    <b:Guid>{F025DB33-B94E-4AB1-91E8-C1220FA066F2}</b:Guid>
+    <b:Title>Qwen 2.5 1.5B modell dokumentációja</b:Title>
+    <b:URL>https://huggingface.co/Qwen/Qwen2.5-1.5B</b:URL>
     <b:RefOrder>26</b:RefOrder>
   </b:Source>
 </b:Sources>
 </file>
 
 <file path=customXml/itemProps1.xml><?xml version="1.0" encoding="utf-8"?>
-<ds:datastoreItem xmlns:ds="http://schemas.openxmlformats.org/officeDocument/2006/customXml" ds:itemID="{4F2AD012-3EFF-4271-8379-4173B730AF8D}">
+<ds:datastoreItem xmlns:ds="http://schemas.openxmlformats.org/officeDocument/2006/customXml" ds:itemID="{5DB39563-93E1-419D-B04A-A7A947957301}">
   <ds:schemaRefs>
     <ds:schemaRef ds:uri="http://schemas.openxmlformats.org/officeDocument/2006/bibliography"/>
   </ds:schemaRefs>

</xml_diff>